<commit_message>
(update): working on the dispatch agent and related uav code
</commit_message>
<xml_diff>
--- a/Reflective_Synthesis_Paper.docx
+++ b/Reflective_Synthesis_Paper.docx
@@ -211,10 +211,7 @@
         <w:t>Ramadan</w:t>
       </w:r>
       <w:r>
-        <w:t xml:space="preserve"> 2024)</w:t>
-      </w:r>
-      <w:r>
-        <w:t xml:space="preserve"> and (</w:t>
+        <w:t xml:space="preserve"> 2024) and (</w:t>
       </w:r>
       <w:r>
         <w:t>Ghosh</w:t>
@@ -409,12 +406,21 @@
         </w:numPr>
         <w:spacing w:line="480" w:lineRule="auto"/>
       </w:pPr>
+      <w:proofErr w:type="spellStart"/>
       <w:r>
         <w:rPr>
           <w:b/>
           <w:bCs/>
         </w:rPr>
-        <w:t>UNet Architecture:</w:t>
+        <w:t>UNet</w:t>
+      </w:r>
+      <w:proofErr w:type="spellEnd"/>
+      <w:r>
+        <w:rPr>
+          <w:b/>
+          <w:bCs/>
+        </w:rPr>
+        <w:t xml:space="preserve"> Architecture:</w:t>
       </w:r>
       <w:r>
         <w:t xml:space="preserve"> Figure </w:t>
@@ -423,7 +429,31 @@
         <w:t>3</w:t>
       </w:r>
       <w:r>
-        <w:t xml:space="preserve"> shows our modified UNet Architecture. We made two changes to this architecture: First, we made it smaller. Experiments in Project 4 suggested that for a binary classification problem we don’t need quite so many parameters on the two “walls” of the UNet. Second, we changed the bridge between the down sample and up sample stage to be a series of convolutions with 3x3 kernels instead of the standard 1x1kernel. This change was done to help the network “predict” where the fire would be next, instead of simply copying the fire’s starting location as was happening when experimentation was first started. Resulting outputs from the modified UNet can be seen in figure </w:t>
+        <w:t xml:space="preserve"> shows our modified </w:t>
+      </w:r>
+      <w:proofErr w:type="spellStart"/>
+      <w:r>
+        <w:t>UNet</w:t>
+      </w:r>
+      <w:proofErr w:type="spellEnd"/>
+      <w:r>
+        <w:t xml:space="preserve"> Architecture. We made two changes to this architecture: First, we made it smaller. Experiments in Project 4 suggested that for a binary classification problem we don’t need quite so many parameters on the two “walls” of the </w:t>
+      </w:r>
+      <w:proofErr w:type="spellStart"/>
+      <w:r>
+        <w:t>UNet</w:t>
+      </w:r>
+      <w:proofErr w:type="spellEnd"/>
+      <w:r>
+        <w:t xml:space="preserve">. Second, we changed the bridge between the down sample and up sample stage to be a series of convolutions with 3x3 kernels instead of the standard 1x1kernel. This change was done to help the network “predict” where the fire would be next, instead of simply copying the fire’s starting location as was happening when experimentation was first started. Resulting outputs from the modified </w:t>
+      </w:r>
+      <w:proofErr w:type="spellStart"/>
+      <w:r>
+        <w:t>UNet</w:t>
+      </w:r>
+      <w:proofErr w:type="spellEnd"/>
+      <w:r>
+        <w:t xml:space="preserve"> can be seen in figure </w:t>
       </w:r>
       <w:r>
         <w:t>4.</w:t>
@@ -625,24 +655,14 @@
       <w:r>
         <w:t xml:space="preserve">Figure </w:t>
       </w:r>
-      <w:r>
-        <w:fldChar w:fldCharType="begin"/>
-      </w:r>
-      <w:r>
-        <w:instrText xml:space="preserve"> SEQ Figure \* ARABIC </w:instrText>
-      </w:r>
-      <w:r>
-        <w:fldChar w:fldCharType="separate"/>
-      </w:r>
-      <w:r>
-        <w:rPr>
-          <w:noProof/>
-        </w:rPr>
-        <w:t>1</w:t>
-      </w:r>
-      <w:r>
-        <w:fldChar w:fldCharType="end"/>
-      </w:r>
+      <w:fldSimple w:instr=" SEQ Figure \* ARABIC ">
+        <w:r>
+          <w:rPr>
+            <w:noProof/>
+          </w:rPr>
+          <w:t>1</w:t>
+        </w:r>
+      </w:fldSimple>
       <w:r>
         <w:t xml:space="preserve"> Perlin Noise Generated Terrain</w:t>
       </w:r>
@@ -715,24 +735,14 @@
       <w:r>
         <w:t xml:space="preserve">Figure </w:t>
       </w:r>
-      <w:r>
-        <w:fldChar w:fldCharType="begin"/>
-      </w:r>
-      <w:r>
-        <w:instrText xml:space="preserve"> SEQ Figure \* ARABIC </w:instrText>
-      </w:r>
-      <w:r>
-        <w:fldChar w:fldCharType="separate"/>
-      </w:r>
-      <w:r>
-        <w:rPr>
-          <w:noProof/>
-        </w:rPr>
-        <w:t>2</w:t>
-      </w:r>
-      <w:r>
-        <w:fldChar w:fldCharType="end"/>
-      </w:r>
+      <w:fldSimple w:instr=" SEQ Figure \* ARABIC ">
+        <w:r>
+          <w:rPr>
+            <w:noProof/>
+          </w:rPr>
+          <w:t>2</w:t>
+        </w:r>
+      </w:fldSimple>
       <w:r>
         <w:t xml:space="preserve"> Wildfire CA in action</w:t>
       </w:r>
@@ -805,26 +815,32 @@
       <w:r>
         <w:t xml:space="preserve">Figure </w:t>
       </w:r>
-      <w:r>
-        <w:fldChar w:fldCharType="begin"/>
-      </w:r>
-      <w:r>
-        <w:instrText xml:space="preserve"> SEQ Figure \* ARABIC </w:instrText>
-      </w:r>
-      <w:r>
-        <w:fldChar w:fldCharType="separate"/>
-      </w:r>
-      <w:r>
-        <w:rPr>
-          <w:noProof/>
-        </w:rPr>
-        <w:t>3</w:t>
-      </w:r>
-      <w:r>
-        <w:fldChar w:fldCharType="end"/>
-      </w:r>
-      <w:r>
-        <w:t xml:space="preserve"> Modified UNet (image generated with assistance of Gemini AI Model based on authors UNet code)</w:t>
+      <w:fldSimple w:instr=" SEQ Figure \* ARABIC ">
+        <w:r>
+          <w:rPr>
+            <w:noProof/>
+          </w:rPr>
+          <w:t>3</w:t>
+        </w:r>
+      </w:fldSimple>
+      <w:r>
+        <w:t xml:space="preserve"> Modified </w:t>
+      </w:r>
+      <w:proofErr w:type="spellStart"/>
+      <w:r>
+        <w:t>UNet</w:t>
+      </w:r>
+      <w:proofErr w:type="spellEnd"/>
+      <w:r>
+        <w:t xml:space="preserve"> (image generated with assistance of Gemini AI Model based on authors </w:t>
+      </w:r>
+      <w:proofErr w:type="spellStart"/>
+      <w:r>
+        <w:t>UNet</w:t>
+      </w:r>
+      <w:proofErr w:type="spellEnd"/>
+      <w:r>
+        <w:t xml:space="preserve"> code)</w:t>
       </w:r>
     </w:p>
     <w:p/>
@@ -838,7 +854,7 @@
         </w:rPr>
         <w:lastRenderedPageBreak/>
         <w:drawing>
-          <wp:inline distT="0" distB="0" distL="0" distR="0" wp14:anchorId="5A99DB7D" wp14:editId="10E96E48">
+          <wp:inline distT="0" distB="0" distL="0" distR="0" wp14:anchorId="5A99DB7D" wp14:editId="685FB762">
             <wp:extent cx="5941060" cy="6047105"/>
             <wp:effectExtent l="0" t="0" r="2540" b="0"/>
             <wp:docPr id="1561439249" name="Picture 5"/>
@@ -895,24 +911,14 @@
       <w:r>
         <w:t xml:space="preserve">Figure </w:t>
       </w:r>
-      <w:r>
-        <w:fldChar w:fldCharType="begin"/>
-      </w:r>
-      <w:r>
-        <w:instrText xml:space="preserve"> SEQ Figure \* ARABIC </w:instrText>
-      </w:r>
-      <w:r>
-        <w:fldChar w:fldCharType="separate"/>
-      </w:r>
-      <w:r>
-        <w:rPr>
-          <w:noProof/>
-        </w:rPr>
-        <w:t>4</w:t>
-      </w:r>
-      <w:r>
-        <w:fldChar w:fldCharType="end"/>
-      </w:r>
+      <w:fldSimple w:instr=" SEQ Figure \* ARABIC ">
+        <w:r>
+          <w:rPr>
+            <w:noProof/>
+          </w:rPr>
+          <w:t>4</w:t>
+        </w:r>
+      </w:fldSimple>
       <w:r>
         <w:t xml:space="preserve"> Fire Risk Prediction Outputs</w:t>
       </w:r>
@@ -985,24 +991,14 @@
       <w:r>
         <w:t xml:space="preserve">Figure </w:t>
       </w:r>
-      <w:r>
-        <w:fldChar w:fldCharType="begin"/>
-      </w:r>
-      <w:r>
-        <w:instrText xml:space="preserve"> SEQ Figure \* ARABIC </w:instrText>
-      </w:r>
-      <w:r>
-        <w:fldChar w:fldCharType="separate"/>
-      </w:r>
-      <w:r>
-        <w:rPr>
-          <w:noProof/>
-        </w:rPr>
-        <w:t>5</w:t>
-      </w:r>
-      <w:r>
-        <w:fldChar w:fldCharType="end"/>
-      </w:r>
+      <w:fldSimple w:instr=" SEQ Figure \* ARABIC ">
+        <w:r>
+          <w:rPr>
+            <w:noProof/>
+          </w:rPr>
+          <w:t>5</w:t>
+        </w:r>
+      </w:fldSimple>
       <w:r>
         <w:t xml:space="preserve"> System Architecture</w:t>
       </w:r>
@@ -1242,7 +1238,35 @@
         <w:rPr>
           <w:lang w:val="en-CA"/>
         </w:rPr>
-        <w:t xml:space="preserve">Chen, L., Lu, K., Rajeswaran, A., Lee, K., Grover, A., Laskin, M., Abbeel, P., Srinivas, A., &amp; Mordatch, I. (2021). </w:t>
+        <w:t xml:space="preserve">Chen, L., Lu, K., Rajeswaran, A., Lee, K., Grover, A., Laskin, M., </w:t>
+      </w:r>
+      <w:proofErr w:type="spellStart"/>
+      <w:r>
+        <w:rPr>
+          <w:lang w:val="en-CA"/>
+        </w:rPr>
+        <w:t>Abbeel</w:t>
+      </w:r>
+      <w:proofErr w:type="spellEnd"/>
+      <w:r>
+        <w:rPr>
+          <w:lang w:val="en-CA"/>
+        </w:rPr>
+        <w:t xml:space="preserve">, P., Srinivas, A., &amp; </w:t>
+      </w:r>
+      <w:proofErr w:type="spellStart"/>
+      <w:r>
+        <w:rPr>
+          <w:lang w:val="en-CA"/>
+        </w:rPr>
+        <w:t>Mordatch</w:t>
+      </w:r>
+      <w:proofErr w:type="spellEnd"/>
+      <w:r>
+        <w:rPr>
+          <w:lang w:val="en-CA"/>
+        </w:rPr>
+        <w:t xml:space="preserve">, I. (2021). </w:t>
       </w:r>
       <w:r>
         <w:rPr>
@@ -1256,7 +1280,21 @@
         <w:rPr>
           <w:lang w:val="en-CA"/>
         </w:rPr>
-        <w:t>. arXiv. https://doi.org/10.48550/arXiv.2106.01345</w:t>
+        <w:t xml:space="preserve">. </w:t>
+      </w:r>
+      <w:proofErr w:type="spellStart"/>
+      <w:r>
+        <w:rPr>
+          <w:lang w:val="en-CA"/>
+        </w:rPr>
+        <w:t>arXiv</w:t>
+      </w:r>
+      <w:proofErr w:type="spellEnd"/>
+      <w:r>
+        <w:rPr>
+          <w:lang w:val="en-CA"/>
+        </w:rPr>
+        <w:t>. https://doi.org/10.48550/arXiv.2106.01345</w:t>
       </w:r>
     </w:p>
     <w:p>
@@ -1280,7 +1318,15 @@
         <w:t>Fire spread modeling using probabilistic cellular automata</w:t>
       </w:r>
       <w:r>
-        <w:t xml:space="preserve">. arXiv. </w:t>
+        <w:t xml:space="preserve">. </w:t>
+      </w:r>
+      <w:proofErr w:type="spellStart"/>
+      <w:r>
+        <w:t>arXiv</w:t>
+      </w:r>
+      <w:proofErr w:type="spellEnd"/>
+      <w:r>
+        <w:t xml:space="preserve">. </w:t>
       </w:r>
       <w:hyperlink r:id="rId13" w:tgtFrame="_blank" w:history="1">
         <w:r>
@@ -1313,7 +1359,15 @@
         <w:t>Distributed wildfire surveillance with autonomous aircraft using deep reinforcement learning</w:t>
       </w:r>
       <w:r>
-        <w:t xml:space="preserve">. arXiv. </w:t>
+        <w:t xml:space="preserve">. </w:t>
+      </w:r>
+      <w:proofErr w:type="spellStart"/>
+      <w:r>
+        <w:t>arXiv</w:t>
+      </w:r>
+      <w:proofErr w:type="spellEnd"/>
+      <w:r>
+        <w:t xml:space="preserve">. </w:t>
       </w:r>
       <w:hyperlink r:id="rId14" w:tgtFrame="_blank" w:history="1">
         <w:r>
@@ -1370,23 +1424,31 @@
     <w:p>
       <w:pPr>
         <w:spacing w:line="480" w:lineRule="auto"/>
+      </w:pPr>
+    </w:p>
+    <w:p>
+      <w:pPr>
+        <w:spacing w:line="480" w:lineRule="auto"/>
         <w:ind w:left="720"/>
       </w:pPr>
-    </w:p>
-    <w:p>
-      <w:pPr>
-        <w:spacing w:line="480" w:lineRule="auto"/>
-        <w:ind w:left="720"/>
-      </w:pPr>
       <w:r>
         <w:t xml:space="preserve">Merlin, P. W. (2009). </w:t>
       </w:r>
+      <w:proofErr w:type="spellStart"/>
       <w:r>
         <w:rPr>
           <w:i/>
           <w:iCs/>
         </w:rPr>
-        <w:t>Ikhana Unmanned Aircraft System: Western States fire missions</w:t>
+        <w:t>Ikhana</w:t>
+      </w:r>
+      <w:proofErr w:type="spellEnd"/>
+      <w:r>
+        <w:rPr>
+          <w:i/>
+          <w:iCs/>
+        </w:rPr>
+        <w:t xml:space="preserve"> Unmanned Aircraft System: Western States fire missions</w:t>
       </w:r>
       <w:r>
         <w:t xml:space="preserve"> (NASA SP-2009-4544; Monographs in Aerospace History, No. 44). National Aeronautics and Space Administration. </w:t>
@@ -1422,7 +1484,15 @@
         <w:t>Wildfire autonomous response and prediction using cellular automata (WARP-CA)</w:t>
       </w:r>
       <w:r>
-        <w:t xml:space="preserve">. arXiv. </w:t>
+        <w:t xml:space="preserve">. </w:t>
+      </w:r>
+      <w:proofErr w:type="spellStart"/>
+      <w:r>
+        <w:t>arXiv</w:t>
+      </w:r>
+      <w:proofErr w:type="spellEnd"/>
+      <w:r>
+        <w:t xml:space="preserve">. </w:t>
       </w:r>
       <w:hyperlink r:id="rId17" w:tgtFrame="_blank" w:history="1">
         <w:r>
@@ -1443,16 +1513,14 @@
       <w:pPr>
         <w:spacing w:line="480" w:lineRule="auto"/>
         <w:ind w:left="720"/>
+      </w:pPr>
+      <w:r>
         <w:rPr>
           <w:lang w:val="en-CA"/>
         </w:rPr>
-      </w:pPr>
-      <w:r>
-        <w:rPr>
-          <w:lang w:val="en-CA"/>
-        </w:rPr>
         <w:t xml:space="preserve">Ronneberger, O., Fischer, P., &amp; Brox, T. (2015). U-Net: Convolutional networks for biomedical image segmentation. </w:t>
       </w:r>
+      <w:proofErr w:type="spellStart"/>
       <w:r>
         <w:rPr>
           <w:i/>
@@ -1461,6 +1529,7 @@
         </w:rPr>
         <w:t>arXiv</w:t>
       </w:r>
+      <w:proofErr w:type="spellEnd"/>
       <w:r>
         <w:rPr>
           <w:lang w:val="en-CA"/>
@@ -1483,10 +1552,54 @@
         <w:ind w:left="720"/>
       </w:pPr>
     </w:p>
+    <w:p>
+      <w:pPr>
+        <w:spacing w:line="480" w:lineRule="auto"/>
+        <w:ind w:left="720"/>
+        <w:rPr>
+          <w:lang w:val="en-CA"/>
+        </w:rPr>
+      </w:pPr>
+      <w:r>
+        <w:t xml:space="preserve">Yu, R., Wan, S., Wang, Y., Gao, C. X., Gan, L., Zhang, Z., &amp; Zhan, D. C. (2025). </w:t>
+      </w:r>
+      <w:r>
+        <w:rPr>
+          <w:i/>
+          <w:iCs/>
+        </w:rPr>
+        <w:t>Reward models in deep reinforcement learning: A survey</w:t>
+      </w:r>
+      <w:r>
+        <w:t xml:space="preserve">. </w:t>
+      </w:r>
+      <w:proofErr w:type="spellStart"/>
+      <w:r>
+        <w:t>arXiv</w:t>
+      </w:r>
+      <w:proofErr w:type="spellEnd"/>
+      <w:r>
+        <w:t xml:space="preserve">. </w:t>
+      </w:r>
+      <w:hyperlink r:id="rId19" w:tgtFrame="_blank" w:history="1">
+        <w:r>
+          <w:rPr>
+            <w:rStyle w:val="Hyperlink"/>
+          </w:rPr>
+          <w:t>https://doi.org/10.48550/arXiv.2506.15421</w:t>
+        </w:r>
+      </w:hyperlink>
+    </w:p>
+    <w:p>
+      <w:pPr>
+        <w:spacing w:line="480" w:lineRule="auto"/>
+        <w:ind w:left="720"/>
+      </w:pPr>
+    </w:p>
     <w:sectPr>
-      <w:headerReference w:type="even" r:id="rId19"/>
-      <w:headerReference w:type="default" r:id="rId20"/>
-      <w:headerReference w:type="first" r:id="rId21"/>
+      <w:headerReference w:type="even" r:id="rId20"/>
+      <w:headerReference w:type="default" r:id="rId21"/>
+      <w:headerReference w:type="first" r:id="rId22"/>
       <w:pgSz w:w="12240" w:h="15840"/>
       <w:pgMar w:top="1440" w:right="1440" w:bottom="1440" w:left="1440" w:header="720" w:footer="1440" w:gutter="0"/>
       <w:pgNumType w:start="1"/>
@@ -1576,11 +1689,33 @@
         <w:t xml:space="preserve"> </w:t>
       </w:r>
       <w:hyperlink r:id="rId2" w:history="1">
+        <w:proofErr w:type="spellStart"/>
         <w:r>
           <w:rPr>
             <w:rStyle w:val="Hyperlink"/>
           </w:rPr>
-          <w:t>BCEWithLogitsLoss — PyTorch 2.12 documentation</w:t>
+          <w:t>BCEWithLogitsLoss</w:t>
+        </w:r>
+        <w:proofErr w:type="spellEnd"/>
+        <w:r>
+          <w:rPr>
+            <w:rStyle w:val="Hyperlink"/>
+          </w:rPr>
+          <w:t xml:space="preserve"> — </w:t>
+        </w:r>
+        <w:proofErr w:type="spellStart"/>
+        <w:r>
+          <w:rPr>
+            <w:rStyle w:val="Hyperlink"/>
+          </w:rPr>
+          <w:t>PyTorch</w:t>
+        </w:r>
+        <w:proofErr w:type="spellEnd"/>
+        <w:r>
+          <w:rPr>
+            <w:rStyle w:val="Hyperlink"/>
+          </w:rPr>
+          <w:t xml:space="preserve"> 2.12 documentation</w:t>
         </w:r>
       </w:hyperlink>
     </w:p>

</xml_diff>

<commit_message>
(update): train UAV's using RL and SVM
</commit_message>
<xml_diff>
--- a/Reflective_Synthesis_Paper.docx
+++ b/Reflective_Synthesis_Paper.docx
@@ -477,31 +477,16 @@
         <w:t>UAV Dispatch Control:</w:t>
       </w:r>
       <w:r>
-        <w:t xml:space="preserve"> Given a set of priorities (protecting people, protecting property, protecting trees for example) we needed to be able to allocate and control a collection of UAVs in a simulated environment. To this end we developed an RL agent using a Generative AI approach (</w:t>
+        <w:t xml:space="preserve"> Given a set of priorities (protecting people, protecting property, protecting trees for example) we needed to be able to allocate and control a collection of UAVs in a simulated environment. To this end we developed an RL agent using </w:t>
+      </w:r>
+      <w:r>
+        <w:t>Iterated Q-Learning powered by a Support Vector Machine (REFERENCE)</w:t>
       </w:r>
       <w:r>
         <w:rPr>
           <w:lang w:val="en-CA"/>
         </w:rPr>
-        <w:t>Chen</w:t>
-      </w:r>
-      <w:r>
-        <w:rPr>
-          <w:lang w:val="en-CA"/>
-        </w:rPr>
-        <w:t xml:space="preserve"> 2021)</w:t>
-      </w:r>
-      <w:r>
-        <w:rPr>
-          <w:lang w:val="en-CA"/>
-        </w:rPr>
-        <w:t xml:space="preserve"> </w:t>
-      </w:r>
-      <w:r>
-        <w:rPr>
-          <w:lang w:val="en-CA"/>
-        </w:rPr>
-        <w:t>that was demonstrated in Project 5</w:t>
+        <w:t>. Use of SVM was demonstrated in a different context for Project 3.</w:t>
       </w:r>
       <w:r>
         <w:rPr>
@@ -550,13 +535,7 @@
           <w:b/>
           <w:bCs/>
         </w:rPr>
-        <w:t>Decision Transformer:</w:t>
-      </w:r>
-      <w:r>
-        <w:t xml:space="preserve"> </w:t>
-      </w:r>
-      <w:r>
-        <w:t xml:space="preserve">Our Decision Transformer takes the place of the Ground Crew in Merlin 2009. </w:t>
+        <w:t xml:space="preserve">RL Agent: </w:t>
       </w:r>
     </w:p>
     <w:p>
@@ -854,7 +833,7 @@
         </w:rPr>
         <w:lastRenderedPageBreak/>
         <w:drawing>
-          <wp:inline distT="0" distB="0" distL="0" distR="0" wp14:anchorId="5A99DB7D" wp14:editId="685FB762">
+          <wp:inline distT="0" distB="0" distL="0" distR="0" wp14:anchorId="5A99DB7D" wp14:editId="49AC8C38">
             <wp:extent cx="5941060" cy="6047105"/>
             <wp:effectExtent l="0" t="0" r="2540" b="0"/>
             <wp:docPr id="1561439249" name="Picture 5"/>
@@ -928,60 +907,6 @@
         <w:keepNext/>
         <w:spacing w:line="480" w:lineRule="auto"/>
       </w:pPr>
-      <w:r>
-        <w:rPr>
-          <w:noProof/>
-        </w:rPr>
-        <w:lastRenderedPageBreak/>
-        <w:drawing>
-          <wp:inline distT="0" distB="0" distL="0" distR="0" wp14:anchorId="084DD64D" wp14:editId="61508C64">
-            <wp:extent cx="5935345" cy="5553710"/>
-            <wp:effectExtent l="0" t="0" r="8255" b="8890"/>
-            <wp:docPr id="344909375" name="Picture 1"/>
-            <wp:cNvGraphicFramePr>
-              <a:graphicFrameLocks xmlns:a="http://schemas.openxmlformats.org/drawingml/2006/main" noChangeAspect="1"/>
-            </wp:cNvGraphicFramePr>
-            <a:graphic xmlns:a="http://schemas.openxmlformats.org/drawingml/2006/main">
-              <a:graphicData uri="http://schemas.openxmlformats.org/drawingml/2006/picture">
-                <pic:pic xmlns:pic="http://schemas.openxmlformats.org/drawingml/2006/picture">
-                  <pic:nvPicPr>
-                    <pic:cNvPr id="0" name="Picture 1"/>
-                    <pic:cNvPicPr>
-                      <a:picLocks noChangeAspect="1" noChangeArrowheads="1"/>
-                    </pic:cNvPicPr>
-                  </pic:nvPicPr>
-                  <pic:blipFill>
-                    <a:blip r:embed="rId12">
-                      <a:extLst>
-                        <a:ext uri="{28A0092B-C50C-407E-A947-70E740481C1C}">
-                          <a14:useLocalDpi xmlns:a14="http://schemas.microsoft.com/office/drawing/2010/main" val="0"/>
-                        </a:ext>
-                      </a:extLst>
-                    </a:blip>
-                    <a:srcRect/>
-                    <a:stretch>
-                      <a:fillRect/>
-                    </a:stretch>
-                  </pic:blipFill>
-                  <pic:spPr bwMode="auto">
-                    <a:xfrm>
-                      <a:off x="0" y="0"/>
-                      <a:ext cx="5935345" cy="5553710"/>
-                    </a:xfrm>
-                    <a:prstGeom prst="rect">
-                      <a:avLst/>
-                    </a:prstGeom>
-                    <a:noFill/>
-                    <a:ln>
-                      <a:noFill/>
-                    </a:ln>
-                  </pic:spPr>
-                </pic:pic>
-              </a:graphicData>
-            </a:graphic>
-          </wp:inline>
-        </w:drawing>
-      </w:r>
     </w:p>
     <w:p>
       <w:pPr>
@@ -1060,7 +985,6 @@
         <w:ind w:firstLine="720"/>
       </w:pPr>
       <w:r>
-        <w:lastRenderedPageBreak/>
         <w:t>The main body of your paper goes here, starting on page 3. (Or starting on page 2, if you’re not required to include an abstract.)</w:t>
       </w:r>
     </w:p>
@@ -1229,106 +1153,49 @@
     <w:p>
       <w:pPr>
         <w:spacing w:line="480" w:lineRule="auto"/>
+        <w:rPr>
+          <w:lang w:val="en-CA"/>
+        </w:rPr>
+      </w:pPr>
+      <w:r>
+        <w:rPr>
+          <w:lang w:val="en-CA"/>
+        </w:rPr>
+        <w:tab/>
+      </w:r>
+    </w:p>
+    <w:p>
+      <w:pPr>
+        <w:spacing w:line="480" w:lineRule="auto"/>
+      </w:pPr>
+    </w:p>
+    <w:p>
+      <w:pPr>
+        <w:spacing w:line="480" w:lineRule="auto"/>
         <w:ind w:left="720"/>
-        <w:rPr>
-          <w:lang w:val="en-CA"/>
-        </w:rPr>
-      </w:pPr>
-      <w:r>
-        <w:rPr>
-          <w:lang w:val="en-CA"/>
-        </w:rPr>
-        <w:t xml:space="preserve">Chen, L., Lu, K., Rajeswaran, A., Lee, K., Grover, A., Laskin, M., </w:t>
-      </w:r>
-      <w:proofErr w:type="spellStart"/>
-      <w:r>
-        <w:rPr>
-          <w:lang w:val="en-CA"/>
-        </w:rPr>
-        <w:t>Abbeel</w:t>
-      </w:r>
-      <w:proofErr w:type="spellEnd"/>
-      <w:r>
-        <w:rPr>
-          <w:lang w:val="en-CA"/>
-        </w:rPr>
-        <w:t xml:space="preserve">, P., Srinivas, A., &amp; </w:t>
-      </w:r>
-      <w:proofErr w:type="spellStart"/>
-      <w:r>
-        <w:rPr>
-          <w:lang w:val="en-CA"/>
-        </w:rPr>
-        <w:t>Mordatch</w:t>
-      </w:r>
-      <w:proofErr w:type="spellEnd"/>
-      <w:r>
-        <w:rPr>
-          <w:lang w:val="en-CA"/>
-        </w:rPr>
-        <w:t xml:space="preserve">, I. (2021). </w:t>
+      </w:pPr>
+      <w:r>
+        <w:t xml:space="preserve">Ghosh, R., Adhikary, J., &amp; Chemlal, R. (2024). </w:t>
       </w:r>
       <w:r>
         <w:rPr>
           <w:i/>
           <w:iCs/>
-          <w:lang w:val="en-CA"/>
-        </w:rPr>
-        <w:t>Decision transformer: Reinforcement learning via sequence modeling</w:t>
-      </w:r>
-      <w:r>
-        <w:rPr>
-          <w:lang w:val="en-CA"/>
-        </w:rPr>
+        </w:rPr>
+        <w:t>Fire spread modeling using probabilistic cellular automata</w:t>
+      </w:r>
+      <w:r>
         <w:t xml:space="preserve">. </w:t>
       </w:r>
       <w:proofErr w:type="spellStart"/>
       <w:r>
-        <w:rPr>
-          <w:lang w:val="en-CA"/>
-        </w:rPr>
         <w:t>arXiv</w:t>
       </w:r>
       <w:proofErr w:type="spellEnd"/>
       <w:r>
-        <w:rPr>
-          <w:lang w:val="en-CA"/>
-        </w:rPr>
-        <w:t>. https://doi.org/10.48550/arXiv.2106.01345</w:t>
-      </w:r>
-    </w:p>
-    <w:p>
-      <w:pPr>
-        <w:spacing w:line="480" w:lineRule="auto"/>
-      </w:pPr>
-    </w:p>
-    <w:p>
-      <w:pPr>
-        <w:spacing w:line="480" w:lineRule="auto"/>
-        <w:ind w:left="720"/>
-      </w:pPr>
-      <w:r>
-        <w:t xml:space="preserve">Ghosh, R., Adhikary, J., &amp; Chemlal, R. (2024). </w:t>
-      </w:r>
-      <w:r>
-        <w:rPr>
-          <w:i/>
-          <w:iCs/>
-        </w:rPr>
-        <w:t>Fire spread modeling using probabilistic cellular automata</w:t>
-      </w:r>
-      <w:r>
         <w:t xml:space="preserve">. </w:t>
       </w:r>
-      <w:proofErr w:type="spellStart"/>
-      <w:r>
-        <w:t>arXiv</w:t>
-      </w:r>
-      <w:proofErr w:type="spellEnd"/>
-      <w:r>
-        <w:t xml:space="preserve">. </w:t>
-      </w:r>
-      <w:hyperlink r:id="rId13" w:tgtFrame="_blank" w:history="1">
+      <w:hyperlink r:id="rId12" w:tgtFrame="_blank" w:history="1">
         <w:r>
           <w:rPr>
             <w:rStyle w:val="Hyperlink"/>
@@ -1369,7 +1236,7 @@
       <w:r>
         <w:t xml:space="preserve">. </w:t>
       </w:r>
-      <w:hyperlink r:id="rId14" w:tgtFrame="_blank" w:history="1">
+      <w:hyperlink r:id="rId13" w:tgtFrame="_blank" w:history="1">
         <w:r>
           <w:rPr>
             <w:rStyle w:val="Hyperlink"/>
@@ -1412,7 +1279,7 @@
       <w:r>
         <w:t xml:space="preserve">(1), 256–259. </w:t>
       </w:r>
-      <w:hyperlink r:id="rId15" w:tgtFrame="_blank" w:history="1">
+      <w:hyperlink r:id="rId14" w:tgtFrame="_blank" w:history="1">
         <w:r>
           <w:rPr>
             <w:rStyle w:val="Hyperlink"/>
@@ -1453,7 +1320,7 @@
       <w:r>
         <w:t xml:space="preserve"> (NASA SP-2009-4544; Monographs in Aerospace History, No. 44). National Aeronautics and Space Administration. </w:t>
       </w:r>
-      <w:hyperlink r:id="rId16" w:tgtFrame="_blank" w:history="1">
+      <w:hyperlink r:id="rId15" w:tgtFrame="_blank" w:history="1">
         <w:r>
           <w:rPr>
             <w:rStyle w:val="Hyperlink"/>
@@ -1494,7 +1361,7 @@
       <w:r>
         <w:t xml:space="preserve">. </w:t>
       </w:r>
-      <w:hyperlink r:id="rId17" w:tgtFrame="_blank" w:history="1">
+      <w:hyperlink r:id="rId16" w:tgtFrame="_blank" w:history="1">
         <w:r>
           <w:rPr>
             <w:rStyle w:val="Hyperlink"/>
@@ -1518,6 +1385,7 @@
         <w:rPr>
           <w:lang w:val="en-CA"/>
         </w:rPr>
+        <w:lastRenderedPageBreak/>
         <w:t xml:space="preserve">Ronneberger, O., Fischer, P., &amp; Brox, T. (2015). U-Net: Convolutional networks for biomedical image segmentation. </w:t>
       </w:r>
       <w:proofErr w:type="spellStart"/>
@@ -1536,7 +1404,7 @@
         </w:rPr>
         <w:t xml:space="preserve">. </w:t>
       </w:r>
-      <w:hyperlink r:id="rId18" w:tgtFrame="_blank" w:history="1">
+      <w:hyperlink r:id="rId17" w:tgtFrame="_blank" w:history="1">
         <w:r>
           <w:rPr>
             <w:rStyle w:val="Hyperlink"/>
@@ -1581,7 +1449,7 @@
       <w:r>
         <w:t xml:space="preserve">. </w:t>
       </w:r>
-      <w:hyperlink r:id="rId19" w:tgtFrame="_blank" w:history="1">
+      <w:hyperlink r:id="rId18" w:tgtFrame="_blank" w:history="1">
         <w:r>
           <w:rPr>
             <w:rStyle w:val="Hyperlink"/>
@@ -1597,9 +1465,9 @@
       </w:pPr>
     </w:p>
     <w:sectPr>
-      <w:headerReference w:type="even" r:id="rId20"/>
-      <w:headerReference w:type="default" r:id="rId21"/>
-      <w:headerReference w:type="first" r:id="rId22"/>
+      <w:headerReference w:type="even" r:id="rId19"/>
+      <w:headerReference w:type="default" r:id="rId20"/>
+      <w:headerReference w:type="first" r:id="rId21"/>
       <w:pgSz w:w="12240" w:h="15840"/>
       <w:pgMar w:top="1440" w:right="1440" w:bottom="1440" w:left="1440" w:header="720" w:footer="1440" w:gutter="0"/>
       <w:pgNumType w:start="1"/>
@@ -2518,6 +2386,7 @@
   <w:style w:type="character" w:default="1" w:styleId="DefaultParagraphFont">
     <w:name w:val="Default Paragraph Font"/>
     <w:uiPriority w:val="1"/>
+    <w:semiHidden/>
     <w:unhideWhenUsed/>
   </w:style>
   <w:style w:type="table" w:default="1" w:styleId="TableNormal">

</xml_diff>

<commit_message>
(update): working on the agentic workflow
</commit_message>
<xml_diff>
--- a/Reflective_Synthesis_Paper.docx
+++ b/Reflective_Synthesis_Paper.docx
@@ -406,21 +406,12 @@
         </w:numPr>
         <w:spacing w:line="480" w:lineRule="auto"/>
       </w:pPr>
-      <w:proofErr w:type="spellStart"/>
       <w:r>
         <w:rPr>
           <w:b/>
           <w:bCs/>
         </w:rPr>
-        <w:t>UNet</w:t>
-      </w:r>
-      <w:proofErr w:type="spellEnd"/>
-      <w:r>
-        <w:rPr>
-          <w:b/>
-          <w:bCs/>
-        </w:rPr>
-        <w:t xml:space="preserve"> Architecture:</w:t>
+        <w:t>UNet Architecture:</w:t>
       </w:r>
       <w:r>
         <w:t xml:space="preserve"> Figure </w:t>
@@ -429,31 +420,7 @@
         <w:t>3</w:t>
       </w:r>
       <w:r>
-        <w:t xml:space="preserve"> shows our modified </w:t>
-      </w:r>
-      <w:proofErr w:type="spellStart"/>
-      <w:r>
-        <w:t>UNet</w:t>
-      </w:r>
-      <w:proofErr w:type="spellEnd"/>
-      <w:r>
-        <w:t xml:space="preserve"> Architecture. We made two changes to this architecture: First, we made it smaller. Experiments in Project 4 suggested that for a binary classification problem we don’t need quite so many parameters on the two “walls” of the </w:t>
-      </w:r>
-      <w:proofErr w:type="spellStart"/>
-      <w:r>
-        <w:t>UNet</w:t>
-      </w:r>
-      <w:proofErr w:type="spellEnd"/>
-      <w:r>
-        <w:t xml:space="preserve">. Second, we changed the bridge between the down sample and up sample stage to be a series of convolutions with 3x3 kernels instead of the standard 1x1kernel. This change was done to help the network “predict” where the fire would be next, instead of simply copying the fire’s starting location as was happening when experimentation was first started. Resulting outputs from the modified </w:t>
-      </w:r>
-      <w:proofErr w:type="spellStart"/>
-      <w:r>
-        <w:t>UNet</w:t>
-      </w:r>
-      <w:proofErr w:type="spellEnd"/>
-      <w:r>
-        <w:t xml:space="preserve"> can be seen in figure </w:t>
+        <w:t xml:space="preserve"> shows our modified UNet Architecture. We made two changes to this architecture: First, we made it smaller. Experiments in Project 4 suggested that for a binary classification problem we don’t need quite so many parameters on the two “walls” of the UNet. Second, we changed the bridge between the down sample and up sample stage to be a series of convolutions with 3x3 kernels instead of the standard 1x1kernel. This change was done to help the network “predict” where the fire would be next, instead of simply copying the fire’s starting location as was happening when experimentation was first started. Resulting outputs from the modified UNet can be seen in figure </w:t>
       </w:r>
       <w:r>
         <w:t>4.</w:t>
@@ -474,25 +441,31 @@
           <w:bCs/>
         </w:rPr>
         <w:lastRenderedPageBreak/>
-        <w:t>UAV Dispatch Control:</w:t>
-      </w:r>
-      <w:r>
-        <w:t xml:space="preserve"> Given a set of priorities (protecting people, protecting property, protecting trees for example) we needed to be able to allocate and control a collection of UAVs in a simulated environment. To this end we developed an RL agent using </w:t>
-      </w:r>
-      <w:r>
-        <w:t>Iterated Q-Learning powered by a Support Vector Machine (REFERENCE)</w:t>
-      </w:r>
-      <w:r>
-        <w:rPr>
-          <w:lang w:val="en-CA"/>
-        </w:rPr>
-        <w:t>. Use of SVM was demonstrated in a different context for Project 3.</w:t>
-      </w:r>
-      <w:r>
-        <w:rPr>
-          <w:lang w:val="en-CA"/>
-        </w:rPr>
-        <w:t xml:space="preserve"> We have two primary components here:</w:t>
+        <w:t>UAVs</w:t>
+      </w:r>
+      <w:r>
+        <w:t>:</w:t>
+      </w:r>
+      <w:r>
+        <w:t xml:space="preserve"> We used Reinforcement Learning, powered by a Support Vector Machine (SVM) to train our UAVs. Policies for the agents were learning using Q-Learning (</w:t>
+      </w:r>
+      <w:r>
+        <w:t>Watkins</w:t>
+      </w:r>
+      <w:r>
+        <w:t xml:space="preserve"> 1992</w:t>
+      </w:r>
+      <w:r>
+        <w:t>). Data to support this was developed using a Monte-Carlo approach.</w:t>
+      </w:r>
+      <w:r>
+        <w:t xml:space="preserve"> We use the best policy we have combined with a parameter to adjust the probability of exploration epsilon. Each round of training, we reduce epsilon by a constant amount. Estimates for the Q-Value are obtained via an SVM regressor. Using this method w</w:t>
+      </w:r>
+      <w:r>
+        <w:t>e trained three different RL Agents, one agent per task that is supported by simulation.</w:t>
+      </w:r>
+      <w:r>
+        <w:t xml:space="preserve"> </w:t>
       </w:r>
     </w:p>
     <w:p>
@@ -509,16 +482,16 @@
           <w:b/>
           <w:bCs/>
         </w:rPr>
-        <w:t>UAV:</w:t>
-      </w:r>
-      <w:r>
-        <w:t xml:space="preserve"> We simulate UAV’s here as aerial drones that accept waypoints and perform a basic task. Control of the UAVs is based on (</w:t>
-      </w:r>
-      <w:r>
-        <w:t>Julian</w:t>
-      </w:r>
-      <w:r>
-        <w:t xml:space="preserve"> 2018) as well as an abstracted version of the communications strategy outlined in (Merlin 2009). We assume a limited number of UAVs are available. We split the UAVs into two categories: Surveillance drones that provide real time fire tracking information, and Control Drones that provide fight extinguishing capabilities.</w:t>
+        <w:t>UAV Design</w:t>
+      </w:r>
+      <w:r>
+        <w:t>:</w:t>
+      </w:r>
+      <w:r>
+        <w:t xml:space="preserve"> The UAVs themselves were inspired by (Merlin 2009). They are autonomous vehicles that can communicate with a central command. Each UAV has three actions: bank left, bank right, and go straight. We augment the original Merlin design by allowing them to also extinguish fires and perform rescue operations.  All UAVs operate in three stages: 1. They use deterministic navigation to reach an assigned location. 2. An RL Agent is used to guide the UAV to completing its task (Fire Recon, Fire Fighting, Search and Rescue). 3. When fuel reaches zero</w:t>
+      </w:r>
+      <w:r>
+        <w:t xml:space="preserve">, the agent is deterministically sent back to home base to refuel. </w:t>
       </w:r>
     </w:p>
     <w:p>
@@ -535,26 +508,84 @@
           <w:b/>
           <w:bCs/>
         </w:rPr>
-        <w:t xml:space="preserve">RL Agent: </w:t>
+        <w:t>Reward Function Design</w:t>
+      </w:r>
+      <w:r>
+        <w:t>:</w:t>
+      </w:r>
+      <w:r>
+        <w:t xml:space="preserve"> Based on the framework suggested by (</w:t>
+      </w:r>
+      <w:r>
+        <w:t>Yu</w:t>
+      </w:r>
+      <w:r>
+        <w:t xml:space="preserve"> 2025) we built our reward functions with two parts: A goal based sub-reward function that rewards the agent to achieving its goals (the extrinsic part of the reward function) and a behavioral part of the reward function that penalizes the agent for being inefficient (the intrinsic part of the reward function). The </w:t>
+      </w:r>
+      <w:r>
+        <w:lastRenderedPageBreak/>
+        <w:t>penalty remained the same for each agent. The reward functions for each UAV are listed below:</w:t>
       </w:r>
     </w:p>
     <w:p>
       <w:pPr>
         <w:pStyle w:val="ListParagraph"/>
         <w:numPr>
-          <w:ilvl w:val="0"/>
+          <w:ilvl w:val="2"/>
           <w:numId w:val="1"/>
         </w:numPr>
         <w:spacing w:line="480" w:lineRule="auto"/>
       </w:pPr>
       <w:r>
-        <w:t xml:space="preserve">Command Workflow: </w:t>
-      </w:r>
-    </w:p>
-    <w:p>
-      <w:pPr>
-        <w:spacing w:line="480" w:lineRule="auto"/>
-      </w:pPr>
+        <w:rPr>
+          <w:b/>
+          <w:bCs/>
+        </w:rPr>
+        <w:t>Recon Agent</w:t>
+      </w:r>
+      <w:r>
+        <w:t>:</w:t>
+      </w:r>
+    </w:p>
+    <w:p>
+      <w:pPr>
+        <w:pStyle w:val="ListParagraph"/>
+        <w:numPr>
+          <w:ilvl w:val="2"/>
+          <w:numId w:val="1"/>
+        </w:numPr>
+        <w:spacing w:line="480" w:lineRule="auto"/>
+      </w:pPr>
+      <w:r>
+        <w:rPr>
+          <w:b/>
+          <w:bCs/>
+        </w:rPr>
+        <w:t>Extinguisher Agent</w:t>
+      </w:r>
+      <w:r>
+        <w:t>:</w:t>
+      </w:r>
+    </w:p>
+    <w:p>
+      <w:pPr>
+        <w:pStyle w:val="ListParagraph"/>
+        <w:numPr>
+          <w:ilvl w:val="2"/>
+          <w:numId w:val="1"/>
+        </w:numPr>
+        <w:spacing w:line="480" w:lineRule="auto"/>
+      </w:pPr>
+      <w:r>
+        <w:rPr>
+          <w:b/>
+          <w:bCs/>
+        </w:rPr>
+        <w:t>Rescue Agent</w:t>
+      </w:r>
+      <w:r>
+        <w:t>:</w:t>
+      </w:r>
     </w:p>
     <w:p>
       <w:pPr>
@@ -803,23 +834,7 @@
         </w:r>
       </w:fldSimple>
       <w:r>
-        <w:t xml:space="preserve"> Modified </w:t>
-      </w:r>
-      <w:proofErr w:type="spellStart"/>
-      <w:r>
-        <w:t>UNet</w:t>
-      </w:r>
-      <w:proofErr w:type="spellEnd"/>
-      <w:r>
-        <w:t xml:space="preserve"> (image generated with assistance of Gemini AI Model based on authors </w:t>
-      </w:r>
-      <w:proofErr w:type="spellStart"/>
-      <w:r>
-        <w:t>UNet</w:t>
-      </w:r>
-      <w:proofErr w:type="spellEnd"/>
-      <w:r>
-        <w:t xml:space="preserve"> code)</w:t>
+        <w:t xml:space="preserve"> Modified UNet (image generated with assistance of Gemini AI Model based on authors UNet code)</w:t>
       </w:r>
     </w:p>
     <w:p/>
@@ -910,6 +925,65 @@
     </w:p>
     <w:p>
       <w:pPr>
+        <w:keepNext/>
+        <w:spacing w:line="480" w:lineRule="auto"/>
+      </w:pPr>
+      <w:r>
+        <w:rPr>
+          <w:noProof/>
+        </w:rPr>
+        <w:drawing>
+          <wp:inline distT="0" distB="0" distL="0" distR="0" wp14:anchorId="76D4C277" wp14:editId="777D23BA">
+            <wp:extent cx="5937250" cy="5549900"/>
+            <wp:effectExtent l="0" t="0" r="6350" b="0"/>
+            <wp:docPr id="1715014003" name="Picture 4"/>
+            <wp:cNvGraphicFramePr>
+              <a:graphicFrameLocks xmlns:a="http://schemas.openxmlformats.org/drawingml/2006/main" noChangeAspect="1"/>
+            </wp:cNvGraphicFramePr>
+            <a:graphic xmlns:a="http://schemas.openxmlformats.org/drawingml/2006/main">
+              <a:graphicData uri="http://schemas.openxmlformats.org/drawingml/2006/picture">
+                <pic:pic xmlns:pic="http://schemas.openxmlformats.org/drawingml/2006/picture">
+                  <pic:nvPicPr>
+                    <pic:cNvPr id="0" name="Picture 4"/>
+                    <pic:cNvPicPr>
+                      <a:picLocks noChangeAspect="1" noChangeArrowheads="1"/>
+                    </pic:cNvPicPr>
+                  </pic:nvPicPr>
+                  <pic:blipFill>
+                    <a:blip r:embed="rId12">
+                      <a:extLst>
+                        <a:ext uri="{28A0092B-C50C-407E-A947-70E740481C1C}">
+                          <a14:useLocalDpi xmlns:a14="http://schemas.microsoft.com/office/drawing/2010/main" val="0"/>
+                        </a:ext>
+                      </a:extLst>
+                    </a:blip>
+                    <a:srcRect/>
+                    <a:stretch>
+                      <a:fillRect/>
+                    </a:stretch>
+                  </pic:blipFill>
+                  <pic:spPr bwMode="auto">
+                    <a:xfrm>
+                      <a:off x="0" y="0"/>
+                      <a:ext cx="5937250" cy="5549900"/>
+                    </a:xfrm>
+                    <a:prstGeom prst="rect">
+                      <a:avLst/>
+                    </a:prstGeom>
+                    <a:noFill/>
+                    <a:ln>
+                      <a:noFill/>
+                    </a:ln>
+                  </pic:spPr>
+                </pic:pic>
+              </a:graphicData>
+            </a:graphic>
+          </wp:inline>
+        </w:drawing>
+      </w:r>
+    </w:p>
+    <w:p>
+      <w:pPr>
         <w:pStyle w:val="Caption"/>
         <w:jc w:val="center"/>
       </w:pPr>
@@ -925,8 +999,14 @@
         </w:r>
       </w:fldSimple>
       <w:r>
-        <w:t xml:space="preserve"> System Architecture</w:t>
-      </w:r>
+        <w:t xml:space="preserve"> System Overview</w:t>
+      </w:r>
+    </w:p>
+    <w:p>
+      <w:pPr>
+        <w:keepNext/>
+        <w:spacing w:line="480" w:lineRule="auto"/>
+      </w:pPr>
     </w:p>
     <w:p>
       <w:pPr>
@@ -1185,17 +1265,9 @@
         <w:t>Fire spread modeling using probabilistic cellular automata</w:t>
       </w:r>
       <w:r>
-        <w:t xml:space="preserve">. </w:t>
-      </w:r>
-      <w:proofErr w:type="spellStart"/>
-      <w:r>
-        <w:t>arXiv</w:t>
-      </w:r>
-      <w:proofErr w:type="spellEnd"/>
-      <w:r>
-        <w:t xml:space="preserve">. </w:t>
-      </w:r>
-      <w:hyperlink r:id="rId12" w:tgtFrame="_blank" w:history="1">
+        <w:t xml:space="preserve">. arXiv. </w:t>
+      </w:r>
+      <w:hyperlink r:id="rId13" w:tgtFrame="_blank" w:history="1">
         <w:r>
           <w:rPr>
             <w:rStyle w:val="Hyperlink"/>
@@ -1226,17 +1298,9 @@
         <w:t>Distributed wildfire surveillance with autonomous aircraft using deep reinforcement learning</w:t>
       </w:r>
       <w:r>
-        <w:t xml:space="preserve">. </w:t>
-      </w:r>
-      <w:proofErr w:type="spellStart"/>
-      <w:r>
-        <w:t>arXiv</w:t>
-      </w:r>
-      <w:proofErr w:type="spellEnd"/>
-      <w:r>
-        <w:t xml:space="preserve">. </w:t>
-      </w:r>
-      <w:hyperlink r:id="rId13" w:tgtFrame="_blank" w:history="1">
+        <w:t xml:space="preserve">. arXiv. </w:t>
+      </w:r>
+      <w:hyperlink r:id="rId14" w:tgtFrame="_blank" w:history="1">
         <w:r>
           <w:rPr>
             <w:rStyle w:val="Hyperlink"/>
@@ -1279,7 +1343,7 @@
       <w:r>
         <w:t xml:space="preserve">(1), 256–259. </w:t>
       </w:r>
-      <w:hyperlink r:id="rId14" w:tgtFrame="_blank" w:history="1">
+      <w:hyperlink r:id="rId15" w:tgtFrame="_blank" w:history="1">
         <w:r>
           <w:rPr>
             <w:rStyle w:val="Hyperlink"/>
@@ -1301,26 +1365,17 @@
       <w:r>
         <w:t xml:space="preserve">Merlin, P. W. (2009). </w:t>
       </w:r>
-      <w:proofErr w:type="spellStart"/>
       <w:r>
         <w:rPr>
           <w:i/>
           <w:iCs/>
         </w:rPr>
-        <w:t>Ikhana</w:t>
-      </w:r>
-      <w:proofErr w:type="spellEnd"/>
-      <w:r>
-        <w:rPr>
-          <w:i/>
-          <w:iCs/>
-        </w:rPr>
-        <w:t xml:space="preserve"> Unmanned Aircraft System: Western States fire missions</w:t>
+        <w:t>Ikhana Unmanned Aircraft System: Western States fire missions</w:t>
       </w:r>
       <w:r>
         <w:t xml:space="preserve"> (NASA SP-2009-4544; Monographs in Aerospace History, No. 44). National Aeronautics and Space Administration. </w:t>
       </w:r>
-      <w:hyperlink r:id="rId15" w:tgtFrame="_blank" w:history="1">
+      <w:hyperlink r:id="rId16" w:tgtFrame="_blank" w:history="1">
         <w:r>
           <w:rPr>
             <w:rStyle w:val="Hyperlink"/>
@@ -1351,17 +1406,9 @@
         <w:t>Wildfire autonomous response and prediction using cellular automata (WARP-CA)</w:t>
       </w:r>
       <w:r>
-        <w:t xml:space="preserve">. </w:t>
-      </w:r>
-      <w:proofErr w:type="spellStart"/>
-      <w:r>
-        <w:t>arXiv</w:t>
-      </w:r>
-      <w:proofErr w:type="spellEnd"/>
-      <w:r>
-        <w:t xml:space="preserve">. </w:t>
-      </w:r>
-      <w:hyperlink r:id="rId16" w:tgtFrame="_blank" w:history="1">
+        <w:t xml:space="preserve">. arXiv. </w:t>
+      </w:r>
+      <w:hyperlink r:id="rId17" w:tgtFrame="_blank" w:history="1">
         <w:r>
           <w:rPr>
             <w:rStyle w:val="Hyperlink"/>
@@ -1388,7 +1435,6 @@
         <w:lastRenderedPageBreak/>
         <w:t xml:space="preserve">Ronneberger, O., Fischer, P., &amp; Brox, T. (2015). U-Net: Convolutional networks for biomedical image segmentation. </w:t>
       </w:r>
-      <w:proofErr w:type="spellStart"/>
       <w:r>
         <w:rPr>
           <w:i/>
@@ -1397,14 +1443,13 @@
         </w:rPr>
         <w:t>arXiv</w:t>
       </w:r>
-      <w:proofErr w:type="spellEnd"/>
       <w:r>
         <w:rPr>
           <w:lang w:val="en-CA"/>
         </w:rPr>
         <w:t xml:space="preserve">. </w:t>
       </w:r>
-      <w:hyperlink r:id="rId17" w:tgtFrame="_blank" w:history="1">
+      <w:hyperlink r:id="rId18" w:tgtFrame="_blank" w:history="1">
         <w:r>
           <w:rPr>
             <w:rStyle w:val="Hyperlink"/>
@@ -1417,16 +1462,12 @@
     <w:p>
       <w:pPr>
         <w:spacing w:line="480" w:lineRule="auto"/>
+      </w:pPr>
+    </w:p>
+    <w:p>
+      <w:pPr>
+        <w:spacing w:line="480" w:lineRule="auto"/>
         <w:ind w:left="720"/>
-      </w:pPr>
-    </w:p>
-    <w:p>
-      <w:pPr>
-        <w:spacing w:line="480" w:lineRule="auto"/>
-        <w:ind w:left="720"/>
-        <w:rPr>
-          <w:lang w:val="en-CA"/>
-        </w:rPr>
       </w:pPr>
       <w:r>
         <w:t xml:space="preserve">Yu, R., Wan, S., Wang, Y., Gao, C. X., Gan, L., Zhang, Z., &amp; Zhan, D. C. (2025). </w:t>
@@ -1439,17 +1480,9 @@
         <w:t>Reward models in deep reinforcement learning: A survey</w:t>
       </w:r>
       <w:r>
-        <w:t xml:space="preserve">. </w:t>
-      </w:r>
-      <w:proofErr w:type="spellStart"/>
-      <w:r>
-        <w:t>arXiv</w:t>
-      </w:r>
-      <w:proofErr w:type="spellEnd"/>
-      <w:r>
-        <w:t xml:space="preserve">. </w:t>
-      </w:r>
-      <w:hyperlink r:id="rId18" w:tgtFrame="_blank" w:history="1">
+        <w:t xml:space="preserve">. arXiv. </w:t>
+      </w:r>
+      <w:hyperlink r:id="rId19" w:tgtFrame="_blank" w:history="1">
         <w:r>
           <w:rPr>
             <w:rStyle w:val="Hyperlink"/>
@@ -1462,12 +1495,54 @@
       <w:pPr>
         <w:spacing w:line="480" w:lineRule="auto"/>
         <w:ind w:left="720"/>
-      </w:pPr>
+        <w:rPr>
+          <w:lang w:val="en-CA"/>
+        </w:rPr>
+      </w:pPr>
+    </w:p>
+    <w:p>
+      <w:pPr>
+        <w:spacing w:line="480" w:lineRule="auto"/>
+        <w:ind w:left="720"/>
+      </w:pPr>
+      <w:r>
+        <w:t>Watkins, C.J.C.H., Dayan, P. </w:t>
+      </w:r>
+      <w:r>
+        <w:rPr>
+          <w:i/>
+          <w:iCs/>
+        </w:rPr>
+        <w:t>Q</w:t>
+      </w:r>
+      <w:r>
+        <w:t>-learning. </w:t>
+      </w:r>
+      <w:r>
+        <w:rPr>
+          <w:i/>
+          <w:iCs/>
+        </w:rPr>
+        <w:t>Mach Learn</w:t>
+      </w:r>
+      <w:r>
+        <w:t> </w:t>
+      </w:r>
+      <w:r>
+        <w:rPr>
+          <w:b/>
+          <w:bCs/>
+        </w:rPr>
+        <w:t>8</w:t>
+      </w:r>
+      <w:r>
+        <w:t>, 279–292 (1992). https://doi.org/10.1007/BF00992698</w:t>
+      </w:r>
     </w:p>
     <w:sectPr>
-      <w:headerReference w:type="even" r:id="rId19"/>
-      <w:headerReference w:type="default" r:id="rId20"/>
-      <w:headerReference w:type="first" r:id="rId21"/>
+      <w:headerReference w:type="even" r:id="rId20"/>
+      <w:headerReference w:type="default" r:id="rId21"/>
+      <w:headerReference w:type="first" r:id="rId22"/>
       <w:pgSz w:w="12240" w:h="15840"/>
       <w:pgMar w:top="1440" w:right="1440" w:bottom="1440" w:left="1440" w:header="720" w:footer="1440" w:gutter="0"/>
       <w:pgNumType w:start="1"/>
@@ -1557,33 +1632,11 @@
         <w:t xml:space="preserve"> </w:t>
       </w:r>
       <w:hyperlink r:id="rId2" w:history="1">
-        <w:proofErr w:type="spellStart"/>
         <w:r>
           <w:rPr>
             <w:rStyle w:val="Hyperlink"/>
           </w:rPr>
-          <w:t>BCEWithLogitsLoss</w:t>
-        </w:r>
-        <w:proofErr w:type="spellEnd"/>
-        <w:r>
-          <w:rPr>
-            <w:rStyle w:val="Hyperlink"/>
-          </w:rPr>
-          <w:t xml:space="preserve"> — </w:t>
-        </w:r>
-        <w:proofErr w:type="spellStart"/>
-        <w:r>
-          <w:rPr>
-            <w:rStyle w:val="Hyperlink"/>
-          </w:rPr>
-          <w:t>PyTorch</w:t>
-        </w:r>
-        <w:proofErr w:type="spellEnd"/>
-        <w:r>
-          <w:rPr>
-            <w:rStyle w:val="Hyperlink"/>
-          </w:rPr>
-          <w:t xml:space="preserve"> 2.12 documentation</w:t>
+          <w:t>BCEWithLogitsLoss — PyTorch 2.12 documentation</w:t>
         </w:r>
       </w:hyperlink>
     </w:p>
@@ -2386,7 +2439,6 @@
   <w:style w:type="character" w:default="1" w:styleId="DefaultParagraphFont">
     <w:name w:val="Default Paragraph Font"/>
     <w:uiPriority w:val="1"/>
-    <w:semiHidden/>
     <w:unhideWhenUsed/>
   </w:style>
   <w:style w:type="table" w:default="1" w:styleId="TableNormal">

</xml_diff>

<commit_message>
(update): finished collecting example data
</commit_message>
<xml_diff>
--- a/Reflective_Synthesis_Paper.docx
+++ b/Reflective_Synthesis_Paper.docx
@@ -104,25 +104,22 @@
         <w:ind w:firstLine="720"/>
       </w:pPr>
       <w:r>
-        <w:t>Driven by climate change, wildfires have been increasing in both number and intensity</w:t>
-      </w:r>
-      <w:r>
-        <w:rPr>
-          <w:rStyle w:val="FootnoteReference"/>
-        </w:rPr>
-        <w:footnoteReference w:id="1"/>
-      </w:r>
-      <w:r>
-        <w:t xml:space="preserve">. As our planet continues to warm, this increase will put pressure on our ability to monitor and respond to wildfire incidents – leading to potential loss human life, animal life, and property damage. This project looks at how various techniques in Artificial Intelligence could be combined to create a Semi-Autonomous Wildfire Monitoring and Control Framework. </w:t>
-      </w:r>
-      <w:r>
-        <w:t xml:space="preserve"> We will look at a vertical slice of the problem – starting with Wildfire simulation, Risk Prediction (where will the fire spread next) Resource Allocation (how should we allocate a limited number of patrol / firefighting resources), and </w:t>
-      </w:r>
-      <w:r>
-        <w:t>long-term</w:t>
-      </w:r>
-      <w:r>
-        <w:t xml:space="preserve"> wildfire fighting strategies (which activities should we focus on first?)</w:t>
+        <w:t>CONTEXT</w:t>
+      </w:r>
+    </w:p>
+    <w:p>
+      <w:pPr>
+        <w:spacing w:line="480" w:lineRule="auto"/>
+        <w:jc w:val="center"/>
+        <w:rPr>
+          <w:b/>
+        </w:rPr>
+      </w:pPr>
+      <w:r>
+        <w:rPr>
+          <w:b/>
+        </w:rPr>
+        <w:t>Integration Rationale</w:t>
       </w:r>
     </w:p>
     <w:p>
@@ -130,6 +127,15 @@
         <w:spacing w:line="480" w:lineRule="auto"/>
         <w:ind w:firstLine="720"/>
       </w:pPr>
+      <w:r>
+        <w:t>The main body of your paper goes here, starting on page 3. (Or starting on page 2, if you’re not required to include an abstract.)</w:t>
+      </w:r>
+    </w:p>
+    <w:p>
+      <w:pPr>
+        <w:spacing w:line="480" w:lineRule="auto"/>
+        <w:ind w:firstLine="720"/>
+      </w:pPr>
     </w:p>
     <w:p>
       <w:pPr>
@@ -143,454 +149,16 @@
         <w:rPr>
           <w:b/>
         </w:rPr>
-        <w:t>Integration Rationale</w:t>
-      </w:r>
-    </w:p>
-    <w:p>
-      <w:pPr>
-        <w:spacing w:line="480" w:lineRule="auto"/>
-        <w:ind w:firstLine="720"/>
-      </w:pPr>
-      <w:r>
-        <w:t>The main body of your paper goes here, starting on page 3. (Or starting on page 2, if you’re not required to include an abstract.)</w:t>
-      </w:r>
-    </w:p>
-    <w:p>
-      <w:pPr>
-        <w:spacing w:line="480" w:lineRule="auto"/>
-        <w:ind w:firstLine="720"/>
-      </w:pPr>
-    </w:p>
-    <w:p>
-      <w:pPr>
-        <w:spacing w:line="480" w:lineRule="auto"/>
-        <w:jc w:val="center"/>
-        <w:rPr>
-          <w:b/>
-        </w:rPr>
-      </w:pPr>
-      <w:r>
-        <w:rPr>
-          <w:b/>
-        </w:rPr>
         <w:t>System Design and Technical Decisions</w:t>
       </w:r>
     </w:p>
     <w:p>
       <w:pPr>
         <w:spacing w:line="480" w:lineRule="auto"/>
-        <w:ind w:firstLine="720"/>
-      </w:pPr>
-      <w:r>
-        <w:t>We broke the problem down in three key components:</w:t>
-      </w:r>
-    </w:p>
-    <w:p>
-      <w:pPr>
-        <w:pStyle w:val="ListParagraph"/>
-        <w:numPr>
-          <w:ilvl w:val="0"/>
-          <w:numId w:val="1"/>
-        </w:numPr>
-        <w:spacing w:line="480" w:lineRule="auto"/>
-      </w:pPr>
-      <w:r>
-        <w:rPr>
-          <w:b/>
-          <w:bCs/>
-        </w:rPr>
-        <w:t>Environmental Simulation:</w:t>
-      </w:r>
-      <w:r>
-        <w:t xml:space="preserve"> To test the idea, we needed to simulate Wildfire Behavior.  </w:t>
-      </w:r>
-      <w:r>
-        <w:t>Based (</w:t>
-      </w:r>
-      <w:r>
-        <w:t>Ramadan</w:t>
-      </w:r>
-      <w:r>
-        <w:t xml:space="preserve"> 2024) and (</w:t>
-      </w:r>
-      <w:r>
-        <w:t>Ghosh</w:t>
-      </w:r>
-      <w:r>
-        <w:t xml:space="preserve"> 2024) we used a Stochastic Cellular Automata to simulate Wildfire propagation with some simplifying assumptions to fit </w:t>
-      </w:r>
-      <w:r>
-        <w:lastRenderedPageBreak/>
-        <w:t xml:space="preserve">our use case. (We do not simulate tree regrowth for example and trees aren’t going to have time to regrow in our timeline. </w:t>
-      </w:r>
-      <w:r>
-        <w:t xml:space="preserve">This was </w:t>
-      </w:r>
-      <w:r>
-        <w:t>broken</w:t>
-      </w:r>
-      <w:r>
-        <w:t xml:space="preserve"> into the following steps:</w:t>
-      </w:r>
-    </w:p>
-    <w:p>
-      <w:pPr>
-        <w:pStyle w:val="ListParagraph"/>
-        <w:numPr>
-          <w:ilvl w:val="1"/>
-          <w:numId w:val="1"/>
-        </w:numPr>
-        <w:spacing w:line="480" w:lineRule="auto"/>
-      </w:pPr>
-      <w:r>
-        <w:rPr>
-          <w:b/>
-          <w:bCs/>
-        </w:rPr>
-        <w:t>Terrain Generation</w:t>
-      </w:r>
-      <w:r>
-        <w:rPr>
-          <w:i/>
-          <w:iCs/>
-        </w:rPr>
-        <w:t>:</w:t>
-      </w:r>
-      <w:r>
-        <w:t xml:space="preserve"> Following</w:t>
-      </w:r>
-      <w:r>
-        <w:t xml:space="preserve"> ideas found in</w:t>
-      </w:r>
-      <w:r>
-        <w:t xml:space="preserve"> </w:t>
-      </w:r>
-      <w:r>
-        <w:t>(</w:t>
-      </w:r>
-      <w:r>
-        <w:t>Kamble 2025) we used Perlin Noise to generate plausible forest terrain maps. We expanded on the 2024 approach by adding additional features for Rural houses and urban areas. Rural housing is assumed to be “flammable” in this model, while urban is not. Other features we generated were small bodies of water, simple grassland, brush, and dense forest. Each flammable source was given a different amount of “fuel” it could burn as well as adjusted probability of ignition.</w:t>
-      </w:r>
-    </w:p>
-    <w:p>
-      <w:pPr>
-        <w:pStyle w:val="ListParagraph"/>
-        <w:numPr>
-          <w:ilvl w:val="1"/>
-          <w:numId w:val="1"/>
-        </w:numPr>
-        <w:spacing w:line="480" w:lineRule="auto"/>
-      </w:pPr>
-      <w:r>
-        <w:rPr>
-          <w:b/>
-          <w:bCs/>
-        </w:rPr>
-        <w:t>Wind Generation</w:t>
-      </w:r>
-      <w:r>
-        <w:rPr>
-          <w:i/>
-          <w:iCs/>
-        </w:rPr>
-        <w:t>:</w:t>
-      </w:r>
-      <w:r>
-        <w:t xml:space="preserve"> To simplify the simulation, we assumed that Wind would remain static throughout the simulation. We used Perlin Noise to generate a vector field of wind directions.</w:t>
-      </w:r>
-    </w:p>
-    <w:p>
-      <w:pPr>
-        <w:pStyle w:val="ListParagraph"/>
-        <w:numPr>
-          <w:ilvl w:val="1"/>
-          <w:numId w:val="1"/>
-        </w:numPr>
-        <w:spacing w:line="480" w:lineRule="auto"/>
-      </w:pPr>
-      <w:r>
-        <w:rPr>
-          <w:b/>
-          <w:bCs/>
-        </w:rPr>
-        <w:t>Human Agents</w:t>
-      </w:r>
-      <w:r>
-        <w:rPr>
-          <w:i/>
-          <w:iCs/>
-        </w:rPr>
-        <w:t>:</w:t>
-      </w:r>
-      <w:r>
-        <w:t xml:space="preserve"> A missing component in both Ramadan 2024 and Ghosh 2024 is the presence of humans in the path of the wildfire. We added a small number of humans to our simulation to provide a conflicting set of priorities to the system. Humans are simulated as stochastic agents who are either doing a random walk through the forest, or “camping” at inopportune spots.</w:t>
-      </w:r>
-    </w:p>
-    <w:p>
-      <w:pPr>
-        <w:pStyle w:val="ListParagraph"/>
-        <w:numPr>
-          <w:ilvl w:val="0"/>
-          <w:numId w:val="1"/>
-        </w:numPr>
-        <w:spacing w:line="480" w:lineRule="auto"/>
-      </w:pPr>
-      <w:r>
-        <w:rPr>
-          <w:b/>
-          <w:bCs/>
-        </w:rPr>
-        <w:t>Risk Prediction:</w:t>
-      </w:r>
-      <w:r>
-        <w:t xml:space="preserve"> This system serves as an intermediary to the final Command Workflow system. Here we use a deep neural network to attempt to predict where the fire will be next. The purpose of this is to provide the planning system with a guideline on where to focus its firefighting efforts. For example, if the areas at risk include known human locations and known rural locations, which one should the planner prioritize? We attempt to perform Risk Prediction using semantic </w:t>
-      </w:r>
-      <w:r>
-        <w:lastRenderedPageBreak/>
-        <w:t>segmentation (see project 4). Here the base image is a snapshot of the simulation at random point, while the mask is a binary image where pixels are marked “safe” (they will not be in the fires path after 20 iterations) or Risky (they will be in the fires path after 20 iterations). 5000 example image/mask pairs were generated</w:t>
-      </w:r>
-      <w:r>
-        <w:t xml:space="preserve">. </w:t>
-      </w:r>
-    </w:p>
-    <w:p>
-      <w:pPr>
-        <w:pStyle w:val="ListParagraph"/>
-        <w:numPr>
-          <w:ilvl w:val="1"/>
-          <w:numId w:val="1"/>
-        </w:numPr>
-        <w:spacing w:line="480" w:lineRule="auto"/>
-      </w:pPr>
-      <w:r>
-        <w:rPr>
-          <w:b/>
-          <w:bCs/>
-        </w:rPr>
-        <w:t>Loss Function:</w:t>
-      </w:r>
-      <w:r>
-        <w:t xml:space="preserve"> The challenge here was to devise a loss function that could handle the class imbalance between safe and risky cells. To solve this, we mixed a Binary Classification Entropy</w:t>
-      </w:r>
-      <w:r>
-        <w:rPr>
-          <w:rStyle w:val="FootnoteReference"/>
-        </w:rPr>
-        <w:footnoteReference w:id="2"/>
-      </w:r>
-      <w:r>
-        <w:t xml:space="preserve"> </w:t>
-      </w:r>
-      <w:r>
-        <w:t>(BCE) loss function with the Dice Loss</w:t>
-      </w:r>
-      <w:r>
-        <w:rPr>
-          <w:rStyle w:val="FootnoteReference"/>
-        </w:rPr>
-        <w:footnoteReference w:id="3"/>
-      </w:r>
-      <w:r>
-        <w:t xml:space="preserve"> function. Our final loss function was the average of the sum of these functions.</w:t>
-      </w:r>
-      <w:r>
-        <w:t xml:space="preserve"> The idea here is that the BCE will help mitigate the effects of class imbalance on the standard Dice Loss used for semantic segmentation problems.</w:t>
-      </w:r>
-    </w:p>
-    <w:p>
-      <w:pPr>
-        <w:pStyle w:val="ListParagraph"/>
-        <w:numPr>
-          <w:ilvl w:val="1"/>
-          <w:numId w:val="1"/>
-        </w:numPr>
-        <w:spacing w:line="480" w:lineRule="auto"/>
-      </w:pPr>
-      <w:r>
-        <w:rPr>
-          <w:b/>
-          <w:bCs/>
-        </w:rPr>
-        <w:t>UNet Architecture:</w:t>
-      </w:r>
-      <w:r>
-        <w:t xml:space="preserve"> Figure </w:t>
-      </w:r>
-      <w:r>
-        <w:t>3</w:t>
-      </w:r>
-      <w:r>
-        <w:t xml:space="preserve"> shows our modified UNet Architecture. We made two changes to this architecture: First, we made it smaller. Experiments in Project 4 suggested that for a binary classification problem we don’t need quite so many parameters on the two “walls” of the UNet. Second, we changed the bridge between the down sample and up sample stage to be a series of convolutions with 3x3 kernels instead of the standard 1x1kernel. This change was done to help the network “predict” where the fire would be next, instead of simply copying the fire’s starting location as was happening when experimentation was first started. Resulting outputs from the modified UNet can be seen in figure </w:t>
-      </w:r>
-      <w:r>
-        <w:t>4.</w:t>
-      </w:r>
-    </w:p>
-    <w:p>
-      <w:pPr>
-        <w:pStyle w:val="ListParagraph"/>
-        <w:numPr>
-          <w:ilvl w:val="0"/>
-          <w:numId w:val="1"/>
-        </w:numPr>
-        <w:spacing w:line="480" w:lineRule="auto"/>
-      </w:pPr>
-      <w:r>
-        <w:rPr>
-          <w:b/>
-          <w:bCs/>
-        </w:rPr>
-        <w:lastRenderedPageBreak/>
-        <w:t>UAVs</w:t>
-      </w:r>
-      <w:r>
-        <w:t>:</w:t>
-      </w:r>
-      <w:r>
-        <w:t xml:space="preserve"> We used Reinforcement Learning, powered by a Support Vector Machine (SVM) to train our UAVs. Policies for the agents were learning using Q-Learning (</w:t>
-      </w:r>
-      <w:r>
-        <w:t>Watkins</w:t>
-      </w:r>
-      <w:r>
-        <w:t xml:space="preserve"> 1992</w:t>
-      </w:r>
-      <w:r>
-        <w:t>). Data to support this was developed using a Monte-Carlo approach.</w:t>
-      </w:r>
-      <w:r>
-        <w:t xml:space="preserve"> We use the best policy we have combined with a parameter to adjust the probability of exploration epsilon. Each round of training, we reduce epsilon by a constant amount. Estimates for the Q-Value are obtained via an SVM regressor. Using this method w</w:t>
-      </w:r>
-      <w:r>
-        <w:t>e trained three different RL Agents, one agent per task that is supported by simulation.</w:t>
-      </w:r>
-      <w:r>
-        <w:t xml:space="preserve"> </w:t>
-      </w:r>
-    </w:p>
-    <w:p>
-      <w:pPr>
-        <w:pStyle w:val="ListParagraph"/>
-        <w:numPr>
-          <w:ilvl w:val="1"/>
-          <w:numId w:val="1"/>
-        </w:numPr>
-        <w:spacing w:line="480" w:lineRule="auto"/>
-      </w:pPr>
-      <w:r>
-        <w:rPr>
-          <w:b/>
-          <w:bCs/>
-        </w:rPr>
-        <w:t>UAV Design</w:t>
-      </w:r>
-      <w:r>
-        <w:t>:</w:t>
-      </w:r>
-      <w:r>
-        <w:t xml:space="preserve"> The UAVs themselves were inspired by (Merlin 2009). They are autonomous vehicles that can communicate with a central command. Each UAV has three actions: bank left, bank right, and go straight. We augment the original Merlin design by allowing them to also extinguish fires and perform rescue operations.  All UAVs operate in three stages: 1. They use deterministic navigation to reach an assigned location. 2. An RL Agent is used to guide the UAV to completing its task (Fire Recon, Fire Fighting, Search and Rescue). 3. When fuel reaches zero</w:t>
-      </w:r>
-      <w:r>
-        <w:t xml:space="preserve">, the agent is deterministically sent back to home base to refuel. </w:t>
-      </w:r>
-    </w:p>
-    <w:p>
-      <w:pPr>
-        <w:pStyle w:val="ListParagraph"/>
-        <w:numPr>
-          <w:ilvl w:val="1"/>
-          <w:numId w:val="1"/>
-        </w:numPr>
-        <w:spacing w:line="480" w:lineRule="auto"/>
-      </w:pPr>
-      <w:r>
-        <w:rPr>
-          <w:b/>
-          <w:bCs/>
-        </w:rPr>
-        <w:t>Reward Function Design</w:t>
-      </w:r>
-      <w:r>
-        <w:t>:</w:t>
-      </w:r>
-      <w:r>
-        <w:t xml:space="preserve"> Based on the framework suggested by (</w:t>
-      </w:r>
-      <w:r>
-        <w:t>Yu</w:t>
-      </w:r>
-      <w:r>
-        <w:t xml:space="preserve"> 2025) we built our reward functions with two parts: A goal based sub-reward function that rewards the agent to achieving its goals (the extrinsic part of the reward function) and a behavioral part of the reward function that penalizes the agent for being inefficient (the intrinsic part of the reward function). The </w:t>
-      </w:r>
-      <w:r>
-        <w:lastRenderedPageBreak/>
-        <w:t>penalty remained the same for each agent. The reward functions for each UAV are listed below:</w:t>
-      </w:r>
-    </w:p>
-    <w:p>
-      <w:pPr>
-        <w:pStyle w:val="ListParagraph"/>
-        <w:numPr>
-          <w:ilvl w:val="2"/>
-          <w:numId w:val="1"/>
-        </w:numPr>
-        <w:spacing w:line="480" w:lineRule="auto"/>
-      </w:pPr>
-      <w:r>
-        <w:rPr>
-          <w:b/>
-          <w:bCs/>
-        </w:rPr>
-        <w:t>Recon Agent</w:t>
-      </w:r>
-      <w:r>
-        <w:t>:</w:t>
-      </w:r>
-    </w:p>
-    <w:p>
-      <w:pPr>
-        <w:pStyle w:val="ListParagraph"/>
-        <w:numPr>
-          <w:ilvl w:val="2"/>
-          <w:numId w:val="1"/>
-        </w:numPr>
-        <w:spacing w:line="480" w:lineRule="auto"/>
-      </w:pPr>
-      <w:r>
-        <w:rPr>
-          <w:b/>
-          <w:bCs/>
-        </w:rPr>
-        <w:t>Extinguisher Agent</w:t>
-      </w:r>
-      <w:r>
-        <w:t>:</w:t>
-      </w:r>
-    </w:p>
-    <w:p>
-      <w:pPr>
-        <w:pStyle w:val="ListParagraph"/>
-        <w:numPr>
-          <w:ilvl w:val="2"/>
-          <w:numId w:val="1"/>
-        </w:numPr>
-        <w:spacing w:line="480" w:lineRule="auto"/>
-      </w:pPr>
-      <w:r>
-        <w:rPr>
-          <w:b/>
-          <w:bCs/>
-        </w:rPr>
-        <w:t>Rescue Agent</w:t>
-      </w:r>
-      <w:r>
-        <w:t>:</w:t>
-      </w:r>
-    </w:p>
-    <w:p>
-      <w:pPr>
-        <w:spacing w:line="480" w:lineRule="auto"/>
-      </w:pPr>
+      </w:pPr>
+      <w:r>
+        <w:t>I did things!</w:t>
+      </w:r>
     </w:p>
     <w:p>
       <w:pPr>
@@ -834,7 +402,23 @@
         </w:r>
       </w:fldSimple>
       <w:r>
-        <w:t xml:space="preserve"> Modified UNet (image generated with assistance of Gemini AI Model based on authors UNet code)</w:t>
+        <w:t xml:space="preserve"> Modified </w:t>
+      </w:r>
+      <w:proofErr w:type="spellStart"/>
+      <w:r>
+        <w:t>UNet</w:t>
+      </w:r>
+      <w:proofErr w:type="spellEnd"/>
+      <w:r>
+        <w:t xml:space="preserve"> (image generated with assistance of Gemini AI Model based on authors </w:t>
+      </w:r>
+      <w:proofErr w:type="spellStart"/>
+      <w:r>
+        <w:t>UNet</w:t>
+      </w:r>
+      <w:proofErr w:type="spellEnd"/>
+      <w:r>
+        <w:t xml:space="preserve"> code)</w:t>
       </w:r>
     </w:p>
     <w:p/>
@@ -848,7 +432,7 @@
         </w:rPr>
         <w:lastRenderedPageBreak/>
         <w:drawing>
-          <wp:inline distT="0" distB="0" distL="0" distR="0" wp14:anchorId="5A99DB7D" wp14:editId="49AC8C38">
+          <wp:inline distT="0" distB="0" distL="0" distR="0" wp14:anchorId="5A99DB7D" wp14:editId="32F13085">
             <wp:extent cx="5941060" cy="6047105"/>
             <wp:effectExtent l="0" t="0" r="2540" b="0"/>
             <wp:docPr id="1561439249" name="Picture 5"/>
@@ -1265,7 +849,15 @@
         <w:t>Fire spread modeling using probabilistic cellular automata</w:t>
       </w:r>
       <w:r>
-        <w:t xml:space="preserve">. arXiv. </w:t>
+        <w:t xml:space="preserve">. </w:t>
+      </w:r>
+      <w:proofErr w:type="spellStart"/>
+      <w:r>
+        <w:t>arXiv</w:t>
+      </w:r>
+      <w:proofErr w:type="spellEnd"/>
+      <w:r>
+        <w:t xml:space="preserve">. </w:t>
       </w:r>
       <w:hyperlink r:id="rId13" w:tgtFrame="_blank" w:history="1">
         <w:r>
@@ -1298,7 +890,15 @@
         <w:t>Distributed wildfire surveillance with autonomous aircraft using deep reinforcement learning</w:t>
       </w:r>
       <w:r>
-        <w:t xml:space="preserve">. arXiv. </w:t>
+        <w:t xml:space="preserve">. </w:t>
+      </w:r>
+      <w:proofErr w:type="spellStart"/>
+      <w:r>
+        <w:t>arXiv</w:t>
+      </w:r>
+      <w:proofErr w:type="spellEnd"/>
+      <w:r>
+        <w:t xml:space="preserve">. </w:t>
       </w:r>
       <w:hyperlink r:id="rId14" w:tgtFrame="_blank" w:history="1">
         <w:r>
@@ -1365,12 +965,21 @@
       <w:r>
         <w:t xml:space="preserve">Merlin, P. W. (2009). </w:t>
       </w:r>
+      <w:proofErr w:type="spellStart"/>
       <w:r>
         <w:rPr>
           <w:i/>
           <w:iCs/>
         </w:rPr>
-        <w:t>Ikhana Unmanned Aircraft System: Western States fire missions</w:t>
+        <w:t>Ikhana</w:t>
+      </w:r>
+      <w:proofErr w:type="spellEnd"/>
+      <w:r>
+        <w:rPr>
+          <w:i/>
+          <w:iCs/>
+        </w:rPr>
+        <w:t xml:space="preserve"> Unmanned Aircraft System: Western States fire missions</w:t>
       </w:r>
       <w:r>
         <w:t xml:space="preserve"> (NASA SP-2009-4544; Monographs in Aerospace History, No. 44). National Aeronautics and Space Administration. </w:t>
@@ -1406,7 +1015,15 @@
         <w:t>Wildfire autonomous response and prediction using cellular automata (WARP-CA)</w:t>
       </w:r>
       <w:r>
-        <w:t xml:space="preserve">. arXiv. </w:t>
+        <w:t xml:space="preserve">. </w:t>
+      </w:r>
+      <w:proofErr w:type="spellStart"/>
+      <w:r>
+        <w:t>arXiv</w:t>
+      </w:r>
+      <w:proofErr w:type="spellEnd"/>
+      <w:r>
+        <w:t xml:space="preserve">. </w:t>
       </w:r>
       <w:hyperlink r:id="rId17" w:tgtFrame="_blank" w:history="1">
         <w:r>
@@ -1435,6 +1052,7 @@
         <w:lastRenderedPageBreak/>
         <w:t xml:space="preserve">Ronneberger, O., Fischer, P., &amp; Brox, T. (2015). U-Net: Convolutional networks for biomedical image segmentation. </w:t>
       </w:r>
+      <w:proofErr w:type="spellStart"/>
       <w:r>
         <w:rPr>
           <w:i/>
@@ -1443,6 +1061,7 @@
         </w:rPr>
         <w:t>arXiv</w:t>
       </w:r>
+      <w:proofErr w:type="spellEnd"/>
       <w:r>
         <w:rPr>
           <w:lang w:val="en-CA"/>
@@ -1480,7 +1099,15 @@
         <w:t>Reward models in deep reinforcement learning: A survey</w:t>
       </w:r>
       <w:r>
-        <w:t xml:space="preserve">. arXiv. </w:t>
+        <w:t xml:space="preserve">. </w:t>
+      </w:r>
+      <w:proofErr w:type="spellStart"/>
+      <w:r>
+        <w:t>arXiv</w:t>
+      </w:r>
+      <w:proofErr w:type="spellEnd"/>
+      <w:r>
+        <w:t xml:space="preserve">. </w:t>
       </w:r>
       <w:hyperlink r:id="rId19" w:tgtFrame="_blank" w:history="1">
         <w:r>
@@ -1585,94 +1212,6 @@
       <w:r>
         <w:continuationSeparator/>
       </w:r>
-    </w:p>
-  </w:footnote>
-  <w:footnote w:id="1">
-    <w:p>
-      <w:pPr>
-        <w:pStyle w:val="FootnoteText"/>
-        <w:rPr>
-          <w:lang w:val="en-CA"/>
-        </w:rPr>
-      </w:pPr>
-      <w:r>
-        <w:rPr>
-          <w:rStyle w:val="FootnoteReference"/>
-        </w:rPr>
-        <w:footnoteRef/>
-      </w:r>
-      <w:r>
-        <w:t xml:space="preserve"> </w:t>
-      </w:r>
-      <w:hyperlink r:id="rId1" w:history="1">
-        <w:r>
-          <w:rPr>
-            <w:rStyle w:val="Hyperlink"/>
-          </w:rPr>
-          <w:t>FACT SHEET: Climate change and wildfires in Canada</w:t>
-        </w:r>
-      </w:hyperlink>
-    </w:p>
-  </w:footnote>
-  <w:footnote w:id="2">
-    <w:p>
-      <w:pPr>
-        <w:pStyle w:val="FootnoteText"/>
-        <w:rPr>
-          <w:lang w:val="en-CA"/>
-        </w:rPr>
-      </w:pPr>
-      <w:r>
-        <w:rPr>
-          <w:rStyle w:val="FootnoteReference"/>
-        </w:rPr>
-        <w:footnoteRef/>
-      </w:r>
-      <w:r>
-        <w:t xml:space="preserve"> </w:t>
-      </w:r>
-      <w:hyperlink r:id="rId2" w:history="1">
-        <w:r>
-          <w:rPr>
-            <w:rStyle w:val="Hyperlink"/>
-          </w:rPr>
-          <w:t>BCEWithLogitsLoss — PyTorch 2.12 documentation</w:t>
-        </w:r>
-      </w:hyperlink>
-    </w:p>
-  </w:footnote>
-  <w:footnote w:id="3">
-    <w:p>
-      <w:pPr>
-        <w:pStyle w:val="FootnoteText"/>
-        <w:rPr>
-          <w:lang w:val="en-CA"/>
-        </w:rPr>
-      </w:pPr>
-      <w:r>
-        <w:rPr>
-          <w:rStyle w:val="FootnoteReference"/>
-        </w:rPr>
-        <w:footnoteRef/>
-      </w:r>
-      <w:r>
-        <w:t xml:space="preserve"> </w:t>
-      </w:r>
-      <w:hyperlink r:id="rId3" w:anchor="diceloss" w:history="1">
-        <w:r>
-          <w:rPr>
-            <w:rStyle w:val="Hyperlink"/>
-            <w:rFonts w:ascii="Segoe UI Emoji" w:hAnsi="Segoe UI Emoji" w:cs="Segoe UI Emoji"/>
-          </w:rPr>
-          <w:t>📉</w:t>
-        </w:r>
-        <w:r>
-          <w:rPr>
-            <w:rStyle w:val="Hyperlink"/>
-          </w:rPr>
-          <w:t xml:space="preserve"> Losses — Segmentation Models documentation</w:t>
-        </w:r>
-      </w:hyperlink>
     </w:p>
   </w:footnote>
 </w:footnotes>
@@ -2439,6 +1978,7 @@
   <w:style w:type="character" w:default="1" w:styleId="DefaultParagraphFont">
     <w:name w:val="Default Paragraph Font"/>
     <w:uiPriority w:val="1"/>
+    <w:semiHidden/>
     <w:unhideWhenUsed/>
   </w:style>
   <w:style w:type="table" w:default="1" w:styleId="TableNormal">

</xml_diff>

<commit_message>
(update): paper written; needs final review before submitting
</commit_message>
<xml_diff>
--- a/Reflective_Synthesis_Paper.docx
+++ b/Reflective_Synthesis_Paper.docx
@@ -116,10 +116,7 @@
         <w:t>across</w:t>
       </w:r>
       <w:r>
-        <w:t xml:space="preserve"> many regions, including Canada</w:t>
-      </w:r>
-      <w:r>
-        <w:t xml:space="preserve"> (Wang 2025). As temperatures continue to rise, this threat is unlikely to </w:t>
+        <w:t xml:space="preserve"> many regions, including Canada (Wang 2025). As temperatures continue to rise, this threat is unlikely to </w:t>
       </w:r>
       <w:r>
         <w:t>decline</w:t>
@@ -137,10 +134,7 @@
         <w:t>creates</w:t>
       </w:r>
       <w:r>
-        <w:t xml:space="preserve"> serious risks to human life (Belval 2025). This paper proposes a framework for a semi-autonomous wildfire monitoring and control system. It draws on techniques from previous projects, explaining </w:t>
-      </w:r>
-      <w:r>
-        <w:t xml:space="preserve">how they are integrated and why they were selected. The paper then presents the system design, examines ethical </w:t>
+        <w:t xml:space="preserve"> serious risks to human life (Belval 2025). This paper proposes a framework for a semi-autonomous wildfire monitoring and control system. It draws on techniques from previous projects, explaining how they are integrated and why they were selected. The paper then presents the system design, examines ethical </w:t>
       </w:r>
       <w:r>
         <w:t>considerations</w:t>
@@ -1606,7 +1600,13 @@
             <w:rPr>
               <w:rFonts w:ascii="Cambria Math" w:hAnsi="Cambria Math"/>
             </w:rPr>
-            <m:t xml:space="preserve">+burningcellcount+2*humancount </m:t>
+            <m:t>+burningcellcount+2*</m:t>
+          </m:r>
+          <m:r>
+            <w:rPr>
+              <w:rFonts w:ascii="Cambria Math" w:hAnsi="Cambria Math"/>
+            </w:rPr>
+            <m:t xml:space="preserve">humancount </m:t>
           </m:r>
         </m:oMath>
       </m:oMathPara>
@@ -1868,6 +1868,23 @@
       </w:pPr>
       <w:r>
         <w:lastRenderedPageBreak/>
+        <w:t xml:space="preserve">Constants were chosen via intuition with some minor tuning while performing end-to-end testing. Unfortunately, optimizing these constants would require further testing on the full system which would </w:t>
+      </w:r>
+      <w:proofErr w:type="gramStart"/>
+      <w:r>
+        <w:t>prohibitively</w:t>
+      </w:r>
+      <w:proofErr w:type="gramEnd"/>
+      <w:r>
+        <w:t xml:space="preserve"> expensive.</w:t>
+      </w:r>
+    </w:p>
+    <w:p>
+      <w:pPr>
+        <w:spacing w:line="480" w:lineRule="auto"/>
+        <w:ind w:firstLine="720"/>
+      </w:pPr>
+      <w:r>
         <w:t>We performed 10 training rounds. For each training round we collected 100 episodes per agent. After training, we measured the mean reward and standard deviation for each agent, which is listed below:</w:t>
       </w:r>
     </w:p>
@@ -2131,6 +2148,7 @@
         <w:spacing w:line="480" w:lineRule="auto"/>
       </w:pPr>
       <w:r>
+        <w:lastRenderedPageBreak/>
         <w:tab/>
       </w:r>
       <w:r>
@@ -2152,11 +2170,7 @@
       </w:pPr>
       <w:r>
         <w:tab/>
-        <w:t xml:space="preserve">Each Agent other than the Command Centre Agent (which is more of an interface between the simulation and the Agentic Workflow) keeps a memory of previous interactions </w:t>
-      </w:r>
-      <w:r>
-        <w:lastRenderedPageBreak/>
-        <w:t>which are inserted as part the prompt for each turn. The memory is implemented as a simple deque with max length of 5. In addition, to avoid exceeding the input token limit on our model, we truncate the end of the input. Historical data is fed to the agent in reverse order, so the newest inputs are first and the oldest are last. This way any data that is truncated is related to older interactions rather than newer ones.</w:t>
+        <w:t>Each Agent other than the Command Centre Agent (which is more of an interface between the simulation and the Agentic Workflow) keeps a memory of previous interactions which are inserted as part the prompt for each turn. The memory is implemented as a simple deque with max length of 5. In addition, to avoid exceeding the input token limit on our model, we truncate the end of the input. Historical data is fed to the agent in reverse order, so the newest inputs are first and the oldest are last. This way any data that is truncated is related to older interactions rather than newer ones.</w:t>
       </w:r>
     </w:p>
     <w:p>
@@ -2292,7 +2306,11 @@
               <w:cnfStyle w:val="000000000000" w:firstRow="0" w:lastRow="0" w:firstColumn="0" w:lastColumn="0" w:oddVBand="0" w:evenVBand="0" w:oddHBand="0" w:evenHBand="0" w:firstRowFirstColumn="0" w:firstRowLastColumn="0" w:lastRowFirstColumn="0" w:lastRowLastColumn="0"/>
             </w:pPr>
             <w:r>
-              <w:t>Orchestration. The command center agent takes in the inputs from the simulation and outputs the final response from the Workflow.</w:t>
+              <w:t xml:space="preserve">Orchestration. The command center agent takes in the </w:t>
+            </w:r>
+            <w:r>
+              <w:lastRenderedPageBreak/>
+              <w:t>inputs from the simulation and outputs the final response from the Workflow.</w:t>
             </w:r>
           </w:p>
         </w:tc>
@@ -2319,7 +2337,6 @@
               <w:spacing w:line="480" w:lineRule="auto"/>
             </w:pPr>
             <w:r>
-              <w:lastRenderedPageBreak/>
               <w:t>Strategy Agent</w:t>
             </w:r>
           </w:p>
@@ -2479,6 +2496,7 @@
         <w:spacing w:line="480" w:lineRule="auto"/>
       </w:pPr>
       <w:r>
+        <w:lastRenderedPageBreak/>
         <w:tab/>
       </w:r>
     </w:p>
@@ -2501,7 +2519,6 @@
         <w:spacing w:line="480" w:lineRule="auto"/>
       </w:pPr>
       <w:r>
-        <w:lastRenderedPageBreak/>
         <w:t>On the first step and every 40-simulation step afterwards</w:t>
       </w:r>
       <w:r>
@@ -2588,6 +2605,7 @@
         <w:spacing w:line="480" w:lineRule="auto"/>
       </w:pPr>
       <w:r>
+        <w:lastRenderedPageBreak/>
         <w:tab/>
         <w:t>The simulation ends either after 750 steps, or when all fire has been extinguished. At the end of the simulation, a video is saved for further review.</w:t>
       </w:r>
@@ -2597,7 +2615,6 @@
         <w:spacing w:line="480" w:lineRule="auto"/>
       </w:pPr>
       <w:r>
-        <w:lastRenderedPageBreak/>
         <w:tab/>
         <w:t>Qualitative and Quantitative results will be covered in the Evaluation and Reflection section.</w:t>
       </w:r>
@@ -2669,27 +2686,14 @@
       <w:r>
         <w:t xml:space="preserve">Figure </w:t>
       </w:r>
-      <w:r>
-        <w:fldChar w:fldCharType="begin"/>
-      </w:r>
-      <w:r>
-        <w:instrText xml:space="preserve"> SEQ Figure \* ARABIC </w:instrText>
-      </w:r>
-      <w:r>
-        <w:fldChar w:fldCharType="separate"/>
-      </w:r>
-      <w:r>
-        <w:rPr>
-          <w:noProof/>
-        </w:rPr>
-        <w:t>1</w:t>
-      </w:r>
-      <w:r>
-        <w:rPr>
-          <w:noProof/>
-        </w:rPr>
-        <w:fldChar w:fldCharType="end"/>
-      </w:r>
+      <w:fldSimple w:instr=" SEQ Figure \* ARABIC ">
+        <w:r>
+          <w:rPr>
+            <w:noProof/>
+          </w:rPr>
+          <w:t>1</w:t>
+        </w:r>
+      </w:fldSimple>
       <w:r>
         <w:t xml:space="preserve"> Perlin Noise Generated Terrain</w:t>
       </w:r>
@@ -2762,27 +2766,14 @@
       <w:r>
         <w:t xml:space="preserve">Figure </w:t>
       </w:r>
-      <w:r>
-        <w:fldChar w:fldCharType="begin"/>
-      </w:r>
-      <w:r>
-        <w:instrText xml:space="preserve"> SEQ Figure \* ARABIC </w:instrText>
-      </w:r>
-      <w:r>
-        <w:fldChar w:fldCharType="separate"/>
-      </w:r>
-      <w:r>
-        <w:rPr>
-          <w:noProof/>
-        </w:rPr>
-        <w:t>2</w:t>
-      </w:r>
-      <w:r>
-        <w:rPr>
-          <w:noProof/>
-        </w:rPr>
-        <w:fldChar w:fldCharType="end"/>
-      </w:r>
+      <w:fldSimple w:instr=" SEQ Figure \* ARABIC ">
+        <w:r>
+          <w:rPr>
+            <w:noProof/>
+          </w:rPr>
+          <w:t>2</w:t>
+        </w:r>
+      </w:fldSimple>
       <w:r>
         <w:t xml:space="preserve"> Wildfire CA in action</w:t>
       </w:r>
@@ -2855,27 +2846,14 @@
       <w:r>
         <w:t xml:space="preserve">Figure </w:t>
       </w:r>
-      <w:r>
-        <w:fldChar w:fldCharType="begin"/>
-      </w:r>
-      <w:r>
-        <w:instrText xml:space="preserve"> SEQ Figure \* ARABIC </w:instrText>
-      </w:r>
-      <w:r>
-        <w:fldChar w:fldCharType="separate"/>
-      </w:r>
-      <w:r>
-        <w:rPr>
-          <w:noProof/>
-        </w:rPr>
-        <w:t>3</w:t>
-      </w:r>
-      <w:r>
-        <w:rPr>
-          <w:noProof/>
-        </w:rPr>
-        <w:fldChar w:fldCharType="end"/>
-      </w:r>
+      <w:fldSimple w:instr=" SEQ Figure \* ARABIC ">
+        <w:r>
+          <w:rPr>
+            <w:noProof/>
+          </w:rPr>
+          <w:t>3</w:t>
+        </w:r>
+      </w:fldSimple>
       <w:r>
         <w:t xml:space="preserve"> Modified </w:t>
       </w:r>
@@ -2907,7 +2885,7 @@
         </w:rPr>
         <w:lastRenderedPageBreak/>
         <w:drawing>
-          <wp:inline distT="0" distB="0" distL="0" distR="0" wp14:anchorId="5A99DB7D" wp14:editId="544A5598">
+          <wp:inline distT="0" distB="0" distL="0" distR="0" wp14:anchorId="5A99DB7D" wp14:editId="42A2CECB">
             <wp:extent cx="5941060" cy="6047105"/>
             <wp:effectExtent l="0" t="0" r="2540" b="0"/>
             <wp:docPr id="1561439249" name="Picture 5"/>
@@ -2964,27 +2942,14 @@
       <w:r>
         <w:t xml:space="preserve">Figure </w:t>
       </w:r>
-      <w:r>
-        <w:fldChar w:fldCharType="begin"/>
-      </w:r>
-      <w:r>
-        <w:instrText xml:space="preserve"> SEQ Figure \* ARABIC </w:instrText>
-      </w:r>
-      <w:r>
-        <w:fldChar w:fldCharType="separate"/>
-      </w:r>
-      <w:r>
-        <w:rPr>
-          <w:noProof/>
-        </w:rPr>
-        <w:t>4</w:t>
-      </w:r>
-      <w:r>
-        <w:rPr>
-          <w:noProof/>
-        </w:rPr>
-        <w:fldChar w:fldCharType="end"/>
-      </w:r>
+      <w:fldSimple w:instr=" SEQ Figure \* ARABIC ">
+        <w:r>
+          <w:rPr>
+            <w:noProof/>
+          </w:rPr>
+          <w:t>4</w:t>
+        </w:r>
+      </w:fldSimple>
       <w:r>
         <w:t xml:space="preserve"> Fire Risk Prediction Outputs</w:t>
       </w:r>
@@ -3062,27 +3027,14 @@
       <w:r>
         <w:t xml:space="preserve">Figure </w:t>
       </w:r>
-      <w:r>
-        <w:fldChar w:fldCharType="begin"/>
-      </w:r>
-      <w:r>
-        <w:instrText xml:space="preserve"> SEQ Figure \* ARABIC </w:instrText>
-      </w:r>
-      <w:r>
-        <w:fldChar w:fldCharType="separate"/>
-      </w:r>
-      <w:r>
-        <w:rPr>
-          <w:noProof/>
-        </w:rPr>
-        <w:t>5</w:t>
-      </w:r>
-      <w:r>
-        <w:rPr>
-          <w:noProof/>
-        </w:rPr>
-        <w:fldChar w:fldCharType="end"/>
-      </w:r>
+      <w:fldSimple w:instr=" SEQ Figure \* ARABIC ">
+        <w:r>
+          <w:rPr>
+            <w:noProof/>
+          </w:rPr>
+          <w:t>5</w:t>
+        </w:r>
+      </w:fldSimple>
       <w:r>
         <w:t xml:space="preserve"> System Overview</w:t>
       </w:r>
@@ -3167,45 +3119,35 @@
       <w:r>
         <w:t xml:space="preserve">Figure </w:t>
       </w:r>
-      <w:r>
-        <w:fldChar w:fldCharType="begin"/>
-      </w:r>
-      <w:r>
-        <w:instrText xml:space="preserve"> SEQ Figure \* ARABIC </w:instrText>
-      </w:r>
-      <w:r>
-        <w:fldChar w:fldCharType="separate"/>
-      </w:r>
+      <w:fldSimple w:instr=" SEQ Figure \* ARABIC ">
+        <w:r>
+          <w:rPr>
+            <w:noProof/>
+          </w:rPr>
+          <w:t>6</w:t>
+        </w:r>
+      </w:fldSimple>
+      <w:r>
+        <w:t xml:space="preserve"> Agentic Workflow</w:t>
+      </w:r>
+    </w:p>
+    <w:p>
+      <w:pPr>
+        <w:spacing w:line="480" w:lineRule="auto"/>
+        <w:ind w:firstLine="720"/>
+      </w:pPr>
+    </w:p>
+    <w:p>
+      <w:pPr>
+        <w:keepNext/>
+        <w:spacing w:line="480" w:lineRule="auto"/>
+      </w:pPr>
       <w:r>
         <w:rPr>
           <w:noProof/>
         </w:rPr>
-        <w:t>6</w:t>
-      </w:r>
-      <w:r>
-        <w:fldChar w:fldCharType="end"/>
-      </w:r>
-      <w:r>
-        <w:t xml:space="preserve"> Agentic Workflow</w:t>
-      </w:r>
-    </w:p>
-    <w:p>
-      <w:pPr>
-        <w:spacing w:line="480" w:lineRule="auto"/>
-        <w:ind w:firstLine="720"/>
-      </w:pPr>
-    </w:p>
-    <w:p>
-      <w:pPr>
-        <w:keepNext/>
-        <w:spacing w:line="480" w:lineRule="auto"/>
-      </w:pPr>
-      <w:r>
-        <w:rPr>
-          <w:noProof/>
-        </w:rPr>
         <w:drawing>
-          <wp:inline distT="0" distB="0" distL="0" distR="0" wp14:anchorId="231DA530" wp14:editId="0479EB73">
+          <wp:inline distT="0" distB="0" distL="0" distR="0" wp14:anchorId="231DA530" wp14:editId="554B3E53">
             <wp:extent cx="5937250" cy="2971800"/>
             <wp:effectExtent l="0" t="0" r="6350" b="0"/>
             <wp:docPr id="1696375601" name="Picture 2"/>
@@ -3262,24 +3204,14 @@
       <w:r>
         <w:t xml:space="preserve">Figure </w:t>
       </w:r>
-      <w:r>
-        <w:fldChar w:fldCharType="begin"/>
-      </w:r>
-      <w:r>
-        <w:instrText xml:space="preserve"> SEQ Figure \* ARABIC </w:instrText>
-      </w:r>
-      <w:r>
-        <w:fldChar w:fldCharType="separate"/>
-      </w:r>
-      <w:r>
-        <w:rPr>
-          <w:noProof/>
-        </w:rPr>
-        <w:t>7</w:t>
-      </w:r>
-      <w:r>
-        <w:fldChar w:fldCharType="end"/>
-      </w:r>
+      <w:fldSimple w:instr=" SEQ Figure \* ARABIC ">
+        <w:r>
+          <w:rPr>
+            <w:noProof/>
+          </w:rPr>
+          <w:t>7</w:t>
+        </w:r>
+      </w:fldSimple>
       <w:r>
         <w:t xml:space="preserve"> </w:t>
       </w:r>
@@ -3367,24 +3299,14 @@
       <w:r>
         <w:t xml:space="preserve">Figure </w:t>
       </w:r>
-      <w:r>
-        <w:fldChar w:fldCharType="begin"/>
-      </w:r>
-      <w:r>
-        <w:instrText xml:space="preserve"> SEQ Figure \* ARABIC </w:instrText>
-      </w:r>
-      <w:r>
-        <w:fldChar w:fldCharType="separate"/>
-      </w:r>
-      <w:r>
-        <w:rPr>
-          <w:noProof/>
-        </w:rPr>
-        <w:t>8</w:t>
-      </w:r>
-      <w:r>
-        <w:fldChar w:fldCharType="end"/>
-      </w:r>
+      <w:fldSimple w:instr=" SEQ Figure \* ARABIC ">
+        <w:r>
+          <w:rPr>
+            <w:noProof/>
+          </w:rPr>
+          <w:t>8</w:t>
+        </w:r>
+      </w:fldSimple>
       <w:r>
         <w:t xml:space="preserve"> UAV Behavior</w:t>
       </w:r>
@@ -3413,10 +3335,74 @@
     <w:p>
       <w:pPr>
         <w:spacing w:line="480" w:lineRule="auto"/>
+        <w:ind w:left="720" w:firstLine="720"/>
+      </w:pPr>
+      <w:r>
+        <w:t xml:space="preserve">While, as previously pointed out, fighting wildfires is a dangerous occupation, it is still an occupation that provides employment. A fully automated system fighting fires in place of human beings would displace this group, potentially leaving them without a comparable source of income. This is not an intended outcome of this framework. It would </w:t>
+      </w:r>
+      <w:r>
+        <w:t xml:space="preserve">be </w:t>
+      </w:r>
+      <w:r>
+        <w:t>better if any system based on this or similar frameworks were used to extend the reach of already existing human resources – augmenting their fire fighting abilities rather than replacing it.</w:t>
+      </w:r>
+    </w:p>
+    <w:p>
+      <w:pPr>
+        <w:spacing w:line="480" w:lineRule="auto"/>
         <w:ind w:left="720"/>
       </w:pPr>
       <w:r>
-        <w:t>Ethics!</w:t>
+        <w:lastRenderedPageBreak/>
+        <w:tab/>
+      </w:r>
+      <w:r>
+        <w:t>We also do not recommend extending this system to be fully autonomous. As shown even in the data already collected, Agents (and the LLMs that power them) can sometimes fixate on unexpected things. An Agent that continues to search for a long dead human while ignoring others that may be in danger (as happened a few times during testing) is not a desirable situation.</w:t>
+      </w:r>
+    </w:p>
+    <w:p>
+      <w:pPr>
+        <w:spacing w:line="480" w:lineRule="auto"/>
+        <w:ind w:left="720"/>
+      </w:pPr>
+      <w:r>
+        <w:tab/>
+      </w:r>
+      <w:r>
+        <w:t>Many assumptions were made during testing that may not hold up in the real world – or would at least require additional testing. For example, for simplicities sake, we assumed a static wind field. Wind is rarely, if ever, static. We assumed we could obtain reliable aerial views of the fire. We assumed that reliable Firefighting and search and rescue drones could be built reliably. This may not be the case. Furthermore, especially for search and rescue, a human presence is likely preferable to deal with any first-aid or psychological distress that might occur during a potential emergency.</w:t>
+      </w:r>
+    </w:p>
+    <w:p>
+      <w:pPr>
+        <w:spacing w:line="480" w:lineRule="auto"/>
+        <w:ind w:left="720"/>
+      </w:pPr>
+      <w:r>
+        <w:tab/>
+        <w:t xml:space="preserve">Another concern to consider is who is responsible for loss of life / property damage that may occur due to reliance on a system like this? If it malfunctions or makes a choice between priorities that we might not agree with causing loss of life or property – someone will need to be held accountable. </w:t>
+      </w:r>
+      <w:r>
+        <w:t>It’s</w:t>
+      </w:r>
+      <w:r>
+        <w:t xml:space="preserve"> for this reason we left in the human-in-the-loop option to override the system, but many people </w:t>
+      </w:r>
+      <w:r>
+        <w:t>will still defer to the computer, especially when they are stressed. This could result in costly, but potentially avoidable mistakes. Protocols will need to put in place to review the plans and reasoning presented by the system to ensure they meet the expected standards, even in life and death situations.</w:t>
+      </w:r>
+    </w:p>
+    <w:p>
+      <w:pPr>
+        <w:spacing w:line="480" w:lineRule="auto"/>
+        <w:ind w:left="720"/>
+      </w:pPr>
+      <w:r>
+        <w:tab/>
+        <w:t xml:space="preserve">Our setup used a remote model – Anthropic Claude Sonnet 4.5. This was sufficient for our purposes, but in a real scenario internet will likely not be reliable </w:t>
+      </w:r>
+      <w:r>
+        <w:lastRenderedPageBreak/>
+        <w:t>enough to stake human life upon. If a system of this nature were to be deployed, it should use a local model instead – this way if there is a disruption in internet infrastructure – the central command system doesn’t go offline.</w:t>
       </w:r>
     </w:p>
     <w:p>
@@ -3461,11 +3447,7 @@
         <w:ind w:firstLine="720"/>
       </w:pPr>
       <w:r>
-        <w:t xml:space="preserve">For each test we tracked the number of steps taken (up to a maximum of 750), number of humans still active in the forest, and number of humans rescued. We also tracked the final </w:t>
-      </w:r>
-      <w:r>
-        <w:lastRenderedPageBreak/>
-        <w:t>number of burning tiles once the simulation was completed. These results are summarized in the table below.</w:t>
+        <w:t>For each test we tracked the number of steps taken (up to a maximum of 750), number of humans still active in the forest, and number of humans rescued. We also tracked the final number of burning tiles once the simulation was completed. These results are summarized in the table below.</w:t>
       </w:r>
     </w:p>
     <w:p>
@@ -3938,6 +3920,26 @@
     <w:p>
       <w:pPr>
         <w:spacing w:line="480" w:lineRule="auto"/>
+        <w:ind w:firstLine="720"/>
+      </w:pPr>
+      <w:r>
+        <w:lastRenderedPageBreak/>
+        <w:t>We notice that in experiment 2 the system obtained significantly better performance than the others.</w:t>
+      </w:r>
+      <w:r>
+        <w:t xml:space="preserve"> In this experiment we had a bit of a lucky start in that the fire ignited near enough to home base that the Extinguishers were able to reach and put out the fire before it could spread.</w:t>
+      </w:r>
+    </w:p>
+    <w:p>
+      <w:pPr>
+        <w:spacing w:line="480" w:lineRule="auto"/>
+        <w:ind w:firstLine="720"/>
+      </w:pPr>
+    </w:p>
+    <w:p>
+      <w:pPr>
+        <w:spacing w:line="480" w:lineRule="auto"/>
+        <w:ind w:firstLine="720"/>
       </w:pPr>
       <w:r>
         <w:t>Each experiment also resulted in a video file. After reviewing the video files, we noticed the following behavior patterns:</w:t>
@@ -4047,7 +4049,6 @@
                 <w:b w:val="0"/>
                 <w:bCs w:val="0"/>
               </w:rPr>
-              <w:lastRenderedPageBreak/>
               <w:t>Search and Rescue operations seem to get fixated on saving a particular human sometimes.</w:t>
             </w:r>
             <w:r>
@@ -4214,7 +4215,6 @@
           <w:bCs/>
           <w:lang w:val="en-CA"/>
         </w:rPr>
-        <w:lastRenderedPageBreak/>
         <w:t>Speculative RESCUE deployment:</w:t>
       </w:r>
       <w:r>
@@ -4295,6 +4295,42 @@
         <w:spacing w:line="480" w:lineRule="auto"/>
         <w:ind w:firstLine="720"/>
       </w:pPr>
+      <w:r>
+        <w:lastRenderedPageBreak/>
+        <w:t>Based on the above, one major problem appears to be that the system never let’s go of a goal once it’s been entered into the graph. Two possible improvements come to mind that could address this:</w:t>
+      </w:r>
+    </w:p>
+    <w:p>
+      <w:pPr>
+        <w:pStyle w:val="ListParagraph"/>
+        <w:numPr>
+          <w:ilvl w:val="0"/>
+          <w:numId w:val="5"/>
+        </w:numPr>
+        <w:spacing w:line="480" w:lineRule="auto"/>
+      </w:pPr>
+      <w:r>
+        <w:t>Allow Goal nodes to expire if not deleted after a certain number of iterations.</w:t>
+      </w:r>
+    </w:p>
+    <w:p>
+      <w:pPr>
+        <w:pStyle w:val="ListParagraph"/>
+        <w:numPr>
+          <w:ilvl w:val="0"/>
+          <w:numId w:val="5"/>
+        </w:numPr>
+        <w:spacing w:line="480" w:lineRule="auto"/>
+      </w:pPr>
+      <w:r>
+        <w:t>Allow for a hybrid prioritization model where the priority of goal is a combination of the original priority and how long it’s been active for. So newer Critical priority goals can take precedence over older ones.</w:t>
+      </w:r>
+    </w:p>
+    <w:p>
+      <w:pPr>
+        <w:spacing w:line="480" w:lineRule="auto"/>
+        <w:ind w:firstLine="720"/>
+      </w:pPr>
     </w:p>
     <w:p>
       <w:pPr>
@@ -4440,8 +4476,20 @@
         <w:ind w:firstLine="720"/>
       </w:pPr>
       <w:r>
+        <w:t xml:space="preserve">We demonstrated that these techniques could be combined to create something potentially useful – including using a simulation environment informed by modern mathematical models of wildfire propagation. Providing a framework for testing system </w:t>
+      </w:r>
+      <w:r>
+        <w:t>hypotheses</w:t>
+      </w:r>
+      <w:r>
+        <w:t xml:space="preserve"> </w:t>
+      </w:r>
+      <w:r>
+        <w:t xml:space="preserve">without </w:t>
+      </w:r>
+      <w:r>
         <w:lastRenderedPageBreak/>
-        <w:t>We demonstrated that these techniques could be combined to create something potentially useful – including using a simulation environment informed by modern mathematical models of wildfire propagation. Providing a framework for testing system hypothesis’ without having to spend the time, money, and risk involved in building a real-world system is an important step in any embodied AI Project.</w:t>
+        <w:t>having to spend the time, money, and risk involved in building a real-world system is an important step in any embodied AI Project.</w:t>
       </w:r>
     </w:p>
     <w:p>
@@ -4459,24 +4507,6 @@
     <w:p>
       <w:pPr>
         <w:spacing w:line="480" w:lineRule="auto"/>
-        <w:ind w:firstLine="720"/>
-      </w:pPr>
-    </w:p>
-    <w:p>
-      <w:pPr>
-        <w:spacing w:line="480" w:lineRule="auto"/>
-        <w:ind w:firstLine="720"/>
-      </w:pPr>
-    </w:p>
-    <w:p>
-      <w:pPr>
-        <w:spacing w:line="480" w:lineRule="auto"/>
-        <w:ind w:firstLine="720"/>
-      </w:pPr>
-    </w:p>
-    <w:p>
-      <w:pPr>
-        <w:spacing w:line="480" w:lineRule="auto"/>
         <w:jc w:val="center"/>
       </w:pPr>
     </w:p>
@@ -4495,72 +4525,25 @@
     <w:p>
       <w:pPr>
         <w:spacing w:line="480" w:lineRule="auto"/>
+      </w:pPr>
+    </w:p>
+    <w:p>
+      <w:pPr>
+        <w:rPr>
+          <w:b/>
+        </w:rPr>
+      </w:pPr>
+      <w:r>
+        <w:rPr>
+          <w:b/>
+        </w:rPr>
+        <w:br w:type="page"/>
+      </w:r>
+    </w:p>
+    <w:p>
+      <w:pPr>
+        <w:spacing w:line="480" w:lineRule="auto"/>
         <w:jc w:val="center"/>
-      </w:pPr>
-    </w:p>
-    <w:p>
-      <w:pPr>
-        <w:spacing w:line="480" w:lineRule="auto"/>
-        <w:jc w:val="center"/>
-      </w:pPr>
-    </w:p>
-    <w:p>
-      <w:pPr>
-        <w:spacing w:line="480" w:lineRule="auto"/>
-        <w:jc w:val="center"/>
-      </w:pPr>
-    </w:p>
-    <w:p>
-      <w:pPr>
-        <w:spacing w:line="480" w:lineRule="auto"/>
-        <w:jc w:val="center"/>
-      </w:pPr>
-    </w:p>
-    <w:p>
-      <w:pPr>
-        <w:spacing w:line="480" w:lineRule="auto"/>
-        <w:jc w:val="center"/>
-      </w:pPr>
-    </w:p>
-    <w:p>
-      <w:pPr>
-        <w:spacing w:line="480" w:lineRule="auto"/>
-        <w:jc w:val="center"/>
-      </w:pPr>
-    </w:p>
-    <w:p>
-      <w:pPr>
-        <w:spacing w:line="480" w:lineRule="auto"/>
-        <w:jc w:val="center"/>
-      </w:pPr>
-    </w:p>
-    <w:p>
-      <w:pPr>
-        <w:spacing w:line="480" w:lineRule="auto"/>
-        <w:jc w:val="center"/>
-      </w:pPr>
-    </w:p>
-    <w:p>
-      <w:pPr>
-        <w:spacing w:line="480" w:lineRule="auto"/>
-      </w:pPr>
-    </w:p>
-    <w:p>
-      <w:pPr>
-        <w:spacing w:line="480" w:lineRule="auto"/>
-        <w:jc w:val="center"/>
-      </w:pPr>
-      <w:r>
-        <w:br w:type="page"/>
-      </w:r>
-    </w:p>
-    <w:p>
-      <w:pPr>
-        <w:spacing w:line="480" w:lineRule="auto"/>
-        <w:jc w:val="center"/>
-        <w:rPr>
-          <w:b/>
-        </w:rPr>
       </w:pPr>
       <w:r>
         <w:rPr>
@@ -6057,16 +6040,16 @@
     </w:lvl>
   </w:abstractNum>
   <w:abstractNum w:abstractNumId="2" w15:restartNumberingAfterBreak="0">
-    <w:nsid w:val="3C170599"/>
+    <w:nsid w:val="2E133DC6"/>
     <w:multiLevelType w:val="hybridMultilevel"/>
-    <w:tmpl w:val="F4BA0B9C"/>
-    <w:lvl w:ilvl="0" w:tplc="1009000F">
+    <w:tmpl w:val="40F8E09E"/>
+    <w:lvl w:ilvl="0" w:tplc="A39656D2">
       <w:start w:val="1"/>
       <w:numFmt w:val="decimal"/>
       <w:lvlText w:val="%1."/>
       <w:lvlJc w:val="left"/>
       <w:pPr>
-        <w:ind w:left="720" w:hanging="360"/>
+        <w:ind w:left="1080" w:hanging="360"/>
       </w:pPr>
       <w:rPr>
         <w:rFonts w:hint="default"/>
@@ -6078,7 +6061,7 @@
       <w:lvlText w:val="%2."/>
       <w:lvlJc w:val="left"/>
       <w:pPr>
-        <w:ind w:left="1440" w:hanging="360"/>
+        <w:ind w:left="1800" w:hanging="360"/>
       </w:pPr>
     </w:lvl>
     <w:lvl w:ilvl="2" w:tplc="1009001B" w:tentative="1">
@@ -6087,7 +6070,7 @@
       <w:lvlText w:val="%3."/>
       <w:lvlJc w:val="right"/>
       <w:pPr>
-        <w:ind w:left="2160" w:hanging="180"/>
+        <w:ind w:left="2520" w:hanging="180"/>
       </w:pPr>
     </w:lvl>
     <w:lvl w:ilvl="3" w:tplc="1009000F" w:tentative="1">
@@ -6096,7 +6079,7 @@
       <w:lvlText w:val="%4."/>
       <w:lvlJc w:val="left"/>
       <w:pPr>
-        <w:ind w:left="2880" w:hanging="360"/>
+        <w:ind w:left="3240" w:hanging="360"/>
       </w:pPr>
     </w:lvl>
     <w:lvl w:ilvl="4" w:tplc="10090019" w:tentative="1">
@@ -6105,7 +6088,7 @@
       <w:lvlText w:val="%5."/>
       <w:lvlJc w:val="left"/>
       <w:pPr>
-        <w:ind w:left="3600" w:hanging="360"/>
+        <w:ind w:left="3960" w:hanging="360"/>
       </w:pPr>
     </w:lvl>
     <w:lvl w:ilvl="5" w:tplc="1009001B" w:tentative="1">
@@ -6114,7 +6097,7 @@
       <w:lvlText w:val="%6."/>
       <w:lvlJc w:val="right"/>
       <w:pPr>
-        <w:ind w:left="4320" w:hanging="180"/>
+        <w:ind w:left="4680" w:hanging="180"/>
       </w:pPr>
     </w:lvl>
     <w:lvl w:ilvl="6" w:tplc="1009000F" w:tentative="1">
@@ -6123,7 +6106,7 @@
       <w:lvlText w:val="%7."/>
       <w:lvlJc w:val="left"/>
       <w:pPr>
-        <w:ind w:left="5040" w:hanging="360"/>
+        <w:ind w:left="5400" w:hanging="360"/>
       </w:pPr>
     </w:lvl>
     <w:lvl w:ilvl="7" w:tplc="10090019" w:tentative="1">
@@ -6132,7 +6115,7 @@
       <w:lvlText w:val="%8."/>
       <w:lvlJc w:val="left"/>
       <w:pPr>
-        <w:ind w:left="5760" w:hanging="360"/>
+        <w:ind w:left="6120" w:hanging="360"/>
       </w:pPr>
     </w:lvl>
     <w:lvl w:ilvl="8" w:tplc="1009001B" w:tentative="1">
@@ -6141,21 +6124,21 @@
       <w:lvlText w:val="%9."/>
       <w:lvlJc w:val="right"/>
       <w:pPr>
-        <w:ind w:left="6480" w:hanging="180"/>
+        <w:ind w:left="6840" w:hanging="180"/>
       </w:pPr>
     </w:lvl>
   </w:abstractNum>
   <w:abstractNum w:abstractNumId="3" w15:restartNumberingAfterBreak="0">
-    <w:nsid w:val="3D843755"/>
+    <w:nsid w:val="3C170599"/>
     <w:multiLevelType w:val="hybridMultilevel"/>
-    <w:tmpl w:val="D550E43E"/>
-    <w:lvl w:ilvl="0" w:tplc="831AE848">
+    <w:tmpl w:val="F4BA0B9C"/>
+    <w:lvl w:ilvl="0" w:tplc="1009000F">
       <w:start w:val="1"/>
       <w:numFmt w:val="decimal"/>
       <w:lvlText w:val="%1."/>
       <w:lvlJc w:val="left"/>
       <w:pPr>
-        <w:ind w:left="1080" w:hanging="360"/>
+        <w:ind w:left="720" w:hanging="360"/>
       </w:pPr>
       <w:rPr>
         <w:rFonts w:hint="default"/>
@@ -6167,7 +6150,7 @@
       <w:lvlText w:val="%2."/>
       <w:lvlJc w:val="left"/>
       <w:pPr>
-        <w:ind w:left="1800" w:hanging="360"/>
+        <w:ind w:left="1440" w:hanging="360"/>
       </w:pPr>
     </w:lvl>
     <w:lvl w:ilvl="2" w:tplc="1009001B" w:tentative="1">
@@ -6176,7 +6159,7 @@
       <w:lvlText w:val="%3."/>
       <w:lvlJc w:val="right"/>
       <w:pPr>
-        <w:ind w:left="2520" w:hanging="180"/>
+        <w:ind w:left="2160" w:hanging="180"/>
       </w:pPr>
     </w:lvl>
     <w:lvl w:ilvl="3" w:tplc="1009000F" w:tentative="1">
@@ -6185,7 +6168,7 @@
       <w:lvlText w:val="%4."/>
       <w:lvlJc w:val="left"/>
       <w:pPr>
-        <w:ind w:left="3240" w:hanging="360"/>
+        <w:ind w:left="2880" w:hanging="360"/>
       </w:pPr>
     </w:lvl>
     <w:lvl w:ilvl="4" w:tplc="10090019" w:tentative="1">
@@ -6194,7 +6177,7 @@
       <w:lvlText w:val="%5."/>
       <w:lvlJc w:val="left"/>
       <w:pPr>
-        <w:ind w:left="3960" w:hanging="360"/>
+        <w:ind w:left="3600" w:hanging="360"/>
       </w:pPr>
     </w:lvl>
     <w:lvl w:ilvl="5" w:tplc="1009001B" w:tentative="1">
@@ -6203,7 +6186,7 @@
       <w:lvlText w:val="%6."/>
       <w:lvlJc w:val="right"/>
       <w:pPr>
-        <w:ind w:left="4680" w:hanging="180"/>
+        <w:ind w:left="4320" w:hanging="180"/>
       </w:pPr>
     </w:lvl>
     <w:lvl w:ilvl="6" w:tplc="1009000F" w:tentative="1">
@@ -6212,7 +6195,7 @@
       <w:lvlText w:val="%7."/>
       <w:lvlJc w:val="left"/>
       <w:pPr>
-        <w:ind w:left="5400" w:hanging="360"/>
+        <w:ind w:left="5040" w:hanging="360"/>
       </w:pPr>
     </w:lvl>
     <w:lvl w:ilvl="7" w:tplc="10090019" w:tentative="1">
@@ -6221,7 +6204,7 @@
       <w:lvlText w:val="%8."/>
       <w:lvlJc w:val="left"/>
       <w:pPr>
-        <w:ind w:left="6120" w:hanging="360"/>
+        <w:ind w:left="5760" w:hanging="360"/>
       </w:pPr>
     </w:lvl>
     <w:lvl w:ilvl="8" w:tplc="1009001B" w:tentative="1">
@@ -6230,6 +6213,95 @@
       <w:lvlText w:val="%9."/>
       <w:lvlJc w:val="right"/>
       <w:pPr>
+        <w:ind w:left="6480" w:hanging="180"/>
+      </w:pPr>
+    </w:lvl>
+  </w:abstractNum>
+  <w:abstractNum w:abstractNumId="4" w15:restartNumberingAfterBreak="0">
+    <w:nsid w:val="3D843755"/>
+    <w:multiLevelType w:val="hybridMultilevel"/>
+    <w:tmpl w:val="D550E43E"/>
+    <w:lvl w:ilvl="0" w:tplc="831AE848">
+      <w:start w:val="1"/>
+      <w:numFmt w:val="decimal"/>
+      <w:lvlText w:val="%1."/>
+      <w:lvlJc w:val="left"/>
+      <w:pPr>
+        <w:ind w:left="1080" w:hanging="360"/>
+      </w:pPr>
+      <w:rPr>
+        <w:rFonts w:hint="default"/>
+      </w:rPr>
+    </w:lvl>
+    <w:lvl w:ilvl="1" w:tplc="10090019" w:tentative="1">
+      <w:start w:val="1"/>
+      <w:numFmt w:val="lowerLetter"/>
+      <w:lvlText w:val="%2."/>
+      <w:lvlJc w:val="left"/>
+      <w:pPr>
+        <w:ind w:left="1800" w:hanging="360"/>
+      </w:pPr>
+    </w:lvl>
+    <w:lvl w:ilvl="2" w:tplc="1009001B" w:tentative="1">
+      <w:start w:val="1"/>
+      <w:numFmt w:val="lowerRoman"/>
+      <w:lvlText w:val="%3."/>
+      <w:lvlJc w:val="right"/>
+      <w:pPr>
+        <w:ind w:left="2520" w:hanging="180"/>
+      </w:pPr>
+    </w:lvl>
+    <w:lvl w:ilvl="3" w:tplc="1009000F" w:tentative="1">
+      <w:start w:val="1"/>
+      <w:numFmt w:val="decimal"/>
+      <w:lvlText w:val="%4."/>
+      <w:lvlJc w:val="left"/>
+      <w:pPr>
+        <w:ind w:left="3240" w:hanging="360"/>
+      </w:pPr>
+    </w:lvl>
+    <w:lvl w:ilvl="4" w:tplc="10090019" w:tentative="1">
+      <w:start w:val="1"/>
+      <w:numFmt w:val="lowerLetter"/>
+      <w:lvlText w:val="%5."/>
+      <w:lvlJc w:val="left"/>
+      <w:pPr>
+        <w:ind w:left="3960" w:hanging="360"/>
+      </w:pPr>
+    </w:lvl>
+    <w:lvl w:ilvl="5" w:tplc="1009001B" w:tentative="1">
+      <w:start w:val="1"/>
+      <w:numFmt w:val="lowerRoman"/>
+      <w:lvlText w:val="%6."/>
+      <w:lvlJc w:val="right"/>
+      <w:pPr>
+        <w:ind w:left="4680" w:hanging="180"/>
+      </w:pPr>
+    </w:lvl>
+    <w:lvl w:ilvl="6" w:tplc="1009000F" w:tentative="1">
+      <w:start w:val="1"/>
+      <w:numFmt w:val="decimal"/>
+      <w:lvlText w:val="%7."/>
+      <w:lvlJc w:val="left"/>
+      <w:pPr>
+        <w:ind w:left="5400" w:hanging="360"/>
+      </w:pPr>
+    </w:lvl>
+    <w:lvl w:ilvl="7" w:tplc="10090019" w:tentative="1">
+      <w:start w:val="1"/>
+      <w:numFmt w:val="lowerLetter"/>
+      <w:lvlText w:val="%8."/>
+      <w:lvlJc w:val="left"/>
+      <w:pPr>
+        <w:ind w:left="6120" w:hanging="360"/>
+      </w:pPr>
+    </w:lvl>
+    <w:lvl w:ilvl="8" w:tplc="1009001B" w:tentative="1">
+      <w:start w:val="1"/>
+      <w:numFmt w:val="lowerRoman"/>
+      <w:lvlText w:val="%9."/>
+      <w:lvlJc w:val="right"/>
+      <w:pPr>
         <w:ind w:left="6840" w:hanging="180"/>
       </w:pPr>
     </w:lvl>
@@ -6238,13 +6310,16 @@
     <w:abstractNumId w:val="1"/>
   </w:num>
   <w:num w:numId="2" w16cid:durableId="548107309">
-    <w:abstractNumId w:val="3"/>
+    <w:abstractNumId w:val="4"/>
   </w:num>
   <w:num w:numId="3" w16cid:durableId="1970435402">
-    <w:abstractNumId w:val="2"/>
+    <w:abstractNumId w:val="3"/>
   </w:num>
   <w:num w:numId="4" w16cid:durableId="1465193618">
     <w:abstractNumId w:val="0"/>
+  </w:num>
+  <w:num w:numId="5" w16cid:durableId="1963143843">
+    <w:abstractNumId w:val="2"/>
   </w:num>
 </w:numbering>
 </file>

</xml_diff>

<commit_message>
(update): cleaning up errors in report
</commit_message>
<xml_diff>
--- a/Reflective_Synthesis_Paper.docx
+++ b/Reflective_Synthesis_Paper.docx
@@ -1448,7 +1448,23 @@
         <w:t>Watkins</w:t>
       </w:r>
       <w:r>
-        <w:t xml:space="preserve"> 1992) to iteratively learn a greedy policy using a Q-Value function. This Q-Value function was estimated using a Random Forest. (SVR was rather slow). Once we had an estimate of the Q-Value function, we used that to train a Support Vector Machine to learn to the best action based on the inputs.</w:t>
+        <w:t xml:space="preserve"> 1992) to iteratively learn a greedy policy using a Q-Value function. This Q-Value function was estimated using a Random Forest. (SVR was rather slow). </w:t>
+      </w:r>
+    </w:p>
+    <w:p>
+      <w:pPr>
+        <w:spacing w:line="480" w:lineRule="auto"/>
+      </w:pPr>
+      <w:r>
+        <w:tab/>
+      </w:r>
+      <w:proofErr w:type="gramStart"/>
+      <w:r>
+        <w:t>Next</w:t>
+      </w:r>
+      <w:proofErr w:type="gramEnd"/>
+      <w:r>
+        <w:t xml:space="preserve"> we used the Q-Value function to support a supervised learning approach where we trained the SVM to approximate the epsilon-greedy policy generated by the training algorithm above.</w:t>
       </w:r>
     </w:p>
     <w:p>
@@ -1774,6 +1790,7 @@
             <w:rPr>
               <w:rFonts w:ascii="Cambria Math" w:hAnsi="Cambria Math"/>
             </w:rPr>
+            <w:lastRenderedPageBreak/>
             <m:t>reward= -0.5-dist</m:t>
           </m:r>
           <m:d>
@@ -1867,14 +1884,11 @@
         <w:ind w:firstLine="720"/>
       </w:pPr>
       <w:r>
-        <w:lastRenderedPageBreak/>
         <w:t xml:space="preserve">Constants were chosen via intuition with some minor tuning while performing end-to-end testing. Unfortunately, optimizing these constants would require further testing on the full system which would </w:t>
       </w:r>
-      <w:proofErr w:type="gramStart"/>
-      <w:r>
-        <w:t>prohibitively</w:t>
-      </w:r>
-      <w:proofErr w:type="gramEnd"/>
+      <w:r>
+        <w:t>be prohibitively</w:t>
+      </w:r>
       <w:r>
         <w:t xml:space="preserve"> expensive.</w:t>
       </w:r>
@@ -2121,6 +2135,19 @@
       <w:pPr>
         <w:spacing w:line="480" w:lineRule="auto"/>
       </w:pPr>
+      <w:r>
+        <w:lastRenderedPageBreak/>
+        <w:tab/>
+        <w:t>To keep the UAVs within the bounds of the simulation, we implemented</w:t>
+      </w:r>
+      <w:r>
+        <w:t xml:space="preserve"> a special “boundary override action”. This action is triggered whenever a UAV reaches the simulation boundary – where it automatically overrides the current input steering it in the opposite direction.</w:t>
+      </w:r>
+    </w:p>
+    <w:p>
+      <w:pPr>
+        <w:spacing w:line="480" w:lineRule="auto"/>
+      </w:pPr>
     </w:p>
     <w:p>
       <w:pPr>
@@ -2148,7 +2175,6 @@
         <w:spacing w:line="480" w:lineRule="auto"/>
       </w:pPr>
       <w:r>
-        <w:lastRenderedPageBreak/>
         <w:tab/>
       </w:r>
       <w:r>
@@ -2217,6 +2243,7 @@
         <w:ind w:firstLine="720"/>
       </w:pPr>
       <w:r>
+        <w:lastRenderedPageBreak/>
         <w:t>Our workflow consisted of the following agents</w:t>
       </w:r>
       <w:r>
@@ -2306,11 +2333,7 @@
               <w:cnfStyle w:val="000000000000" w:firstRow="0" w:lastRow="0" w:firstColumn="0" w:lastColumn="0" w:oddVBand="0" w:evenVBand="0" w:oddHBand="0" w:evenHBand="0" w:firstRowFirstColumn="0" w:firstRowLastColumn="0" w:lastRowFirstColumn="0" w:lastRowLastColumn="0"/>
             </w:pPr>
             <w:r>
-              <w:t xml:space="preserve">Orchestration. The command center agent takes in the </w:t>
-            </w:r>
-            <w:r>
-              <w:lastRenderedPageBreak/>
-              <w:t>inputs from the simulation and outputs the final response from the Workflow.</w:t>
+              <w:t>Orchestration. The command center agent takes in the inputs from the simulation and outputs the final response from the Workflow.</w:t>
             </w:r>
           </w:p>
         </w:tc>
@@ -2428,6 +2451,7 @@
               <w:spacing w:line="480" w:lineRule="auto"/>
             </w:pPr>
             <w:r>
+              <w:lastRenderedPageBreak/>
               <w:t>Assistant Agent</w:t>
             </w:r>
           </w:p>
@@ -2496,7 +2520,6 @@
         <w:spacing w:line="480" w:lineRule="auto"/>
       </w:pPr>
       <w:r>
-        <w:lastRenderedPageBreak/>
         <w:tab/>
       </w:r>
     </w:p>
@@ -2605,7 +2628,6 @@
         <w:spacing w:line="480" w:lineRule="auto"/>
       </w:pPr>
       <w:r>
-        <w:lastRenderedPageBreak/>
         <w:tab/>
         <w:t>The simulation ends either after 750 steps, or when all fire has been extinguished. At the end of the simulation, a video is saved for further review.</w:t>
       </w:r>
@@ -2628,6 +2650,7 @@
         <w:rPr>
           <w:noProof/>
         </w:rPr>
+        <w:lastRenderedPageBreak/>
         <w:drawing>
           <wp:inline distT="0" distB="0" distL="0" distR="0" wp14:anchorId="39C87280" wp14:editId="050CE50D">
             <wp:extent cx="5946140" cy="5946140"/>
@@ -2885,7 +2908,7 @@
         </w:rPr>
         <w:lastRenderedPageBreak/>
         <w:drawing>
-          <wp:inline distT="0" distB="0" distL="0" distR="0" wp14:anchorId="5A99DB7D" wp14:editId="42A2CECB">
+          <wp:inline distT="0" distB="0" distL="0" distR="0" wp14:anchorId="5A99DB7D" wp14:editId="39F4D898">
             <wp:extent cx="5941060" cy="6047105"/>
             <wp:effectExtent l="0" t="0" r="2540" b="0"/>
             <wp:docPr id="1561439249" name="Picture 5"/>
@@ -2970,9 +2993,9 @@
           <w:noProof/>
         </w:rPr>
         <w:drawing>
-          <wp:inline distT="0" distB="0" distL="0" distR="0" wp14:anchorId="76D4C277" wp14:editId="777D23BA">
-            <wp:extent cx="5937250" cy="5549900"/>
-            <wp:effectExtent l="0" t="0" r="6350" b="0"/>
+          <wp:inline distT="0" distB="0" distL="0" distR="0" wp14:anchorId="76D4C277" wp14:editId="08462065">
+            <wp:extent cx="5932651" cy="5549900"/>
+            <wp:effectExtent l="0" t="0" r="0" b="0"/>
             <wp:docPr id="1715014003" name="Picture 4"/>
             <wp:cNvGraphicFramePr>
               <a:graphicFrameLocks xmlns:a="http://schemas.openxmlformats.org/drawingml/2006/main" noChangeAspect="1"/>
@@ -2981,7 +3004,7 @@
               <a:graphicData uri="http://schemas.openxmlformats.org/drawingml/2006/picture">
                 <pic:pic xmlns:pic="http://schemas.openxmlformats.org/drawingml/2006/picture">
                   <pic:nvPicPr>
-                    <pic:cNvPr id="0" name="Picture 4"/>
+                    <pic:cNvPr id="1715014003" name="Picture 4"/>
                     <pic:cNvPicPr>
                       <a:picLocks noChangeAspect="1" noChangeArrowheads="1"/>
                     </pic:cNvPicPr>
@@ -2994,7 +3017,6 @@
                         </a:ext>
                       </a:extLst>
                     </a:blip>
-                    <a:srcRect/>
                     <a:stretch>
                       <a:fillRect/>
                     </a:stretch>
@@ -3002,7 +3024,7 @@
                   <pic:spPr bwMode="auto">
                     <a:xfrm>
                       <a:off x="0" y="0"/>
-                      <a:ext cx="5937250" cy="5549900"/>
+                      <a:ext cx="5932651" cy="5549900"/>
                     </a:xfrm>
                     <a:prstGeom prst="rect">
                       <a:avLst/>
@@ -3147,7 +3169,7 @@
           <w:noProof/>
         </w:rPr>
         <w:drawing>
-          <wp:inline distT="0" distB="0" distL="0" distR="0" wp14:anchorId="231DA530" wp14:editId="554B3E53">
+          <wp:inline distT="0" distB="0" distL="0" distR="0" wp14:anchorId="231DA530" wp14:editId="7A5F6D66">
             <wp:extent cx="5937250" cy="2971800"/>
             <wp:effectExtent l="0" t="0" r="6350" b="0"/>
             <wp:docPr id="1696375601" name="Picture 2"/>
@@ -3235,6 +3257,7 @@
         <w:keepNext/>
         <w:spacing w:line="480" w:lineRule="auto"/>
         <w:ind w:firstLine="720"/>
+        <w:jc w:val="center"/>
       </w:pPr>
       <w:r>
         <w:rPr>
@@ -3242,8 +3265,8 @@
         </w:rPr>
         <w:lastRenderedPageBreak/>
         <w:drawing>
-          <wp:inline distT="0" distB="0" distL="0" distR="0" wp14:anchorId="07AEBEAA" wp14:editId="4B897F84">
-            <wp:extent cx="5441950" cy="4203700"/>
+          <wp:inline distT="0" distB="0" distL="0" distR="0" wp14:anchorId="07AEBEAA" wp14:editId="15EDD4E2">
+            <wp:extent cx="4203700" cy="4203700"/>
             <wp:effectExtent l="0" t="0" r="6350" b="6350"/>
             <wp:docPr id="1927120881" name="Picture 3"/>
             <wp:cNvGraphicFramePr>
@@ -3253,7 +3276,7 @@
               <a:graphicData uri="http://schemas.openxmlformats.org/drawingml/2006/picture">
                 <pic:pic xmlns:pic="http://schemas.openxmlformats.org/drawingml/2006/picture">
                   <pic:nvPicPr>
-                    <pic:cNvPr id="0" name="Picture 3"/>
+                    <pic:cNvPr id="1927120881" name="Picture 3"/>
                     <pic:cNvPicPr>
                       <a:picLocks noChangeAspect="1" noChangeArrowheads="1"/>
                     </pic:cNvPicPr>
@@ -3266,7 +3289,6 @@
                         </a:ext>
                       </a:extLst>
                     </a:blip>
-                    <a:srcRect/>
                     <a:stretch>
                       <a:fillRect/>
                     </a:stretch>
@@ -3274,7 +3296,7 @@
                   <pic:spPr bwMode="auto">
                     <a:xfrm>
                       <a:off x="0" y="0"/>
-                      <a:ext cx="5441950" cy="4203700"/>
+                      <a:ext cx="4203700" cy="4203700"/>
                     </a:xfrm>
                     <a:prstGeom prst="rect">
                       <a:avLst/>
@@ -3402,7 +3424,30 @@
       </w:r>
       <w:r>
         <w:lastRenderedPageBreak/>
-        <w:t>enough to stake human life upon. If a system of this nature were to be deployed, it should use a local model instead – this way if there is a disruption in internet infrastructure – the central command system doesn’t go offline.</w:t>
+        <w:t xml:space="preserve">enough to stake human life upon. If a system of this nature were to be deployed, it should use a local model instead </w:t>
+      </w:r>
+      <w:r>
+        <w:t xml:space="preserve">(for example Llama 4 Scout, </w:t>
+      </w:r>
+      <w:proofErr w:type="spellStart"/>
+      <w:r>
+        <w:t>Minstral</w:t>
+      </w:r>
+      <w:proofErr w:type="spellEnd"/>
+      <w:r>
+        <w:t xml:space="preserve"> Small</w:t>
+      </w:r>
+      <w:r>
+        <w:rPr>
+          <w:rStyle w:val="FootnoteReference"/>
+        </w:rPr>
+        <w:footnoteReference w:id="3"/>
+      </w:r>
+      <w:r>
+        <w:t>)</w:t>
+      </w:r>
+      <w:r>
+        <w:t>– this way if there is a disruption in internet infrastructure – the central command system doesn’t go offline.</w:t>
       </w:r>
     </w:p>
     <w:p>
@@ -5704,6 +5749,33 @@
         </w:rPr>
         <w:t>Running the Agents every 40 steps keep the simulation run time down to a manageable amount of time, as well as saving on token usage.</w:t>
       </w:r>
+    </w:p>
+  </w:footnote>
+  <w:footnote w:id="3">
+    <w:p>
+      <w:pPr>
+        <w:pStyle w:val="FootnoteText"/>
+        <w:rPr>
+          <w:lang w:val="en-CA"/>
+        </w:rPr>
+      </w:pPr>
+      <w:r>
+        <w:rPr>
+          <w:rStyle w:val="FootnoteReference"/>
+        </w:rPr>
+        <w:footnoteRef/>
+      </w:r>
+      <w:r>
+        <w:t xml:space="preserve"> </w:t>
+      </w:r>
+      <w:hyperlink r:id="rId2" w:history="1">
+        <w:r>
+          <w:rPr>
+            <w:rStyle w:val="Hyperlink"/>
+          </w:rPr>
+          <w:t>The Best Open Source and Open-Weight LLM Models to Run Locally in 2026</w:t>
+        </w:r>
+      </w:hyperlink>
     </w:p>
   </w:footnote>
 </w:footnotes>

</xml_diff>

<commit_message>
(update): trimmed down the length of the report.
</commit_message>
<xml_diff>
--- a/Reflective_Synthesis_Paper.docx
+++ b/Reflective_Synthesis_Paper.docx
@@ -197,10 +197,25 @@
         <w:t xml:space="preserve"> We wanted a fast way to provide the system with predictions of where the fire would go next. </w:t>
       </w:r>
       <w:r>
-        <w:t>Assuming we had either a high-altitude aerial view, or at a periodic satellite view, we decided that building a “risk” map of the area would be a good approach. A risk map in our case is a simple binary classification problem for each cell in our simulation – safe or not safe. Semantic Segmentation</w:t>
-      </w:r>
-      <w:r>
-        <w:t xml:space="preserve">, with its ability to classify images on a pixel-by-pixel basis, seemed to be right tool for the job.  With this in mind, we reused the </w:t>
+        <w:t xml:space="preserve">Assuming we had either a high-altitude aerial view, or at a periodic satellite view, </w:t>
+      </w:r>
+      <w:r>
+        <w:t xml:space="preserve">we built a </w:t>
+      </w:r>
+      <w:r>
+        <w:t xml:space="preserve">“risk” map of the area would be a good approach. </w:t>
+      </w:r>
+      <w:r>
+        <w:t xml:space="preserve">This </w:t>
+      </w:r>
+      <w:r>
+        <w:t xml:space="preserve">is a simple binary classification problem for each cell in our simulation. </w:t>
+      </w:r>
+      <w:r>
+        <w:t>W</w:t>
+      </w:r>
+      <w:r>
+        <w:t xml:space="preserve">e reused the </w:t>
       </w:r>
       <w:proofErr w:type="spellStart"/>
       <w:r>
@@ -225,7 +240,10 @@
         <w:t xml:space="preserve"> 2015</w:t>
       </w:r>
       <w:r>
-        <w:t>) built for Project 4, with a few modifications that will be covered in the next section.</w:t>
+        <w:t>) built for Project 4</w:t>
+      </w:r>
+      <w:r>
+        <w:t xml:space="preserve"> here.</w:t>
       </w:r>
     </w:p>
     <w:p>
@@ -242,20 +260,41 @@
           <w:b/>
           <w:bCs/>
         </w:rPr>
+        <w:t>Support Vector Machine:</w:t>
+      </w:r>
+      <w:r>
+        <w:t xml:space="preserve"> Aviation injuries are the primary dangers fire fighters face when fighting wildfires (</w:t>
+      </w:r>
+      <w:r>
+        <w:t>Centers for Disease Control and Prevention</w:t>
+      </w:r>
+      <w:r>
+        <w:t xml:space="preserve"> 2014). NASA </w:t>
+      </w:r>
+      <w:r>
+        <w:t>has shown that UAVs can be effective in this domain</w:t>
+      </w:r>
+      <w:r>
+        <w:t xml:space="preserve"> (Merlin 2009). For this simulation, we trained a Support Vector Machine to control </w:t>
+      </w:r>
+      <w:r>
+        <w:t>the UAVs</w:t>
+      </w:r>
+      <w:r>
+        <w:t xml:space="preserve"> when they </w:t>
+      </w:r>
+      <w:r>
         <w:lastRenderedPageBreak/>
-        <w:t>Support Vector Machine:</w:t>
-      </w:r>
-      <w:r>
-        <w:t xml:space="preserve"> Aviation injuries are the primary dangers fire fighters face when fighting wildfires (</w:t>
-      </w:r>
-      <w:r>
-        <w:t>Centers for Disease Control and Prevention</w:t>
-      </w:r>
-      <w:r>
-        <w:t xml:space="preserve"> 2014). To this end, we imagine this system would work best with UAVs. NASA already has an example of this (Merlin 2009). While these UAVs will take commands from a central command post (much as NASA designed in their paper), we still need them to work independently. For this simulation, we trained a Support Vector Machine to control the navigation of the UAVs when they don’t have a predetermined waypoint. SVM are fast and lightweight, making them ideal for this task. We used SVM</w:t>
-      </w:r>
-      <w:r>
-        <w:t>s in a planetary science context for Project 3.</w:t>
+        <w:t>don’t have a predetermined waypoint. SVM are fast and lightweight, making them ideal for this task. SVM</w:t>
+      </w:r>
+      <w:r>
+        <w:t xml:space="preserve">s </w:t>
+      </w:r>
+      <w:r>
+        <w:t xml:space="preserve">were used </w:t>
+      </w:r>
+      <w:r>
+        <w:t>in a planetary science context for Project 3.</w:t>
       </w:r>
     </w:p>
     <w:p>
@@ -275,7 +314,31 @@
         <w:t>Agentic AI:</w:t>
       </w:r>
       <w:r>
-        <w:t xml:space="preserve"> A Semi-Autonomous command center was needed to provide commands to the UAVs. We chose to build this using an Agentic AI approach. The approach exploits the reasoning and generative abilities of modern Large Language Models (in our case Claude Sonnet 4.5 was used) to prioritize fire fighting activities and generate waypoints for the UAVs. </w:t>
+        <w:t xml:space="preserve"> A Semi-Autonomous command center was needed to provide commands to the UAVs. We chose to build this using </w:t>
+      </w:r>
+      <w:r>
+        <w:t>Agentic AI</w:t>
+      </w:r>
+      <w:r>
+        <w:t xml:space="preserve">. </w:t>
+      </w:r>
+      <w:r>
+        <w:t xml:space="preserve">This </w:t>
+      </w:r>
+      <w:r>
+        <w:t>exploits the reasoning and generative abilities of modern L</w:t>
+      </w:r>
+      <w:r>
+        <w:t xml:space="preserve">LM </w:t>
+      </w:r>
+      <w:r>
+        <w:t xml:space="preserve">to prioritize </w:t>
+      </w:r>
+      <w:r>
+        <w:t>firefighting</w:t>
+      </w:r>
+      <w:r>
+        <w:t xml:space="preserve"> activities and generate waypoints for the UAVs. </w:t>
       </w:r>
       <w:proofErr w:type="spellStart"/>
       <w:r>
@@ -289,36 +352,58 @@
         <w:rPr>
           <w:lang w:val="en-CA"/>
         </w:rPr>
-        <w:t>Han</w:t>
-      </w:r>
-      <w:r>
-        <w:rPr>
-          <w:lang w:val="en-CA"/>
-        </w:rPr>
-        <w:t xml:space="preserve"> 2025)</w:t>
-      </w:r>
-      <w:r>
-        <w:t xml:space="preserve"> was introduced on top of this to allow the system to store long term information about its goals and enhance reasoning abilities. This was based on Project 6, where similar architecture was developed for generating Interactive Fiction environments. We consider the system to be semi-autonomous as well allow the user to pause the system and query/provide new priorities at any time while the simulation is active.</w:t>
-      </w:r>
-    </w:p>
-    <w:p>
-      <w:pPr>
-        <w:pStyle w:val="ListParagraph"/>
-        <w:spacing w:line="480" w:lineRule="auto"/>
-        <w:ind w:left="1080"/>
-      </w:pPr>
+        <w:t>Han 2025)</w:t>
+      </w:r>
+      <w:r>
+        <w:t xml:space="preserve"> was introduced to allow the system to store information about its goals and enhance reasoning abilities.</w:t>
+      </w:r>
+      <w:r>
+        <w:t xml:space="preserve"> A similar approach was used in Project 6</w:t>
+      </w:r>
+      <w:r>
+        <w:t xml:space="preserve">. </w:t>
+      </w:r>
     </w:p>
     <w:p>
       <w:pPr>
         <w:spacing w:line="480" w:lineRule="auto"/>
         <w:ind w:left="720" w:firstLine="360"/>
       </w:pPr>
-      <w:r>
-        <w:t xml:space="preserve">In addition to the above, we originally intended to use a Decision Transformer (Chen 2021) as outlined in Project 5 on Generative AI. However, Decision Transformers require a significant number of expert training examples to make work, as overlapping in many </w:t>
-      </w:r>
-      <w:r>
-        <w:lastRenderedPageBreak/>
-        <w:t>ways with the capabilities of the Agentic AI system. For this reason, we have chosen not to apply that technique on this project.</w:t>
+    </w:p>
+    <w:p>
+      <w:pPr>
+        <w:spacing w:line="480" w:lineRule="auto"/>
+        <w:ind w:left="720" w:firstLine="360"/>
+      </w:pPr>
+      <w:r>
+        <w:t>O</w:t>
+      </w:r>
+      <w:r>
+        <w:t>riginally intended to use a Decision Transformer (Chen 2021) as outlined in Project 5</w:t>
+      </w:r>
+      <w:r>
+        <w:t xml:space="preserve">. </w:t>
+      </w:r>
+      <w:r>
+        <w:t>However, Decision Transformers require a significant number of expert training examples to make work</w:t>
+      </w:r>
+      <w:r>
+        <w:t xml:space="preserve"> which were not available. As such</w:t>
+      </w:r>
+      <w:r>
+        <w:t xml:space="preserve">, </w:t>
+      </w:r>
+      <w:r>
+        <w:t>we did not</w:t>
+      </w:r>
+      <w:r>
+        <w:t xml:space="preserve"> apply that technique</w:t>
+      </w:r>
+      <w:r>
+        <w:t xml:space="preserve"> here</w:t>
+      </w:r>
+      <w:r>
+        <w:t>.</w:t>
       </w:r>
     </w:p>
     <w:p>
@@ -346,11 +431,13 @@
         <w:spacing w:line="480" w:lineRule="auto"/>
       </w:pPr>
       <w:r>
+        <w:t xml:space="preserve"> </w:t>
+      </w:r>
+      <w:r>
         <w:tab/>
-        <w:t>We split the system design into three distinct modules</w:t>
-      </w:r>
-      <w:r>
-        <w:t>, as described below. A visual overview of the system design can be found in Figure 5.</w:t>
+      </w:r>
+      <w:r>
+        <w:t>A visual overview of the system design can be found in Figure 5.</w:t>
       </w:r>
     </w:p>
     <w:p>
@@ -387,7 +474,10 @@
         <w:tab/>
       </w:r>
       <w:r>
-        <w:t xml:space="preserve">This module was responsible for simulating the environment as well as generating “risk predictions” based on the environmental inputs. </w:t>
+        <w:t>This module was responsible for simulating the environment as well as generating “risk predictions” based on the environment</w:t>
+      </w:r>
+      <w:r>
+        <w:t>.</w:t>
       </w:r>
     </w:p>
     <w:p>
@@ -396,7 +486,13 @@
       </w:pPr>
       <w:r>
         <w:tab/>
-        <w:t>Our environment was randomly generated using Perlin Noise, adapting a technique from (</w:t>
+        <w:t xml:space="preserve">Our environment was randomly generated using Perlin Noise, </w:t>
+      </w:r>
+      <w:r>
+        <w:t>adapted from</w:t>
+      </w:r>
+      <w:r>
+        <w:t xml:space="preserve"> (</w:t>
       </w:r>
       <w:r>
         <w:t>Kamble</w:t>
@@ -405,7 +501,13 @@
         <w:t xml:space="preserve"> 2025).</w:t>
       </w:r>
       <w:r>
-        <w:t xml:space="preserve"> We effectively assigned environmental features like grasslands, trees, water, housing, and urban areas to numerical ranges – converting the generated noise into terrain. </w:t>
+        <w:t xml:space="preserve"> We assigned environmental features</w:t>
+      </w:r>
+      <w:r>
+        <w:t xml:space="preserve">: </w:t>
+      </w:r>
+      <w:r>
+        <w:t xml:space="preserve">grasslands, trees, water, housing, and urban areas to numerical ranges. </w:t>
       </w:r>
       <w:r>
         <w:t>Figure 1 shows an example of the terrain this generates.</w:t>
@@ -417,7 +519,14 @@
         <w:ind w:firstLine="720"/>
       </w:pPr>
       <w:r>
-        <w:t>A similar approach was used to generate a static model for wind, computing wind direction based on the output from a separate Perlin Noise iteration. To keep the simulation tractable, we assumed wind to be static once generated.</w:t>
+        <w:lastRenderedPageBreak/>
+        <w:t>A similar approach was used to generate a static model for wind</w:t>
+      </w:r>
+      <w:r>
+        <w:t>.</w:t>
+      </w:r>
+      <w:r>
+        <w:t xml:space="preserve"> To keep the simulation tractable, we assumed wind to be static once generated.</w:t>
       </w:r>
     </w:p>
     <w:p>
@@ -426,7 +535,7 @@
       </w:pPr>
       <w:r>
         <w:tab/>
-        <w:t>We simulated the Wildfire itself using a Stochastic Cellular Automata approach adapted from (</w:t>
+        <w:t>We simulated the Wildfire using a Stochastic Cellular Automata adapted from (</w:t>
       </w:r>
       <w:r>
         <w:t>Ghosh</w:t>
@@ -450,20 +559,37 @@
         <w:t xml:space="preserve"> </w:t>
       </w:r>
       <w:r>
-        <w:t>We begin each simulation by igniting a single “cell” in the automata and letting the fire play out. We used equation 1 to determine the probability of fire spreading from one cell to another. An example run through of the system can be seen in Figure 2.</w:t>
-      </w:r>
-    </w:p>
-    <w:p>
-      <w:pPr>
-        <w:spacing w:line="480" w:lineRule="auto"/>
-      </w:pPr>
-    </w:p>
-    <w:p>
-      <w:pPr>
-        <w:spacing w:line="480" w:lineRule="auto"/>
-      </w:pPr>
-      <w:r>
-        <w:lastRenderedPageBreak/>
+        <w:t xml:space="preserve">We begin each simulation by igniting a single “cell” and letting the fire play out. </w:t>
+      </w:r>
+      <w:r>
+        <w:t>E</w:t>
+      </w:r>
+      <w:r>
+        <w:t xml:space="preserve">quation 1 </w:t>
+      </w:r>
+      <w:r>
+        <w:t>de</w:t>
+      </w:r>
+      <w:r>
+        <w:t>termine</w:t>
+      </w:r>
+      <w:r>
+        <w:t>s</w:t>
+      </w:r>
+      <w:r>
+        <w:t xml:space="preserve"> the probability of fire spreading from one cell to another. An example can be seen in Figure 2.</w:t>
+      </w:r>
+    </w:p>
+    <w:p>
+      <w:pPr>
+        <w:spacing w:line="480" w:lineRule="auto"/>
+      </w:pPr>
+    </w:p>
+    <w:p>
+      <w:pPr>
+        <w:spacing w:line="480" w:lineRule="auto"/>
+      </w:pPr>
+      <w:r>
         <w:t>Equation 1:</w:t>
       </w:r>
     </w:p>
@@ -783,16 +909,29 @@
       </w:pPr>
       <w:r>
         <w:tab/>
-        <w:t>Each burnable cell has a finite amount of fuel associated with it. This fuel is decremented at the end of every step of the simulation. When a cell runs out of fuel, it is converted to ash.</w:t>
-      </w:r>
-    </w:p>
-    <w:p>
-      <w:pPr>
-        <w:spacing w:line="480" w:lineRule="auto"/>
-      </w:pPr>
-      <w:r>
+        <w:t>Each burnable cell has a finite amount of fuel</w:t>
+      </w:r>
+      <w:r>
+        <w:t xml:space="preserve"> which</w:t>
+      </w:r>
+      <w:r>
+        <w:t xml:space="preserve"> decremented at the end of every step</w:t>
+      </w:r>
+      <w:r>
+        <w:t xml:space="preserve">. </w:t>
+      </w:r>
+      <w:r>
+        <w:t>When a cell runs out of fuel, it is converted to ash.</w:t>
+      </w:r>
+    </w:p>
+    <w:p>
+      <w:pPr>
+        <w:spacing w:line="480" w:lineRule="auto"/>
+      </w:pPr>
+      <w:r>
+        <w:lastRenderedPageBreak/>
         <w:tab/>
-        <w:t xml:space="preserve">Finally, one element we felt was missing from previous simulations was the presence of humans in the forested area. Given that humans do sometimes head out into the forest for various work and recreational reasons, we added human agents to the simulation. These human agents are purely stochastic and are considered “casualties” when they </w:t>
+        <w:t xml:space="preserve">Given that humans sometimes head out into the forest for various reasons, we added human agents to the simulation. These human agents are stochastic and are considered “casualties” when they </w:t>
       </w:r>
       <w:r>
         <w:t>encounter</w:t>
@@ -840,14 +979,16 @@
       </w:r>
       <w:proofErr w:type="spellEnd"/>
       <w:r>
-        <w:t xml:space="preserve"> to perform risk prediction. Our primary modification was to alter the bottleneck to use multiple 3x3 convolutional layers instead of a single 1x1 convolution. </w:t>
-      </w:r>
-      <w:r>
-        <w:t xml:space="preserve">We did this as early version showed a tendency to copy the original locations of the </w:t>
-      </w:r>
-      <w:r>
-        <w:lastRenderedPageBreak/>
-        <w:t xml:space="preserve">fire and ignore future locations – it was hoped this this additional complexity would allow it to predict risk status and not simply classify fire. Figure 3 shows a schematic diagram of our </w:t>
+        <w:t xml:space="preserve"> to perform risk prediction. </w:t>
+      </w:r>
+      <w:r>
+        <w:t>We altered</w:t>
+      </w:r>
+      <w:r>
+        <w:t xml:space="preserve"> the bottleneck to use multiple 3x3 convolutional layers instead of a single 1x1 convolution</w:t>
+      </w:r>
+      <w:r>
+        <w:t xml:space="preserve">. Figure 3 shows a schematic diagram of our </w:t>
       </w:r>
       <w:proofErr w:type="spellStart"/>
       <w:r>
@@ -864,16 +1005,52 @@
       </w:pPr>
       <w:r>
         <w:tab/>
-        <w:t>We created a synthetic dataset using output from our simulation. We recorded a random starting point in the simulation, ran the simulation for 20 steps, then recorded the output. The areas in the final image that were still burning or destroyed (but not destroyed in the original image) were used to create a mask. Red Pixels were considered “at risk” areas, while green was considered safe. An example of the results after training can be seen in Figure 4.</w:t>
-      </w:r>
-    </w:p>
-    <w:p>
-      <w:pPr>
-        <w:spacing w:line="480" w:lineRule="auto"/>
-      </w:pPr>
-      <w:r>
-        <w:tab/>
-        <w:t>Our model was trained using the following parameters:</w:t>
+        <w:t xml:space="preserve">We created a synthetic dataset using </w:t>
+      </w:r>
+      <w:r>
+        <w:t>simulation output</w:t>
+      </w:r>
+      <w:r>
+        <w:t xml:space="preserve">. We recorded a random starting point in the simulation, ran </w:t>
+      </w:r>
+      <w:r>
+        <w:t xml:space="preserve">it </w:t>
+      </w:r>
+      <w:r>
+        <w:t xml:space="preserve">for 20 steps, then recorded the output. </w:t>
+      </w:r>
+      <w:r>
+        <w:t>A</w:t>
+      </w:r>
+      <w:r>
+        <w:t>reas in the final image that were still burning or destroyed (but not destroyed in the original image)</w:t>
+      </w:r>
+      <w:r>
+        <w:t xml:space="preserve"> were marked “Risky” in the mask</w:t>
+      </w:r>
+      <w:r>
+        <w:t>. An example of the results after training can be seen in Figure 4.</w:t>
+      </w:r>
+    </w:p>
+    <w:p>
+      <w:pPr>
+        <w:spacing w:line="480" w:lineRule="auto"/>
+      </w:pPr>
+    </w:p>
+    <w:p>
+      <w:pPr>
+        <w:spacing w:line="480" w:lineRule="auto"/>
+        <w:rPr>
+          <w:i/>
+          <w:iCs/>
+        </w:rPr>
+      </w:pPr>
+      <w:r>
+        <w:rPr>
+          <w:i/>
+          <w:iCs/>
+        </w:rPr>
+        <w:t>Model Training Parameters:</w:t>
       </w:r>
     </w:p>
     <w:p>
@@ -1088,6 +1265,7 @@
             <w:rPr>
               <w:rFonts w:ascii="Cambria Math" w:hAnsi="Cambria Math"/>
             </w:rPr>
+            <w:lastRenderedPageBreak/>
             <m:t>loss=0.5*BCELossWithLogitsLoss+0.5*DiceLoss</m:t>
           </m:r>
         </m:oMath>
@@ -1120,37 +1298,22 @@
       </w:r>
       <w:proofErr w:type="spellEnd"/>
       <w:r>
-        <w:t xml:space="preserve"> helps ensure that the overall shape of the output is preserved. Two loss functions were chosen to help mitigate cases where very few pixels would be </w:t>
-      </w:r>
-      <w:r>
-        <w:lastRenderedPageBreak/>
-        <w:t>considered “at risk”.</w:t>
-      </w:r>
-      <w:r>
-        <w:t xml:space="preserve"> Early stopping was used to avoid overfitting. The resulting loss curves can be seen in Figure 7.</w:t>
-      </w:r>
-    </w:p>
-    <w:p>
-      <w:pPr>
-        <w:spacing w:line="480" w:lineRule="auto"/>
-        <w:ind w:firstLine="720"/>
-      </w:pPr>
-    </w:p>
-    <w:p>
-      <w:pPr>
-        <w:spacing w:line="480" w:lineRule="auto"/>
-      </w:pPr>
-      <w:r>
-        <w:tab/>
-        <w:t xml:space="preserve">We evaluated the model using Mean </w:t>
-      </w:r>
-      <w:proofErr w:type="spellStart"/>
-      <w:r>
-        <w:t>IoU</w:t>
-      </w:r>
-      <w:proofErr w:type="spellEnd"/>
-      <w:r>
-        <w:t xml:space="preserve"> and Dice Score:</w:t>
+        <w:t xml:space="preserve"> helps ensure that the overall shape of the output is preserved. </w:t>
+      </w:r>
+      <w:r>
+        <w:t>This helps mitigate class imbalance</w:t>
+      </w:r>
+      <w:r>
+        <w:t>.</w:t>
+      </w:r>
+      <w:r>
+        <w:t xml:space="preserve"> Early stopping was used to avoid overfitting. </w:t>
+      </w:r>
+      <w:r>
+        <w:t>L</w:t>
+      </w:r>
+      <w:r>
+        <w:t>oss curves can be seen in Figure 7.</w:t>
       </w:r>
     </w:p>
     <w:p>
@@ -1387,10 +1550,16 @@
         <w:tab/>
       </w:r>
       <w:r>
-        <w:t>We extrapolate from (Merlin 2009) the potential existence of three classes of UAV</w:t>
-      </w:r>
-      <w:r>
-        <w:t>: Recon (a direct analogue to the UAV in Merlin 2009), Extinguishers equipped to put out fires, and Search and Rescue UAVs that can pick up humans from unsafe areas.</w:t>
+        <w:t xml:space="preserve">We define three UAV types: </w:t>
+      </w:r>
+      <w:r>
+        <w:t xml:space="preserve">Recon (a direct analogue to the UAV in Merlin 2009), Extinguishers equipped to put out fires, and </w:t>
+      </w:r>
+      <w:r>
+        <w:t>SAR</w:t>
+      </w:r>
+      <w:r>
+        <w:t xml:space="preserve"> UAVs that can pick up humans from unsafe areas.</w:t>
       </w:r>
     </w:p>
     <w:p>
@@ -1399,26 +1568,55 @@
       </w:pPr>
       <w:r>
         <w:tab/>
-        <w:t xml:space="preserve">Our UAVs used a hybrid approach of combining deterministic behavior with behavior guided by a machine learning model (an SVM in our instance). When given a waypoint, UAVs proceed directly to the waypoint. If a UAVs primary action can be performed in the cell it is in, it does so automatically. When the UAV does not have a waypoint, it uses the SVM to determine its navigational commands. This approach is </w:t>
-      </w:r>
-      <w:r>
-        <w:t>akin to</w:t>
-      </w:r>
-      <w:r>
-        <w:t xml:space="preserve"> subsumption</w:t>
-      </w:r>
-      <w:r>
-        <w:t xml:space="preserve"> where one behavioral layer </w:t>
+      </w:r>
+      <w:r>
+        <w:t>A</w:t>
+      </w:r>
+      <w:r>
+        <w:t xml:space="preserve"> hybrid approach of combining deterministic behavior with</w:t>
+      </w:r>
+      <w:r>
+        <w:t xml:space="preserve"> an SVM was used</w:t>
+      </w:r>
+      <w:r>
+        <w:t xml:space="preserve">. When given a waypoint, UAVs proceed directly to the waypoint. If a UAVs primary action can be performed in the cell it is in, it does so automatically. </w:t>
+      </w:r>
+      <w:r>
+        <w:t>If it doesn’t</w:t>
+      </w:r>
+      <w:r>
+        <w:t xml:space="preserve"> have a waypoint, the SVM determine</w:t>
+      </w:r>
+      <w:r>
+        <w:t>s</w:t>
+      </w:r>
+      <w:r>
+        <w:t xml:space="preserve"> its </w:t>
+      </w:r>
+      <w:r>
+        <w:t>next</w:t>
+      </w:r>
+      <w:r>
+        <w:t xml:space="preserve"> </w:t>
+      </w:r>
+      <w:r>
+        <w:t>action</w:t>
+      </w:r>
+      <w:r>
+        <w:t xml:space="preserve">. </w:t>
+      </w:r>
+      <w:r>
+        <w:t xml:space="preserve">This is inspired by Subsumption architecture. </w:t>
+      </w:r>
+      <w:r>
+        <w:t>Connell</w:t>
+      </w:r>
+      <w:r>
+        <w:t xml:space="preserve"> 1990 provides </w:t>
       </w:r>
       <w:r>
         <w:lastRenderedPageBreak/>
-        <w:t xml:space="preserve">overrides the ones beneath it. </w:t>
-      </w:r>
-      <w:r>
-        <w:t>Connell</w:t>
-      </w:r>
-      <w:r>
-        <w:t xml:space="preserve"> 1990 provides an in-depth example of this approach</w:t>
+        <w:t>an in-depth example of this approach</w:t>
       </w:r>
       <w:r>
         <w:t>. Figure 8 shows an overview of how these behaviors override each other.</w:t>
@@ -1427,13 +1625,51 @@
     <w:p>
       <w:pPr>
         <w:spacing w:line="480" w:lineRule="auto"/>
+        <w:ind w:firstLine="720"/>
+      </w:pPr>
+      <w:r>
+        <w:t>Cells within UAVs detection radius were used as input. Detection radius varies by UAV.</w:t>
+      </w:r>
+    </w:p>
+    <w:p>
+      <w:pPr>
+        <w:spacing w:line="480" w:lineRule="auto"/>
       </w:pPr>
       <w:r>
         <w:tab/>
-        <w:t xml:space="preserve">We trained the SVM </w:t>
-      </w:r>
-      <w:r>
-        <w:t>in two stages:</w:t>
+      </w:r>
+      <w:r>
+        <w:t>We</w:t>
+      </w:r>
+      <w:r>
+        <w:t xml:space="preserve"> used Monte-Carlo + Q-Learning (</w:t>
+      </w:r>
+      <w:r>
+        <w:t>Watkins</w:t>
+      </w:r>
+      <w:r>
+        <w:t xml:space="preserve"> 1992) to iteratively learn a greedy policy using a Q-Value function.</w:t>
+      </w:r>
+      <w:r>
+        <w:t xml:space="preserve"> </w:t>
+      </w:r>
+      <w:r>
+        <w:t xml:space="preserve">A Random Forest was used to estimate Q-Value function. </w:t>
+      </w:r>
+    </w:p>
+    <w:p>
+      <w:pPr>
+        <w:spacing w:line="480" w:lineRule="auto"/>
+        <w:ind w:firstLine="720"/>
+      </w:pPr>
+      <w:r>
+        <w:t xml:space="preserve">An </w:t>
+      </w:r>
+      <w:r>
+        <w:t>SVM was fitted to the policy generated by this.</w:t>
+      </w:r>
+      <w:r>
+        <w:t xml:space="preserve"> </w:t>
       </w:r>
     </w:p>
     <w:p>
@@ -1442,47 +1678,12 @@
       </w:pPr>
       <w:r>
         <w:tab/>
-        <w:t>First, we used Monte-Carlo + Q-Learning (</w:t>
-      </w:r>
-      <w:r>
-        <w:t>Watkins</w:t>
-      </w:r>
-      <w:r>
-        <w:t xml:space="preserve"> 1992) to iteratively learn a greedy policy using a Q-Value function. This Q-Value function was estimated using a Random Forest. (SVR was rather slow). </w:t>
-      </w:r>
-    </w:p>
-    <w:p>
-      <w:pPr>
-        <w:spacing w:line="480" w:lineRule="auto"/>
-      </w:pPr>
-      <w:r>
-        <w:tab/>
-      </w:r>
-      <w:proofErr w:type="gramStart"/>
-      <w:r>
-        <w:t>Next</w:t>
-      </w:r>
-      <w:proofErr w:type="gramEnd"/>
-      <w:r>
-        <w:t xml:space="preserve"> we used the Q-Value function to support a supervised learning approach where we trained the SVM to approximate the epsilon-greedy policy generated by the training algorithm above.</w:t>
-      </w:r>
-    </w:p>
-    <w:p>
-      <w:pPr>
-        <w:spacing w:line="480" w:lineRule="auto"/>
-      </w:pPr>
-      <w:r>
-        <w:tab/>
-        <w:t xml:space="preserve">Each </w:t>
-      </w:r>
-      <w:r>
-        <w:t>UAV class</w:t>
-      </w:r>
-      <w:r>
-        <w:t xml:space="preserve"> takes in as input the cells </w:t>
-      </w:r>
-      <w:r>
-        <w:t>in the UAVs detection radius. Detection radius varies by UAV. We have three distinct reward functions – one for each class of UAV. Reward function design was inspired by (</w:t>
+      </w:r>
+      <w:r>
+        <w:t>Each UAV class has its own reward function.</w:t>
+      </w:r>
+      <w:r>
+        <w:t xml:space="preserve"> Reward function design was inspired by (</w:t>
       </w:r>
       <w:r>
         <w:t>Yu</w:t>
@@ -1500,7 +1701,7 @@
         <w:t>).</w:t>
       </w:r>
       <w:r>
-        <w:t xml:space="preserve"> Reward function design approach was to divide rewards into Extrinsic or Goal Based parameters and Intrinsic Behavioral Parameters.  Reward functions for each UAV class are listed below:</w:t>
+        <w:t xml:space="preserve"> </w:t>
       </w:r>
     </w:p>
     <w:p>
@@ -1790,7 +1991,6 @@
             <w:rPr>
               <w:rFonts w:ascii="Cambria Math" w:hAnsi="Cambria Math"/>
             </w:rPr>
-            <w:lastRenderedPageBreak/>
             <m:t>reward= -0.5-dist</m:t>
           </m:r>
           <m:d>
@@ -1881,16 +2081,27 @@
     <w:p>
       <w:pPr>
         <w:spacing w:line="480" w:lineRule="auto"/>
+      </w:pPr>
+    </w:p>
+    <w:p>
+      <w:pPr>
+        <w:spacing w:line="480" w:lineRule="auto"/>
         <w:ind w:firstLine="720"/>
       </w:pPr>
       <w:r>
-        <w:t xml:space="preserve">Constants were chosen via intuition with some minor tuning while performing end-to-end testing. Unfortunately, optimizing these constants would require further testing on the full system which would </w:t>
-      </w:r>
-      <w:r>
-        <w:t>be prohibitively</w:t>
-      </w:r>
-      <w:r>
-        <w:t xml:space="preserve"> expensive.</w:t>
+        <w:t xml:space="preserve">Constants were chosen via intuition with minor tuning </w:t>
+      </w:r>
+      <w:r>
+        <w:t xml:space="preserve">during </w:t>
+      </w:r>
+      <w:r>
+        <w:t>end-to-end testing.</w:t>
+      </w:r>
+      <w:r>
+        <w:t xml:space="preserve"> </w:t>
+      </w:r>
+      <w:r>
+        <w:t>Further optimization here requires more end-to-end testing which is prohibitively expensive.</w:t>
       </w:r>
     </w:p>
     <w:p>
@@ -1899,7 +2110,10 @@
         <w:ind w:firstLine="720"/>
       </w:pPr>
       <w:r>
-        <w:t>We performed 10 training rounds. For each training round we collected 100 episodes per agent. After training, we measured the mean reward and standard deviation for each agent, which is listed below:</w:t>
+        <w:t>We performed 10 training rounds</w:t>
+      </w:r>
+      <w:r>
+        <w:t>, 100 episodes per agent. Results are below:</w:t>
       </w:r>
     </w:p>
     <w:p>
@@ -2110,38 +2324,55 @@
         <w:ind w:firstLine="720"/>
       </w:pPr>
       <w:r>
-        <w:t>These results might improve with the application of techniques like Experience Replay, but these have been left for a future project.</w:t>
-      </w:r>
-    </w:p>
-    <w:p>
-      <w:pPr>
-        <w:spacing w:line="480" w:lineRule="auto"/>
-        <w:ind w:firstLine="720"/>
-      </w:pPr>
-      <w:r>
-        <w:t xml:space="preserve">In addition to their own behaviors, the UAVs have functionality intended to facilitate interaction with the Command Module. </w:t>
-      </w:r>
-      <w:r>
-        <w:t xml:space="preserve">UAVs keep a record of all observations / positions / waypoint status for each step. This data is sent to the Command Module by the simulation after an appropriate number of steps have passed. </w:t>
+        <w:t xml:space="preserve">UAVs have functionality to facilitate interaction with the Command Module. </w:t>
+      </w:r>
+      <w:r>
+        <w:t>UAVs keep a record of all observations / positions / waypoint</w:t>
+      </w:r>
+      <w:r>
+        <w:t xml:space="preserve">s </w:t>
+      </w:r>
+      <w:r>
+        <w:t xml:space="preserve">for each step. </w:t>
+      </w:r>
+      <w:r>
+        <w:t>D</w:t>
+      </w:r>
+      <w:r>
+        <w:t xml:space="preserve">ata is sent to the Command Module after an appropriate number of steps have passed. </w:t>
       </w:r>
       <w:r>
         <w:t>UAVs</w:t>
       </w:r>
       <w:r>
-        <w:t xml:space="preserve"> also accept commands from the Command Module (via the simulation) setting new waypoints / sending back to homebase for refueling.</w:t>
-      </w:r>
-    </w:p>
-    <w:p>
-      <w:pPr>
-        <w:spacing w:line="480" w:lineRule="auto"/>
-      </w:pPr>
-      <w:r>
-        <w:lastRenderedPageBreak/>
+        <w:t xml:space="preserve"> accept commands from the Command Module</w:t>
+      </w:r>
+      <w:r>
+        <w:t>.</w:t>
+      </w:r>
+    </w:p>
+    <w:p>
+      <w:pPr>
+        <w:spacing w:line="480" w:lineRule="auto"/>
+      </w:pPr>
+      <w:r>
         <w:tab/>
-        <w:t>To keep the UAVs within the bounds of the simulation, we implemented</w:t>
-      </w:r>
-      <w:r>
-        <w:t xml:space="preserve"> a special “boundary override action”. This action is triggered whenever a UAV reaches the simulation boundary – where it automatically overrides the current input steering it in the opposite direction.</w:t>
+        <w:t xml:space="preserve">To keep the UAVs within </w:t>
+      </w:r>
+      <w:r>
+        <w:t>the grid</w:t>
+      </w:r>
+      <w:r>
+        <w:t>, we implemented</w:t>
+      </w:r>
+      <w:r>
+        <w:t xml:space="preserve"> a special “boundary override</w:t>
+      </w:r>
+      <w:r>
+        <w:t xml:space="preserve"> action” that </w:t>
+      </w:r>
+      <w:r>
+        <w:t>automatically overrides the current input steering it in the opposite direction.</w:t>
       </w:r>
     </w:p>
     <w:p>
@@ -2187,7 +2418,7 @@
         <w:t xml:space="preserve"> Workflow as the basis for our Command Module.</w:t>
       </w:r>
       <w:r>
-        <w:t xml:space="preserve"> We modelled the Command Module as a muti-agent architecture. Figure 6 provides a schematic diagram of the workflow. </w:t>
+        <w:t xml:space="preserve"> Figure 6 provides a schematic diagram of the workflow. </w:t>
       </w:r>
     </w:p>
     <w:p>
@@ -2196,7 +2427,25 @@
       </w:pPr>
       <w:r>
         <w:tab/>
-        <w:t>Each Agent other than the Command Centre Agent (which is more of an interface between the simulation and the Agentic Workflow) keeps a memory of previous interactions which are inserted as part the prompt for each turn. The memory is implemented as a simple deque with max length of 5. In addition, to avoid exceeding the input token limit on our model, we truncate the end of the input. Historical data is fed to the agent in reverse order, so the newest inputs are first and the oldest are last. This way any data that is truncated is related to older interactions rather than newer ones.</w:t>
+        <w:t xml:space="preserve">Each Agent other than the Command Centre Agent keeps a memory of previous interactions which are inserted as part the prompt for each turn. </w:t>
+      </w:r>
+      <w:r>
+        <w:t>M</w:t>
+      </w:r>
+      <w:r>
+        <w:t xml:space="preserve">emory is implemented as a deque. </w:t>
+      </w:r>
+      <w:r>
+        <w:t>To</w:t>
+      </w:r>
+      <w:r>
+        <w:t xml:space="preserve"> avoid exceeding the input token limit on our model, we truncate the input. Historical data is fed to the agent in reverse</w:t>
+      </w:r>
+      <w:r>
+        <w:t xml:space="preserve"> chronological order</w:t>
+      </w:r>
+      <w:r>
+        <w:t>.</w:t>
       </w:r>
     </w:p>
     <w:p>
@@ -2205,22 +2454,65 @@
       </w:pPr>
       <w:r>
         <w:tab/>
-        <w:t>The system tracks long term goals and priorities using a Knowledge Graph, an approach adapted from (</w:t>
+      </w:r>
+      <w:r>
+        <w:t>L</w:t>
+      </w:r>
+      <w:r>
+        <w:t>ong term goals</w:t>
+      </w:r>
+      <w:r>
+        <w:t xml:space="preserve"> (LTG)</w:t>
+      </w:r>
+      <w:r>
+        <w:t xml:space="preserve"> </w:t>
+      </w:r>
+      <w:r>
+        <w:t>are tracked</w:t>
+      </w:r>
+      <w:r>
+        <w:t xml:space="preserve"> using a Knowledge Graph, adapted from (</w:t>
       </w:r>
       <w:r>
         <w:t>Yang</w:t>
       </w:r>
       <w:r>
-        <w:t xml:space="preserve"> 2025). We assume three long term goals in our model: Search and Rescue, Housing Protection, and Fire Fighting. We provide the system with predefined ontology for tracking subgoals of these long-term goals (as seen in Figure 6). </w:t>
-      </w:r>
-    </w:p>
-    <w:p>
-      <w:pPr>
-        <w:spacing w:line="480" w:lineRule="auto"/>
-      </w:pPr>
-      <w:r>
+        <w:t xml:space="preserve"> 2025). We </w:t>
+      </w:r>
+      <w:r>
+        <w:t xml:space="preserve">have three </w:t>
+      </w:r>
+      <w:r>
+        <w:t>LTG’s:</w:t>
+      </w:r>
+      <w:r>
+        <w:t xml:space="preserve"> Search and Rescue, Housing Protection, and Fire Fighting. </w:t>
+      </w:r>
+      <w:r>
+        <w:t xml:space="preserve">Our KG ontology </w:t>
+      </w:r>
+      <w:proofErr w:type="gramStart"/>
+      <w:r>
+        <w:t xml:space="preserve">is </w:t>
+      </w:r>
+      <w:r>
+        <w:t>in</w:t>
+      </w:r>
+      <w:proofErr w:type="gramEnd"/>
+      <w:r>
+        <w:t xml:space="preserve"> Figure 6.</w:t>
+      </w:r>
+      <w:r>
+        <w:t xml:space="preserve"> </w:t>
+      </w:r>
+    </w:p>
+    <w:p>
+      <w:pPr>
+        <w:spacing w:line="480" w:lineRule="auto"/>
+      </w:pPr>
+      <w:r>
+        <w:lastRenderedPageBreak/>
         <w:tab/>
-        <w:t xml:space="preserve">Our Knowledge Graph is implemented using </w:t>
       </w:r>
       <w:proofErr w:type="spellStart"/>
       <w:r>
@@ -2234,7 +2526,18 @@
         <w:footnoteReference w:id="1"/>
       </w:r>
       <w:r>
-        <w:t>, a python library that allows us to create an in-memory Graph Database. We created a wrapper around this that exposes tools for the Agents to add/remove/query various entities and relationships from the graph as needed.</w:t>
+        <w:t xml:space="preserve"> was used for </w:t>
+      </w:r>
+      <w:proofErr w:type="spellStart"/>
+      <w:r>
+        <w:t>GraphDB</w:t>
+      </w:r>
+      <w:proofErr w:type="spellEnd"/>
+      <w:r>
+        <w:t>. We created tools for the Agents to add/remove/query entities and relationships from the graph</w:t>
+      </w:r>
+      <w:r>
+        <w:t>.</w:t>
       </w:r>
     </w:p>
     <w:p>
@@ -2242,13 +2545,6 @@
         <w:spacing w:line="480" w:lineRule="auto"/>
         <w:ind w:firstLine="720"/>
       </w:pPr>
-      <w:r>
-        <w:lastRenderedPageBreak/>
-        <w:t>Our workflow consisted of the following agents</w:t>
-      </w:r>
-      <w:r>
-        <w:t>:</w:t>
-      </w:r>
     </w:p>
     <w:tbl>
       <w:tblPr>
@@ -2346,6 +2642,9 @@
               <w:spacing w:line="480" w:lineRule="auto"/>
               <w:cnfStyle w:val="000000000000" w:firstRow="0" w:lastRow="0" w:firstColumn="0" w:lastColumn="0" w:oddVBand="0" w:evenVBand="0" w:oddHBand="0" w:evenHBand="0" w:firstRowFirstColumn="0" w:firstRowLastColumn="0" w:lastRowFirstColumn="0" w:lastRowLastColumn="0"/>
             </w:pPr>
+            <w:r>
+              <w:t>None</w:t>
+            </w:r>
           </w:p>
         </w:tc>
       </w:tr>
@@ -2373,11 +2672,13 @@
               <w:spacing w:line="480" w:lineRule="auto"/>
               <w:cnfStyle w:val="000000000000" w:firstRow="0" w:lastRow="0" w:firstColumn="0" w:lastColumn="0" w:oddVBand="0" w:evenVBand="0" w:oddHBand="0" w:evenHBand="0" w:firstRowFirstColumn="0" w:firstRowLastColumn="0" w:lastRowFirstColumn="0" w:lastRowLastColumn="0"/>
             </w:pPr>
-            <w:r>
-              <w:t xml:space="preserve">This agent is responsible for </w:t>
-            </w:r>
-            <w:r>
-              <w:t>developing and tracking global strategy – which areas and activities should be focused on, which can be deprioritized. It generates a collection of Activities each with a priority attached to them.</w:t>
+            <w:proofErr w:type="gramStart"/>
+            <w:r>
+              <w:t>Generates</w:t>
+            </w:r>
+            <w:proofErr w:type="gramEnd"/>
+            <w:r>
+              <w:t xml:space="preserve"> Subgoals for LTGs</w:t>
             </w:r>
           </w:p>
         </w:tc>
@@ -2391,7 +2692,7 @@
               <w:cnfStyle w:val="000000000000" w:firstRow="0" w:lastRow="0" w:firstColumn="0" w:lastColumn="0" w:oddVBand="0" w:evenVBand="0" w:oddHBand="0" w:evenHBand="0" w:firstRowFirstColumn="0" w:firstRowLastColumn="0" w:lastRowFirstColumn="0" w:lastRowLastColumn="0"/>
             </w:pPr>
             <w:r>
-              <w:t>Has full read/write access to the underlying Knowledge Graph.</w:t>
+              <w:t xml:space="preserve">Read/Write </w:t>
             </w:r>
           </w:p>
         </w:tc>
@@ -2421,7 +2722,19 @@
               <w:cnfStyle w:val="000000000000" w:firstRow="0" w:lastRow="0" w:firstColumn="0" w:lastColumn="0" w:oddVBand="0" w:evenVBand="0" w:oddHBand="0" w:evenHBand="0" w:firstRowFirstColumn="0" w:firstRowLastColumn="0" w:lastRowFirstColumn="0" w:lastRowLastColumn="0"/>
             </w:pPr>
             <w:r>
-              <w:t>The Dispatch Agent translates the activities and priority list generated by the Strategy Agent into waypoints to send the UAVs.</w:t>
+              <w:t>Translate</w:t>
+            </w:r>
+            <w:r>
+              <w:t xml:space="preserve"> </w:t>
+            </w:r>
+            <w:r>
+              <w:t>t</w:t>
+            </w:r>
+            <w:r>
+              <w:t xml:space="preserve">he activities and priority list generated by the Strategy Agent </w:t>
+            </w:r>
+            <w:r>
+              <w:t>UAV Commands</w:t>
             </w:r>
           </w:p>
         </w:tc>
@@ -2435,7 +2748,7 @@
               <w:cnfStyle w:val="000000000000" w:firstRow="0" w:lastRow="0" w:firstColumn="0" w:lastColumn="0" w:oddVBand="0" w:evenVBand="0" w:oddHBand="0" w:evenHBand="0" w:firstRowFirstColumn="0" w:firstRowLastColumn="0" w:lastRowFirstColumn="0" w:lastRowLastColumn="0"/>
             </w:pPr>
             <w:r>
-              <w:t>Has Read only access to the underlying Knowledge Graph</w:t>
+              <w:t>Read</w:t>
             </w:r>
           </w:p>
         </w:tc>
@@ -2451,7 +2764,6 @@
               <w:spacing w:line="480" w:lineRule="auto"/>
             </w:pPr>
             <w:r>
-              <w:lastRenderedPageBreak/>
               <w:t>Assistant Agent</w:t>
             </w:r>
           </w:p>
@@ -2466,23 +2778,22 @@
               <w:cnfStyle w:val="000000000000" w:firstRow="0" w:lastRow="0" w:firstColumn="0" w:lastColumn="0" w:oddVBand="0" w:evenVBand="0" w:oddHBand="0" w:evenHBand="0" w:firstRowFirstColumn="0" w:firstRowLastColumn="0" w:lastRowFirstColumn="0" w:lastRowLastColumn="0"/>
             </w:pPr>
             <w:r>
-              <w:t xml:space="preserve">The Assistant Agent responds to user queries and </w:t>
-            </w:r>
-            <w:proofErr w:type="gramStart"/>
-            <w:r>
-              <w:t>update</w:t>
-            </w:r>
-            <w:proofErr w:type="gramEnd"/>
+              <w:t>R</w:t>
+            </w:r>
+            <w:r>
+              <w:t xml:space="preserve">esponds to user queries and </w:t>
+            </w:r>
+            <w:r>
+              <w:t>updates</w:t>
+            </w:r>
             <w:r>
               <w:t xml:space="preserve"> the </w:t>
             </w:r>
-            <w:proofErr w:type="gramStart"/>
-            <w:r>
-              <w:t>Long Term</w:t>
-            </w:r>
-            <w:proofErr w:type="gramEnd"/>
-            <w:r>
-              <w:t xml:space="preserve"> Goals in the Knowledge Graph as needed.</w:t>
+            <w:r>
+              <w:t>LTG</w:t>
+            </w:r>
+            <w:r>
+              <w:t xml:space="preserve"> in the Knowledge Graph as needed.</w:t>
             </w:r>
           </w:p>
         </w:tc>
@@ -2496,7 +2807,7 @@
               <w:cnfStyle w:val="000000000000" w:firstRow="0" w:lastRow="0" w:firstColumn="0" w:lastColumn="0" w:oddVBand="0" w:evenVBand="0" w:oddHBand="0" w:evenHBand="0" w:firstRowFirstColumn="0" w:firstRowLastColumn="0" w:lastRowFirstColumn="0" w:lastRowLastColumn="0"/>
             </w:pPr>
             <w:r>
-              <w:t>Has full read/write access.</w:t>
+              <w:t>Read/Write</w:t>
             </w:r>
           </w:p>
         </w:tc>
@@ -2506,19 +2817,6 @@
       <w:pPr>
         <w:spacing w:line="480" w:lineRule="auto"/>
       </w:pPr>
-    </w:p>
-    <w:p>
-      <w:pPr>
-        <w:spacing w:line="480" w:lineRule="auto"/>
-      </w:pPr>
-      <w:r>
-        <w:t>System prompts for each agent have been included in the Appendix.</w:t>
-      </w:r>
-    </w:p>
-    <w:p>
-      <w:pPr>
-        <w:spacing w:line="480" w:lineRule="auto"/>
-      </w:pPr>
       <w:r>
         <w:tab/>
       </w:r>
@@ -2529,7 +2827,7 @@
         <w:ind w:firstLine="360"/>
       </w:pPr>
       <w:r>
-        <w:t>An outline of how this was integrated with the rest of the simulation is as follows:</w:t>
+        <w:t>Integration worked as follows:</w:t>
       </w:r>
     </w:p>
     <w:p>
@@ -2542,6 +2840,7 @@
         <w:spacing w:line="480" w:lineRule="auto"/>
       </w:pPr>
       <w:r>
+        <w:lastRenderedPageBreak/>
         <w:t>On the first step and every 40-simulation step afterwards</w:t>
       </w:r>
       <w:r>
@@ -2551,7 +2850,10 @@
         <w:footnoteReference w:id="2"/>
       </w:r>
       <w:r>
-        <w:t xml:space="preserve">, the simulation calls the Command Center Agent. The simulation provides the recent history of each UAV, a screenshot of the current area, as well as the image mask generated by Fire Prediction </w:t>
+        <w:t>, the simulation calls the Command Center Agent. The simulation provides the recent history of each UAV, a screenshot of the current area,</w:t>
+      </w:r>
+      <w:r>
+        <w:t xml:space="preserve"> and output from the </w:t>
       </w:r>
       <w:proofErr w:type="spellStart"/>
       <w:r>
@@ -2559,7 +2861,10 @@
       </w:r>
       <w:proofErr w:type="spellEnd"/>
       <w:r>
-        <w:t xml:space="preserve"> model.</w:t>
+        <w:t xml:space="preserve"> model</w:t>
+      </w:r>
+      <w:r>
+        <w:t>.</w:t>
       </w:r>
     </w:p>
     <w:p>
@@ -2572,7 +2877,10 @@
         <w:spacing w:line="480" w:lineRule="auto"/>
       </w:pPr>
       <w:r>
-        <w:t>On the first invocation of the Command Center Agent, and every 5 iterations afterwards, the Strategy Agent is invoked to update the long-term priorities. The Strategy Agent takes in all the input given to the Command Center Agent, updates the Knowledge Graph, and produces a new set of priorities.</w:t>
+        <w:t xml:space="preserve">On the first invocation of the Command Center Agent, and every 5 iterations afterwards, the Strategy Agent is invoked to update </w:t>
+      </w:r>
+      <w:r>
+        <w:t>LTGs.</w:t>
       </w:r>
     </w:p>
     <w:p>
@@ -2585,7 +2893,19 @@
         <w:spacing w:line="480" w:lineRule="auto"/>
       </w:pPr>
       <w:r>
-        <w:t>The most recently collected set of priorities, as well as the input, are sent to the Dispatcher Agent. The dispatch agent reads any additional information it needs from the Knowledge Graph and produces a new waypoint for each UAV under its control. A reason for each command provided.</w:t>
+        <w:t xml:space="preserve">The most </w:t>
+      </w:r>
+      <w:r>
+        <w:t>recent</w:t>
+      </w:r>
+      <w:r>
+        <w:t xml:space="preserve"> priorities</w:t>
+      </w:r>
+      <w:r>
+        <w:t xml:space="preserve"> and inputs</w:t>
+      </w:r>
+      <w:r>
+        <w:t xml:space="preserve"> are sent to the Dispatcher Agent. The dispatch agent produces a new waypoint for each UAV under its control. A reason for each command provided.</w:t>
       </w:r>
     </w:p>
     <w:p>
@@ -2598,13 +2918,11 @@
         <w:spacing w:line="480" w:lineRule="auto"/>
       </w:pPr>
       <w:r>
-        <w:t>These commands are passed on to the UAVs in the simulation, who update their state. The simulation then proceeds as normal.</w:t>
-      </w:r>
-    </w:p>
-    <w:p>
-      <w:pPr>
-        <w:spacing w:line="480" w:lineRule="auto"/>
-      </w:pPr>
+        <w:t>These commands are passed on to the UAV</w:t>
+      </w:r>
+      <w:r>
+        <w:t>s.</w:t>
+      </w:r>
     </w:p>
     <w:p>
       <w:pPr>
@@ -2612,15 +2930,28 @@
         <w:ind w:firstLine="360"/>
       </w:pPr>
       <w:r>
-        <w:t xml:space="preserve">At any given time, the Operator can interrupt the simulation while it is running to query the current state of the Knowledge Graph or provide new priorities. These queries are </w:t>
-      </w:r>
-      <w:proofErr w:type="gramStart"/>
-      <w:r>
-        <w:t>routed</w:t>
-      </w:r>
-      <w:proofErr w:type="gramEnd"/>
-      <w:r>
-        <w:t xml:space="preserve"> to the Assistant Agent, which is responsible for providing answers to user questions and making updates to the Knowledge Graph on their behalf.</w:t>
+        <w:t xml:space="preserve">The </w:t>
+      </w:r>
+      <w:r>
+        <w:t>Operator can interrupt the simulation while it is running to query the current state. These queries are routed to the Assistant Agent, which</w:t>
+      </w:r>
+      <w:r>
+        <w:t xml:space="preserve"> answers questions </w:t>
+      </w:r>
+      <w:r>
+        <w:t>and mak</w:t>
+      </w:r>
+      <w:r>
+        <w:t>es</w:t>
+      </w:r>
+      <w:r>
+        <w:t xml:space="preserve"> updates to the Knowledge Graph </w:t>
+      </w:r>
+      <w:r>
+        <w:t>as needed</w:t>
+      </w:r>
+      <w:r>
+        <w:t>.</w:t>
       </w:r>
     </w:p>
     <w:p>
@@ -2629,16 +2960,7 @@
       </w:pPr>
       <w:r>
         <w:tab/>
-        <w:t>The simulation ends either after 750 steps, or when all fire has been extinguished. At the end of the simulation, a video is saved for further review.</w:t>
-      </w:r>
-    </w:p>
-    <w:p>
-      <w:pPr>
-        <w:spacing w:line="480" w:lineRule="auto"/>
-      </w:pPr>
-      <w:r>
-        <w:tab/>
-        <w:t>Qualitative and Quantitative results will be covered in the Evaluation and Reflection section.</w:t>
+        <w:t xml:space="preserve">The simulation ends either after 750 steps, or when all fire has been extinguished. </w:t>
       </w:r>
     </w:p>
     <w:p>
@@ -2908,7 +3230,7 @@
         </w:rPr>
         <w:lastRenderedPageBreak/>
         <w:drawing>
-          <wp:inline distT="0" distB="0" distL="0" distR="0" wp14:anchorId="5A99DB7D" wp14:editId="39F4D898">
+          <wp:inline distT="0" distB="0" distL="0" distR="0" wp14:anchorId="5A99DB7D" wp14:editId="15FA4CFC">
             <wp:extent cx="5941060" cy="6047105"/>
             <wp:effectExtent l="0" t="0" r="2540" b="0"/>
             <wp:docPr id="1561439249" name="Picture 5"/>
@@ -3169,7 +3491,7 @@
           <w:noProof/>
         </w:rPr>
         <w:drawing>
-          <wp:inline distT="0" distB="0" distL="0" distR="0" wp14:anchorId="231DA530" wp14:editId="7A5F6D66">
+          <wp:inline distT="0" distB="0" distL="0" distR="0" wp14:anchorId="231DA530" wp14:editId="43B87200">
             <wp:extent cx="5937250" cy="2971800"/>
             <wp:effectExtent l="0" t="0" r="6350" b="0"/>
             <wp:docPr id="1696375601" name="Picture 2"/>
@@ -3360,13 +3682,31 @@
         <w:ind w:left="720" w:firstLine="720"/>
       </w:pPr>
       <w:r>
-        <w:t xml:space="preserve">While, as previously pointed out, fighting wildfires is a dangerous occupation, it is still an occupation that provides employment. A fully automated system fighting fires in place of human beings would displace this group, potentially leaving them without a comparable source of income. This is not an intended outcome of this framework. It would </w:t>
-      </w:r>
-      <w:r>
-        <w:t xml:space="preserve">be </w:t>
-      </w:r>
-      <w:r>
-        <w:t>better if any system based on this or similar frameworks were used to extend the reach of already existing human resources – augmenting their fire fighting abilities rather than replacing it.</w:t>
+        <w:t>While</w:t>
+      </w:r>
+      <w:r>
+        <w:t xml:space="preserve"> fighting wildfires is a dangerous occupation, it </w:t>
+      </w:r>
+      <w:r>
+        <w:t>still provides</w:t>
+      </w:r>
+      <w:r>
+        <w:t xml:space="preserve"> employment. </w:t>
+      </w:r>
+      <w:r>
+        <w:t>Replacing these workers could leave</w:t>
+      </w:r>
+      <w:r>
+        <w:t xml:space="preserve"> them without a comparable source of income. This is not an intended outcome of this framework. </w:t>
+      </w:r>
+      <w:r>
+        <w:t>This work and similar work should</w:t>
+      </w:r>
+      <w:r>
+        <w:t xml:space="preserve"> </w:t>
+      </w:r>
+      <w:r>
+        <w:t>augment human abilities.</w:t>
       </w:r>
     </w:p>
     <w:p>
@@ -3375,11 +3715,154 @@
         <w:ind w:left="720"/>
       </w:pPr>
       <w:r>
+        <w:tab/>
+      </w:r>
+      <w:r>
+        <w:t xml:space="preserve">We do not recommend extending this system to be fully autonomous. </w:t>
+      </w:r>
+      <w:r>
+        <w:t xml:space="preserve">Agents </w:t>
+      </w:r>
+      <w:r>
+        <w:t>can sometimes fixate on unexpected things. An Agent that continues to search for a dead human while ignoring others (as happened during testing) is not a desirable situation.</w:t>
+      </w:r>
+    </w:p>
+    <w:p>
+      <w:pPr>
+        <w:spacing w:line="480" w:lineRule="auto"/>
+        <w:ind w:left="720"/>
+      </w:pPr>
+      <w:r>
+        <w:tab/>
+      </w:r>
+      <w:r>
+        <w:t>A</w:t>
+      </w:r>
+      <w:r>
+        <w:t>ssumptions were made during testing that may</w:t>
+      </w:r>
+      <w:r>
+        <w:t xml:space="preserve"> not be realistic</w:t>
+      </w:r>
+      <w:r>
+        <w:t xml:space="preserve">. </w:t>
+      </w:r>
+    </w:p>
+    <w:p>
+      <w:pPr>
+        <w:spacing w:line="480" w:lineRule="auto"/>
+        <w:ind w:left="720"/>
+      </w:pPr>
+      <w:r>
         <w:lastRenderedPageBreak/>
+        <w:t xml:space="preserve">Examples: </w:t>
+      </w:r>
+      <w:r>
+        <w:t xml:space="preserve"> </w:t>
+      </w:r>
+    </w:p>
+    <w:p>
+      <w:pPr>
+        <w:pStyle w:val="ListParagraph"/>
+        <w:numPr>
+          <w:ilvl w:val="0"/>
+          <w:numId w:val="7"/>
+        </w:numPr>
+        <w:spacing w:line="480" w:lineRule="auto"/>
+      </w:pPr>
+      <w:r>
+        <w:t>S</w:t>
+      </w:r>
+      <w:r>
+        <w:t xml:space="preserve">tatic wind field. Wind is </w:t>
+      </w:r>
+      <w:r>
+        <w:t>rarely</w:t>
+      </w:r>
+      <w:r>
+        <w:t xml:space="preserve"> static. We assumed reliable aerial views of the fire. </w:t>
+      </w:r>
+    </w:p>
+    <w:p>
+      <w:pPr>
+        <w:pStyle w:val="ListParagraph"/>
+        <w:numPr>
+          <w:ilvl w:val="0"/>
+          <w:numId w:val="7"/>
+        </w:numPr>
+        <w:spacing w:line="480" w:lineRule="auto"/>
+      </w:pPr>
+      <w:r>
+        <w:t xml:space="preserve">Firefighting and </w:t>
+      </w:r>
+      <w:r>
+        <w:t>SAR</w:t>
+      </w:r>
+      <w:r>
+        <w:t xml:space="preserve"> drones could be built reliably. Furthermore, especially for </w:t>
+      </w:r>
+      <w:r>
+        <w:t>SAR</w:t>
+      </w:r>
+      <w:r>
+        <w:t>, a human presence is preferable to deal with first-aid or psychological distress that might occur during a</w:t>
+      </w:r>
+      <w:r>
+        <w:t xml:space="preserve">n </w:t>
+      </w:r>
+      <w:r>
+        <w:t>emergency.</w:t>
+      </w:r>
+    </w:p>
+    <w:p>
+      <w:pPr>
+        <w:spacing w:line="480" w:lineRule="auto"/>
+        <w:ind w:left="720"/>
+      </w:pPr>
+      <w:r>
         <w:tab/>
       </w:r>
       <w:r>
-        <w:t>We also do not recommend extending this system to be fully autonomous. As shown even in the data already collected, Agents (and the LLMs that power them) can sometimes fixate on unexpected things. An Agent that continues to search for a long dead human while ignoring others that may be in danger (as happened a few times during testing) is not a desirable situation.</w:t>
+        <w:t>W</w:t>
+      </w:r>
+      <w:r>
+        <w:t xml:space="preserve">ho is responsible for loss of life / property damage that may occur due to a system like this? </w:t>
+      </w:r>
+      <w:r>
+        <w:t>A</w:t>
+      </w:r>
+      <w:r>
+        <w:t xml:space="preserve"> malfunction or a choice</w:t>
+      </w:r>
+      <w:r>
+        <w:t xml:space="preserve"> could </w:t>
+      </w:r>
+      <w:r>
+        <w:t>lead to</w:t>
+      </w:r>
+      <w:r>
+        <w:t xml:space="preserve"> loss of life or property. </w:t>
+      </w:r>
+      <w:r>
+        <w:t>W</w:t>
+      </w:r>
+      <w:r>
+        <w:t xml:space="preserve">e left in the human-in-the-loop option to override the system, but people </w:t>
+      </w:r>
+      <w:r>
+        <w:t xml:space="preserve">will still defer to the computer, especially when stressed. Protocols will need to </w:t>
+      </w:r>
+      <w:r>
+        <w:t>be</w:t>
+      </w:r>
+      <w:r>
+        <w:t xml:space="preserve"> in place to review </w:t>
+      </w:r>
+      <w:r>
+        <w:t xml:space="preserve">the </w:t>
+      </w:r>
+      <w:r>
+        <w:t>reasoning presented by the system to ensure they meet the expected standards.</w:t>
       </w:r>
     </w:p>
     <w:p>
@@ -3389,42 +3872,25 @@
       </w:pPr>
       <w:r>
         <w:tab/>
-      </w:r>
-      <w:r>
-        <w:t>Many assumptions were made during testing that may not hold up in the real world – or would at least require additional testing. For example, for simplicities sake, we assumed a static wind field. Wind is rarely, if ever, static. We assumed we could obtain reliable aerial views of the fire. We assumed that reliable Firefighting and search and rescue drones could be built reliably. This may not be the case. Furthermore, especially for search and rescue, a human presence is likely preferable to deal with any first-aid or psychological distress that might occur during a potential emergency.</w:t>
-      </w:r>
-    </w:p>
-    <w:p>
-      <w:pPr>
-        <w:spacing w:line="480" w:lineRule="auto"/>
-        <w:ind w:left="720"/>
-      </w:pPr>
-      <w:r>
-        <w:tab/>
-        <w:t xml:space="preserve">Another concern to consider is who is responsible for loss of life / property damage that may occur due to reliance on a system like this? If it malfunctions or makes a choice between priorities that we might not agree with causing loss of life or property – someone will need to be held accountable. </w:t>
-      </w:r>
-      <w:r>
-        <w:t>It’s</w:t>
-      </w:r>
-      <w:r>
-        <w:t xml:space="preserve"> for this reason we left in the human-in-the-loop option to override the system, but many people </w:t>
-      </w:r>
-      <w:r>
-        <w:t>will still defer to the computer, especially when they are stressed. This could result in costly, but potentially avoidable mistakes. Protocols will need to put in place to review the plans and reasoning presented by the system to ensure they meet the expected standards, even in life and death situations.</w:t>
-      </w:r>
-    </w:p>
-    <w:p>
-      <w:pPr>
-        <w:spacing w:line="480" w:lineRule="auto"/>
-        <w:ind w:left="720"/>
-      </w:pPr>
-      <w:r>
-        <w:tab/>
-        <w:t xml:space="preserve">Our setup used a remote model – Anthropic Claude Sonnet 4.5. This was sufficient for our purposes, but in a real scenario internet will likely not be reliable </w:t>
-      </w:r>
-      <w:r>
-        <w:lastRenderedPageBreak/>
-        <w:t xml:space="preserve">enough to stake human life upon. If a system of this nature were to be deployed, it should use a local model instead </w:t>
+        <w:t>Our setup used a remote model – Anthropic Claude Sonnet 4.5. This was sufficient for our purposes</w:t>
+      </w:r>
+      <w:r>
+        <w:t>. Infrastructure may not be reliable in a realistic scenario</w:t>
+      </w:r>
+      <w:r>
+        <w:t xml:space="preserve">. </w:t>
+      </w:r>
+      <w:r>
+        <w:t>A</w:t>
+      </w:r>
+      <w:r>
+        <w:t xml:space="preserve"> local model </w:t>
+      </w:r>
+      <w:r>
+        <w:t>should be used</w:t>
+      </w:r>
+      <w:r>
+        <w:t xml:space="preserve"> </w:t>
       </w:r>
       <w:r>
         <w:t xml:space="preserve">(for example Llama 4 Scout, </w:t>
@@ -3447,7 +3913,13 @@
         <w:t>)</w:t>
       </w:r>
       <w:r>
-        <w:t>– this way if there is a disruption in internet infrastructure – the central command system doesn’t go offline.</w:t>
+        <w:t xml:space="preserve"> so the system is independent of local </w:t>
+      </w:r>
+      <w:r>
+        <w:t>infrastructure</w:t>
+      </w:r>
+      <w:r>
+        <w:t>.</w:t>
       </w:r>
     </w:p>
     <w:p>
@@ -3477,13 +3949,7 @@
         <w:ind w:firstLine="720"/>
       </w:pPr>
       <w:r>
-        <w:t>We ran five end to end tests on the current version of the system. (More tests were run on previous iterations to fine-tune the system)</w:t>
-      </w:r>
-      <w:r>
-        <w:t>.</w:t>
-      </w:r>
-      <w:r>
-        <w:t xml:space="preserve"> Despite the stochastic nature of the system, we kept the number of tests low as running the system with an appropriate model was cost prohibitive. </w:t>
+        <w:t xml:space="preserve">We ran five end to end tests on the current version of the system. Despite the stochastic nature of the system, we kept the number of tests low as running the system with an appropriate model was cost prohibitive. </w:t>
       </w:r>
     </w:p>
     <w:p>
@@ -3492,7 +3958,13 @@
         <w:ind w:firstLine="720"/>
       </w:pPr>
       <w:r>
-        <w:t>For each test we tracked the number of steps taken (up to a maximum of 750), number of humans still active in the forest, and number of humans rescued. We also tracked the final number of burning tiles once the simulation was completed. These results are summarized in the table below.</w:t>
+        <w:t>Each test ran for maximum of 750 steps.</w:t>
+      </w:r>
+      <w:r>
+        <w:t xml:space="preserve"> </w:t>
+      </w:r>
+      <w:r>
+        <w:t>We recorded video and output logs for each simulation.</w:t>
       </w:r>
     </w:p>
     <w:p>
@@ -3968,11 +4440,34 @@
         <w:ind w:firstLine="720"/>
       </w:pPr>
       <w:r>
-        <w:lastRenderedPageBreak/>
-        <w:t>We notice that in experiment 2 the system obtained significantly better performance than the others.</w:t>
-      </w:r>
-      <w:r>
-        <w:t xml:space="preserve"> In this experiment we had a bit of a lucky start in that the fire ignited near enough to home base that the Extinguishers were able to reach and put out the fire before it could spread.</w:t>
+        <w:t xml:space="preserve">Reviewing </w:t>
+      </w:r>
+      <w:r>
+        <w:t>the video for experiment 2</w:t>
+      </w:r>
+      <w:r>
+        <w:t xml:space="preserve"> </w:t>
+      </w:r>
+      <w:r>
+        <w:t>noticed</w:t>
+      </w:r>
+      <w:r>
+        <w:t xml:space="preserve"> that the system obtained better performance than the others.</w:t>
+      </w:r>
+      <w:r>
+        <w:t xml:space="preserve"> </w:t>
+      </w:r>
+      <w:r>
+        <w:t>Our video shows</w:t>
+      </w:r>
+      <w:r>
+        <w:t xml:space="preserve"> we had a lucky start in that the fire ignited near enough to home base</w:t>
+      </w:r>
+      <w:r>
+        <w:t xml:space="preserve"> allowing the fire to be put out unusually quickly</w:t>
+      </w:r>
+      <w:r>
+        <w:t>.</w:t>
       </w:r>
     </w:p>
     <w:p>
@@ -3980,20 +4475,54 @@
         <w:spacing w:line="480" w:lineRule="auto"/>
         <w:ind w:firstLine="720"/>
       </w:pPr>
+      <w:r>
+        <w:t xml:space="preserve">This </w:t>
+      </w:r>
+      <w:r>
+        <w:t xml:space="preserve">data collected is not representative of a full picture of what this system is capable of. These runs primarily give us qualitative information on the </w:t>
+      </w:r>
+      <w:r>
+        <w:t>systems’</w:t>
+      </w:r>
+      <w:r>
+        <w:t xml:space="preserve"> failure modes rather than a full picture of the system.</w:t>
+      </w:r>
     </w:p>
     <w:p>
       <w:pPr>
         <w:spacing w:line="480" w:lineRule="auto"/>
         <w:ind w:firstLine="720"/>
       </w:pPr>
-      <w:r>
-        <w:t>Each experiment also resulted in a video file. After reviewing the video files, we noticed the following behavior patterns:</w:t>
-      </w:r>
-    </w:p>
-    <w:p>
-      <w:pPr>
-        <w:spacing w:line="480" w:lineRule="auto"/>
-      </w:pPr>
+    </w:p>
+    <w:p>
+      <w:pPr>
+        <w:spacing w:line="480" w:lineRule="auto"/>
+        <w:rPr>
+          <w:i/>
+          <w:iCs/>
+        </w:rPr>
+      </w:pPr>
+      <w:r>
+        <w:rPr>
+          <w:i/>
+          <w:iCs/>
+        </w:rPr>
+        <w:t>Observations</w:t>
+      </w:r>
+      <w:r>
+        <w:rPr>
+          <w:i/>
+          <w:iCs/>
+        </w:rPr>
+        <w:t xml:space="preserve"> based on videos</w:t>
+      </w:r>
+      <w:r>
+        <w:rPr>
+          <w:i/>
+          <w:iCs/>
+        </w:rPr>
+        <w:t>:</w:t>
+      </w:r>
     </w:p>
     <w:tbl>
       <w:tblPr>
@@ -4022,7 +4551,7 @@
                 <w:b w:val="0"/>
                 <w:bCs w:val="0"/>
               </w:rPr>
-              <w:t>Firefighting UAVs can efficiently fight the fire in their assigned area but will ignore any fire nearby. This could be an artifact of their reward function which punishes them from going too far away from their last assigned waypoint. This results in fire that sometimes spreads further than might otherwise be expected.</w:t>
+              <w:t>Firefighting UAVs fight the fire in their area but will ignore any fire nearby</w:t>
             </w:r>
           </w:p>
         </w:tc>
@@ -4065,77 +4594,57 @@
               </w:rPr>
               <w:t xml:space="preserve"> frontier</w:t>
             </w:r>
-            <w:r>
+          </w:p>
+        </w:tc>
+      </w:tr>
+      <w:tr>
+        <w:tc>
+          <w:tcPr>
+            <w:cnfStyle w:val="001000000000" w:firstRow="0" w:lastRow="0" w:firstColumn="1" w:lastColumn="0" w:oddVBand="0" w:evenVBand="0" w:oddHBand="0" w:evenHBand="0" w:firstRowFirstColumn="0" w:firstRowLastColumn="0" w:lastRowFirstColumn="0" w:lastRowLastColumn="0"/>
+            <w:tcW w:w="9350" w:type="dxa"/>
+          </w:tcPr>
+          <w:p>
+            <w:pPr>
+              <w:spacing w:line="480" w:lineRule="auto"/>
               <w:rPr>
                 <w:b w:val="0"/>
                 <w:bCs w:val="0"/>
               </w:rPr>
-              <w:t>. It might be better to encourage the system to spread them out a bit to make it easier to track the location of humans in need of rescue.</w:t>
-            </w:r>
-          </w:p>
-        </w:tc>
-      </w:tr>
-      <w:tr>
-        <w:tc>
-          <w:tcPr>
-            <w:cnfStyle w:val="001000000000" w:firstRow="0" w:lastRow="0" w:firstColumn="1" w:lastColumn="0" w:oddVBand="0" w:evenVBand="0" w:oddHBand="0" w:evenHBand="0" w:firstRowFirstColumn="0" w:firstRowLastColumn="0" w:lastRowFirstColumn="0" w:lastRowLastColumn="0"/>
-            <w:tcW w:w="9350" w:type="dxa"/>
-          </w:tcPr>
-          <w:p>
-            <w:pPr>
-              <w:spacing w:line="480" w:lineRule="auto"/>
+            </w:pPr>
+            <w:r>
               <w:rPr>
                 <w:b w:val="0"/>
                 <w:bCs w:val="0"/>
               </w:rPr>
-            </w:pPr>
+              <w:t>SAR</w:t>
+            </w:r>
             <w:r>
               <w:rPr>
                 <w:b w:val="0"/>
                 <w:bCs w:val="0"/>
               </w:rPr>
-              <w:t>Search and Rescue operations seem to get fixated on saving a particular human sometimes.</w:t>
+              <w:t xml:space="preserve"> operations seem to </w:t>
             </w:r>
             <w:r>
               <w:rPr>
                 <w:b w:val="0"/>
                 <w:bCs w:val="0"/>
               </w:rPr>
-              <w:t xml:space="preserve"> Its possible this is caused by the fact the system has no way of differentiating individual humans from each other – so if the one its searching for dies, it doesn’t know that and keeps looking in the last known location.</w:t>
-            </w:r>
-          </w:p>
-        </w:tc>
-      </w:tr>
-      <w:tr>
-        <w:trPr>
-          <w:cnfStyle w:val="000000100000" w:firstRow="0" w:lastRow="0" w:firstColumn="0" w:lastColumn="0" w:oddVBand="0" w:evenVBand="0" w:oddHBand="1" w:evenHBand="0" w:firstRowFirstColumn="0" w:firstRowLastColumn="0" w:lastRowFirstColumn="0" w:lastRowLastColumn="0"/>
-        </w:trPr>
-        <w:tc>
-          <w:tcPr>
-            <w:cnfStyle w:val="001000000000" w:firstRow="0" w:lastRow="0" w:firstColumn="1" w:lastColumn="0" w:oddVBand="0" w:evenVBand="0" w:oddHBand="0" w:evenHBand="0" w:firstRowFirstColumn="0" w:firstRowLastColumn="0" w:lastRowFirstColumn="0" w:lastRowLastColumn="0"/>
-            <w:tcW w:w="9350" w:type="dxa"/>
-          </w:tcPr>
-          <w:p>
-            <w:pPr>
-              <w:spacing w:line="480" w:lineRule="auto"/>
+              <w:t>fixate</w:t>
+            </w:r>
+            <w:r>
               <w:rPr>
                 <w:b w:val="0"/>
                 <w:bCs w:val="0"/>
               </w:rPr>
-            </w:pPr>
+              <w:t xml:space="preserve"> on saving a particular human.</w:t>
+            </w:r>
             <w:r>
               <w:rPr>
                 <w:b w:val="0"/>
                 <w:bCs w:val="0"/>
               </w:rPr>
-              <w:t xml:space="preserve">The system quickly gets overwhelmed once the fire passes a certain size. This is particularly noticeable when all the UAVs return to the base for refueling. </w:t>
-            </w:r>
-            <w:r>
-              <w:rPr>
-                <w:b w:val="0"/>
-                <w:bCs w:val="0"/>
-              </w:rPr>
-              <w:t>This might be a defect in the Dispatchers prompt, which instructs the system to always provide a UAV command. As such, it ignores suggestions from the Strategy Agent to hold UAVs in reserve to handle just such an occasion.</w:t>
+              <w:t xml:space="preserve"> </w:t>
             </w:r>
           </w:p>
         </w:tc>
@@ -4149,72 +4658,120 @@
     <w:p>
       <w:pPr>
         <w:spacing w:line="480" w:lineRule="auto"/>
-      </w:pPr>
-    </w:p>
-    <w:p>
-      <w:pPr>
-        <w:spacing w:line="480" w:lineRule="auto"/>
-      </w:pPr>
-      <w:r>
-        <w:t>In addition, we also kept a log of all commands given to the UAVs during each simulation. We fed these to an LLM to look for any patterns that might be observable purely from the reasons provided by the Command Center Agent.</w:t>
-      </w:r>
-    </w:p>
-    <w:p>
-      <w:pPr>
-        <w:spacing w:line="480" w:lineRule="auto"/>
+        <w:ind w:firstLine="720"/>
+      </w:pPr>
+      <w:r>
+        <w:t xml:space="preserve">We </w:t>
+      </w:r>
+      <w:r>
+        <w:t xml:space="preserve">had an LLM find </w:t>
+      </w:r>
+      <w:r>
+        <w:t>any patterns</w:t>
+      </w:r>
+      <w:r>
+        <w:t xml:space="preserve"> in the output logs</w:t>
+      </w:r>
+      <w:r>
+        <w:t>.</w:t>
+      </w:r>
+      <w:r>
+        <w:t xml:space="preserve"> </w:t>
+      </w:r>
+      <w:r>
+        <w:t xml:space="preserve">We </w:t>
+      </w:r>
+      <w:r>
+        <w:t xml:space="preserve">checked </w:t>
+      </w:r>
+      <w:r>
+        <w:t>these to ensure accuracy.</w:t>
+      </w:r>
+    </w:p>
+    <w:p>
+      <w:pPr>
+        <w:spacing w:line="480" w:lineRule="auto"/>
+        <w:ind w:firstLine="720"/>
+      </w:pPr>
+    </w:p>
+    <w:p>
+      <w:pPr>
+        <w:spacing w:line="480" w:lineRule="auto"/>
+        <w:rPr>
+          <w:i/>
+          <w:iCs/>
+          <w:lang w:val="en-CA"/>
+        </w:rPr>
+      </w:pPr>
+      <w:r>
+        <w:rPr>
+          <w:i/>
+          <w:iCs/>
+          <w:lang w:val="en-CA"/>
+        </w:rPr>
+        <w:t>LLM Observations:</w:t>
+      </w:r>
+    </w:p>
+    <w:p>
+      <w:pPr>
+        <w:spacing w:line="480" w:lineRule="auto"/>
+        <w:rPr>
+          <w:lang w:val="en-CA"/>
+        </w:rPr>
+      </w:pPr>
+      <w:r>
         <w:rPr>
           <w:b/>
           <w:bCs/>
           <w:lang w:val="en-CA"/>
         </w:rPr>
-      </w:pPr>
-    </w:p>
-    <w:p>
-      <w:pPr>
-        <w:spacing w:line="480" w:lineRule="auto"/>
+        <w:t>RESCUE UAV target stickiness:</w:t>
+      </w:r>
+      <w:r>
         <w:rPr>
           <w:lang w:val="en-CA"/>
         </w:rPr>
-      </w:pPr>
-      <w:r>
+        <w:t> In ex3 and ex5 (both 0 rescues), the RESCUE UAV was locked onto the same coordinates for 8–10 consecutive dispatch cycles</w:t>
+      </w:r>
+    </w:p>
+    <w:p>
+      <w:pPr>
+        <w:spacing w:line="480" w:lineRule="auto"/>
         <w:rPr>
           <w:b/>
           <w:bCs/>
           <w:lang w:val="en-CA"/>
         </w:rPr>
-        <w:t>RESCUE UAV target stickiness:</w:t>
-      </w:r>
-      <w:r>
+      </w:pPr>
+    </w:p>
+    <w:p>
+      <w:pPr>
+        <w:spacing w:line="480" w:lineRule="auto"/>
         <w:rPr>
           <w:lang w:val="en-CA"/>
         </w:rPr>
-        <w:t> In ex3 and ex5 (both 0 rescues), the RESCUE UAV was locked onto the same coordinates for 8–10 consecutive dispatch cycles (160–200 sim steps). The knowledge graph records "rescue humans at (</w:t>
-      </w:r>
-      <w:proofErr w:type="spellStart"/>
-      <w:proofErr w:type="gramStart"/>
-      <w:r>
-        <w:rPr>
-          <w:lang w:val="en-CA"/>
-        </w:rPr>
-        <w:t>x,y</w:t>
-      </w:r>
-      <w:proofErr w:type="spellEnd"/>
-      <w:proofErr w:type="gramEnd"/>
-      <w:r>
-        <w:rPr>
-          <w:lang w:val="en-CA"/>
-        </w:rPr>
-        <w:t>)" once and nobody ever marks it complete, so the dispatcher keeps sending UAV 7 to the same stale location.</w:t>
-      </w:r>
-    </w:p>
-    <w:p>
-      <w:pPr>
-        <w:spacing w:line="480" w:lineRule="auto"/>
+      </w:pPr>
+      <w:r>
         <w:rPr>
           <w:b/>
           <w:bCs/>
           <w:lang w:val="en-CA"/>
         </w:rPr>
+        <w:t>Out-of-bounds coordinates:</w:t>
+      </w:r>
+      <w:r>
+        <w:rPr>
+          <w:lang w:val="en-CA"/>
+        </w:rPr>
+        <w:t xml:space="preserve"> In ex1, pixel (220, 760) got converted to grid (44, 152) — Y=152 is way off the 100×100 grid. </w:t>
+      </w:r>
+    </w:p>
+    <w:p>
+      <w:pPr>
+        <w:spacing w:line="480" w:lineRule="auto"/>
+        <w:rPr>
+          <w:lang w:val="en-CA"/>
+        </w:rPr>
       </w:pPr>
     </w:p>
     <w:p>
@@ -4230,13 +4787,13 @@
           <w:bCs/>
           <w:lang w:val="en-CA"/>
         </w:rPr>
-        <w:t>Out-of-bounds coordinates:</w:t>
+        <w:t>Speculative RESCUE deployment:</w:t>
       </w:r>
       <w:r>
         <w:rPr>
           <w:lang w:val="en-CA"/>
         </w:rPr>
-        <w:t> In ex1, pixel (220, 760) got converted to grid (44, 152) — Y=152 is way off the 100×100 grid. The UAV hits boundary repulsion and never arrives.</w:t>
+        <w:t xml:space="preserve"> The RESCUE UAV is frequently sent "just in case" to housing areas with language like "once RECON identifies civilians" </w:t>
       </w:r>
     </w:p>
     <w:p>
@@ -4260,35 +4817,21 @@
           <w:bCs/>
           <w:lang w:val="en-CA"/>
         </w:rPr>
-        <w:t>Speculative RESCUE deployment:</w:t>
-      </w:r>
-      <w:r>
-        <w:rPr>
-          <w:lang w:val="en-CA"/>
-        </w:rPr>
-        <w:t> The RESCUE UAV is frequently sent "just in case" to housing areas with language like "once RECON identifies civilians" rather than being dispatched reactively to a confirmed human sighting.</w:t>
-      </w:r>
-    </w:p>
-    <w:p>
-      <w:pPr>
-        <w:spacing w:line="480" w:lineRule="auto"/>
-        <w:rPr>
-          <w:lang w:val="en-CA"/>
-        </w:rPr>
-      </w:pPr>
+        <w:t xml:space="preserve">Knowledge graph goals never </w:t>
+      </w:r>
       <w:r>
         <w:rPr>
           <w:b/>
           <w:bCs/>
           <w:lang w:val="en-CA"/>
         </w:rPr>
-        <w:t>Knowledge graph goals never expire:</w:t>
+        <w:t>expire</w:t>
       </w:r>
       <w:r>
         <w:rPr>
           <w:lang w:val="en-CA"/>
         </w:rPr>
-        <w:t> This is the root cause of the stickiness pattern — stale goals persist indefinitely in the graph.</w:t>
+        <w:t>  stale goals persist indefinitely in the graph.</w:t>
       </w:r>
     </w:p>
     <w:p>
@@ -4302,47 +4845,12 @@
     <w:p>
       <w:pPr>
         <w:spacing w:line="480" w:lineRule="auto"/>
-        <w:rPr>
-          <w:lang w:val="en-CA"/>
-        </w:rPr>
-      </w:pPr>
-      <w:r>
-        <w:rPr>
-          <w:b/>
-          <w:bCs/>
-          <w:lang w:val="en-CA"/>
-        </w:rPr>
-        <w:t>RECON and EXTINGUISH are generally well-behaved</w:t>
-      </w:r>
-      <w:r>
-        <w:rPr>
-          <w:lang w:val="en-CA"/>
-        </w:rPr>
-        <w:t xml:space="preserve"> — good role adherence and sensible targeting, though EXTINGUISH sometimes gets inconsistent </w:t>
-      </w:r>
-      <w:proofErr w:type="spellStart"/>
-      <w:r>
-        <w:rPr>
-          <w:lang w:val="en-CA"/>
-        </w:rPr>
-        <w:t>pixel→grid</w:t>
-      </w:r>
-      <w:proofErr w:type="spellEnd"/>
-      <w:r>
-        <w:rPr>
-          <w:lang w:val="en-CA"/>
-        </w:rPr>
-        <w:t xml:space="preserve"> conversions from the LLM guessing at coordinates.</w:t>
-      </w:r>
-    </w:p>
-    <w:p>
-      <w:pPr>
-        <w:spacing w:line="480" w:lineRule="auto"/>
-        <w:ind w:firstLine="720"/>
-      </w:pPr>
-      <w:r>
-        <w:lastRenderedPageBreak/>
-        <w:t>Based on the above, one major problem appears to be that the system never let’s go of a goal once it’s been entered into the graph. Two possible improvements come to mind that could address this:</w:t>
+      </w:pPr>
+      <w:r>
+        <w:t>LLM results suggest we could improve goal tracking</w:t>
+      </w:r>
+      <w:r>
+        <w:t>:</w:t>
       </w:r>
     </w:p>
     <w:p>
@@ -4368,7 +4876,7 @@
         <w:spacing w:line="480" w:lineRule="auto"/>
       </w:pPr>
       <w:r>
-        <w:t>Allow for a hybrid prioritization model where the priority of goal is a combination of the original priority and how long it’s been active for. So newer Critical priority goals can take precedence over older ones.</w:t>
+        <w:t>Prioritize newer goals over older goals.</w:t>
       </w:r>
     </w:p>
     <w:p>
@@ -4376,6 +4884,21 @@
         <w:spacing w:line="480" w:lineRule="auto"/>
         <w:ind w:firstLine="720"/>
       </w:pPr>
+      <w:r>
+        <w:t xml:space="preserve">We leave these improvements for </w:t>
+      </w:r>
+      <w:r>
+        <w:t>future</w:t>
+      </w:r>
+      <w:r>
+        <w:t xml:space="preserve"> iteration.</w:t>
+      </w:r>
+    </w:p>
+    <w:p>
+      <w:pPr>
+        <w:spacing w:line="480" w:lineRule="auto"/>
+        <w:ind w:firstLine="720"/>
+      </w:pPr>
     </w:p>
     <w:p>
       <w:pPr>
@@ -4398,143 +4921,170 @@
         <w:ind w:firstLine="720"/>
       </w:pPr>
       <w:r>
-        <w:t>This project demonstrates several techniques in Artificial Intelligence that may be of interest in a professional setting.</w:t>
+        <w:t>This project demonstrates several techniques in Artificial Intelligence</w:t>
+      </w:r>
+      <w:r>
+        <w:t>:</w:t>
+      </w:r>
+    </w:p>
+    <w:p>
+      <w:pPr>
+        <w:pStyle w:val="ListParagraph"/>
+        <w:numPr>
+          <w:ilvl w:val="0"/>
+          <w:numId w:val="6"/>
+        </w:numPr>
+        <w:spacing w:line="480" w:lineRule="auto"/>
+      </w:pPr>
+      <w:r>
+        <w:t>Semantic Segmentation as a predictive technique – which could have potential applications in Autonomous Driving (</w:t>
+      </w:r>
+      <w:r>
+        <w:t>Feng</w:t>
+      </w:r>
+      <w:r>
+        <w:t xml:space="preserve"> 2021) and Robotics (</w:t>
+      </w:r>
+      <w:r>
+        <w:t>Hurtado</w:t>
+      </w:r>
+      <w:r>
+        <w:t xml:space="preserve"> 2022) (as well as the original application of </w:t>
+      </w:r>
+      <w:proofErr w:type="spellStart"/>
+      <w:r>
+        <w:t>UNet</w:t>
+      </w:r>
+      <w:proofErr w:type="spellEnd"/>
+      <w:r>
+        <w:t xml:space="preserve"> to medical imagery).</w:t>
+      </w:r>
+    </w:p>
+    <w:p>
+      <w:pPr>
+        <w:pStyle w:val="ListParagraph"/>
+        <w:numPr>
+          <w:ilvl w:val="0"/>
+          <w:numId w:val="6"/>
+        </w:numPr>
+        <w:spacing w:line="480" w:lineRule="auto"/>
+      </w:pPr>
+      <w:r>
+        <w:lastRenderedPageBreak/>
+        <w:t xml:space="preserve">Reinforcement Learning (RL) as well as Machine Learning via </w:t>
+      </w:r>
+      <w:r>
+        <w:t>SVM</w:t>
+      </w:r>
+      <w:r>
+        <w:t>. RL has already been applied to UAV control in this domain (</w:t>
+      </w:r>
+      <w:r>
+        <w:t>Julian</w:t>
+      </w:r>
+      <w:r>
+        <w:t xml:space="preserve"> 2018). RL has applications to robotics (</w:t>
+      </w:r>
+      <w:r>
+        <w:rPr>
+          <w:lang w:val="en-CA"/>
+        </w:rPr>
+        <w:t>Rajeswaran 2017</w:t>
+      </w:r>
+      <w:r>
+        <w:t xml:space="preserve">) and </w:t>
+      </w:r>
+      <w:r>
+        <w:t>A</w:t>
+      </w:r>
+      <w:r>
+        <w:t xml:space="preserve">utomated </w:t>
+      </w:r>
+      <w:r>
+        <w:t>G</w:t>
+      </w:r>
+      <w:r>
+        <w:t>ameplaying (</w:t>
+      </w:r>
+      <w:proofErr w:type="spellStart"/>
+      <w:r>
+        <w:rPr>
+          <w:lang w:val="en-CA"/>
+        </w:rPr>
+        <w:t>Mnih</w:t>
+      </w:r>
+      <w:proofErr w:type="spellEnd"/>
+      <w:r>
+        <w:rPr>
+          <w:lang w:val="en-CA"/>
+        </w:rPr>
+        <w:t xml:space="preserve"> 2015</w:t>
+      </w:r>
+      <w:r>
+        <w:t>).</w:t>
+      </w:r>
+    </w:p>
+    <w:p>
+      <w:pPr>
+        <w:pStyle w:val="ListParagraph"/>
+        <w:numPr>
+          <w:ilvl w:val="0"/>
+          <w:numId w:val="6"/>
+        </w:numPr>
+        <w:spacing w:line="480" w:lineRule="auto"/>
+      </w:pPr>
+      <w:r>
+        <w:t>Agentic Workflows, which is finding applications in Finance (</w:t>
+      </w:r>
+      <w:r>
+        <w:t>Yang</w:t>
+      </w:r>
+      <w:r>
+        <w:t xml:space="preserve"> 2024), and Entertainment (</w:t>
+      </w:r>
+      <w:proofErr w:type="spellStart"/>
+      <w:r>
+        <w:rPr>
+          <w:lang w:val="en-CA"/>
+        </w:rPr>
+        <w:t>Ammanabrolu</w:t>
+      </w:r>
+      <w:proofErr w:type="spellEnd"/>
+      <w:r>
+        <w:rPr>
+          <w:lang w:val="en-CA"/>
+        </w:rPr>
+        <w:t xml:space="preserve"> 2020</w:t>
+      </w:r>
+      <w:r>
+        <w:t>)</w:t>
+      </w:r>
+      <w:r>
+        <w:t>.</w:t>
+      </w:r>
+    </w:p>
+    <w:p>
+      <w:pPr>
+        <w:spacing w:line="480" w:lineRule="auto"/>
+        <w:ind w:firstLine="720"/>
+      </w:pPr>
+      <w:r>
+        <w:t>We</w:t>
+      </w:r>
+      <w:r>
+        <w:t xml:space="preserve"> combined </w:t>
+      </w:r>
+      <w:r>
+        <w:t xml:space="preserve">these to model Wildfire Monitoring Control, demonstrating the ability to </w:t>
+      </w:r>
+      <w:r>
+        <w:t>synthesize</w:t>
       </w:r>
       <w:r>
         <w:t xml:space="preserve"> </w:t>
       </w:r>
-    </w:p>
-    <w:p>
-      <w:pPr>
-        <w:spacing w:line="480" w:lineRule="auto"/>
-        <w:ind w:firstLine="720"/>
-      </w:pPr>
-      <w:r>
-        <w:t>W</w:t>
-      </w:r>
-      <w:r>
-        <w:t>e demonstrate using Semantic Segmentation as a predictive technique – which could have potential applications in Autonomous Driving (</w:t>
-      </w:r>
-      <w:r>
-        <w:t>Feng</w:t>
-      </w:r>
-      <w:r>
-        <w:t xml:space="preserve"> 2021) and Robotics (</w:t>
-      </w:r>
-      <w:r>
-        <w:t>Hurtado</w:t>
-      </w:r>
-      <w:r>
-        <w:t xml:space="preserve"> 2022) (as well as the original application of </w:t>
-      </w:r>
-      <w:proofErr w:type="spellStart"/>
-      <w:r>
-        <w:t>UNet</w:t>
-      </w:r>
-      <w:proofErr w:type="spellEnd"/>
-      <w:r>
-        <w:t xml:space="preserve"> to medical imagery).</w:t>
-      </w:r>
-    </w:p>
-    <w:p>
-      <w:pPr>
-        <w:spacing w:line="480" w:lineRule="auto"/>
-        <w:ind w:firstLine="720"/>
-      </w:pPr>
-      <w:r>
-        <w:t>We demonstrate the use of Reinforcement Learning (RL) as well as Machine Learning via an SVM. RL has already been applied to UAV control in this domain (</w:t>
-      </w:r>
-      <w:r>
-        <w:t>Julian</w:t>
-      </w:r>
-      <w:r>
-        <w:t xml:space="preserve"> 2018). RL has also shown to have applications to robotics (</w:t>
-      </w:r>
-      <w:r>
-        <w:rPr>
-          <w:lang w:val="en-CA"/>
-        </w:rPr>
-        <w:t>Rajeswaran</w:t>
-      </w:r>
-      <w:r>
-        <w:rPr>
-          <w:lang w:val="en-CA"/>
-        </w:rPr>
-        <w:t xml:space="preserve"> 2017</w:t>
-      </w:r>
-      <w:r>
-        <w:t>) and automated gameplaying (</w:t>
-      </w:r>
-      <w:proofErr w:type="spellStart"/>
-      <w:r>
-        <w:rPr>
-          <w:lang w:val="en-CA"/>
-        </w:rPr>
-        <w:t>Mnih</w:t>
-      </w:r>
-      <w:proofErr w:type="spellEnd"/>
-      <w:r>
-        <w:rPr>
-          <w:lang w:val="en-CA"/>
-        </w:rPr>
-        <w:t xml:space="preserve"> 2015</w:t>
-      </w:r>
-      <w:r>
-        <w:t>).</w:t>
-      </w:r>
-    </w:p>
-    <w:p>
-      <w:pPr>
-        <w:spacing w:line="480" w:lineRule="auto"/>
-        <w:ind w:firstLine="720"/>
-      </w:pPr>
-      <w:r>
-        <w:t>We also demonstrate the use of Agentic Workflows, which is finding applications in Finance (</w:t>
-      </w:r>
-      <w:r>
-        <w:t>Yang</w:t>
-      </w:r>
-      <w:r>
-        <w:t xml:space="preserve"> 2024), and Entertainment (</w:t>
-      </w:r>
-      <w:proofErr w:type="spellStart"/>
-      <w:r>
-        <w:rPr>
-          <w:lang w:val="en-CA"/>
-        </w:rPr>
-        <w:t>Ammanabrolu</w:t>
-      </w:r>
-      <w:proofErr w:type="spellEnd"/>
-      <w:r>
-        <w:rPr>
-          <w:lang w:val="en-CA"/>
-        </w:rPr>
-        <w:t xml:space="preserve"> 2020</w:t>
-      </w:r>
-      <w:r>
-        <w:t xml:space="preserve">) (amongst other things). </w:t>
-      </w:r>
-    </w:p>
-    <w:p>
-      <w:pPr>
-        <w:spacing w:line="480" w:lineRule="auto"/>
-        <w:ind w:firstLine="720"/>
-      </w:pPr>
-      <w:r>
-        <w:t xml:space="preserve">We demonstrated that these techniques could be combined to create something potentially useful – including using a simulation environment informed by modern mathematical models of wildfire propagation. Providing a framework for testing system </w:t>
-      </w:r>
-      <w:r>
-        <w:t>hypotheses</w:t>
-      </w:r>
-      <w:r>
-        <w:t xml:space="preserve"> </w:t>
-      </w:r>
-      <w:r>
-        <w:t xml:space="preserve">without </w:t>
-      </w:r>
-      <w:r>
-        <w:lastRenderedPageBreak/>
-        <w:t>having to spend the time, money, and risk involved in building a real-world system is an important step in any embodied AI Project.</w:t>
+      <w:r>
+        <w:t>into a single system.</w:t>
       </w:r>
     </w:p>
     <w:p>
@@ -5747,7 +6297,13 @@
         <w:rPr>
           <w:lang w:val="en-CA"/>
         </w:rPr>
-        <w:t>Running the Agents every 40 steps keep the simulation run time down to a manageable amount of time, as well as saving on token usage.</w:t>
+        <w:t xml:space="preserve">Optimizes </w:t>
+      </w:r>
+      <w:r>
+        <w:rPr>
+          <w:lang w:val="en-CA"/>
+        </w:rPr>
+        <w:t>runtime and token usage.</w:t>
       </w:r>
     </w:p>
   </w:footnote>
@@ -6112,10 +6668,10 @@
     </w:lvl>
   </w:abstractNum>
   <w:abstractNum w:abstractNumId="2" w15:restartNumberingAfterBreak="0">
-    <w:nsid w:val="2E133DC6"/>
+    <w:nsid w:val="2C2241CB"/>
     <w:multiLevelType w:val="hybridMultilevel"/>
-    <w:tmpl w:val="40F8E09E"/>
-    <w:lvl w:ilvl="0" w:tplc="A39656D2">
+    <w:tmpl w:val="20665726"/>
+    <w:lvl w:ilvl="0" w:tplc="4270498E">
       <w:start w:val="1"/>
       <w:numFmt w:val="decimal"/>
       <w:lvlText w:val="%1."/>
@@ -6201,16 +6757,16 @@
     </w:lvl>
   </w:abstractNum>
   <w:abstractNum w:abstractNumId="3" w15:restartNumberingAfterBreak="0">
-    <w:nsid w:val="3C170599"/>
+    <w:nsid w:val="2E133DC6"/>
     <w:multiLevelType w:val="hybridMultilevel"/>
-    <w:tmpl w:val="F4BA0B9C"/>
-    <w:lvl w:ilvl="0" w:tplc="1009000F">
+    <w:tmpl w:val="40F8E09E"/>
+    <w:lvl w:ilvl="0" w:tplc="A39656D2">
       <w:start w:val="1"/>
       <w:numFmt w:val="decimal"/>
       <w:lvlText w:val="%1."/>
       <w:lvlJc w:val="left"/>
       <w:pPr>
-        <w:ind w:left="720" w:hanging="360"/>
+        <w:ind w:left="1080" w:hanging="360"/>
       </w:pPr>
       <w:rPr>
         <w:rFonts w:hint="default"/>
@@ -6222,7 +6778,7 @@
       <w:lvlText w:val="%2."/>
       <w:lvlJc w:val="left"/>
       <w:pPr>
-        <w:ind w:left="1440" w:hanging="360"/>
+        <w:ind w:left="1800" w:hanging="360"/>
       </w:pPr>
     </w:lvl>
     <w:lvl w:ilvl="2" w:tplc="1009001B" w:tentative="1">
@@ -6231,7 +6787,7 @@
       <w:lvlText w:val="%3."/>
       <w:lvlJc w:val="right"/>
       <w:pPr>
-        <w:ind w:left="2160" w:hanging="180"/>
+        <w:ind w:left="2520" w:hanging="180"/>
       </w:pPr>
     </w:lvl>
     <w:lvl w:ilvl="3" w:tplc="1009000F" w:tentative="1">
@@ -6240,7 +6796,7 @@
       <w:lvlText w:val="%4."/>
       <w:lvlJc w:val="left"/>
       <w:pPr>
-        <w:ind w:left="2880" w:hanging="360"/>
+        <w:ind w:left="3240" w:hanging="360"/>
       </w:pPr>
     </w:lvl>
     <w:lvl w:ilvl="4" w:tplc="10090019" w:tentative="1">
@@ -6249,7 +6805,7 @@
       <w:lvlText w:val="%5."/>
       <w:lvlJc w:val="left"/>
       <w:pPr>
-        <w:ind w:left="3600" w:hanging="360"/>
+        <w:ind w:left="3960" w:hanging="360"/>
       </w:pPr>
     </w:lvl>
     <w:lvl w:ilvl="5" w:tplc="1009001B" w:tentative="1">
@@ -6258,7 +6814,7 @@
       <w:lvlText w:val="%6."/>
       <w:lvlJc w:val="right"/>
       <w:pPr>
-        <w:ind w:left="4320" w:hanging="180"/>
+        <w:ind w:left="4680" w:hanging="180"/>
       </w:pPr>
     </w:lvl>
     <w:lvl w:ilvl="6" w:tplc="1009000F" w:tentative="1">
@@ -6267,7 +6823,7 @@
       <w:lvlText w:val="%7."/>
       <w:lvlJc w:val="left"/>
       <w:pPr>
-        <w:ind w:left="5040" w:hanging="360"/>
+        <w:ind w:left="5400" w:hanging="360"/>
       </w:pPr>
     </w:lvl>
     <w:lvl w:ilvl="7" w:tplc="10090019" w:tentative="1">
@@ -6276,7 +6832,7 @@
       <w:lvlText w:val="%8."/>
       <w:lvlJc w:val="left"/>
       <w:pPr>
-        <w:ind w:left="5760" w:hanging="360"/>
+        <w:ind w:left="6120" w:hanging="360"/>
       </w:pPr>
     </w:lvl>
     <w:lvl w:ilvl="8" w:tplc="1009001B" w:tentative="1">
@@ -6285,21 +6841,21 @@
       <w:lvlText w:val="%9."/>
       <w:lvlJc w:val="right"/>
       <w:pPr>
-        <w:ind w:left="6480" w:hanging="180"/>
+        <w:ind w:left="6840" w:hanging="180"/>
       </w:pPr>
     </w:lvl>
   </w:abstractNum>
   <w:abstractNum w:abstractNumId="4" w15:restartNumberingAfterBreak="0">
-    <w:nsid w:val="3D843755"/>
+    <w:nsid w:val="3C170599"/>
     <w:multiLevelType w:val="hybridMultilevel"/>
-    <w:tmpl w:val="D550E43E"/>
-    <w:lvl w:ilvl="0" w:tplc="831AE848">
+    <w:tmpl w:val="F4BA0B9C"/>
+    <w:lvl w:ilvl="0" w:tplc="1009000F">
       <w:start w:val="1"/>
       <w:numFmt w:val="decimal"/>
       <w:lvlText w:val="%1."/>
       <w:lvlJc w:val="left"/>
       <w:pPr>
-        <w:ind w:left="1080" w:hanging="360"/>
+        <w:ind w:left="720" w:hanging="360"/>
       </w:pPr>
       <w:rPr>
         <w:rFonts w:hint="default"/>
@@ -6311,7 +6867,7 @@
       <w:lvlText w:val="%2."/>
       <w:lvlJc w:val="left"/>
       <w:pPr>
-        <w:ind w:left="1800" w:hanging="360"/>
+        <w:ind w:left="1440" w:hanging="360"/>
       </w:pPr>
     </w:lvl>
     <w:lvl w:ilvl="2" w:tplc="1009001B" w:tentative="1">
@@ -6320,7 +6876,7 @@
       <w:lvlText w:val="%3."/>
       <w:lvlJc w:val="right"/>
       <w:pPr>
-        <w:ind w:left="2520" w:hanging="180"/>
+        <w:ind w:left="2160" w:hanging="180"/>
       </w:pPr>
     </w:lvl>
     <w:lvl w:ilvl="3" w:tplc="1009000F" w:tentative="1">
@@ -6329,7 +6885,7 @@
       <w:lvlText w:val="%4."/>
       <w:lvlJc w:val="left"/>
       <w:pPr>
-        <w:ind w:left="3240" w:hanging="360"/>
+        <w:ind w:left="2880" w:hanging="360"/>
       </w:pPr>
     </w:lvl>
     <w:lvl w:ilvl="4" w:tplc="10090019" w:tentative="1">
@@ -6338,7 +6894,7 @@
       <w:lvlText w:val="%5."/>
       <w:lvlJc w:val="left"/>
       <w:pPr>
-        <w:ind w:left="3960" w:hanging="360"/>
+        <w:ind w:left="3600" w:hanging="360"/>
       </w:pPr>
     </w:lvl>
     <w:lvl w:ilvl="5" w:tplc="1009001B" w:tentative="1">
@@ -6347,7 +6903,7 @@
       <w:lvlText w:val="%6."/>
       <w:lvlJc w:val="right"/>
       <w:pPr>
-        <w:ind w:left="4680" w:hanging="180"/>
+        <w:ind w:left="4320" w:hanging="180"/>
       </w:pPr>
     </w:lvl>
     <w:lvl w:ilvl="6" w:tplc="1009000F" w:tentative="1">
@@ -6356,7 +6912,7 @@
       <w:lvlText w:val="%7."/>
       <w:lvlJc w:val="left"/>
       <w:pPr>
-        <w:ind w:left="5400" w:hanging="360"/>
+        <w:ind w:left="5040" w:hanging="360"/>
       </w:pPr>
     </w:lvl>
     <w:lvl w:ilvl="7" w:tplc="10090019" w:tentative="1">
@@ -6365,7 +6921,7 @@
       <w:lvlText w:val="%8."/>
       <w:lvlJc w:val="left"/>
       <w:pPr>
-        <w:ind w:left="6120" w:hanging="360"/>
+        <w:ind w:left="5760" w:hanging="360"/>
       </w:pPr>
     </w:lvl>
     <w:lvl w:ilvl="8" w:tplc="1009001B" w:tentative="1">
@@ -6374,6 +6930,184 @@
       <w:lvlText w:val="%9."/>
       <w:lvlJc w:val="right"/>
       <w:pPr>
+        <w:ind w:left="6480" w:hanging="180"/>
+      </w:pPr>
+    </w:lvl>
+  </w:abstractNum>
+  <w:abstractNum w:abstractNumId="5" w15:restartNumberingAfterBreak="0">
+    <w:nsid w:val="3D843755"/>
+    <w:multiLevelType w:val="hybridMultilevel"/>
+    <w:tmpl w:val="D550E43E"/>
+    <w:lvl w:ilvl="0" w:tplc="831AE848">
+      <w:start w:val="1"/>
+      <w:numFmt w:val="decimal"/>
+      <w:lvlText w:val="%1."/>
+      <w:lvlJc w:val="left"/>
+      <w:pPr>
+        <w:ind w:left="1080" w:hanging="360"/>
+      </w:pPr>
+      <w:rPr>
+        <w:rFonts w:hint="default"/>
+      </w:rPr>
+    </w:lvl>
+    <w:lvl w:ilvl="1" w:tplc="10090019" w:tentative="1">
+      <w:start w:val="1"/>
+      <w:numFmt w:val="lowerLetter"/>
+      <w:lvlText w:val="%2."/>
+      <w:lvlJc w:val="left"/>
+      <w:pPr>
+        <w:ind w:left="1800" w:hanging="360"/>
+      </w:pPr>
+    </w:lvl>
+    <w:lvl w:ilvl="2" w:tplc="1009001B" w:tentative="1">
+      <w:start w:val="1"/>
+      <w:numFmt w:val="lowerRoman"/>
+      <w:lvlText w:val="%3."/>
+      <w:lvlJc w:val="right"/>
+      <w:pPr>
+        <w:ind w:left="2520" w:hanging="180"/>
+      </w:pPr>
+    </w:lvl>
+    <w:lvl w:ilvl="3" w:tplc="1009000F" w:tentative="1">
+      <w:start w:val="1"/>
+      <w:numFmt w:val="decimal"/>
+      <w:lvlText w:val="%4."/>
+      <w:lvlJc w:val="left"/>
+      <w:pPr>
+        <w:ind w:left="3240" w:hanging="360"/>
+      </w:pPr>
+    </w:lvl>
+    <w:lvl w:ilvl="4" w:tplc="10090019" w:tentative="1">
+      <w:start w:val="1"/>
+      <w:numFmt w:val="lowerLetter"/>
+      <w:lvlText w:val="%5."/>
+      <w:lvlJc w:val="left"/>
+      <w:pPr>
+        <w:ind w:left="3960" w:hanging="360"/>
+      </w:pPr>
+    </w:lvl>
+    <w:lvl w:ilvl="5" w:tplc="1009001B" w:tentative="1">
+      <w:start w:val="1"/>
+      <w:numFmt w:val="lowerRoman"/>
+      <w:lvlText w:val="%6."/>
+      <w:lvlJc w:val="right"/>
+      <w:pPr>
+        <w:ind w:left="4680" w:hanging="180"/>
+      </w:pPr>
+    </w:lvl>
+    <w:lvl w:ilvl="6" w:tplc="1009000F" w:tentative="1">
+      <w:start w:val="1"/>
+      <w:numFmt w:val="decimal"/>
+      <w:lvlText w:val="%7."/>
+      <w:lvlJc w:val="left"/>
+      <w:pPr>
+        <w:ind w:left="5400" w:hanging="360"/>
+      </w:pPr>
+    </w:lvl>
+    <w:lvl w:ilvl="7" w:tplc="10090019" w:tentative="1">
+      <w:start w:val="1"/>
+      <w:numFmt w:val="lowerLetter"/>
+      <w:lvlText w:val="%8."/>
+      <w:lvlJc w:val="left"/>
+      <w:pPr>
+        <w:ind w:left="6120" w:hanging="360"/>
+      </w:pPr>
+    </w:lvl>
+    <w:lvl w:ilvl="8" w:tplc="1009001B" w:tentative="1">
+      <w:start w:val="1"/>
+      <w:numFmt w:val="lowerRoman"/>
+      <w:lvlText w:val="%9."/>
+      <w:lvlJc w:val="right"/>
+      <w:pPr>
+        <w:ind w:left="6840" w:hanging="180"/>
+      </w:pPr>
+    </w:lvl>
+  </w:abstractNum>
+  <w:abstractNum w:abstractNumId="6" w15:restartNumberingAfterBreak="0">
+    <w:nsid w:val="413558D9"/>
+    <w:multiLevelType w:val="hybridMultilevel"/>
+    <w:tmpl w:val="A8DC6F46"/>
+    <w:lvl w:ilvl="0" w:tplc="7BA4C63C">
+      <w:start w:val="1"/>
+      <w:numFmt w:val="decimal"/>
+      <w:lvlText w:val="%1."/>
+      <w:lvlJc w:val="left"/>
+      <w:pPr>
+        <w:ind w:left="1080" w:hanging="360"/>
+      </w:pPr>
+      <w:rPr>
+        <w:rFonts w:hint="default"/>
+      </w:rPr>
+    </w:lvl>
+    <w:lvl w:ilvl="1" w:tplc="10090019" w:tentative="1">
+      <w:start w:val="1"/>
+      <w:numFmt w:val="lowerLetter"/>
+      <w:lvlText w:val="%2."/>
+      <w:lvlJc w:val="left"/>
+      <w:pPr>
+        <w:ind w:left="1800" w:hanging="360"/>
+      </w:pPr>
+    </w:lvl>
+    <w:lvl w:ilvl="2" w:tplc="1009001B" w:tentative="1">
+      <w:start w:val="1"/>
+      <w:numFmt w:val="lowerRoman"/>
+      <w:lvlText w:val="%3."/>
+      <w:lvlJc w:val="right"/>
+      <w:pPr>
+        <w:ind w:left="2520" w:hanging="180"/>
+      </w:pPr>
+    </w:lvl>
+    <w:lvl w:ilvl="3" w:tplc="1009000F" w:tentative="1">
+      <w:start w:val="1"/>
+      <w:numFmt w:val="decimal"/>
+      <w:lvlText w:val="%4."/>
+      <w:lvlJc w:val="left"/>
+      <w:pPr>
+        <w:ind w:left="3240" w:hanging="360"/>
+      </w:pPr>
+    </w:lvl>
+    <w:lvl w:ilvl="4" w:tplc="10090019" w:tentative="1">
+      <w:start w:val="1"/>
+      <w:numFmt w:val="lowerLetter"/>
+      <w:lvlText w:val="%5."/>
+      <w:lvlJc w:val="left"/>
+      <w:pPr>
+        <w:ind w:left="3960" w:hanging="360"/>
+      </w:pPr>
+    </w:lvl>
+    <w:lvl w:ilvl="5" w:tplc="1009001B" w:tentative="1">
+      <w:start w:val="1"/>
+      <w:numFmt w:val="lowerRoman"/>
+      <w:lvlText w:val="%6."/>
+      <w:lvlJc w:val="right"/>
+      <w:pPr>
+        <w:ind w:left="4680" w:hanging="180"/>
+      </w:pPr>
+    </w:lvl>
+    <w:lvl w:ilvl="6" w:tplc="1009000F" w:tentative="1">
+      <w:start w:val="1"/>
+      <w:numFmt w:val="decimal"/>
+      <w:lvlText w:val="%7."/>
+      <w:lvlJc w:val="left"/>
+      <w:pPr>
+        <w:ind w:left="5400" w:hanging="360"/>
+      </w:pPr>
+    </w:lvl>
+    <w:lvl w:ilvl="7" w:tplc="10090019" w:tentative="1">
+      <w:start w:val="1"/>
+      <w:numFmt w:val="lowerLetter"/>
+      <w:lvlText w:val="%8."/>
+      <w:lvlJc w:val="left"/>
+      <w:pPr>
+        <w:ind w:left="6120" w:hanging="360"/>
+      </w:pPr>
+    </w:lvl>
+    <w:lvl w:ilvl="8" w:tplc="1009001B" w:tentative="1">
+      <w:start w:val="1"/>
+      <w:numFmt w:val="lowerRoman"/>
+      <w:lvlText w:val="%9."/>
+      <w:lvlJc w:val="right"/>
+      <w:pPr>
         <w:ind w:left="6840" w:hanging="180"/>
       </w:pPr>
     </w:lvl>
@@ -6382,15 +7116,21 @@
     <w:abstractNumId w:val="1"/>
   </w:num>
   <w:num w:numId="2" w16cid:durableId="548107309">
-    <w:abstractNumId w:val="4"/>
+    <w:abstractNumId w:val="5"/>
   </w:num>
   <w:num w:numId="3" w16cid:durableId="1970435402">
-    <w:abstractNumId w:val="3"/>
+    <w:abstractNumId w:val="4"/>
   </w:num>
   <w:num w:numId="4" w16cid:durableId="1465193618">
     <w:abstractNumId w:val="0"/>
   </w:num>
   <w:num w:numId="5" w16cid:durableId="1963143843">
+    <w:abstractNumId w:val="3"/>
+  </w:num>
+  <w:num w:numId="6" w16cid:durableId="40714192">
+    <w:abstractNumId w:val="6"/>
+  </w:num>
+  <w:num w:numId="7" w16cid:durableId="1019745114">
     <w:abstractNumId w:val="2"/>
   </w:num>
 </w:numbering>

</xml_diff>

<commit_message>
(update): final clena up on paper; working on presentation materials
</commit_message>
<xml_diff>
--- a/Reflective_Synthesis_Paper.docx
+++ b/Reflective_Synthesis_Paper.docx
@@ -3230,7 +3230,7 @@
         </w:rPr>
         <w:lastRenderedPageBreak/>
         <w:drawing>
-          <wp:inline distT="0" distB="0" distL="0" distR="0" wp14:anchorId="5A99DB7D" wp14:editId="15FA4CFC">
+          <wp:inline distT="0" distB="0" distL="0" distR="0" wp14:anchorId="5A99DB7D" wp14:editId="3B5A8444">
             <wp:extent cx="5941060" cy="6047105"/>
             <wp:effectExtent l="0" t="0" r="2540" b="0"/>
             <wp:docPr id="1561439249" name="Picture 5"/>
@@ -3491,7 +3491,7 @@
           <w:noProof/>
         </w:rPr>
         <w:drawing>
-          <wp:inline distT="0" distB="0" distL="0" distR="0" wp14:anchorId="231DA530" wp14:editId="43B87200">
+          <wp:inline distT="0" distB="0" distL="0" distR="0" wp14:anchorId="231DA530" wp14:editId="11D534E2">
             <wp:extent cx="5937250" cy="2971800"/>
             <wp:effectExtent l="0" t="0" r="6350" b="0"/>
             <wp:docPr id="1696375601" name="Picture 2"/>
@@ -4819,6 +4819,7 @@
         </w:rPr>
         <w:t xml:space="preserve">Knowledge graph goals never </w:t>
       </w:r>
+      <w:proofErr w:type="gramStart"/>
       <w:r>
         <w:rPr>
           <w:b/>
@@ -4827,6 +4828,15 @@
         </w:rPr>
         <w:t>expire</w:t>
       </w:r>
+      <w:r>
+        <w:rPr>
+          <w:b/>
+          <w:bCs/>
+          <w:lang w:val="en-CA"/>
+        </w:rPr>
+        <w:t>:</w:t>
+      </w:r>
+      <w:proofErr w:type="gramEnd"/>
       <w:r>
         <w:rPr>
           <w:lang w:val="en-CA"/>
@@ -5079,6 +5089,9 @@
       </w:r>
       <w:r>
         <w:t>synthesize</w:t>
+      </w:r>
+      <w:r>
+        <w:t xml:space="preserve"> multiple techniques</w:t>
       </w:r>
       <w:r>
         <w:t xml:space="preserve"> </w:t>
@@ -7650,6 +7663,7 @@
   <w:style w:type="character" w:default="1" w:styleId="DefaultParagraphFont">
     <w:name w:val="Default Paragraph Font"/>
     <w:uiPriority w:val="1"/>
+    <w:semiHidden/>
     <w:unhideWhenUsed/>
   </w:style>
   <w:style w:type="table" w:default="1" w:styleId="TableNormal">

</xml_diff>

<commit_message>
(update): collect test results and update report
</commit_message>
<xml_diff>
--- a/Reflective_Synthesis_Paper.docx
+++ b/Reflective_Synthesis_Paper.docx
@@ -260,41 +260,39 @@
           <w:b/>
           <w:bCs/>
         </w:rPr>
-        <w:t>Support Vector Machine:</w:t>
-      </w:r>
-      <w:r>
-        <w:t xml:space="preserve"> Aviation injuries are the primary dangers fire fighters face when fighting wildfires (</w:t>
-      </w:r>
-      <w:r>
-        <w:t>Centers for Disease Control and Prevention</w:t>
-      </w:r>
-      <w:r>
-        <w:t xml:space="preserve"> 2014). NASA </w:t>
-      </w:r>
-      <w:r>
-        <w:t>has shown that UAVs can be effective in this domain</w:t>
-      </w:r>
-      <w:r>
-        <w:t xml:space="preserve"> (Merlin 2009). For this simulation, we trained a Support Vector Machine to control </w:t>
-      </w:r>
-      <w:r>
-        <w:t>the UAVs</w:t>
-      </w:r>
-      <w:r>
-        <w:t xml:space="preserve"> when they </w:t>
-      </w:r>
-      <w:r>
-        <w:lastRenderedPageBreak/>
-        <w:t>don’t have a predetermined waypoint. SVM are fast and lightweight, making them ideal for this task. SVM</w:t>
-      </w:r>
-      <w:r>
-        <w:t xml:space="preserve">s </w:t>
-      </w:r>
-      <w:r>
-        <w:t xml:space="preserve">were used </w:t>
-      </w:r>
-      <w:r>
-        <w:t>in a planetary science context for Project 3.</w:t>
+        <w:t>Agentic AI:</w:t>
+      </w:r>
+      <w:r>
+        <w:t xml:space="preserve"> A Semi-Autonomous command center was needed to provide commands to the UAVs. We chose to build this using </w:t>
+      </w:r>
+      <w:r>
+        <w:t>Agentic AI</w:t>
+      </w:r>
+      <w:r>
+        <w:t xml:space="preserve"> with </w:t>
+      </w:r>
+      <w:proofErr w:type="spellStart"/>
+      <w:r>
+        <w:t>GraphRAG</w:t>
+      </w:r>
+      <w:proofErr w:type="spellEnd"/>
+      <w:r>
+        <w:t xml:space="preserve"> (</w:t>
+      </w:r>
+      <w:r>
+        <w:rPr>
+          <w:lang w:val="en-CA"/>
+        </w:rPr>
+        <w:t>Han 2025)</w:t>
+      </w:r>
+      <w:r>
+        <w:t>.</w:t>
+      </w:r>
+      <w:r>
+        <w:t xml:space="preserve"> A similar approach was used in Project 6</w:t>
+      </w:r>
+      <w:r>
+        <w:t xml:space="preserve">. </w:t>
       </w:r>
     </w:p>
     <w:p>
@@ -311,104 +309,45 @@
           <w:b/>
           <w:bCs/>
         </w:rPr>
-        <w:t>Agentic AI:</w:t>
-      </w:r>
-      <w:r>
-        <w:t xml:space="preserve"> A Semi-Autonomous command center was needed to provide commands to the UAVs. We chose to build this using </w:t>
-      </w:r>
-      <w:r>
-        <w:t>Agentic AI</w:t>
-      </w:r>
-      <w:r>
-        <w:t xml:space="preserve">. </w:t>
-      </w:r>
-      <w:r>
-        <w:t xml:space="preserve">This </w:t>
-      </w:r>
-      <w:r>
-        <w:t>exploits the reasoning and generative abilities of modern L</w:t>
-      </w:r>
-      <w:r>
-        <w:t xml:space="preserve">LM </w:t>
-      </w:r>
-      <w:r>
-        <w:t xml:space="preserve">to prioritize </w:t>
-      </w:r>
-      <w:r>
-        <w:t>firefighting</w:t>
-      </w:r>
-      <w:r>
-        <w:t xml:space="preserve"> activities and generate waypoints for the UAVs. </w:t>
-      </w:r>
-      <w:proofErr w:type="spellStart"/>
-      <w:r>
-        <w:t>GraphRAG</w:t>
-      </w:r>
-      <w:proofErr w:type="spellEnd"/>
-      <w:r>
-        <w:t xml:space="preserve"> (</w:t>
-      </w:r>
-      <w:r>
-        <w:rPr>
-          <w:lang w:val="en-CA"/>
-        </w:rPr>
-        <w:t>Han 2025)</w:t>
-      </w:r>
-      <w:r>
-        <w:t xml:space="preserve"> was introduced to allow the system to store information about its goals and enhance reasoning abilities.</w:t>
-      </w:r>
-      <w:r>
-        <w:t xml:space="preserve"> A similar approach was used in Project 6</w:t>
-      </w:r>
-      <w:r>
-        <w:t xml:space="preserve">. </w:t>
-      </w:r>
-    </w:p>
-    <w:p>
-      <w:pPr>
-        <w:spacing w:line="480" w:lineRule="auto"/>
-        <w:ind w:left="720" w:firstLine="360"/>
-      </w:pPr>
-    </w:p>
-    <w:p>
-      <w:pPr>
-        <w:spacing w:line="480" w:lineRule="auto"/>
-        <w:ind w:left="720" w:firstLine="360"/>
-      </w:pPr>
-      <w:r>
-        <w:t>O</w:t>
-      </w:r>
-      <w:r>
-        <w:t>riginally intended to use a Decision Transformer (Chen 2021) as outlined in Project 5</w:t>
-      </w:r>
-      <w:r>
-        <w:t xml:space="preserve">. </w:t>
-      </w:r>
-      <w:r>
-        <w:t>However, Decision Transformers require a significant number of expert training examples to make work</w:t>
-      </w:r>
-      <w:r>
-        <w:t xml:space="preserve"> which were not available. As such</w:t>
-      </w:r>
-      <w:r>
-        <w:t xml:space="preserve">, </w:t>
-      </w:r>
-      <w:r>
-        <w:t>we did not</w:t>
-      </w:r>
-      <w:r>
-        <w:t xml:space="preserve"> apply that technique</w:t>
-      </w:r>
-      <w:r>
-        <w:t xml:space="preserve"> here</w:t>
-      </w:r>
-      <w:r>
-        <w:t>.</w:t>
-      </w:r>
-    </w:p>
-    <w:p>
-      <w:pPr>
-        <w:spacing w:line="480" w:lineRule="auto"/>
+        <w:lastRenderedPageBreak/>
+        <w:t xml:space="preserve">Data Analysis: </w:t>
+      </w:r>
+      <w:r>
+        <w:t xml:space="preserve">We collect data on the </w:t>
+      </w:r>
+      <w:r>
+        <w:t>systems’</w:t>
+      </w:r>
+      <w:r>
+        <w:t xml:space="preserve"> performance and use the Man</w:t>
+      </w:r>
+      <w:r>
+        <w:t>n</w:t>
+      </w:r>
+      <w:r>
+        <w:t xml:space="preserve">-Whitney U </w:t>
+      </w:r>
+      <w:r>
+        <w:t>T</w:t>
+      </w:r>
+      <w:r>
+        <w:t>est</w:t>
+      </w:r>
+      <w:r>
+        <w:t xml:space="preserve"> (Mann 1947) </w:t>
+      </w:r>
+      <w:r>
+        <w:t>to determine if the system had a statistically significant effect on the fire simulation.</w:t>
+      </w:r>
+      <w:r>
+        <w:t xml:space="preserve"> We used this test to compare asteroid populations in Project 2.</w:t>
+      </w:r>
+    </w:p>
+    <w:p>
+      <w:pPr>
+        <w:pStyle w:val="ListParagraph"/>
+        <w:spacing w:line="480" w:lineRule="auto"/>
+        <w:ind w:left="1080"/>
       </w:pPr>
     </w:p>
     <w:p>
@@ -519,7 +458,6 @@
         <w:ind w:firstLine="720"/>
       </w:pPr>
       <w:r>
-        <w:lastRenderedPageBreak/>
         <w:t>A similar approach was used to generate a static model for wind</w:t>
       </w:r>
       <w:r>
@@ -929,7 +867,6 @@
         <w:spacing w:line="480" w:lineRule="auto"/>
       </w:pPr>
       <w:r>
-        <w:lastRenderedPageBreak/>
         <w:tab/>
         <w:t xml:space="preserve">Given that humans sometimes head out into the forest for various reasons, we added human agents to the simulation. These human agents are stochastic and are considered “casualties” when they </w:t>
       </w:r>
@@ -1023,7 +960,11 @@
         <w:t>A</w:t>
       </w:r>
       <w:r>
-        <w:t>reas in the final image that were still burning or destroyed (but not destroyed in the original image)</w:t>
+        <w:t xml:space="preserve">reas in the final image that </w:t>
+      </w:r>
+      <w:r>
+        <w:lastRenderedPageBreak/>
+        <w:t>were still burning or destroyed (but not destroyed in the original image)</w:t>
       </w:r>
       <w:r>
         <w:t xml:space="preserve"> were marked “Risky” in the mask</w:t>
@@ -1265,7 +1206,6 @@
             <w:rPr>
               <w:rFonts w:ascii="Cambria Math" w:hAnsi="Cambria Math"/>
             </w:rPr>
-            <w:lastRenderedPageBreak/>
             <m:t>loss=0.5*BCELossWithLogitsLoss+0.5*DiceLoss</m:t>
           </m:r>
         </m:oMath>
@@ -1450,6 +1390,7 @@
               <w:spacing w:line="480" w:lineRule="auto"/>
             </w:pPr>
             <w:r>
+              <w:lastRenderedPageBreak/>
               <w:t>RISKY – MIOU</w:t>
             </w:r>
           </w:p>
@@ -1565,62 +1506,88 @@
     <w:p>
       <w:pPr>
         <w:spacing w:line="480" w:lineRule="auto"/>
-      </w:pPr>
-      <w:r>
-        <w:tab/>
-      </w:r>
-      <w:r>
-        <w:t>A</w:t>
-      </w:r>
-      <w:r>
-        <w:t xml:space="preserve"> hybrid approach of combining deterministic behavior with</w:t>
-      </w:r>
-      <w:r>
-        <w:t xml:space="preserve"> an SVM was used</w:t>
-      </w:r>
-      <w:r>
-        <w:t xml:space="preserve">. When given a waypoint, UAVs proceed directly to the waypoint. If a UAVs primary action can be performed in the cell it is in, it does so automatically. </w:t>
-      </w:r>
-      <w:r>
-        <w:t>If it doesn’t</w:t>
-      </w:r>
-      <w:r>
-        <w:t xml:space="preserve"> have a waypoint, the SVM determine</w:t>
-      </w:r>
-      <w:r>
-        <w:t>s</w:t>
-      </w:r>
-      <w:r>
-        <w:t xml:space="preserve"> its </w:t>
-      </w:r>
-      <w:r>
-        <w:t>next</w:t>
-      </w:r>
-      <w:r>
-        <w:t xml:space="preserve"> </w:t>
-      </w:r>
-      <w:r>
-        <w:t>action</w:t>
+        <w:ind w:firstLine="720"/>
+      </w:pPr>
+      <w:r>
+        <w:t xml:space="preserve"> Subsumption</w:t>
+      </w:r>
+      <w:r>
+        <w:t xml:space="preserve"> architecture</w:t>
+      </w:r>
+      <w:r>
+        <w:t xml:space="preserve"> (see Figure 8) was used to model UAV behavior</w:t>
       </w:r>
       <w:r>
         <w:t xml:space="preserve">. </w:t>
       </w:r>
       <w:r>
-        <w:t xml:space="preserve">This is inspired by Subsumption architecture. </w:t>
-      </w:r>
-      <w:r>
         <w:t>Connell</w:t>
       </w:r>
       <w:r>
-        <w:t xml:space="preserve"> 1990 provides </w:t>
-      </w:r>
-      <w:r>
-        <w:lastRenderedPageBreak/>
-        <w:t>an in-depth example of this approach</w:t>
-      </w:r>
-      <w:r>
-        <w:t>. Figure 8 shows an overview of how these behaviors override each other.</w:t>
-      </w:r>
+        <w:t xml:space="preserve"> 1990 provides an in-depth example of this approach</w:t>
+      </w:r>
+      <w:r>
+        <w:t>.</w:t>
+      </w:r>
+    </w:p>
+    <w:p>
+      <w:pPr>
+        <w:pStyle w:val="ListParagraph"/>
+        <w:numPr>
+          <w:ilvl w:val="0"/>
+          <w:numId w:val="8"/>
+        </w:numPr>
+        <w:spacing w:line="480" w:lineRule="auto"/>
+      </w:pPr>
+      <w:r>
+        <w:t>Boundary Override moves UAV away from boundaries.</w:t>
+      </w:r>
+    </w:p>
+    <w:p>
+      <w:pPr>
+        <w:pStyle w:val="ListParagraph"/>
+        <w:numPr>
+          <w:ilvl w:val="0"/>
+          <w:numId w:val="8"/>
+        </w:numPr>
+        <w:spacing w:line="480" w:lineRule="auto"/>
+      </w:pPr>
+      <w:r>
+        <w:t>Return Home moves UAV to home base when low on fuel.</w:t>
+      </w:r>
+    </w:p>
+    <w:p>
+      <w:pPr>
+        <w:pStyle w:val="ListParagraph"/>
+        <w:numPr>
+          <w:ilvl w:val="0"/>
+          <w:numId w:val="8"/>
+        </w:numPr>
+        <w:spacing w:line="480" w:lineRule="auto"/>
+      </w:pPr>
+      <w:r>
+        <w:t>Head to waypoint moves UAV to waypoint.</w:t>
+      </w:r>
+    </w:p>
+    <w:p>
+      <w:pPr>
+        <w:pStyle w:val="ListParagraph"/>
+        <w:numPr>
+          <w:ilvl w:val="0"/>
+          <w:numId w:val="8"/>
+        </w:numPr>
+        <w:spacing w:line="480" w:lineRule="auto"/>
+      </w:pPr>
+      <w:r>
+        <w:t>Heuristic Module is activated if there is no waypoint.</w:t>
+      </w:r>
+    </w:p>
+    <w:p>
+      <w:pPr>
+        <w:pStyle w:val="ListParagraph"/>
+        <w:spacing w:line="480" w:lineRule="auto"/>
+        <w:ind w:left="1080"/>
+      </w:pPr>
     </w:p>
     <w:p>
       <w:pPr>
@@ -1628,705 +1595,6 @@
         <w:ind w:firstLine="720"/>
       </w:pPr>
       <w:r>
-        <w:t>Cells within UAVs detection radius were used as input. Detection radius varies by UAV.</w:t>
-      </w:r>
-    </w:p>
-    <w:p>
-      <w:pPr>
-        <w:spacing w:line="480" w:lineRule="auto"/>
-      </w:pPr>
-      <w:r>
-        <w:tab/>
-      </w:r>
-      <w:r>
-        <w:t>We</w:t>
-      </w:r>
-      <w:r>
-        <w:t xml:space="preserve"> used Monte-Carlo + Q-Learning (</w:t>
-      </w:r>
-      <w:r>
-        <w:t>Watkins</w:t>
-      </w:r>
-      <w:r>
-        <w:t xml:space="preserve"> 1992) to iteratively learn a greedy policy using a Q-Value function.</w:t>
-      </w:r>
-      <w:r>
-        <w:t xml:space="preserve"> </w:t>
-      </w:r>
-      <w:r>
-        <w:t xml:space="preserve">A Random Forest was used to estimate Q-Value function. </w:t>
-      </w:r>
-    </w:p>
-    <w:p>
-      <w:pPr>
-        <w:spacing w:line="480" w:lineRule="auto"/>
-        <w:ind w:firstLine="720"/>
-      </w:pPr>
-      <w:r>
-        <w:t xml:space="preserve">An </w:t>
-      </w:r>
-      <w:r>
-        <w:t>SVM was fitted to the policy generated by this.</w:t>
-      </w:r>
-      <w:r>
-        <w:t xml:space="preserve"> </w:t>
-      </w:r>
-    </w:p>
-    <w:p>
-      <w:pPr>
-        <w:spacing w:line="480" w:lineRule="auto"/>
-      </w:pPr>
-      <w:r>
-        <w:tab/>
-      </w:r>
-      <w:r>
-        <w:t>Each UAV class has its own reward function.</w:t>
-      </w:r>
-      <w:r>
-        <w:t xml:space="preserve"> Reward function design was inspired by (</w:t>
-      </w:r>
-      <w:r>
-        <w:t>Yu</w:t>
-      </w:r>
-      <w:r>
-        <w:t xml:space="preserve"> 2025) and (</w:t>
-      </w:r>
-      <w:r>
-        <w:t>Julian</w:t>
-      </w:r>
-      <w:r>
-        <w:t xml:space="preserve"> 2018</w:t>
-      </w:r>
-      <w:r>
-        <w:t>).</w:t>
-      </w:r>
-      <w:r>
-        <w:t xml:space="preserve"> </w:t>
-      </w:r>
-    </w:p>
-    <w:p>
-      <w:pPr>
-        <w:spacing w:line="480" w:lineRule="auto"/>
-      </w:pPr>
-    </w:p>
-    <w:p>
-      <w:pPr>
-        <w:spacing w:line="480" w:lineRule="auto"/>
-        <w:rPr>
-          <w:i/>
-          <w:iCs/>
-        </w:rPr>
-      </w:pPr>
-      <w:r>
-        <w:rPr>
-          <w:i/>
-          <w:iCs/>
-        </w:rPr>
-        <w:t>Recon:</w:t>
-      </w:r>
-    </w:p>
-    <w:p>
-      <w:pPr>
-        <w:spacing w:line="480" w:lineRule="auto"/>
-      </w:pPr>
-      <m:oMathPara>
-        <m:oMath>
-          <m:r>
-            <w:rPr>
-              <w:rFonts w:ascii="Cambria Math" w:hAnsi="Cambria Math"/>
-            </w:rPr>
-            <m:t>reward= -0.5-dist</m:t>
-          </m:r>
-          <m:d>
-            <m:dPr>
-              <m:ctrlPr>
-                <w:rPr>
-                  <w:rFonts w:ascii="Cambria Math" w:hAnsi="Cambria Math"/>
-                  <w:i/>
-                </w:rPr>
-              </m:ctrlPr>
-            </m:dPr>
-            <m:e>
-              <m:r>
-                <w:rPr>
-                  <w:rFonts w:ascii="Cambria Math" w:hAnsi="Cambria Math"/>
-                </w:rPr>
-                <m:t>agen</m:t>
-              </m:r>
-              <m:sSub>
-                <m:sSubPr>
-                  <m:ctrlPr>
-                    <w:rPr>
-                      <w:rFonts w:ascii="Cambria Math" w:hAnsi="Cambria Math"/>
-                      <w:i/>
-                    </w:rPr>
-                  </m:ctrlPr>
-                </m:sSubPr>
-                <m:e>
-                  <m:r>
-                    <w:rPr>
-                      <w:rFonts w:ascii="Cambria Math" w:hAnsi="Cambria Math"/>
-                    </w:rPr>
-                    <m:t>t</m:t>
-                  </m:r>
-                </m:e>
-                <m:sub>
-                  <m:r>
-                    <w:rPr>
-                      <w:rFonts w:ascii="Cambria Math" w:hAnsi="Cambria Math"/>
-                    </w:rPr>
-                    <m:t>pos</m:t>
-                  </m:r>
-                </m:sub>
-              </m:sSub>
-              <m:r>
-                <w:rPr>
-                  <w:rFonts w:ascii="Cambria Math" w:hAnsi="Cambria Math"/>
-                </w:rPr>
-                <m:t>, agen</m:t>
-              </m:r>
-              <m:sSub>
-                <m:sSubPr>
-                  <m:ctrlPr>
-                    <w:rPr>
-                      <w:rFonts w:ascii="Cambria Math" w:hAnsi="Cambria Math"/>
-                      <w:i/>
-                    </w:rPr>
-                  </m:ctrlPr>
-                </m:sSubPr>
-                <m:e>
-                  <m:r>
-                    <w:rPr>
-                      <w:rFonts w:ascii="Cambria Math" w:hAnsi="Cambria Math"/>
-                    </w:rPr>
-                    <m:t>t</m:t>
-                  </m:r>
-                </m:e>
-                <m:sub>
-                  <m:r>
-                    <w:rPr>
-                      <w:rFonts w:ascii="Cambria Math" w:hAnsi="Cambria Math"/>
-                    </w:rPr>
-                    <m:t>waypoint</m:t>
-                  </m:r>
-                </m:sub>
-              </m:sSub>
-            </m:e>
-          </m:d>
-          <m:r>
-            <w:rPr>
-              <w:rFonts w:ascii="Cambria Math" w:hAnsi="Cambria Math"/>
-            </w:rPr>
-            <m:t>+burningcellcount+2*</m:t>
-          </m:r>
-          <m:r>
-            <w:rPr>
-              <w:rFonts w:ascii="Cambria Math" w:hAnsi="Cambria Math"/>
-            </w:rPr>
-            <m:t xml:space="preserve">humancount </m:t>
-          </m:r>
-        </m:oMath>
-      </m:oMathPara>
-    </w:p>
-    <w:p>
-      <w:pPr>
-        <w:spacing w:line="480" w:lineRule="auto"/>
-        <w:rPr>
-          <w:i/>
-          <w:iCs/>
-        </w:rPr>
-      </w:pPr>
-    </w:p>
-    <w:p>
-      <w:pPr>
-        <w:spacing w:line="480" w:lineRule="auto"/>
-        <w:rPr>
-          <w:i/>
-          <w:iCs/>
-        </w:rPr>
-      </w:pPr>
-      <w:r>
-        <w:rPr>
-          <w:i/>
-          <w:iCs/>
-        </w:rPr>
-        <w:t>Extinguisher:</w:t>
-      </w:r>
-    </w:p>
-    <w:p>
-      <w:pPr>
-        <w:spacing w:line="480" w:lineRule="auto"/>
-      </w:pPr>
-      <m:oMathPara>
-        <m:oMathParaPr>
-          <m:jc m:val="left"/>
-        </m:oMathParaPr>
-        <m:oMath>
-          <m:r>
-            <w:rPr>
-              <w:rFonts w:ascii="Cambria Math" w:hAnsi="Cambria Math"/>
-            </w:rPr>
-            <m:t>reward= -0.5-dist</m:t>
-          </m:r>
-          <m:d>
-            <m:dPr>
-              <m:ctrlPr>
-                <w:rPr>
-                  <w:rFonts w:ascii="Cambria Math" w:hAnsi="Cambria Math"/>
-                  <w:i/>
-                </w:rPr>
-              </m:ctrlPr>
-            </m:dPr>
-            <m:e>
-              <m:r>
-                <w:rPr>
-                  <w:rFonts w:ascii="Cambria Math" w:hAnsi="Cambria Math"/>
-                </w:rPr>
-                <m:t>agen</m:t>
-              </m:r>
-              <m:sSub>
-                <m:sSubPr>
-                  <m:ctrlPr>
-                    <w:rPr>
-                      <w:rFonts w:ascii="Cambria Math" w:hAnsi="Cambria Math"/>
-                      <w:i/>
-                    </w:rPr>
-                  </m:ctrlPr>
-                </m:sSubPr>
-                <m:e>
-                  <m:r>
-                    <w:rPr>
-                      <w:rFonts w:ascii="Cambria Math" w:hAnsi="Cambria Math"/>
-                    </w:rPr>
-                    <m:t>t</m:t>
-                  </m:r>
-                </m:e>
-                <m:sub>
-                  <m:r>
-                    <w:rPr>
-                      <w:rFonts w:ascii="Cambria Math" w:hAnsi="Cambria Math"/>
-                    </w:rPr>
-                    <m:t>pos</m:t>
-                  </m:r>
-                </m:sub>
-              </m:sSub>
-              <m:r>
-                <w:rPr>
-                  <w:rFonts w:ascii="Cambria Math" w:hAnsi="Cambria Math"/>
-                </w:rPr>
-                <m:t>, agen</m:t>
-              </m:r>
-              <m:sSub>
-                <m:sSubPr>
-                  <m:ctrlPr>
-                    <w:rPr>
-                      <w:rFonts w:ascii="Cambria Math" w:hAnsi="Cambria Math"/>
-                      <w:i/>
-                    </w:rPr>
-                  </m:ctrlPr>
-                </m:sSubPr>
-                <m:e>
-                  <m:r>
-                    <w:rPr>
-                      <w:rFonts w:ascii="Cambria Math" w:hAnsi="Cambria Math"/>
-                    </w:rPr>
-                    <m:t>t</m:t>
-                  </m:r>
-                </m:e>
-                <m:sub>
-                  <m:r>
-                    <w:rPr>
-                      <w:rFonts w:ascii="Cambria Math" w:hAnsi="Cambria Math"/>
-                    </w:rPr>
-                    <m:t>waypoint</m:t>
-                  </m:r>
-                </m:sub>
-              </m:sSub>
-            </m:e>
-          </m:d>
-          <m:r>
-            <w:rPr>
-              <w:rFonts w:ascii="Cambria Math" w:hAnsi="Cambria Math"/>
-            </w:rPr>
-            <m:t>+25*extinguishedfire-remaingingfire</m:t>
-          </m:r>
-        </m:oMath>
-      </m:oMathPara>
-    </w:p>
-    <w:p>
-      <w:pPr>
-        <w:spacing w:line="480" w:lineRule="auto"/>
-        <w:rPr>
-          <w:i/>
-          <w:iCs/>
-        </w:rPr>
-      </w:pPr>
-    </w:p>
-    <w:p>
-      <w:pPr>
-        <w:spacing w:line="480" w:lineRule="auto"/>
-        <w:rPr>
-          <w:i/>
-          <w:iCs/>
-        </w:rPr>
-      </w:pPr>
-      <w:r>
-        <w:rPr>
-          <w:i/>
-          <w:iCs/>
-        </w:rPr>
-        <w:t>Search and Rescue:</w:t>
-      </w:r>
-    </w:p>
-    <w:p>
-      <w:pPr>
-        <w:spacing w:line="480" w:lineRule="auto"/>
-      </w:pPr>
-      <m:oMathPara>
-        <m:oMathParaPr>
-          <m:jc m:val="left"/>
-        </m:oMathParaPr>
-        <m:oMath>
-          <m:r>
-            <w:rPr>
-              <w:rFonts w:ascii="Cambria Math" w:hAnsi="Cambria Math"/>
-            </w:rPr>
-            <m:t>reward= -0.5-dist</m:t>
-          </m:r>
-          <m:d>
-            <m:dPr>
-              <m:ctrlPr>
-                <w:rPr>
-                  <w:rFonts w:ascii="Cambria Math" w:hAnsi="Cambria Math"/>
-                  <w:i/>
-                </w:rPr>
-              </m:ctrlPr>
-            </m:dPr>
-            <m:e>
-              <m:r>
-                <w:rPr>
-                  <w:rFonts w:ascii="Cambria Math" w:hAnsi="Cambria Math"/>
-                </w:rPr>
-                <m:t>agen</m:t>
-              </m:r>
-              <m:sSub>
-                <m:sSubPr>
-                  <m:ctrlPr>
-                    <w:rPr>
-                      <w:rFonts w:ascii="Cambria Math" w:hAnsi="Cambria Math"/>
-                      <w:i/>
-                    </w:rPr>
-                  </m:ctrlPr>
-                </m:sSubPr>
-                <m:e>
-                  <m:r>
-                    <w:rPr>
-                      <w:rFonts w:ascii="Cambria Math" w:hAnsi="Cambria Math"/>
-                    </w:rPr>
-                    <m:t>t</m:t>
-                  </m:r>
-                </m:e>
-                <m:sub>
-                  <m:r>
-                    <w:rPr>
-                      <w:rFonts w:ascii="Cambria Math" w:hAnsi="Cambria Math"/>
-                    </w:rPr>
-                    <m:t>pos</m:t>
-                  </m:r>
-                </m:sub>
-              </m:sSub>
-              <m:r>
-                <w:rPr>
-                  <w:rFonts w:ascii="Cambria Math" w:hAnsi="Cambria Math"/>
-                </w:rPr>
-                <m:t>,agen</m:t>
-              </m:r>
-              <m:sSub>
-                <m:sSubPr>
-                  <m:ctrlPr>
-                    <w:rPr>
-                      <w:rFonts w:ascii="Cambria Math" w:hAnsi="Cambria Math"/>
-                      <w:i/>
-                    </w:rPr>
-                  </m:ctrlPr>
-                </m:sSubPr>
-                <m:e>
-                  <m:r>
-                    <w:rPr>
-                      <w:rFonts w:ascii="Cambria Math" w:hAnsi="Cambria Math"/>
-                    </w:rPr>
-                    <m:t>t</m:t>
-                  </m:r>
-                </m:e>
-                <m:sub>
-                  <m:r>
-                    <w:rPr>
-                      <w:rFonts w:ascii="Cambria Math" w:hAnsi="Cambria Math"/>
-                    </w:rPr>
-                    <m:t>waypoint</m:t>
-                  </m:r>
-                </m:sub>
-              </m:sSub>
-            </m:e>
-          </m:d>
-          <m:r>
-            <w:rPr>
-              <w:rFonts w:ascii="Cambria Math" w:hAnsi="Cambria Math"/>
-            </w:rPr>
-            <m:t>+50*rescuedhumancount+5*detectedhumancount</m:t>
-          </m:r>
-        </m:oMath>
-      </m:oMathPara>
-    </w:p>
-    <w:p>
-      <w:pPr>
-        <w:spacing w:line="480" w:lineRule="auto"/>
-      </w:pPr>
-    </w:p>
-    <w:p>
-      <w:pPr>
-        <w:spacing w:line="480" w:lineRule="auto"/>
-        <w:ind w:firstLine="720"/>
-      </w:pPr>
-      <w:r>
-        <w:t xml:space="preserve">Constants were chosen via intuition with minor tuning </w:t>
-      </w:r>
-      <w:r>
-        <w:t xml:space="preserve">during </w:t>
-      </w:r>
-      <w:r>
-        <w:t>end-to-end testing.</w:t>
-      </w:r>
-      <w:r>
-        <w:t xml:space="preserve"> </w:t>
-      </w:r>
-      <w:r>
-        <w:t>Further optimization here requires more end-to-end testing which is prohibitively expensive.</w:t>
-      </w:r>
-    </w:p>
-    <w:p>
-      <w:pPr>
-        <w:spacing w:line="480" w:lineRule="auto"/>
-        <w:ind w:firstLine="720"/>
-      </w:pPr>
-      <w:r>
-        <w:t>We performed 10 training rounds</w:t>
-      </w:r>
-      <w:r>
-        <w:t>, 100 episodes per agent. Results are below:</w:t>
-      </w:r>
-    </w:p>
-    <w:p>
-      <w:pPr>
-        <w:spacing w:line="480" w:lineRule="auto"/>
-        <w:ind w:firstLine="720"/>
-      </w:pPr>
-    </w:p>
-    <w:tbl>
-      <w:tblPr>
-        <w:tblStyle w:val="GridTable1Light"/>
-        <w:tblW w:w="0" w:type="auto"/>
-        <w:tblLook w:val="04A0" w:firstRow="1" w:lastRow="0" w:firstColumn="1" w:lastColumn="0" w:noHBand="0" w:noVBand="1"/>
-      </w:tblPr>
-      <w:tblGrid>
-        <w:gridCol w:w="3116"/>
-        <w:gridCol w:w="3117"/>
-        <w:gridCol w:w="3117"/>
-      </w:tblGrid>
-      <w:tr>
-        <w:trPr>
-          <w:cnfStyle w:val="100000000000" w:firstRow="1" w:lastRow="0" w:firstColumn="0" w:lastColumn="0" w:oddVBand="0" w:evenVBand="0" w:oddHBand="0" w:evenHBand="0" w:firstRowFirstColumn="0" w:firstRowLastColumn="0" w:lastRowFirstColumn="0" w:lastRowLastColumn="0"/>
-        </w:trPr>
-        <w:tc>
-          <w:tcPr>
-            <w:cnfStyle w:val="001000000000" w:firstRow="0" w:lastRow="0" w:firstColumn="1" w:lastColumn="0" w:oddVBand="0" w:evenVBand="0" w:oddHBand="0" w:evenHBand="0" w:firstRowFirstColumn="0" w:firstRowLastColumn="0" w:lastRowFirstColumn="0" w:lastRowLastColumn="0"/>
-            <w:tcW w:w="3116" w:type="dxa"/>
-          </w:tcPr>
-          <w:p>
-            <w:pPr>
-              <w:spacing w:line="480" w:lineRule="auto"/>
-            </w:pPr>
-            <w:r>
-              <w:t>UAV</w:t>
-            </w:r>
-          </w:p>
-        </w:tc>
-        <w:tc>
-          <w:tcPr>
-            <w:tcW w:w="3117" w:type="dxa"/>
-          </w:tcPr>
-          <w:p>
-            <w:pPr>
-              <w:spacing w:line="480" w:lineRule="auto"/>
-              <w:cnfStyle w:val="100000000000" w:firstRow="1" w:lastRow="0" w:firstColumn="0" w:lastColumn="0" w:oddVBand="0" w:evenVBand="0" w:oddHBand="0" w:evenHBand="0" w:firstRowFirstColumn="0" w:firstRowLastColumn="0" w:lastRowFirstColumn="0" w:lastRowLastColumn="0"/>
-            </w:pPr>
-            <w:r>
-              <w:t>MEAN REWARD</w:t>
-            </w:r>
-          </w:p>
-        </w:tc>
-        <w:tc>
-          <w:tcPr>
-            <w:tcW w:w="3117" w:type="dxa"/>
-          </w:tcPr>
-          <w:p>
-            <w:pPr>
-              <w:spacing w:line="480" w:lineRule="auto"/>
-              <w:cnfStyle w:val="100000000000" w:firstRow="1" w:lastRow="0" w:firstColumn="0" w:lastColumn="0" w:oddVBand="0" w:evenVBand="0" w:oddHBand="0" w:evenHBand="0" w:firstRowFirstColumn="0" w:firstRowLastColumn="0" w:lastRowFirstColumn="0" w:lastRowLastColumn="0"/>
-            </w:pPr>
-            <w:r>
-              <w:t>STANDARD DEVIATION</w:t>
-            </w:r>
-          </w:p>
-        </w:tc>
-      </w:tr>
-      <w:tr>
-        <w:tc>
-          <w:tcPr>
-            <w:cnfStyle w:val="001000000000" w:firstRow="0" w:lastRow="0" w:firstColumn="1" w:lastColumn="0" w:oddVBand="0" w:evenVBand="0" w:oddHBand="0" w:evenHBand="0" w:firstRowFirstColumn="0" w:firstRowLastColumn="0" w:lastRowFirstColumn="0" w:lastRowLastColumn="0"/>
-            <w:tcW w:w="3116" w:type="dxa"/>
-          </w:tcPr>
-          <w:p>
-            <w:pPr>
-              <w:spacing w:line="480" w:lineRule="auto"/>
-            </w:pPr>
-            <w:r>
-              <w:t>RECON</w:t>
-            </w:r>
-          </w:p>
-        </w:tc>
-        <w:tc>
-          <w:tcPr>
-            <w:tcW w:w="3117" w:type="dxa"/>
-          </w:tcPr>
-          <w:p>
-            <w:pPr>
-              <w:spacing w:line="480" w:lineRule="auto"/>
-              <w:cnfStyle w:val="000000000000" w:firstRow="0" w:lastRow="0" w:firstColumn="0" w:lastColumn="0" w:oddVBand="0" w:evenVBand="0" w:oddHBand="0" w:evenHBand="0" w:firstRowFirstColumn="0" w:firstRowLastColumn="0" w:lastRowFirstColumn="0" w:lastRowLastColumn="0"/>
-            </w:pPr>
-            <w:r>
-              <w:t>-5.99</w:t>
-            </w:r>
-          </w:p>
-        </w:tc>
-        <w:tc>
-          <w:tcPr>
-            <w:tcW w:w="3117" w:type="dxa"/>
-          </w:tcPr>
-          <w:p>
-            <w:pPr>
-              <w:spacing w:line="480" w:lineRule="auto"/>
-              <w:cnfStyle w:val="000000000000" w:firstRow="0" w:lastRow="0" w:firstColumn="0" w:lastColumn="0" w:oddVBand="0" w:evenVBand="0" w:oddHBand="0" w:evenHBand="0" w:firstRowFirstColumn="0" w:firstRowLastColumn="0" w:lastRowFirstColumn="0" w:lastRowLastColumn="0"/>
-            </w:pPr>
-            <w:r>
-              <w:t>6.05</w:t>
-            </w:r>
-          </w:p>
-        </w:tc>
-      </w:tr>
-      <w:tr>
-        <w:tc>
-          <w:tcPr>
-            <w:cnfStyle w:val="001000000000" w:firstRow="0" w:lastRow="0" w:firstColumn="1" w:lastColumn="0" w:oddVBand="0" w:evenVBand="0" w:oddHBand="0" w:evenHBand="0" w:firstRowFirstColumn="0" w:firstRowLastColumn="0" w:lastRowFirstColumn="0" w:lastRowLastColumn="0"/>
-            <w:tcW w:w="3116" w:type="dxa"/>
-          </w:tcPr>
-          <w:p>
-            <w:pPr>
-              <w:spacing w:line="480" w:lineRule="auto"/>
-            </w:pPr>
-            <w:r>
-              <w:t>EXTINGUISH</w:t>
-            </w:r>
-          </w:p>
-        </w:tc>
-        <w:tc>
-          <w:tcPr>
-            <w:tcW w:w="3117" w:type="dxa"/>
-          </w:tcPr>
-          <w:p>
-            <w:pPr>
-              <w:spacing w:line="480" w:lineRule="auto"/>
-              <w:cnfStyle w:val="000000000000" w:firstRow="0" w:lastRow="0" w:firstColumn="0" w:lastColumn="0" w:oddVBand="0" w:evenVBand="0" w:oddHBand="0" w:evenHBand="0" w:firstRowFirstColumn="0" w:firstRowLastColumn="0" w:lastRowFirstColumn="0" w:lastRowLastColumn="0"/>
-            </w:pPr>
-            <w:r>
-              <w:t>-6.9</w:t>
-            </w:r>
-          </w:p>
-        </w:tc>
-        <w:tc>
-          <w:tcPr>
-            <w:tcW w:w="3117" w:type="dxa"/>
-          </w:tcPr>
-          <w:p>
-            <w:pPr>
-              <w:spacing w:line="480" w:lineRule="auto"/>
-              <w:cnfStyle w:val="000000000000" w:firstRow="0" w:lastRow="0" w:firstColumn="0" w:lastColumn="0" w:oddVBand="0" w:evenVBand="0" w:oddHBand="0" w:evenHBand="0" w:firstRowFirstColumn="0" w:firstRowLastColumn="0" w:lastRowFirstColumn="0" w:lastRowLastColumn="0"/>
-            </w:pPr>
-            <w:r>
-              <w:t>11.05</w:t>
-            </w:r>
-          </w:p>
-        </w:tc>
-      </w:tr>
-      <w:tr>
-        <w:tc>
-          <w:tcPr>
-            <w:cnfStyle w:val="001000000000" w:firstRow="0" w:lastRow="0" w:firstColumn="1" w:lastColumn="0" w:oddVBand="0" w:evenVBand="0" w:oddHBand="0" w:evenHBand="0" w:firstRowFirstColumn="0" w:firstRowLastColumn="0" w:lastRowFirstColumn="0" w:lastRowLastColumn="0"/>
-            <w:tcW w:w="3116" w:type="dxa"/>
-          </w:tcPr>
-          <w:p>
-            <w:pPr>
-              <w:spacing w:line="480" w:lineRule="auto"/>
-            </w:pPr>
-            <w:r>
-              <w:t>RESCUE</w:t>
-            </w:r>
-          </w:p>
-        </w:tc>
-        <w:tc>
-          <w:tcPr>
-            <w:tcW w:w="3117" w:type="dxa"/>
-          </w:tcPr>
-          <w:p>
-            <w:pPr>
-              <w:spacing w:line="480" w:lineRule="auto"/>
-              <w:cnfStyle w:val="000000000000" w:firstRow="0" w:lastRow="0" w:firstColumn="0" w:lastColumn="0" w:oddVBand="0" w:evenVBand="0" w:oddHBand="0" w:evenHBand="0" w:firstRowFirstColumn="0" w:firstRowLastColumn="0" w:lastRowFirstColumn="0" w:lastRowLastColumn="0"/>
-            </w:pPr>
-            <w:r>
-              <w:t>-6.02</w:t>
-            </w:r>
-          </w:p>
-        </w:tc>
-        <w:tc>
-          <w:tcPr>
-            <w:tcW w:w="3117" w:type="dxa"/>
-          </w:tcPr>
-          <w:p>
-            <w:pPr>
-              <w:spacing w:line="480" w:lineRule="auto"/>
-              <w:cnfStyle w:val="000000000000" w:firstRow="0" w:lastRow="0" w:firstColumn="0" w:lastColumn="0" w:oddVBand="0" w:evenVBand="0" w:oddHBand="0" w:evenHBand="0" w:firstRowFirstColumn="0" w:firstRowLastColumn="0" w:lastRowFirstColumn="0" w:lastRowLastColumn="0"/>
-            </w:pPr>
-            <w:r>
-              <w:t>4.36</w:t>
-            </w:r>
-          </w:p>
-        </w:tc>
-      </w:tr>
-    </w:tbl>
-    <w:p>
-      <w:pPr>
-        <w:spacing w:line="480" w:lineRule="auto"/>
-      </w:pPr>
-    </w:p>
-    <w:p>
-      <w:pPr>
-        <w:spacing w:line="480" w:lineRule="auto"/>
-        <w:ind w:firstLine="720"/>
-      </w:pPr>
-      <w:r>
-        <w:t xml:space="preserve">UAVs have functionality to facilitate interaction with the Command Module. </w:t>
-      </w:r>
-      <w:r>
         <w:t>UAVs keep a record of all observations / positions / waypoint</w:t>
       </w:r>
       <w:r>
@@ -2349,30 +1617,6 @@
       </w:r>
       <w:r>
         <w:t>.</w:t>
-      </w:r>
-    </w:p>
-    <w:p>
-      <w:pPr>
-        <w:spacing w:line="480" w:lineRule="auto"/>
-      </w:pPr>
-      <w:r>
-        <w:tab/>
-        <w:t xml:space="preserve">To keep the UAVs within </w:t>
-      </w:r>
-      <w:r>
-        <w:t>the grid</w:t>
-      </w:r>
-      <w:r>
-        <w:t>, we implemented</w:t>
-      </w:r>
-      <w:r>
-        <w:t xml:space="preserve"> a special “boundary override</w:t>
-      </w:r>
-      <w:r>
-        <w:t xml:space="preserve"> action” that </w:t>
-      </w:r>
-      <w:r>
-        <w:t>automatically overrides the current input steering it in the opposite direction.</w:t>
       </w:r>
     </w:p>
     <w:p>
@@ -2426,6 +1670,7 @@
         <w:spacing w:line="480" w:lineRule="auto"/>
       </w:pPr>
       <w:r>
+        <w:lastRenderedPageBreak/>
         <w:tab/>
         <w:t xml:space="preserve">Each Agent other than the Command Centre Agent keeps a memory of previous interactions which are inserted as part the prompt for each turn. </w:t>
       </w:r>
@@ -2511,7 +1756,6 @@
         <w:spacing w:line="480" w:lineRule="auto"/>
       </w:pPr>
       <w:r>
-        <w:lastRenderedPageBreak/>
         <w:tab/>
       </w:r>
       <w:proofErr w:type="spellStart"/>
@@ -2672,13 +1916,8 @@
               <w:spacing w:line="480" w:lineRule="auto"/>
               <w:cnfStyle w:val="000000000000" w:firstRow="0" w:lastRow="0" w:firstColumn="0" w:lastColumn="0" w:oddVBand="0" w:evenVBand="0" w:oddHBand="0" w:evenHBand="0" w:firstRowFirstColumn="0" w:firstRowLastColumn="0" w:lastRowFirstColumn="0" w:lastRowLastColumn="0"/>
             </w:pPr>
-            <w:proofErr w:type="gramStart"/>
             <w:r>
-              <w:t>Generates</w:t>
-            </w:r>
-            <w:proofErr w:type="gramEnd"/>
-            <w:r>
-              <w:t xml:space="preserve"> Subgoals for LTGs</w:t>
+              <w:t>Generate Subgoals for LTGs</w:t>
             </w:r>
           </w:p>
         </w:tc>
@@ -2764,6 +2003,7 @@
               <w:spacing w:line="480" w:lineRule="auto"/>
             </w:pPr>
             <w:r>
+              <w:lastRenderedPageBreak/>
               <w:t>Assistant Agent</w:t>
             </w:r>
           </w:p>
@@ -2840,7 +2080,6 @@
         <w:spacing w:line="480" w:lineRule="auto"/>
       </w:pPr>
       <w:r>
-        <w:lastRenderedPageBreak/>
         <w:t>On the first step and every 40-simulation step afterwards</w:t>
       </w:r>
       <w:r>
@@ -3230,7 +2469,7 @@
         </w:rPr>
         <w:lastRenderedPageBreak/>
         <w:drawing>
-          <wp:inline distT="0" distB="0" distL="0" distR="0" wp14:anchorId="5A99DB7D" wp14:editId="3B5A8444">
+          <wp:inline distT="0" distB="0" distL="0" distR="0" wp14:anchorId="5A99DB7D" wp14:editId="3A4F8A09">
             <wp:extent cx="5941060" cy="6047105"/>
             <wp:effectExtent l="0" t="0" r="2540" b="0"/>
             <wp:docPr id="1561439249" name="Picture 5"/>
@@ -3315,8 +2554,8 @@
           <w:noProof/>
         </w:rPr>
         <w:drawing>
-          <wp:inline distT="0" distB="0" distL="0" distR="0" wp14:anchorId="76D4C277" wp14:editId="08462065">
-            <wp:extent cx="5932651" cy="5549900"/>
+          <wp:inline distT="0" distB="0" distL="0" distR="0" wp14:anchorId="76D4C277" wp14:editId="7ABFAAB6">
+            <wp:extent cx="5932651" cy="5549899"/>
             <wp:effectExtent l="0" t="0" r="0" b="0"/>
             <wp:docPr id="1715014003" name="Picture 4"/>
             <wp:cNvGraphicFramePr>
@@ -3346,7 +2585,7 @@
                   <pic:spPr bwMode="auto">
                     <a:xfrm>
                       <a:off x="0" y="0"/>
-                      <a:ext cx="5932651" cy="5549900"/>
+                      <a:ext cx="5932651" cy="5549899"/>
                     </a:xfrm>
                     <a:prstGeom prst="rect">
                       <a:avLst/>
@@ -3491,7 +2730,7 @@
           <w:noProof/>
         </w:rPr>
         <w:drawing>
-          <wp:inline distT="0" distB="0" distL="0" distR="0" wp14:anchorId="231DA530" wp14:editId="11D534E2">
+          <wp:inline distT="0" distB="0" distL="0" distR="0" wp14:anchorId="231DA530" wp14:editId="2DF8BBF6">
             <wp:extent cx="5937250" cy="2971800"/>
             <wp:effectExtent l="0" t="0" r="6350" b="0"/>
             <wp:docPr id="1696375601" name="Picture 2"/>
@@ -3587,7 +2826,7 @@
         </w:rPr>
         <w:lastRenderedPageBreak/>
         <w:drawing>
-          <wp:inline distT="0" distB="0" distL="0" distR="0" wp14:anchorId="07AEBEAA" wp14:editId="15EDD4E2">
+          <wp:inline distT="0" distB="0" distL="0" distR="0" wp14:anchorId="07AEBEAA" wp14:editId="3EE1FA8E">
             <wp:extent cx="4203700" cy="4203700"/>
             <wp:effectExtent l="0" t="0" r="6350" b="6350"/>
             <wp:docPr id="1927120881" name="Picture 3"/>
@@ -3655,10 +2894,10 @@
         <w:t xml:space="preserve"> UAV Behavior</w:t>
       </w:r>
     </w:p>
-    <w:p>
-      <w:pPr>
-        <w:spacing w:line="480" w:lineRule="auto"/>
-        <w:ind w:firstLine="720"/>
+    <w:p/>
+    <w:p>
+      <w:pPr>
+        <w:spacing w:line="480" w:lineRule="auto"/>
       </w:pPr>
     </w:p>
     <w:p>
@@ -3872,7 +3111,13 @@
       </w:pPr>
       <w:r>
         <w:tab/>
-        <w:t>Our setup used a remote model – Anthropic Claude Sonnet 4.5. This was sufficient for our purposes</w:t>
+        <w:t xml:space="preserve">Our setup used a remote model – Anthropic Claude </w:t>
+      </w:r>
+      <w:r>
+        <w:t>Haiku</w:t>
+      </w:r>
+      <w:r>
+        <w:t xml:space="preserve"> 4.5. This was sufficient for our purposes</w:t>
       </w:r>
       <w:r>
         <w:t>. Infrastructure may not be reliable in a realistic scenario</w:t>
@@ -3949,7 +3194,86 @@
         <w:ind w:firstLine="720"/>
       </w:pPr>
       <w:r>
-        <w:t xml:space="preserve">We ran five end to end tests on the current version of the system. Despite the stochastic nature of the system, we kept the number of tests low as running the system with an appropriate model was cost prohibitive. </w:t>
+        <w:t>We measured the effectiveness of this system by performing the following experiment:</w:t>
+      </w:r>
+    </w:p>
+    <w:p>
+      <w:pPr>
+        <w:pStyle w:val="ListParagraph"/>
+        <w:numPr>
+          <w:ilvl w:val="0"/>
+          <w:numId w:val="9"/>
+        </w:numPr>
+        <w:spacing w:line="480" w:lineRule="auto"/>
+      </w:pPr>
+      <w:r>
+        <w:t>Run the simulation 30 times without the Agentic Workflow and UAV active.</w:t>
+      </w:r>
+    </w:p>
+    <w:p>
+      <w:pPr>
+        <w:pStyle w:val="ListParagraph"/>
+        <w:numPr>
+          <w:ilvl w:val="0"/>
+          <w:numId w:val="9"/>
+        </w:numPr>
+        <w:spacing w:line="480" w:lineRule="auto"/>
+      </w:pPr>
+      <w:r>
+        <w:t>Run the simulation 30 times with Agentic Workflow and UAV.</w:t>
+      </w:r>
+    </w:p>
+    <w:p>
+      <w:pPr>
+        <w:pStyle w:val="ListParagraph"/>
+        <w:numPr>
+          <w:ilvl w:val="0"/>
+          <w:numId w:val="9"/>
+        </w:numPr>
+        <w:spacing w:line="480" w:lineRule="auto"/>
+      </w:pPr>
+      <w:r>
+        <w:t xml:space="preserve">Performed basic data exploration and visualization of the data using a </w:t>
+      </w:r>
+      <w:proofErr w:type="spellStart"/>
+      <w:r>
+        <w:t>jupyter</w:t>
+      </w:r>
+      <w:proofErr w:type="spellEnd"/>
+      <w:r>
+        <w:t xml:space="preserve"> notebook.</w:t>
+      </w:r>
+    </w:p>
+    <w:p>
+      <w:pPr>
+        <w:pStyle w:val="ListParagraph"/>
+        <w:numPr>
+          <w:ilvl w:val="0"/>
+          <w:numId w:val="9"/>
+        </w:numPr>
+        <w:spacing w:line="480" w:lineRule="auto"/>
+      </w:pPr>
+      <w:r>
+        <w:lastRenderedPageBreak/>
+        <w:t xml:space="preserve">Performed </w:t>
+      </w:r>
+      <w:r>
+        <w:t xml:space="preserve">a one-sided </w:t>
+      </w:r>
+      <w:r>
+        <w:t>Man</w:t>
+      </w:r>
+      <w:r>
+        <w:t>n</w:t>
+      </w:r>
+      <w:r>
+        <w:t>-Whitney U</w:t>
+      </w:r>
+      <w:r>
+        <w:t xml:space="preserve"> test with the hypothesis that our system will improve both the BURNED AREA metric and the CASUALTY metric.</w:t>
+      </w:r>
+      <w:r>
+        <w:t xml:space="preserve"> </w:t>
       </w:r>
     </w:p>
     <w:p>
@@ -3958,29 +3282,17 @@
         <w:ind w:firstLine="720"/>
       </w:pPr>
       <w:r>
-        <w:t>Each test ran for maximum of 750 steps.</w:t>
-      </w:r>
-      <w:r>
-        <w:t xml:space="preserve"> </w:t>
-      </w:r>
-      <w:r>
-        <w:t>We recorded video and output logs for each simulation.</w:t>
-      </w:r>
-    </w:p>
-    <w:p>
-      <w:pPr>
-        <w:spacing w:line="480" w:lineRule="auto"/>
-        <w:ind w:firstLine="720"/>
-      </w:pPr>
-      <w:r>
-        <w:t xml:space="preserve">We used Claude Sonnet 4.5 as our LLM for all Agents. </w:t>
-      </w:r>
-    </w:p>
-    <w:p>
-      <w:pPr>
-        <w:spacing w:line="480" w:lineRule="auto"/>
-        <w:ind w:firstLine="720"/>
-      </w:pPr>
+        <w:t>Figure 9 shows the burned area and causalities for each of our two datasets. The table below provides the results of Man</w:t>
+      </w:r>
+      <w:r>
+        <w:t>n</w:t>
+      </w:r>
+      <w:r>
+        <w:t>-Whitney U test.</w:t>
+      </w:r>
+      <w:r>
+        <w:tab/>
+      </w:r>
     </w:p>
     <w:tbl>
       <w:tblPr>
@@ -3989,11 +3301,10 @@
         <w:tblLook w:val="04A0" w:firstRow="1" w:lastRow="0" w:firstColumn="1" w:lastColumn="0" w:noHBand="0" w:noVBand="1"/>
       </w:tblPr>
       <w:tblGrid>
-        <w:gridCol w:w="1870"/>
-        <w:gridCol w:w="1870"/>
-        <w:gridCol w:w="1870"/>
-        <w:gridCol w:w="1870"/>
-        <w:gridCol w:w="1870"/>
+        <w:gridCol w:w="2460"/>
+        <w:gridCol w:w="2365"/>
+        <w:gridCol w:w="2451"/>
+        <w:gridCol w:w="2074"/>
       </w:tblGrid>
       <w:tr>
         <w:trPr>
@@ -4002,17 +3313,20 @@
         <w:tc>
           <w:tcPr>
             <w:cnfStyle w:val="001000000000" w:firstRow="0" w:lastRow="0" w:firstColumn="1" w:lastColumn="0" w:oddVBand="0" w:evenVBand="0" w:oddHBand="0" w:evenHBand="0" w:firstRowFirstColumn="0" w:firstRowLastColumn="0" w:lastRowFirstColumn="0" w:lastRowLastColumn="0"/>
-            <w:tcW w:w="1870" w:type="dxa"/>
+            <w:tcW w:w="2460" w:type="dxa"/>
           </w:tcPr>
           <w:p>
             <w:pPr>
               <w:spacing w:line="480" w:lineRule="auto"/>
             </w:pPr>
+            <w:r>
+              <w:t>FEATURE</w:t>
+            </w:r>
           </w:p>
         </w:tc>
         <w:tc>
           <w:tcPr>
-            <w:tcW w:w="1870" w:type="dxa"/>
+            <w:tcW w:w="2365" w:type="dxa"/>
           </w:tcPr>
           <w:p>
             <w:pPr>
@@ -4020,13 +3334,13 @@
               <w:cnfStyle w:val="100000000000" w:firstRow="1" w:lastRow="0" w:firstColumn="0" w:lastColumn="0" w:oddVBand="0" w:evenVBand="0" w:oddHBand="0" w:evenHBand="0" w:firstRowFirstColumn="0" w:firstRowLastColumn="0" w:lastRowFirstColumn="0" w:lastRowLastColumn="0"/>
             </w:pPr>
             <w:r>
-              <w:t>STEPS</w:t>
+              <w:t>BASE MEDIAN</w:t>
             </w:r>
           </w:p>
         </w:tc>
         <w:tc>
           <w:tcPr>
-            <w:tcW w:w="1870" w:type="dxa"/>
+            <w:tcW w:w="2451" w:type="dxa"/>
           </w:tcPr>
           <w:p>
             <w:pPr>
@@ -4034,13 +3348,13 @@
               <w:cnfStyle w:val="100000000000" w:firstRow="1" w:lastRow="0" w:firstColumn="0" w:lastColumn="0" w:oddVBand="0" w:evenVBand="0" w:oddHBand="0" w:evenHBand="0" w:firstRowFirstColumn="0" w:firstRowLastColumn="0" w:lastRowFirstColumn="0" w:lastRowLastColumn="0"/>
             </w:pPr>
             <w:r>
-              <w:t>ALIVE HUMANS</w:t>
+              <w:t>AGENTIC MEDIAN</w:t>
             </w:r>
           </w:p>
         </w:tc>
         <w:tc>
           <w:tcPr>
-            <w:tcW w:w="1870" w:type="dxa"/>
+            <w:tcW w:w="2074" w:type="dxa"/>
           </w:tcPr>
           <w:p>
             <w:pPr>
@@ -4048,21 +3362,7 @@
               <w:cnfStyle w:val="100000000000" w:firstRow="1" w:lastRow="0" w:firstColumn="0" w:lastColumn="0" w:oddVBand="0" w:evenVBand="0" w:oddHBand="0" w:evenHBand="0" w:firstRowFirstColumn="0" w:firstRowLastColumn="0" w:lastRowFirstColumn="0" w:lastRowLastColumn="0"/>
             </w:pPr>
             <w:r>
-              <w:t>RESCUED HUMANS</w:t>
-            </w:r>
-          </w:p>
-        </w:tc>
-        <w:tc>
-          <w:tcPr>
-            <w:tcW w:w="1870" w:type="dxa"/>
-          </w:tcPr>
-          <w:p>
-            <w:pPr>
-              <w:spacing w:line="480" w:lineRule="auto"/>
-              <w:cnfStyle w:val="100000000000" w:firstRow="1" w:lastRow="0" w:firstColumn="0" w:lastColumn="0" w:oddVBand="0" w:evenVBand="0" w:oddHBand="0" w:evenHBand="0" w:firstRowFirstColumn="0" w:firstRowLastColumn="0" w:lastRowFirstColumn="0" w:lastRowLastColumn="0"/>
-            </w:pPr>
-            <w:r>
-              <w:t>BURNING CELLS</w:t>
+              <w:t>P-VALUE</w:t>
             </w:r>
           </w:p>
         </w:tc>
@@ -4071,20 +3371,20 @@
         <w:tc>
           <w:tcPr>
             <w:cnfStyle w:val="001000000000" w:firstRow="0" w:lastRow="0" w:firstColumn="1" w:lastColumn="0" w:oddVBand="0" w:evenVBand="0" w:oddHBand="0" w:evenHBand="0" w:firstRowFirstColumn="0" w:firstRowLastColumn="0" w:lastRowFirstColumn="0" w:lastRowLastColumn="0"/>
-            <w:tcW w:w="1870" w:type="dxa"/>
+            <w:tcW w:w="2460" w:type="dxa"/>
           </w:tcPr>
           <w:p>
             <w:pPr>
               <w:spacing w:line="480" w:lineRule="auto"/>
             </w:pPr>
             <w:r>
-              <w:t>EX 1</w:t>
+              <w:t>BURNED AREA</w:t>
             </w:r>
           </w:p>
         </w:tc>
         <w:tc>
           <w:tcPr>
-            <w:tcW w:w="1870" w:type="dxa"/>
+            <w:tcW w:w="2365" w:type="dxa"/>
           </w:tcPr>
           <w:p>
             <w:pPr>
@@ -4092,13 +3392,13 @@
               <w:cnfStyle w:val="000000000000" w:firstRow="0" w:lastRow="0" w:firstColumn="0" w:lastColumn="0" w:oddVBand="0" w:evenVBand="0" w:oddHBand="0" w:evenHBand="0" w:firstRowFirstColumn="0" w:firstRowLastColumn="0" w:lastRowFirstColumn="0" w:lastRowLastColumn="0"/>
             </w:pPr>
             <w:r>
-              <w:t>750</w:t>
+              <w:t>22.9%</w:t>
             </w:r>
           </w:p>
         </w:tc>
         <w:tc>
           <w:tcPr>
-            <w:tcW w:w="1870" w:type="dxa"/>
+            <w:tcW w:w="2451" w:type="dxa"/>
           </w:tcPr>
           <w:p>
             <w:pPr>
@@ -4106,13 +3406,57 @@
               <w:cnfStyle w:val="000000000000" w:firstRow="0" w:lastRow="0" w:firstColumn="0" w:lastColumn="0" w:oddVBand="0" w:evenVBand="0" w:oddHBand="0" w:evenHBand="0" w:firstRowFirstColumn="0" w:firstRowLastColumn="0" w:lastRowFirstColumn="0" w:lastRowLastColumn="0"/>
             </w:pPr>
             <w:r>
-              <w:t>7</w:t>
+              <w:t>13.45%</w:t>
             </w:r>
           </w:p>
         </w:tc>
         <w:tc>
           <w:tcPr>
-            <w:tcW w:w="1870" w:type="dxa"/>
+            <w:tcW w:w="2074" w:type="dxa"/>
+          </w:tcPr>
+          <w:p>
+            <w:pPr>
+              <w:spacing w:line="480" w:lineRule="auto"/>
+              <w:cnfStyle w:val="000000000000" w:firstRow="0" w:lastRow="0" w:firstColumn="0" w:lastColumn="0" w:oddVBand="0" w:evenVBand="0" w:oddHBand="0" w:evenHBand="0" w:firstRowFirstColumn="0" w:firstRowLastColumn="0" w:lastRowFirstColumn="0" w:lastRowLastColumn="0"/>
+            </w:pPr>
+            <w:r>
+              <w:t>0.0023</w:t>
+            </w:r>
+          </w:p>
+        </w:tc>
+      </w:tr>
+      <w:tr>
+        <w:tc>
+          <w:tcPr>
+            <w:cnfStyle w:val="001000000000" w:firstRow="0" w:lastRow="0" w:firstColumn="1" w:lastColumn="0" w:oddVBand="0" w:evenVBand="0" w:oddHBand="0" w:evenHBand="0" w:firstRowFirstColumn="0" w:firstRowLastColumn="0" w:lastRowFirstColumn="0" w:lastRowLastColumn="0"/>
+            <w:tcW w:w="2460" w:type="dxa"/>
+          </w:tcPr>
+          <w:p>
+            <w:pPr>
+              <w:spacing w:line="480" w:lineRule="auto"/>
+            </w:pPr>
+            <w:r>
+              <w:t>CASUALTIES</w:t>
+            </w:r>
+          </w:p>
+        </w:tc>
+        <w:tc>
+          <w:tcPr>
+            <w:tcW w:w="2365" w:type="dxa"/>
+          </w:tcPr>
+          <w:p>
+            <w:pPr>
+              <w:spacing w:line="480" w:lineRule="auto"/>
+              <w:cnfStyle w:val="000000000000" w:firstRow="0" w:lastRow="0" w:firstColumn="0" w:lastColumn="0" w:oddVBand="0" w:evenVBand="0" w:oddHBand="0" w:evenHBand="0" w:firstRowFirstColumn="0" w:firstRowLastColumn="0" w:lastRowFirstColumn="0" w:lastRowLastColumn="0"/>
+            </w:pPr>
+            <w:r>
+              <w:t>5</w:t>
+            </w:r>
+          </w:p>
+        </w:tc>
+        <w:tc>
+          <w:tcPr>
+            <w:tcW w:w="2451" w:type="dxa"/>
           </w:tcPr>
           <w:p>
             <w:pPr>
@@ -4126,7 +3470,7 @@
         </w:tc>
         <w:tc>
           <w:tcPr>
-            <w:tcW w:w="1870" w:type="dxa"/>
+            <w:tcW w:w="2074" w:type="dxa"/>
           </w:tcPr>
           <w:p>
             <w:pPr>
@@ -4134,295 +3478,7 @@
               <w:cnfStyle w:val="000000000000" w:firstRow="0" w:lastRow="0" w:firstColumn="0" w:lastColumn="0" w:oddVBand="0" w:evenVBand="0" w:oddHBand="0" w:evenHBand="0" w:firstRowFirstColumn="0" w:firstRowLastColumn="0" w:lastRowFirstColumn="0" w:lastRowLastColumn="0"/>
             </w:pPr>
             <w:r>
-              <w:t>375</w:t>
-            </w:r>
-          </w:p>
-        </w:tc>
-      </w:tr>
-      <w:tr>
-        <w:tc>
-          <w:tcPr>
-            <w:cnfStyle w:val="001000000000" w:firstRow="0" w:lastRow="0" w:firstColumn="1" w:lastColumn="0" w:oddVBand="0" w:evenVBand="0" w:oddHBand="0" w:evenHBand="0" w:firstRowFirstColumn="0" w:firstRowLastColumn="0" w:lastRowFirstColumn="0" w:lastRowLastColumn="0"/>
-            <w:tcW w:w="1870" w:type="dxa"/>
-          </w:tcPr>
-          <w:p>
-            <w:pPr>
-              <w:spacing w:line="480" w:lineRule="auto"/>
-            </w:pPr>
-            <w:r>
-              <w:t>EX 2</w:t>
-            </w:r>
-          </w:p>
-        </w:tc>
-        <w:tc>
-          <w:tcPr>
-            <w:tcW w:w="1870" w:type="dxa"/>
-          </w:tcPr>
-          <w:p>
-            <w:pPr>
-              <w:spacing w:line="480" w:lineRule="auto"/>
-              <w:cnfStyle w:val="000000000000" w:firstRow="0" w:lastRow="0" w:firstColumn="0" w:lastColumn="0" w:oddVBand="0" w:evenVBand="0" w:oddHBand="0" w:evenHBand="0" w:firstRowFirstColumn="0" w:firstRowLastColumn="0" w:lastRowFirstColumn="0" w:lastRowLastColumn="0"/>
-            </w:pPr>
-            <w:r>
-              <w:t>72</w:t>
-            </w:r>
-          </w:p>
-        </w:tc>
-        <w:tc>
-          <w:tcPr>
-            <w:tcW w:w="1870" w:type="dxa"/>
-          </w:tcPr>
-          <w:p>
-            <w:pPr>
-              <w:spacing w:line="480" w:lineRule="auto"/>
-              <w:cnfStyle w:val="000000000000" w:firstRow="0" w:lastRow="0" w:firstColumn="0" w:lastColumn="0" w:oddVBand="0" w:evenVBand="0" w:oddHBand="0" w:evenHBand="0" w:firstRowFirstColumn="0" w:firstRowLastColumn="0" w:lastRowFirstColumn="0" w:lastRowLastColumn="0"/>
-            </w:pPr>
-            <w:r>
-              <w:t>13</w:t>
-            </w:r>
-          </w:p>
-        </w:tc>
-        <w:tc>
-          <w:tcPr>
-            <w:tcW w:w="1870" w:type="dxa"/>
-          </w:tcPr>
-          <w:p>
-            <w:pPr>
-              <w:spacing w:line="480" w:lineRule="auto"/>
-              <w:cnfStyle w:val="000000000000" w:firstRow="0" w:lastRow="0" w:firstColumn="0" w:lastColumn="0" w:oddVBand="0" w:evenVBand="0" w:oddHBand="0" w:evenHBand="0" w:firstRowFirstColumn="0" w:firstRowLastColumn="0" w:lastRowFirstColumn="0" w:lastRowLastColumn="0"/>
-            </w:pPr>
-            <w:r>
-              <w:t>2</w:t>
-            </w:r>
-          </w:p>
-        </w:tc>
-        <w:tc>
-          <w:tcPr>
-            <w:tcW w:w="1870" w:type="dxa"/>
-          </w:tcPr>
-          <w:p>
-            <w:pPr>
-              <w:spacing w:line="480" w:lineRule="auto"/>
-              <w:cnfStyle w:val="000000000000" w:firstRow="0" w:lastRow="0" w:firstColumn="0" w:lastColumn="0" w:oddVBand="0" w:evenVBand="0" w:oddHBand="0" w:evenHBand="0" w:firstRowFirstColumn="0" w:firstRowLastColumn="0" w:lastRowFirstColumn="0" w:lastRowLastColumn="0"/>
-            </w:pPr>
-            <w:r>
-              <w:t>0</w:t>
-            </w:r>
-          </w:p>
-        </w:tc>
-      </w:tr>
-      <w:tr>
-        <w:tc>
-          <w:tcPr>
-            <w:cnfStyle w:val="001000000000" w:firstRow="0" w:lastRow="0" w:firstColumn="1" w:lastColumn="0" w:oddVBand="0" w:evenVBand="0" w:oddHBand="0" w:evenHBand="0" w:firstRowFirstColumn="0" w:firstRowLastColumn="0" w:lastRowFirstColumn="0" w:lastRowLastColumn="0"/>
-            <w:tcW w:w="1870" w:type="dxa"/>
-          </w:tcPr>
-          <w:p>
-            <w:pPr>
-              <w:spacing w:line="480" w:lineRule="auto"/>
-            </w:pPr>
-            <w:r>
-              <w:t>EX 3</w:t>
-            </w:r>
-          </w:p>
-        </w:tc>
-        <w:tc>
-          <w:tcPr>
-            <w:tcW w:w="1870" w:type="dxa"/>
-          </w:tcPr>
-          <w:p>
-            <w:pPr>
-              <w:spacing w:line="480" w:lineRule="auto"/>
-              <w:cnfStyle w:val="000000000000" w:firstRow="0" w:lastRow="0" w:firstColumn="0" w:lastColumn="0" w:oddVBand="0" w:evenVBand="0" w:oddHBand="0" w:evenHBand="0" w:firstRowFirstColumn="0" w:firstRowLastColumn="0" w:lastRowFirstColumn="0" w:lastRowLastColumn="0"/>
-            </w:pPr>
-            <w:r>
-              <w:t>750</w:t>
-            </w:r>
-          </w:p>
-        </w:tc>
-        <w:tc>
-          <w:tcPr>
-            <w:tcW w:w="1870" w:type="dxa"/>
-          </w:tcPr>
-          <w:p>
-            <w:pPr>
-              <w:spacing w:line="480" w:lineRule="auto"/>
-              <w:cnfStyle w:val="000000000000" w:firstRow="0" w:lastRow="0" w:firstColumn="0" w:lastColumn="0" w:oddVBand="0" w:evenVBand="0" w:oddHBand="0" w:evenHBand="0" w:firstRowFirstColumn="0" w:firstRowLastColumn="0" w:lastRowFirstColumn="0" w:lastRowLastColumn="0"/>
-            </w:pPr>
-            <w:r>
-              <w:t>2</w:t>
-            </w:r>
-          </w:p>
-        </w:tc>
-        <w:tc>
-          <w:tcPr>
-            <w:tcW w:w="1870" w:type="dxa"/>
-          </w:tcPr>
-          <w:p>
-            <w:pPr>
-              <w:spacing w:line="480" w:lineRule="auto"/>
-              <w:cnfStyle w:val="000000000000" w:firstRow="0" w:lastRow="0" w:firstColumn="0" w:lastColumn="0" w:oddVBand="0" w:evenVBand="0" w:oddHBand="0" w:evenHBand="0" w:firstRowFirstColumn="0" w:firstRowLastColumn="0" w:lastRowFirstColumn="0" w:lastRowLastColumn="0"/>
-            </w:pPr>
-            <w:r>
-              <w:t>0</w:t>
-            </w:r>
-          </w:p>
-        </w:tc>
-        <w:tc>
-          <w:tcPr>
-            <w:tcW w:w="1870" w:type="dxa"/>
-          </w:tcPr>
-          <w:p>
-            <w:pPr>
-              <w:spacing w:line="480" w:lineRule="auto"/>
-              <w:cnfStyle w:val="000000000000" w:firstRow="0" w:lastRow="0" w:firstColumn="0" w:lastColumn="0" w:oddVBand="0" w:evenVBand="0" w:oddHBand="0" w:evenHBand="0" w:firstRowFirstColumn="0" w:firstRowLastColumn="0" w:lastRowFirstColumn="0" w:lastRowLastColumn="0"/>
-            </w:pPr>
-            <w:r>
-              <w:t>1579</w:t>
-            </w:r>
-          </w:p>
-        </w:tc>
-      </w:tr>
-      <w:tr>
-        <w:tc>
-          <w:tcPr>
-            <w:cnfStyle w:val="001000000000" w:firstRow="0" w:lastRow="0" w:firstColumn="1" w:lastColumn="0" w:oddVBand="0" w:evenVBand="0" w:oddHBand="0" w:evenHBand="0" w:firstRowFirstColumn="0" w:firstRowLastColumn="0" w:lastRowFirstColumn="0" w:lastRowLastColumn="0"/>
-            <w:tcW w:w="1870" w:type="dxa"/>
-          </w:tcPr>
-          <w:p>
-            <w:pPr>
-              <w:spacing w:line="480" w:lineRule="auto"/>
-            </w:pPr>
-            <w:r>
-              <w:t>EX 4</w:t>
-            </w:r>
-          </w:p>
-        </w:tc>
-        <w:tc>
-          <w:tcPr>
-            <w:tcW w:w="1870" w:type="dxa"/>
-          </w:tcPr>
-          <w:p>
-            <w:pPr>
-              <w:spacing w:line="480" w:lineRule="auto"/>
-              <w:cnfStyle w:val="000000000000" w:firstRow="0" w:lastRow="0" w:firstColumn="0" w:lastColumn="0" w:oddVBand="0" w:evenVBand="0" w:oddHBand="0" w:evenHBand="0" w:firstRowFirstColumn="0" w:firstRowLastColumn="0" w:lastRowFirstColumn="0" w:lastRowLastColumn="0"/>
-            </w:pPr>
-            <w:r>
-              <w:t>750</w:t>
-            </w:r>
-          </w:p>
-        </w:tc>
-        <w:tc>
-          <w:tcPr>
-            <w:tcW w:w="1870" w:type="dxa"/>
-          </w:tcPr>
-          <w:p>
-            <w:pPr>
-              <w:spacing w:line="480" w:lineRule="auto"/>
-              <w:cnfStyle w:val="000000000000" w:firstRow="0" w:lastRow="0" w:firstColumn="0" w:lastColumn="0" w:oddVBand="0" w:evenVBand="0" w:oddHBand="0" w:evenHBand="0" w:firstRowFirstColumn="0" w:firstRowLastColumn="0" w:lastRowFirstColumn="0" w:lastRowLastColumn="0"/>
-            </w:pPr>
-            <w:r>
-              <w:t>1</w:t>
-            </w:r>
-          </w:p>
-        </w:tc>
-        <w:tc>
-          <w:tcPr>
-            <w:tcW w:w="1870" w:type="dxa"/>
-          </w:tcPr>
-          <w:p>
-            <w:pPr>
-              <w:spacing w:line="480" w:lineRule="auto"/>
-              <w:cnfStyle w:val="000000000000" w:firstRow="0" w:lastRow="0" w:firstColumn="0" w:lastColumn="0" w:oddVBand="0" w:evenVBand="0" w:oddHBand="0" w:evenHBand="0" w:firstRowFirstColumn="0" w:firstRowLastColumn="0" w:lastRowFirstColumn="0" w:lastRowLastColumn="0"/>
-            </w:pPr>
-            <w:r>
-              <w:t>2</w:t>
-            </w:r>
-          </w:p>
-        </w:tc>
-        <w:tc>
-          <w:tcPr>
-            <w:tcW w:w="1870" w:type="dxa"/>
-          </w:tcPr>
-          <w:p>
-            <w:pPr>
-              <w:spacing w:line="480" w:lineRule="auto"/>
-              <w:cnfStyle w:val="000000000000" w:firstRow="0" w:lastRow="0" w:firstColumn="0" w:lastColumn="0" w:oddVBand="0" w:evenVBand="0" w:oddHBand="0" w:evenHBand="0" w:firstRowFirstColumn="0" w:firstRowLastColumn="0" w:lastRowFirstColumn="0" w:lastRowLastColumn="0"/>
-            </w:pPr>
-            <w:r>
-              <w:t>1590</w:t>
-            </w:r>
-          </w:p>
-        </w:tc>
-      </w:tr>
-      <w:tr>
-        <w:tc>
-          <w:tcPr>
-            <w:cnfStyle w:val="001000000000" w:firstRow="0" w:lastRow="0" w:firstColumn="1" w:lastColumn="0" w:oddVBand="0" w:evenVBand="0" w:oddHBand="0" w:evenHBand="0" w:firstRowFirstColumn="0" w:firstRowLastColumn="0" w:lastRowFirstColumn="0" w:lastRowLastColumn="0"/>
-            <w:tcW w:w="1870" w:type="dxa"/>
-          </w:tcPr>
-          <w:p>
-            <w:pPr>
-              <w:spacing w:line="480" w:lineRule="auto"/>
-            </w:pPr>
-            <w:r>
-              <w:t>EX 5</w:t>
-            </w:r>
-          </w:p>
-        </w:tc>
-        <w:tc>
-          <w:tcPr>
-            <w:tcW w:w="1870" w:type="dxa"/>
-          </w:tcPr>
-          <w:p>
-            <w:pPr>
-              <w:spacing w:line="480" w:lineRule="auto"/>
-              <w:cnfStyle w:val="000000000000" w:firstRow="0" w:lastRow="0" w:firstColumn="0" w:lastColumn="0" w:oddVBand="0" w:evenVBand="0" w:oddHBand="0" w:evenHBand="0" w:firstRowFirstColumn="0" w:firstRowLastColumn="0" w:lastRowFirstColumn="0" w:lastRowLastColumn="0"/>
-            </w:pPr>
-            <w:r>
-              <w:t>750</w:t>
-            </w:r>
-          </w:p>
-        </w:tc>
-        <w:tc>
-          <w:tcPr>
-            <w:tcW w:w="1870" w:type="dxa"/>
-          </w:tcPr>
-          <w:p>
-            <w:pPr>
-              <w:spacing w:line="480" w:lineRule="auto"/>
-              <w:cnfStyle w:val="000000000000" w:firstRow="0" w:lastRow="0" w:firstColumn="0" w:lastColumn="0" w:oddVBand="0" w:evenVBand="0" w:oddHBand="0" w:evenHBand="0" w:firstRowFirstColumn="0" w:firstRowLastColumn="0" w:lastRowFirstColumn="0" w:lastRowLastColumn="0"/>
-            </w:pPr>
-            <w:r>
-              <w:t>7</w:t>
-            </w:r>
-          </w:p>
-        </w:tc>
-        <w:tc>
-          <w:tcPr>
-            <w:tcW w:w="1870" w:type="dxa"/>
-          </w:tcPr>
-          <w:p>
-            <w:pPr>
-              <w:spacing w:line="480" w:lineRule="auto"/>
-              <w:cnfStyle w:val="000000000000" w:firstRow="0" w:lastRow="0" w:firstColumn="0" w:lastColumn="0" w:oddVBand="0" w:evenVBand="0" w:oddHBand="0" w:evenHBand="0" w:firstRowFirstColumn="0" w:firstRowLastColumn="0" w:lastRowFirstColumn="0" w:lastRowLastColumn="0"/>
-            </w:pPr>
-            <w:r>
-              <w:t>0</w:t>
-            </w:r>
-          </w:p>
-        </w:tc>
-        <w:tc>
-          <w:tcPr>
-            <w:tcW w:w="1870" w:type="dxa"/>
-          </w:tcPr>
-          <w:p>
-            <w:pPr>
-              <w:spacing w:line="480" w:lineRule="auto"/>
-              <w:cnfStyle w:val="000000000000" w:firstRow="0" w:lastRow="0" w:firstColumn="0" w:lastColumn="0" w:oddVBand="0" w:evenVBand="0" w:oddHBand="0" w:evenHBand="0" w:firstRowFirstColumn="0" w:firstRowLastColumn="0" w:lastRowFirstColumn="0" w:lastRowLastColumn="0"/>
-            </w:pPr>
-            <w:r>
-              <w:t>1585</w:t>
+              <w:t>0.012</w:t>
             </w:r>
           </w:p>
         </w:tc>
@@ -4431,6 +3487,95 @@
     <w:p>
       <w:pPr>
         <w:spacing w:line="480" w:lineRule="auto"/>
+      </w:pPr>
+    </w:p>
+    <w:p>
+      <w:pPr>
+        <w:spacing w:line="480" w:lineRule="auto"/>
+      </w:pPr>
+    </w:p>
+    <w:p>
+      <w:pPr>
+        <w:keepNext/>
+        <w:spacing w:line="480" w:lineRule="auto"/>
+      </w:pPr>
+      <w:r>
+        <w:rPr>
+          <w:noProof/>
+        </w:rPr>
+        <w:drawing>
+          <wp:inline distT="0" distB="0" distL="0" distR="0" wp14:anchorId="1068ABD1" wp14:editId="1A941E1C">
+            <wp:extent cx="5937250" cy="2381250"/>
+            <wp:effectExtent l="0" t="0" r="6350" b="0"/>
+            <wp:docPr id="262277473" name="Picture 1"/>
+            <wp:cNvGraphicFramePr>
+              <a:graphicFrameLocks xmlns:a="http://schemas.openxmlformats.org/drawingml/2006/main" noChangeAspect="1"/>
+            </wp:cNvGraphicFramePr>
+            <a:graphic xmlns:a="http://schemas.openxmlformats.org/drawingml/2006/main">
+              <a:graphicData uri="http://schemas.openxmlformats.org/drawingml/2006/picture">
+                <pic:pic xmlns:pic="http://schemas.openxmlformats.org/drawingml/2006/picture">
+                  <pic:nvPicPr>
+                    <pic:cNvPr id="0" name="Picture 1"/>
+                    <pic:cNvPicPr>
+                      <a:picLocks noChangeAspect="1" noChangeArrowheads="1"/>
+                    </pic:cNvPicPr>
+                  </pic:nvPicPr>
+                  <pic:blipFill>
+                    <a:blip r:embed="rId16" cstate="print">
+                      <a:extLst>
+                        <a:ext uri="{28A0092B-C50C-407E-A947-70E740481C1C}">
+                          <a14:useLocalDpi xmlns:a14="http://schemas.microsoft.com/office/drawing/2010/main" val="0"/>
+                        </a:ext>
+                      </a:extLst>
+                    </a:blip>
+                    <a:srcRect/>
+                    <a:stretch>
+                      <a:fillRect/>
+                    </a:stretch>
+                  </pic:blipFill>
+                  <pic:spPr bwMode="auto">
+                    <a:xfrm>
+                      <a:off x="0" y="0"/>
+                      <a:ext cx="5937250" cy="2381250"/>
+                    </a:xfrm>
+                    <a:prstGeom prst="rect">
+                      <a:avLst/>
+                    </a:prstGeom>
+                    <a:noFill/>
+                    <a:ln>
+                      <a:noFill/>
+                    </a:ln>
+                  </pic:spPr>
+                </pic:pic>
+              </a:graphicData>
+            </a:graphic>
+          </wp:inline>
+        </w:drawing>
+      </w:r>
+    </w:p>
+    <w:p>
+      <w:pPr>
+        <w:pStyle w:val="Caption"/>
+        <w:jc w:val="center"/>
+      </w:pPr>
+      <w:r>
+        <w:t xml:space="preserve">Figure </w:t>
+      </w:r>
+      <w:fldSimple w:instr=" SEQ Figure \* ARABIC ">
+        <w:r>
+          <w:rPr>
+            <w:noProof/>
+          </w:rPr>
+          <w:t>9</w:t>
+        </w:r>
+      </w:fldSimple>
+      <w:r>
+        <w:t xml:space="preserve"> Simulation Results</w:t>
+      </w:r>
+    </w:p>
+    <w:p>
+      <w:pPr>
+        <w:spacing w:line="480" w:lineRule="auto"/>
         <w:ind w:firstLine="720"/>
       </w:pPr>
     </w:p>
@@ -4440,34 +3585,7 @@
         <w:ind w:firstLine="720"/>
       </w:pPr>
       <w:r>
-        <w:t xml:space="preserve">Reviewing </w:t>
-      </w:r>
-      <w:r>
-        <w:t>the video for experiment 2</w:t>
-      </w:r>
-      <w:r>
-        <w:t xml:space="preserve"> </w:t>
-      </w:r>
-      <w:r>
-        <w:t>noticed</w:t>
-      </w:r>
-      <w:r>
-        <w:t xml:space="preserve"> that the system obtained better performance than the others.</w:t>
-      </w:r>
-      <w:r>
-        <w:t xml:space="preserve"> </w:t>
-      </w:r>
-      <w:r>
-        <w:t>Our video shows</w:t>
-      </w:r>
-      <w:r>
-        <w:t xml:space="preserve"> we had a lucky start in that the fire ignited near enough to home base</w:t>
-      </w:r>
-      <w:r>
-        <w:t xml:space="preserve"> allowing the fire to be put out unusually quickly</w:t>
-      </w:r>
-      <w:r>
-        <w:t>.</w:t>
+        <w:t>The table shows p-values &lt; 0.05 for both features we compared. This shows that our system reduced the burned area as well as the number of casualties by a statistically significant margin.</w:t>
       </w:r>
     </w:p>
     <w:p>
@@ -4475,17 +3593,20 @@
         <w:spacing w:line="480" w:lineRule="auto"/>
         <w:ind w:firstLine="720"/>
       </w:pPr>
-      <w:r>
-        <w:t xml:space="preserve">This </w:t>
-      </w:r>
-      <w:r>
-        <w:t xml:space="preserve">data collected is not representative of a full picture of what this system is capable of. These runs primarily give us qualitative information on the </w:t>
-      </w:r>
-      <w:r>
-        <w:t>systems’</w:t>
-      </w:r>
-      <w:r>
-        <w:t xml:space="preserve"> failure modes rather than a full picture of the system.</w:t>
+    </w:p>
+    <w:p>
+      <w:pPr>
+        <w:spacing w:line="480" w:lineRule="auto"/>
+        <w:jc w:val="center"/>
+        <w:rPr>
+          <w:b/>
+        </w:rPr>
+      </w:pPr>
+      <w:r>
+        <w:rPr>
+          <w:b/>
+        </w:rPr>
+        <w:t>Professional Relevance</w:t>
       </w:r>
     </w:p>
     <w:p>
@@ -4493,444 +3614,8 @@
         <w:spacing w:line="480" w:lineRule="auto"/>
         <w:ind w:firstLine="720"/>
       </w:pPr>
-    </w:p>
-    <w:p>
-      <w:pPr>
-        <w:spacing w:line="480" w:lineRule="auto"/>
-        <w:rPr>
-          <w:i/>
-          <w:iCs/>
-        </w:rPr>
-      </w:pPr>
-      <w:r>
-        <w:rPr>
-          <w:i/>
-          <w:iCs/>
-        </w:rPr>
-        <w:t>Observations</w:t>
-      </w:r>
-      <w:r>
-        <w:rPr>
-          <w:i/>
-          <w:iCs/>
-        </w:rPr>
-        <w:t xml:space="preserve"> based on videos</w:t>
-      </w:r>
-      <w:r>
-        <w:rPr>
-          <w:i/>
-          <w:iCs/>
-        </w:rPr>
-        <w:t>:</w:t>
-      </w:r>
-    </w:p>
-    <w:tbl>
-      <w:tblPr>
-        <w:tblStyle w:val="PlainTable2"/>
-        <w:tblW w:w="0" w:type="auto"/>
-        <w:tblLook w:val="04A0" w:firstRow="1" w:lastRow="0" w:firstColumn="1" w:lastColumn="0" w:noHBand="0" w:noVBand="1"/>
-      </w:tblPr>
-      <w:tblGrid>
-        <w:gridCol w:w="9350"/>
-      </w:tblGrid>
-      <w:tr>
-        <w:trPr>
-          <w:cnfStyle w:val="100000000000" w:firstRow="1" w:lastRow="0" w:firstColumn="0" w:lastColumn="0" w:oddVBand="0" w:evenVBand="0" w:oddHBand="0" w:evenHBand="0" w:firstRowFirstColumn="0" w:firstRowLastColumn="0" w:lastRowFirstColumn="0" w:lastRowLastColumn="0"/>
-        </w:trPr>
-        <w:tc>
-          <w:tcPr>
-            <w:cnfStyle w:val="001000000000" w:firstRow="0" w:lastRow="0" w:firstColumn="1" w:lastColumn="0" w:oddVBand="0" w:evenVBand="0" w:oddHBand="0" w:evenHBand="0" w:firstRowFirstColumn="0" w:firstRowLastColumn="0" w:lastRowFirstColumn="0" w:lastRowLastColumn="0"/>
-            <w:tcW w:w="9350" w:type="dxa"/>
-          </w:tcPr>
-          <w:p>
-            <w:pPr>
-              <w:spacing w:line="480" w:lineRule="auto"/>
-            </w:pPr>
-            <w:r>
-              <w:rPr>
-                <w:b w:val="0"/>
-                <w:bCs w:val="0"/>
-              </w:rPr>
-              <w:t>Firefighting UAVs fight the fire in their area but will ignore any fire nearby</w:t>
-            </w:r>
-          </w:p>
-        </w:tc>
-      </w:tr>
-      <w:tr>
-        <w:trPr>
-          <w:cnfStyle w:val="000000100000" w:firstRow="0" w:lastRow="0" w:firstColumn="0" w:lastColumn="0" w:oddVBand="0" w:evenVBand="0" w:oddHBand="1" w:evenHBand="0" w:firstRowFirstColumn="0" w:firstRowLastColumn="0" w:lastRowFirstColumn="0" w:lastRowLastColumn="0"/>
-        </w:trPr>
-        <w:tc>
-          <w:tcPr>
-            <w:cnfStyle w:val="001000000000" w:firstRow="0" w:lastRow="0" w:firstColumn="1" w:lastColumn="0" w:oddVBand="0" w:evenVBand="0" w:oddHBand="0" w:evenHBand="0" w:firstRowFirstColumn="0" w:firstRowLastColumn="0" w:lastRowFirstColumn="0" w:lastRowLastColumn="0"/>
-            <w:tcW w:w="9350" w:type="dxa"/>
-          </w:tcPr>
-          <w:p>
-            <w:pPr>
-              <w:spacing w:line="480" w:lineRule="auto"/>
-              <w:rPr>
-                <w:b w:val="0"/>
-                <w:bCs w:val="0"/>
-              </w:rPr>
-            </w:pPr>
-            <w:r>
-              <w:rPr>
-                <w:b w:val="0"/>
-                <w:bCs w:val="0"/>
-              </w:rPr>
-              <w:t xml:space="preserve">Recon UAVs appear to be deployed in clumps near the </w:t>
-            </w:r>
-            <w:r>
-              <w:rPr>
-                <w:b w:val="0"/>
-                <w:bCs w:val="0"/>
-              </w:rPr>
-              <w:t>fire’s</w:t>
-            </w:r>
-            <w:r>
-              <w:rPr>
-                <w:b w:val="0"/>
-                <w:bCs w:val="0"/>
-              </w:rPr>
-              <w:t xml:space="preserve"> frontier</w:t>
-            </w:r>
-          </w:p>
-        </w:tc>
-      </w:tr>
-      <w:tr>
-        <w:tc>
-          <w:tcPr>
-            <w:cnfStyle w:val="001000000000" w:firstRow="0" w:lastRow="0" w:firstColumn="1" w:lastColumn="0" w:oddVBand="0" w:evenVBand="0" w:oddHBand="0" w:evenHBand="0" w:firstRowFirstColumn="0" w:firstRowLastColumn="0" w:lastRowFirstColumn="0" w:lastRowLastColumn="0"/>
-            <w:tcW w:w="9350" w:type="dxa"/>
-          </w:tcPr>
-          <w:p>
-            <w:pPr>
-              <w:spacing w:line="480" w:lineRule="auto"/>
-              <w:rPr>
-                <w:b w:val="0"/>
-                <w:bCs w:val="0"/>
-              </w:rPr>
-            </w:pPr>
-            <w:r>
-              <w:rPr>
-                <w:b w:val="0"/>
-                <w:bCs w:val="0"/>
-              </w:rPr>
-              <w:t>SAR</w:t>
-            </w:r>
-            <w:r>
-              <w:rPr>
-                <w:b w:val="0"/>
-                <w:bCs w:val="0"/>
-              </w:rPr>
-              <w:t xml:space="preserve"> operations seem to </w:t>
-            </w:r>
-            <w:r>
-              <w:rPr>
-                <w:b w:val="0"/>
-                <w:bCs w:val="0"/>
-              </w:rPr>
-              <w:t>fixate</w:t>
-            </w:r>
-            <w:r>
-              <w:rPr>
-                <w:b w:val="0"/>
-                <w:bCs w:val="0"/>
-              </w:rPr>
-              <w:t xml:space="preserve"> on saving a particular human.</w:t>
-            </w:r>
-            <w:r>
-              <w:rPr>
-                <w:b w:val="0"/>
-                <w:bCs w:val="0"/>
-              </w:rPr>
-              <w:t xml:space="preserve"> </w:t>
-            </w:r>
-          </w:p>
-        </w:tc>
-      </w:tr>
-    </w:tbl>
-    <w:p>
-      <w:pPr>
-        <w:spacing w:line="480" w:lineRule="auto"/>
-      </w:pPr>
-    </w:p>
-    <w:p>
-      <w:pPr>
-        <w:spacing w:line="480" w:lineRule="auto"/>
-        <w:ind w:firstLine="720"/>
-      </w:pPr>
-      <w:r>
-        <w:t xml:space="preserve">We </w:t>
-      </w:r>
-      <w:r>
-        <w:t xml:space="preserve">had an LLM find </w:t>
-      </w:r>
-      <w:r>
-        <w:t>any patterns</w:t>
-      </w:r>
-      <w:r>
-        <w:t xml:space="preserve"> in the output logs</w:t>
-      </w:r>
-      <w:r>
-        <w:t>.</w:t>
-      </w:r>
-      <w:r>
-        <w:t xml:space="preserve"> </w:t>
-      </w:r>
-      <w:r>
-        <w:t xml:space="preserve">We </w:t>
-      </w:r>
-      <w:r>
-        <w:t xml:space="preserve">checked </w:t>
-      </w:r>
-      <w:r>
-        <w:t>these to ensure accuracy.</w:t>
-      </w:r>
-    </w:p>
-    <w:p>
-      <w:pPr>
-        <w:spacing w:line="480" w:lineRule="auto"/>
-        <w:ind w:firstLine="720"/>
-      </w:pPr>
-    </w:p>
-    <w:p>
-      <w:pPr>
-        <w:spacing w:line="480" w:lineRule="auto"/>
-        <w:rPr>
-          <w:i/>
-          <w:iCs/>
-          <w:lang w:val="en-CA"/>
-        </w:rPr>
-      </w:pPr>
-      <w:r>
-        <w:rPr>
-          <w:i/>
-          <w:iCs/>
-          <w:lang w:val="en-CA"/>
-        </w:rPr>
-        <w:t>LLM Observations:</w:t>
-      </w:r>
-    </w:p>
-    <w:p>
-      <w:pPr>
-        <w:spacing w:line="480" w:lineRule="auto"/>
-        <w:rPr>
-          <w:lang w:val="en-CA"/>
-        </w:rPr>
-      </w:pPr>
-      <w:r>
-        <w:rPr>
-          <w:b/>
-          <w:bCs/>
-          <w:lang w:val="en-CA"/>
-        </w:rPr>
-        <w:t>RESCUE UAV target stickiness:</w:t>
-      </w:r>
-      <w:r>
-        <w:rPr>
-          <w:lang w:val="en-CA"/>
-        </w:rPr>
-        <w:t> In ex3 and ex5 (both 0 rescues), the RESCUE UAV was locked onto the same coordinates for 8–10 consecutive dispatch cycles</w:t>
-      </w:r>
-    </w:p>
-    <w:p>
-      <w:pPr>
-        <w:spacing w:line="480" w:lineRule="auto"/>
-        <w:rPr>
-          <w:b/>
-          <w:bCs/>
-          <w:lang w:val="en-CA"/>
-        </w:rPr>
-      </w:pPr>
-    </w:p>
-    <w:p>
-      <w:pPr>
-        <w:spacing w:line="480" w:lineRule="auto"/>
-        <w:rPr>
-          <w:lang w:val="en-CA"/>
-        </w:rPr>
-      </w:pPr>
-      <w:r>
-        <w:rPr>
-          <w:b/>
-          <w:bCs/>
-          <w:lang w:val="en-CA"/>
-        </w:rPr>
-        <w:t>Out-of-bounds coordinates:</w:t>
-      </w:r>
-      <w:r>
-        <w:rPr>
-          <w:lang w:val="en-CA"/>
-        </w:rPr>
-        <w:t xml:space="preserve"> In ex1, pixel (220, 760) got converted to grid (44, 152) — Y=152 is way off the 100×100 grid. </w:t>
-      </w:r>
-    </w:p>
-    <w:p>
-      <w:pPr>
-        <w:spacing w:line="480" w:lineRule="auto"/>
-        <w:rPr>
-          <w:lang w:val="en-CA"/>
-        </w:rPr>
-      </w:pPr>
-    </w:p>
-    <w:p>
-      <w:pPr>
-        <w:spacing w:line="480" w:lineRule="auto"/>
-        <w:rPr>
-          <w:lang w:val="en-CA"/>
-        </w:rPr>
-      </w:pPr>
-      <w:r>
-        <w:rPr>
-          <w:b/>
-          <w:bCs/>
-          <w:lang w:val="en-CA"/>
-        </w:rPr>
-        <w:t>Speculative RESCUE deployment:</w:t>
-      </w:r>
-      <w:r>
-        <w:rPr>
-          <w:lang w:val="en-CA"/>
-        </w:rPr>
-        <w:t xml:space="preserve"> The RESCUE UAV is frequently sent "just in case" to housing areas with language like "once RECON identifies civilians" </w:t>
-      </w:r>
-    </w:p>
-    <w:p>
-      <w:pPr>
-        <w:spacing w:line="480" w:lineRule="auto"/>
-        <w:rPr>
-          <w:lang w:val="en-CA"/>
-        </w:rPr>
-      </w:pPr>
-    </w:p>
-    <w:p>
-      <w:pPr>
-        <w:spacing w:line="480" w:lineRule="auto"/>
-        <w:rPr>
-          <w:lang w:val="en-CA"/>
-        </w:rPr>
-      </w:pPr>
-      <w:r>
-        <w:rPr>
-          <w:b/>
-          <w:bCs/>
-          <w:lang w:val="en-CA"/>
-        </w:rPr>
-        <w:t xml:space="preserve">Knowledge graph goals never </w:t>
-      </w:r>
-      <w:proofErr w:type="gramStart"/>
-      <w:r>
-        <w:rPr>
-          <w:b/>
-          <w:bCs/>
-          <w:lang w:val="en-CA"/>
-        </w:rPr>
-        <w:t>expire</w:t>
-      </w:r>
-      <w:r>
-        <w:rPr>
-          <w:b/>
-          <w:bCs/>
-          <w:lang w:val="en-CA"/>
-        </w:rPr>
-        <w:t>:</w:t>
-      </w:r>
-      <w:proofErr w:type="gramEnd"/>
-      <w:r>
-        <w:rPr>
-          <w:lang w:val="en-CA"/>
-        </w:rPr>
-        <w:t>  stale goals persist indefinitely in the graph.</w:t>
-      </w:r>
-    </w:p>
-    <w:p>
-      <w:pPr>
-        <w:spacing w:line="480" w:lineRule="auto"/>
-        <w:rPr>
-          <w:lang w:val="en-CA"/>
-        </w:rPr>
-      </w:pPr>
-    </w:p>
-    <w:p>
-      <w:pPr>
-        <w:spacing w:line="480" w:lineRule="auto"/>
-      </w:pPr>
-      <w:r>
-        <w:t>LLM results suggest we could improve goal tracking</w:t>
-      </w:r>
-      <w:r>
-        <w:t>:</w:t>
-      </w:r>
-    </w:p>
-    <w:p>
-      <w:pPr>
-        <w:pStyle w:val="ListParagraph"/>
-        <w:numPr>
-          <w:ilvl w:val="0"/>
-          <w:numId w:val="5"/>
-        </w:numPr>
-        <w:spacing w:line="480" w:lineRule="auto"/>
-      </w:pPr>
-      <w:r>
-        <w:t>Allow Goal nodes to expire if not deleted after a certain number of iterations.</w:t>
-      </w:r>
-    </w:p>
-    <w:p>
-      <w:pPr>
-        <w:pStyle w:val="ListParagraph"/>
-        <w:numPr>
-          <w:ilvl w:val="0"/>
-          <w:numId w:val="5"/>
-        </w:numPr>
-        <w:spacing w:line="480" w:lineRule="auto"/>
-      </w:pPr>
-      <w:r>
-        <w:t>Prioritize newer goals over older goals.</w:t>
-      </w:r>
-    </w:p>
-    <w:p>
-      <w:pPr>
-        <w:spacing w:line="480" w:lineRule="auto"/>
-        <w:ind w:firstLine="720"/>
-      </w:pPr>
-      <w:r>
-        <w:t xml:space="preserve">We leave these improvements for </w:t>
-      </w:r>
-      <w:r>
-        <w:t>future</w:t>
-      </w:r>
-      <w:r>
-        <w:t xml:space="preserve"> iteration.</w:t>
-      </w:r>
-    </w:p>
-    <w:p>
-      <w:pPr>
-        <w:spacing w:line="480" w:lineRule="auto"/>
-        <w:ind w:firstLine="720"/>
-      </w:pPr>
-    </w:p>
-    <w:p>
-      <w:pPr>
-        <w:spacing w:line="480" w:lineRule="auto"/>
-        <w:jc w:val="center"/>
-        <w:rPr>
-          <w:b/>
-        </w:rPr>
-      </w:pPr>
-      <w:r>
-        <w:rPr>
-          <w:b/>
-        </w:rPr>
-        <w:t>Professional Relevance</w:t>
-      </w:r>
-    </w:p>
-    <w:p>
-      <w:pPr>
-        <w:spacing w:line="480" w:lineRule="auto"/>
-        <w:ind w:firstLine="720"/>
-      </w:pPr>
-      <w:r>
+      <w:r>
+        <w:lastRenderedPageBreak/>
         <w:t>This project demonstrates several techniques in Artificial Intelligence</w:t>
       </w:r>
       <w:r>
@@ -4980,58 +3665,33 @@
         <w:spacing w:line="480" w:lineRule="auto"/>
       </w:pPr>
       <w:r>
-        <w:lastRenderedPageBreak/>
-        <w:t xml:space="preserve">Reinforcement Learning (RL) as well as Machine Learning via </w:t>
-      </w:r>
-      <w:r>
-        <w:t>SVM</w:t>
-      </w:r>
-      <w:r>
-        <w:t>. RL has already been applied to UAV control in this domain (</w:t>
-      </w:r>
-      <w:r>
-        <w:t>Julian</w:t>
-      </w:r>
-      <w:r>
-        <w:t xml:space="preserve"> 2018). RL has applications to robotics (</w:t>
-      </w:r>
+        <w:t>Agentic Workflows, which is finding applications in Finance (</w:t>
+      </w:r>
+      <w:r>
+        <w:t>Yang</w:t>
+      </w:r>
+      <w:r>
+        <w:t xml:space="preserve"> 2024), and Entertainment (</w:t>
+      </w:r>
+      <w:proofErr w:type="spellStart"/>
       <w:r>
         <w:rPr>
           <w:lang w:val="en-CA"/>
         </w:rPr>
-        <w:t>Rajeswaran 2017</w:t>
-      </w:r>
-      <w:r>
-        <w:t xml:space="preserve">) and </w:t>
-      </w:r>
-      <w:r>
-        <w:t>A</w:t>
-      </w:r>
-      <w:r>
-        <w:t xml:space="preserve">utomated </w:t>
-      </w:r>
-      <w:r>
-        <w:t>G</w:t>
-      </w:r>
-      <w:r>
-        <w:t>ameplaying (</w:t>
-      </w:r>
-      <w:proofErr w:type="spellStart"/>
+        <w:t>Ammanabrolu</w:t>
+      </w:r>
+      <w:proofErr w:type="spellEnd"/>
       <w:r>
         <w:rPr>
           <w:lang w:val="en-CA"/>
         </w:rPr>
-        <w:t>Mnih</w:t>
-      </w:r>
-      <w:proofErr w:type="spellEnd"/>
-      <w:r>
-        <w:rPr>
-          <w:lang w:val="en-CA"/>
-        </w:rPr>
-        <w:t xml:space="preserve"> 2015</w:t>
-      </w:r>
-      <w:r>
-        <w:t>).</w:t>
+        <w:t xml:space="preserve"> 2020</w:t>
+      </w:r>
+      <w:r>
+        <w:t>)</w:t>
+      </w:r>
+      <w:r>
+        <w:t>.</w:t>
       </w:r>
     </w:p>
     <w:p>
@@ -5044,33 +3704,7 @@
         <w:spacing w:line="480" w:lineRule="auto"/>
       </w:pPr>
       <w:r>
-        <w:t>Agentic Workflows, which is finding applications in Finance (</w:t>
-      </w:r>
-      <w:r>
-        <w:t>Yang</w:t>
-      </w:r>
-      <w:r>
-        <w:t xml:space="preserve"> 2024), and Entertainment (</w:t>
-      </w:r>
-      <w:proofErr w:type="spellStart"/>
-      <w:r>
-        <w:rPr>
-          <w:lang w:val="en-CA"/>
-        </w:rPr>
-        <w:t>Ammanabrolu</w:t>
-      </w:r>
-      <w:proofErr w:type="spellEnd"/>
-      <w:r>
-        <w:rPr>
-          <w:lang w:val="en-CA"/>
-        </w:rPr>
-        <w:t xml:space="preserve"> 2020</w:t>
-      </w:r>
-      <w:r>
-        <w:t>)</w:t>
-      </w:r>
-      <w:r>
-        <w:t>.</w:t>
+        <w:t>Statistical Analysis to show our approach can have a positive effect on the outcome.</w:t>
       </w:r>
     </w:p>
     <w:p>
@@ -5225,7 +3859,7 @@
         </w:rPr>
         <w:t xml:space="preserve">. </w:t>
       </w:r>
-      <w:hyperlink r:id="rId16" w:tgtFrame="_blank" w:history="1">
+      <w:hyperlink r:id="rId17" w:tgtFrame="_blank" w:history="1">
         <w:r>
           <w:rPr>
             <w:rStyle w:val="Hyperlink"/>
@@ -5258,7 +3892,7 @@
       <w:r>
         <w:t xml:space="preserve">. </w:t>
       </w:r>
-      <w:hyperlink r:id="rId17" w:history="1">
+      <w:hyperlink r:id="rId18" w:history="1">
         <w:r>
           <w:rPr>
             <w:rStyle w:val="Hyperlink"/>
@@ -5291,7 +3925,7 @@
       <w:r>
         <w:t xml:space="preserve">. </w:t>
       </w:r>
-      <w:hyperlink r:id="rId18" w:history="1">
+      <w:hyperlink r:id="rId19" w:history="1">
         <w:r>
           <w:rPr>
             <w:rStyle w:val="Hyperlink"/>
@@ -5303,153 +3937,66 @@
     <w:p>
       <w:pPr>
         <w:spacing w:line="480" w:lineRule="auto"/>
+        <w:rPr>
+          <w:lang w:val="en-CA"/>
+        </w:rPr>
+      </w:pPr>
+    </w:p>
+    <w:p>
+      <w:pPr>
+        <w:spacing w:line="480" w:lineRule="auto"/>
         <w:ind w:left="720"/>
       </w:pPr>
-    </w:p>
-    <w:p>
-      <w:pPr>
-        <w:spacing w:line="480" w:lineRule="auto"/>
-        <w:ind w:left="720"/>
-        <w:rPr>
-          <w:lang w:val="en-CA"/>
-        </w:rPr>
-      </w:pPr>
-      <w:r>
-        <w:rPr>
-          <w:lang w:val="en-CA"/>
-        </w:rPr>
-        <w:t xml:space="preserve">Chen, L., Lu, K., Rajeswaran, A., Lee, K., Grover, A., Laskin, M., </w:t>
-      </w:r>
-      <w:proofErr w:type="spellStart"/>
-      <w:r>
-        <w:rPr>
-          <w:lang w:val="en-CA"/>
-        </w:rPr>
-        <w:t>Abbeel</w:t>
-      </w:r>
-      <w:proofErr w:type="spellEnd"/>
-      <w:r>
-        <w:rPr>
-          <w:lang w:val="en-CA"/>
-        </w:rPr>
-        <w:t xml:space="preserve">, P., Srinivas, A., &amp; </w:t>
-      </w:r>
-      <w:proofErr w:type="spellStart"/>
-      <w:r>
-        <w:rPr>
-          <w:lang w:val="en-CA"/>
-        </w:rPr>
-        <w:t>Mordatch</w:t>
-      </w:r>
-      <w:proofErr w:type="spellEnd"/>
-      <w:r>
-        <w:rPr>
-          <w:lang w:val="en-CA"/>
-        </w:rPr>
-        <w:t xml:space="preserve">, I. (2021). </w:t>
+      <w:r>
+        <w:t xml:space="preserve">Connell, J. H. (1990). </w:t>
       </w:r>
       <w:r>
         <w:rPr>
           <w:i/>
           <w:iCs/>
-          <w:lang w:val="en-CA"/>
-        </w:rPr>
-        <w:t>Decision transformer: Reinforcement learning via sequence modeling</w:t>
-      </w:r>
-      <w:r>
-        <w:rPr>
-          <w:lang w:val="en-CA"/>
-        </w:rPr>
-        <w:t xml:space="preserve">. </w:t>
+        </w:rPr>
+        <w:t>Minimalist mobile robotics: A colony-style architecture for an artificial creature</w:t>
+      </w:r>
+      <w:r>
+        <w:t>. Academic Press.</w:t>
+      </w:r>
+    </w:p>
+    <w:p>
+      <w:pPr>
+        <w:spacing w:line="480" w:lineRule="auto"/>
+        <w:ind w:left="720"/>
+      </w:pPr>
+    </w:p>
+    <w:p>
+      <w:pPr>
+        <w:spacing w:line="480" w:lineRule="auto"/>
+        <w:ind w:left="720"/>
+      </w:pPr>
+      <w:r>
+        <w:t xml:space="preserve">Feng, D., Haase-Schutz, C., Rosenbaum, L., Hertlein, H., Glaser, C., Timm, Fabian., </w:t>
       </w:r>
       <w:proofErr w:type="spellStart"/>
       <w:r>
-        <w:rPr>
-          <w:lang w:val="en-CA"/>
-        </w:rPr>
-        <w:t>arXiv</w:t>
+        <w:t>Wiesbeck</w:t>
       </w:r>
       <w:proofErr w:type="spellEnd"/>
       <w:r>
-        <w:rPr>
-          <w:lang w:val="en-CA"/>
-        </w:rPr>
-        <w:t xml:space="preserve">. </w:t>
-      </w:r>
-      <w:hyperlink r:id="rId19" w:history="1">
-        <w:r>
-          <w:rPr>
-            <w:rStyle w:val="Hyperlink"/>
-            <w:lang w:val="en-CA"/>
-          </w:rPr>
-          <w:t>https://doi.org/10.48550/arXiv.2106.01345</w:t>
-        </w:r>
-      </w:hyperlink>
-    </w:p>
-    <w:p>
-      <w:pPr>
-        <w:spacing w:line="480" w:lineRule="auto"/>
-        <w:ind w:left="720"/>
-        <w:rPr>
-          <w:lang w:val="en-CA"/>
-        </w:rPr>
-      </w:pPr>
-    </w:p>
-    <w:p>
-      <w:pPr>
-        <w:spacing w:line="480" w:lineRule="auto"/>
-        <w:ind w:left="720"/>
-      </w:pPr>
-      <w:r>
-        <w:t xml:space="preserve">Connell, J. H. (1990). </w:t>
+        <w:t xml:space="preserve">, W., &amp; </w:t>
+      </w:r>
+      <w:proofErr w:type="spellStart"/>
+      <w:r>
+        <w:t>Dietmayer</w:t>
+      </w:r>
+      <w:proofErr w:type="spellEnd"/>
+      <w:r>
+        <w:t xml:space="preserve">, K. (2021). Deep Multi-Modal Object Detection and Semantic Segmentation for Autonomous Driving: Datasets, Methods, and Challenges. </w:t>
       </w:r>
       <w:r>
         <w:rPr>
           <w:i/>
           <w:iCs/>
         </w:rPr>
-        <w:t>Minimalist mobile robotics: A colony-style architecture for an artificial creature</w:t>
-      </w:r>
-      <w:r>
-        <w:t>. Academic Press.</w:t>
-      </w:r>
-    </w:p>
-    <w:p>
-      <w:pPr>
-        <w:spacing w:line="480" w:lineRule="auto"/>
-        <w:ind w:left="720"/>
-      </w:pPr>
-    </w:p>
-    <w:p>
-      <w:pPr>
-        <w:spacing w:line="480" w:lineRule="auto"/>
-        <w:ind w:left="720"/>
-      </w:pPr>
-      <w:r>
         <w:lastRenderedPageBreak/>
-        <w:t xml:space="preserve">Feng, D., Haase-Schutz, C., Rosenbaum, L., Hertlein, H., Glaser, C., Timm, Fabian., </w:t>
-      </w:r>
-      <w:proofErr w:type="spellStart"/>
-      <w:r>
-        <w:t>Wiesbeck</w:t>
-      </w:r>
-      <w:proofErr w:type="spellEnd"/>
-      <w:r>
-        <w:t xml:space="preserve">, W., &amp; </w:t>
-      </w:r>
-      <w:proofErr w:type="spellStart"/>
-      <w:r>
-        <w:t>Dietmayer</w:t>
-      </w:r>
-      <w:proofErr w:type="spellEnd"/>
-      <w:r>
-        <w:t xml:space="preserve">, K. (2021). Deep Multi-Modal Object Detection and Semantic Segmentation for Autonomous Driving: Datasets, Methods, and Challenges. </w:t>
-      </w:r>
-      <w:r>
-        <w:rPr>
-          <w:i/>
-          <w:iCs/>
-        </w:rPr>
         <w:t>IEEE Transactions on Intelligent Transportation Systems</w:t>
       </w:r>
       <w:r>
@@ -5634,71 +4181,29 @@
         <w:ind w:left="720"/>
       </w:pPr>
       <w:r>
-        <w:t xml:space="preserve">Julian, K. D., &amp; Kochenderfer, M. J. (2018). </w:t>
+        <w:t xml:space="preserve">Kamble, A. D., &amp; Ghule, S. D. (2025). Procedural terrain generation using Perlin noise. </w:t>
       </w:r>
       <w:r>
         <w:rPr>
           <w:i/>
           <w:iCs/>
         </w:rPr>
-        <w:t>Distributed wildfire surveillance with autonomous aircraft using deep reinforcement learning</w:t>
-      </w:r>
-      <w:r>
-        <w:t xml:space="preserve">. </w:t>
-      </w:r>
-      <w:proofErr w:type="spellStart"/>
-      <w:r>
-        <w:t>arXiv</w:t>
-      </w:r>
-      <w:proofErr w:type="spellEnd"/>
-      <w:r>
-        <w:t xml:space="preserve">. </w:t>
-      </w:r>
-      <w:hyperlink r:id="rId24" w:tgtFrame="_blank" w:history="1">
-        <w:r>
-          <w:rPr>
-            <w:rStyle w:val="Hyperlink"/>
-          </w:rPr>
-          <w:t>https://doi.org/10.48550/arXiv.1810.04244</w:t>
-        </w:r>
-      </w:hyperlink>
-    </w:p>
-    <w:p>
-      <w:pPr>
-        <w:spacing w:line="480" w:lineRule="auto"/>
-        <w:ind w:left="720"/>
-      </w:pPr>
-    </w:p>
-    <w:p>
-      <w:pPr>
-        <w:spacing w:line="480" w:lineRule="auto"/>
-        <w:ind w:left="720"/>
-      </w:pPr>
-      <w:r>
-        <w:lastRenderedPageBreak/>
-        <w:t xml:space="preserve">Kamble, A. D., &amp; Ghule, S. D. (2025). Procedural terrain generation using Perlin noise. </w:t>
+        <w:t>International Journal of Innovative Research in Technology</w:t>
+      </w:r>
+      <w:r>
+        <w:t xml:space="preserve">, </w:t>
       </w:r>
       <w:r>
         <w:rPr>
           <w:i/>
           <w:iCs/>
         </w:rPr>
-        <w:t>International Journal of Innovative Research in Technology</w:t>
-      </w:r>
-      <w:r>
-        <w:t xml:space="preserve">, </w:t>
-      </w:r>
-      <w:r>
-        <w:rPr>
-          <w:i/>
-          <w:iCs/>
-        </w:rPr>
         <w:t>12</w:t>
       </w:r>
       <w:r>
         <w:t xml:space="preserve">(1), 256–259. </w:t>
       </w:r>
-      <w:hyperlink r:id="rId25" w:tgtFrame="_blank" w:history="1">
+      <w:hyperlink r:id="rId24" w:tgtFrame="_blank" w:history="1">
         <w:r>
           <w:rPr>
             <w:rStyle w:val="Hyperlink"/>
@@ -5718,6 +4223,49 @@
         <w:ind w:left="720"/>
       </w:pPr>
       <w:r>
+        <w:t xml:space="preserve">Mann, H. B., &amp; Whitney, D. R. (1947). On a test of whether one of two random variables is stochastically larger than the other. </w:t>
+      </w:r>
+      <w:r>
+        <w:rPr>
+          <w:i/>
+          <w:iCs/>
+        </w:rPr>
+        <w:t>The Annals of Mathematical Statistics</w:t>
+      </w:r>
+      <w:r>
+        <w:t xml:space="preserve">, </w:t>
+      </w:r>
+      <w:r>
+        <w:rPr>
+          <w:i/>
+          <w:iCs/>
+        </w:rPr>
+        <w:t>18</w:t>
+      </w:r>
+      <w:r>
+        <w:t xml:space="preserve">(1), 50–60. </w:t>
+      </w:r>
+      <w:hyperlink r:id="rId25" w:tgtFrame="_blank" w:history="1">
+        <w:r>
+          <w:rPr>
+            <w:rStyle w:val="Hyperlink"/>
+          </w:rPr>
+          <w:t>https://doi.org/10.1214/aoms/1177730491</w:t>
+        </w:r>
+      </w:hyperlink>
+    </w:p>
+    <w:p>
+      <w:pPr>
+        <w:spacing w:line="480" w:lineRule="auto"/>
+      </w:pPr>
+    </w:p>
+    <w:p>
+      <w:pPr>
+        <w:spacing w:line="480" w:lineRule="auto"/>
+        <w:ind w:left="720"/>
+      </w:pPr>
+      <w:r>
+        <w:lastRenderedPageBreak/>
         <w:t xml:space="preserve">Merlin, P. W. (2009). </w:t>
       </w:r>
       <w:proofErr w:type="spellStart"/>
@@ -5751,127 +4299,6 @@
     <w:p>
       <w:pPr>
         <w:spacing w:line="480" w:lineRule="auto"/>
-        <w:ind w:left="720"/>
-      </w:pPr>
-    </w:p>
-    <w:p>
-      <w:pPr>
-        <w:spacing w:line="480" w:lineRule="auto"/>
-        <w:ind w:left="720"/>
-        <w:rPr>
-          <w:lang w:val="en-CA"/>
-        </w:rPr>
-      </w:pPr>
-      <w:proofErr w:type="spellStart"/>
-      <w:r>
-        <w:rPr>
-          <w:lang w:val="en-CA"/>
-        </w:rPr>
-        <w:t>Mnih</w:t>
-      </w:r>
-      <w:proofErr w:type="spellEnd"/>
-      <w:r>
-        <w:rPr>
-          <w:lang w:val="en-CA"/>
-        </w:rPr>
-        <w:t xml:space="preserve">, V., Kavukcuoglu, K., Silver, D., Rusu, A. A., Veness, J., Bellemare, M. G., Graves, A., Riedmiller, M., Fidjeland, A. K., Ostrovski, G., Petersen, S., Beattie, C., Sadik, A., </w:t>
-      </w:r>
-      <w:proofErr w:type="spellStart"/>
-      <w:r>
-        <w:rPr>
-          <w:lang w:val="en-CA"/>
-        </w:rPr>
-        <w:t>Antonoglou</w:t>
-      </w:r>
-      <w:proofErr w:type="spellEnd"/>
-      <w:r>
-        <w:rPr>
-          <w:lang w:val="en-CA"/>
-        </w:rPr>
-        <w:t xml:space="preserve">, I., King, H., Kumaran, D., </w:t>
-      </w:r>
-      <w:proofErr w:type="spellStart"/>
-      <w:r>
-        <w:rPr>
-          <w:lang w:val="en-CA"/>
-        </w:rPr>
-        <w:t>Wierstra</w:t>
-      </w:r>
-      <w:proofErr w:type="spellEnd"/>
-      <w:r>
-        <w:rPr>
-          <w:lang w:val="en-CA"/>
-        </w:rPr>
-        <w:t xml:space="preserve">, D., Legg, S., &amp; Hassabis, D. (2015). Human-level control through deep reinforcement learning. </w:t>
-      </w:r>
-      <w:r>
-        <w:rPr>
-          <w:i/>
-          <w:iCs/>
-          <w:lang w:val="en-CA"/>
-        </w:rPr>
-        <w:t>Nature</w:t>
-      </w:r>
-      <w:r>
-        <w:rPr>
-          <w:lang w:val="en-CA"/>
-        </w:rPr>
-        <w:t xml:space="preserve">, </w:t>
-      </w:r>
-      <w:r>
-        <w:rPr>
-          <w:i/>
-          <w:iCs/>
-          <w:lang w:val="en-CA"/>
-        </w:rPr>
-        <w:t>518</w:t>
-      </w:r>
-      <w:r>
-        <w:rPr>
-          <w:lang w:val="en-CA"/>
-        </w:rPr>
-        <w:t>(7540), 529–533. https://doi.org/10.1038/nature14236</w:t>
-      </w:r>
-    </w:p>
-    <w:p>
-      <w:pPr>
-        <w:spacing w:line="480" w:lineRule="auto"/>
-        <w:ind w:left="720"/>
-      </w:pPr>
-    </w:p>
-    <w:p>
-      <w:pPr>
-        <w:spacing w:line="480" w:lineRule="auto"/>
-        <w:ind w:left="720"/>
-        <w:rPr>
-          <w:lang w:val="en-CA"/>
-        </w:rPr>
-      </w:pPr>
-      <w:r>
-        <w:rPr>
-          <w:lang w:val="en-CA"/>
-        </w:rPr>
-        <w:t xml:space="preserve">Rajeswaran, Aravind, et al. ‘Learning Complex Dexterous Manipulation with Deep Reinforcement Learning and Demonstrations’. </w:t>
-      </w:r>
-      <w:proofErr w:type="spellStart"/>
-      <w:r>
-        <w:rPr>
-          <w:lang w:val="en-CA"/>
-        </w:rPr>
-        <w:t>CoRR</w:t>
-      </w:r>
-      <w:proofErr w:type="spellEnd"/>
-      <w:r>
-        <w:rPr>
-          <w:lang w:val="en-CA"/>
-        </w:rPr>
-        <w:t>, vol. abs/1709.10087, 2017, http://arxiv.org/abs/1709.10087</w:t>
-      </w:r>
-    </w:p>
-    <w:p>
-      <w:pPr>
-        <w:spacing w:line="480" w:lineRule="auto"/>
-        <w:ind w:left="720"/>
       </w:pPr>
     </w:p>
     <w:p>
@@ -5924,7 +4351,6 @@
         <w:rPr>
           <w:lang w:val="en-CA"/>
         </w:rPr>
-        <w:lastRenderedPageBreak/>
         <w:t xml:space="preserve">Ronneberger, O., Fischer, P., &amp; Brox, T. (2015). U-Net: Convolutional networks for biomedical image segmentation. </w:t>
       </w:r>
       <w:proofErr w:type="spellStart"/>
@@ -6001,100 +4427,43 @@
     <w:p>
       <w:pPr>
         <w:spacing w:line="480" w:lineRule="auto"/>
+      </w:pPr>
+    </w:p>
+    <w:p>
+      <w:pPr>
+        <w:spacing w:line="480" w:lineRule="auto"/>
         <w:ind w:left="720"/>
-        <w:rPr>
-          <w:lang w:val="en-CA"/>
-        </w:rPr>
-      </w:pPr>
-    </w:p>
-    <w:p>
-      <w:pPr>
-        <w:spacing w:line="480" w:lineRule="auto"/>
-        <w:ind w:left="720"/>
-      </w:pPr>
-      <w:r>
-        <w:t>Watkins, C.J.C.H., Dayan, P. </w:t>
+      </w:pPr>
+      <w:r>
+        <w:t xml:space="preserve">Yang, H., Chen, J., Siew, M., </w:t>
+      </w:r>
+      <w:proofErr w:type="spellStart"/>
+      <w:r>
+        <w:t>Lorido-Botran</w:t>
+      </w:r>
+      <w:proofErr w:type="spellEnd"/>
+      <w:r>
+        <w:t xml:space="preserve">, T., &amp; Joe-Wong, C. (2025). </w:t>
       </w:r>
       <w:r>
         <w:rPr>
           <w:i/>
           <w:iCs/>
         </w:rPr>
-        <w:t>Q</w:t>
-      </w:r>
-      <w:r>
-        <w:t>-learning. </w:t>
-      </w:r>
-      <w:r>
-        <w:rPr>
-          <w:i/>
-          <w:iCs/>
-        </w:rPr>
-        <w:t>Mach Learn</w:t>
-      </w:r>
-      <w:r>
-        <w:t> </w:t>
-      </w:r>
-      <w:r>
-        <w:rPr>
-          <w:b/>
-          <w:bCs/>
-        </w:rPr>
-        <w:t>8</w:t>
-      </w:r>
-      <w:r>
-        <w:t xml:space="preserve">, 279–292 (1992). </w:t>
-      </w:r>
-      <w:hyperlink r:id="rId30" w:history="1">
-        <w:r>
-          <w:rPr>
-            <w:rStyle w:val="Hyperlink"/>
-          </w:rPr>
-          <w:t>https://doi.org/10.1007/BF00992698</w:t>
-        </w:r>
-      </w:hyperlink>
-    </w:p>
-    <w:p>
-      <w:pPr>
-        <w:spacing w:line="480" w:lineRule="auto"/>
-        <w:ind w:left="720"/>
-      </w:pPr>
-    </w:p>
-    <w:p>
-      <w:pPr>
-        <w:spacing w:line="480" w:lineRule="auto"/>
-        <w:ind w:left="720"/>
-      </w:pPr>
-      <w:r>
-        <w:t xml:space="preserve">Yang, H., Chen, J., Siew, M., </w:t>
+        <w:t>LLM-powered decentralized generative agents with adaptive hierarchical knowledge graph for cooperative planning</w:t>
+      </w:r>
+      <w:r>
+        <w:t xml:space="preserve">. </w:t>
       </w:r>
       <w:proofErr w:type="spellStart"/>
       <w:r>
-        <w:t>Lorido-Botran</w:t>
+        <w:t>arXiv</w:t>
       </w:r>
       <w:proofErr w:type="spellEnd"/>
       <w:r>
-        <w:t xml:space="preserve">, T., &amp; Joe-Wong, C. (2025). </w:t>
-      </w:r>
-      <w:r>
-        <w:rPr>
-          <w:i/>
-          <w:iCs/>
-        </w:rPr>
-        <w:t>LLM-powered decentralized generative agents with adaptive hierarchical knowledge graph for cooperative planning</w:t>
-      </w:r>
-      <w:r>
         <w:t xml:space="preserve">. </w:t>
       </w:r>
-      <w:proofErr w:type="spellStart"/>
-      <w:r>
-        <w:t>arXiv</w:t>
-      </w:r>
-      <w:proofErr w:type="spellEnd"/>
-      <w:r>
-        <w:t xml:space="preserve">. </w:t>
-      </w:r>
-      <w:hyperlink r:id="rId31" w:tgtFrame="_blank" w:history="1">
+      <w:hyperlink r:id="rId30" w:tgtFrame="_blank" w:history="1">
         <w:r>
           <w:rPr>
             <w:rStyle w:val="Hyperlink"/>
@@ -6143,7 +4512,7 @@
       <w:r>
         <w:t xml:space="preserve">. </w:t>
       </w:r>
-      <w:hyperlink r:id="rId32" w:tgtFrame="_blank" w:history="1">
+      <w:hyperlink r:id="rId31" w:tgtFrame="_blank" w:history="1">
         <w:r>
           <w:rPr>
             <w:rStyle w:val="Hyperlink"/>
@@ -6155,53 +4524,12 @@
     <w:p>
       <w:pPr>
         <w:spacing w:line="480" w:lineRule="auto"/>
-        <w:ind w:left="720"/>
-      </w:pPr>
-    </w:p>
-    <w:p>
-      <w:pPr>
-        <w:spacing w:line="480" w:lineRule="auto"/>
-        <w:ind w:left="720"/>
-      </w:pPr>
-      <w:r>
-        <w:t xml:space="preserve">Yu, R., Wan, S., Wang, Y., Gao, C. X., Gan, L., Zhang, Z., &amp; Zhan, D. C. (2025). </w:t>
-      </w:r>
-      <w:r>
-        <w:rPr>
-          <w:i/>
-          <w:iCs/>
-        </w:rPr>
-        <w:t>Reward models in deep reinforcement learning: A survey</w:t>
-      </w:r>
-      <w:r>
-        <w:t xml:space="preserve">. </w:t>
-      </w:r>
-      <w:proofErr w:type="spellStart"/>
-      <w:r>
-        <w:t>arXiv</w:t>
-      </w:r>
-      <w:proofErr w:type="spellEnd"/>
-      <w:r>
-        <w:t xml:space="preserve">. </w:t>
-      </w:r>
-      <w:hyperlink r:id="rId33" w:tgtFrame="_blank" w:history="1">
-        <w:r>
-          <w:rPr>
-            <w:rStyle w:val="Hyperlink"/>
-          </w:rPr>
-          <w:t>https://doi.org/10.48550/arXiv.2506.15421</w:t>
-        </w:r>
-      </w:hyperlink>
-    </w:p>
-    <w:p>
-      <w:pPr>
-        <w:spacing w:line="480" w:lineRule="auto"/>
       </w:pPr>
     </w:p>
     <w:sectPr>
-      <w:headerReference w:type="even" r:id="rId34"/>
-      <w:headerReference w:type="default" r:id="rId35"/>
-      <w:headerReference w:type="first" r:id="rId36"/>
+      <w:headerReference w:type="even" r:id="rId32"/>
+      <w:headerReference w:type="default" r:id="rId33"/>
+      <w:headerReference w:type="first" r:id="rId34"/>
       <w:pgSz w:w="12240" w:h="15840"/>
       <w:pgMar w:top="1440" w:right="1440" w:bottom="1440" w:left="1440" w:header="720" w:footer="1440" w:gutter="0"/>
       <w:pgNumType w:start="1"/>
@@ -6592,6 +4920,95 @@
     </w:lvl>
   </w:abstractNum>
   <w:abstractNum w:abstractNumId="1" w15:restartNumberingAfterBreak="0">
+    <w:nsid w:val="086113E9"/>
+    <w:multiLevelType w:val="hybridMultilevel"/>
+    <w:tmpl w:val="29B8CAE4"/>
+    <w:lvl w:ilvl="0" w:tplc="B70CC362">
+      <w:start w:val="1"/>
+      <w:numFmt w:val="decimal"/>
+      <w:lvlText w:val="%1."/>
+      <w:lvlJc w:val="left"/>
+      <w:pPr>
+        <w:ind w:left="1080" w:hanging="360"/>
+      </w:pPr>
+      <w:rPr>
+        <w:rFonts w:hint="default"/>
+      </w:rPr>
+    </w:lvl>
+    <w:lvl w:ilvl="1" w:tplc="10090019" w:tentative="1">
+      <w:start w:val="1"/>
+      <w:numFmt w:val="lowerLetter"/>
+      <w:lvlText w:val="%2."/>
+      <w:lvlJc w:val="left"/>
+      <w:pPr>
+        <w:ind w:left="1800" w:hanging="360"/>
+      </w:pPr>
+    </w:lvl>
+    <w:lvl w:ilvl="2" w:tplc="1009001B" w:tentative="1">
+      <w:start w:val="1"/>
+      <w:numFmt w:val="lowerRoman"/>
+      <w:lvlText w:val="%3."/>
+      <w:lvlJc w:val="right"/>
+      <w:pPr>
+        <w:ind w:left="2520" w:hanging="180"/>
+      </w:pPr>
+    </w:lvl>
+    <w:lvl w:ilvl="3" w:tplc="1009000F" w:tentative="1">
+      <w:start w:val="1"/>
+      <w:numFmt w:val="decimal"/>
+      <w:lvlText w:val="%4."/>
+      <w:lvlJc w:val="left"/>
+      <w:pPr>
+        <w:ind w:left="3240" w:hanging="360"/>
+      </w:pPr>
+    </w:lvl>
+    <w:lvl w:ilvl="4" w:tplc="10090019" w:tentative="1">
+      <w:start w:val="1"/>
+      <w:numFmt w:val="lowerLetter"/>
+      <w:lvlText w:val="%5."/>
+      <w:lvlJc w:val="left"/>
+      <w:pPr>
+        <w:ind w:left="3960" w:hanging="360"/>
+      </w:pPr>
+    </w:lvl>
+    <w:lvl w:ilvl="5" w:tplc="1009001B" w:tentative="1">
+      <w:start w:val="1"/>
+      <w:numFmt w:val="lowerRoman"/>
+      <w:lvlText w:val="%6."/>
+      <w:lvlJc w:val="right"/>
+      <w:pPr>
+        <w:ind w:left="4680" w:hanging="180"/>
+      </w:pPr>
+    </w:lvl>
+    <w:lvl w:ilvl="6" w:tplc="1009000F" w:tentative="1">
+      <w:start w:val="1"/>
+      <w:numFmt w:val="decimal"/>
+      <w:lvlText w:val="%7."/>
+      <w:lvlJc w:val="left"/>
+      <w:pPr>
+        <w:ind w:left="5400" w:hanging="360"/>
+      </w:pPr>
+    </w:lvl>
+    <w:lvl w:ilvl="7" w:tplc="10090019" w:tentative="1">
+      <w:start w:val="1"/>
+      <w:numFmt w:val="lowerLetter"/>
+      <w:lvlText w:val="%8."/>
+      <w:lvlJc w:val="left"/>
+      <w:pPr>
+        <w:ind w:left="6120" w:hanging="360"/>
+      </w:pPr>
+    </w:lvl>
+    <w:lvl w:ilvl="8" w:tplc="1009001B" w:tentative="1">
+      <w:start w:val="1"/>
+      <w:numFmt w:val="lowerRoman"/>
+      <w:lvlText w:val="%9."/>
+      <w:lvlJc w:val="right"/>
+      <w:pPr>
+        <w:ind w:left="6840" w:hanging="180"/>
+      </w:pPr>
+    </w:lvl>
+  </w:abstractNum>
+  <w:abstractNum w:abstractNumId="2" w15:restartNumberingAfterBreak="0">
     <w:nsid w:val="164B7D58"/>
     <w:multiLevelType w:val="hybridMultilevel"/>
     <w:tmpl w:val="EBEEA622"/>
@@ -6680,7 +5097,7 @@
       </w:pPr>
     </w:lvl>
   </w:abstractNum>
-  <w:abstractNum w:abstractNumId="2" w15:restartNumberingAfterBreak="0">
+  <w:abstractNum w:abstractNumId="3" w15:restartNumberingAfterBreak="0">
     <w:nsid w:val="2C2241CB"/>
     <w:multiLevelType w:val="hybridMultilevel"/>
     <w:tmpl w:val="20665726"/>
@@ -6769,7 +5186,7 @@
       </w:pPr>
     </w:lvl>
   </w:abstractNum>
-  <w:abstractNum w:abstractNumId="3" w15:restartNumberingAfterBreak="0">
+  <w:abstractNum w:abstractNumId="4" w15:restartNumberingAfterBreak="0">
     <w:nsid w:val="2E133DC6"/>
     <w:multiLevelType w:val="hybridMultilevel"/>
     <w:tmpl w:val="40F8E09E"/>
@@ -6858,7 +5275,7 @@
       </w:pPr>
     </w:lvl>
   </w:abstractNum>
-  <w:abstractNum w:abstractNumId="4" w15:restartNumberingAfterBreak="0">
+  <w:abstractNum w:abstractNumId="5" w15:restartNumberingAfterBreak="0">
     <w:nsid w:val="3C170599"/>
     <w:multiLevelType w:val="hybridMultilevel"/>
     <w:tmpl w:val="F4BA0B9C"/>
@@ -6947,7 +5364,7 @@
       </w:pPr>
     </w:lvl>
   </w:abstractNum>
-  <w:abstractNum w:abstractNumId="5" w15:restartNumberingAfterBreak="0">
+  <w:abstractNum w:abstractNumId="6" w15:restartNumberingAfterBreak="0">
     <w:nsid w:val="3D843755"/>
     <w:multiLevelType w:val="hybridMultilevel"/>
     <w:tmpl w:val="D550E43E"/>
@@ -7036,7 +5453,7 @@
       </w:pPr>
     </w:lvl>
   </w:abstractNum>
-  <w:abstractNum w:abstractNumId="6" w15:restartNumberingAfterBreak="0">
+  <w:abstractNum w:abstractNumId="7" w15:restartNumberingAfterBreak="0">
     <w:nsid w:val="413558D9"/>
     <w:multiLevelType w:val="hybridMultilevel"/>
     <w:tmpl w:val="A8DC6F46"/>
@@ -7125,26 +5542,121 @@
       </w:pPr>
     </w:lvl>
   </w:abstractNum>
+  <w:abstractNum w:abstractNumId="8" w15:restartNumberingAfterBreak="0">
+    <w:nsid w:val="4CF05C9D"/>
+    <w:multiLevelType w:val="hybridMultilevel"/>
+    <w:tmpl w:val="8C701548"/>
+    <w:lvl w:ilvl="0" w:tplc="C346D4B4">
+      <w:start w:val="1"/>
+      <w:numFmt w:val="decimal"/>
+      <w:lvlText w:val="%1."/>
+      <w:lvlJc w:val="left"/>
+      <w:pPr>
+        <w:ind w:left="1080" w:hanging="360"/>
+      </w:pPr>
+      <w:rPr>
+        <w:rFonts w:hint="default"/>
+      </w:rPr>
+    </w:lvl>
+    <w:lvl w:ilvl="1" w:tplc="10090019" w:tentative="1">
+      <w:start w:val="1"/>
+      <w:numFmt w:val="lowerLetter"/>
+      <w:lvlText w:val="%2."/>
+      <w:lvlJc w:val="left"/>
+      <w:pPr>
+        <w:ind w:left="1800" w:hanging="360"/>
+      </w:pPr>
+    </w:lvl>
+    <w:lvl w:ilvl="2" w:tplc="1009001B" w:tentative="1">
+      <w:start w:val="1"/>
+      <w:numFmt w:val="lowerRoman"/>
+      <w:lvlText w:val="%3."/>
+      <w:lvlJc w:val="right"/>
+      <w:pPr>
+        <w:ind w:left="2520" w:hanging="180"/>
+      </w:pPr>
+    </w:lvl>
+    <w:lvl w:ilvl="3" w:tplc="1009000F" w:tentative="1">
+      <w:start w:val="1"/>
+      <w:numFmt w:val="decimal"/>
+      <w:lvlText w:val="%4."/>
+      <w:lvlJc w:val="left"/>
+      <w:pPr>
+        <w:ind w:left="3240" w:hanging="360"/>
+      </w:pPr>
+    </w:lvl>
+    <w:lvl w:ilvl="4" w:tplc="10090019" w:tentative="1">
+      <w:start w:val="1"/>
+      <w:numFmt w:val="lowerLetter"/>
+      <w:lvlText w:val="%5."/>
+      <w:lvlJc w:val="left"/>
+      <w:pPr>
+        <w:ind w:left="3960" w:hanging="360"/>
+      </w:pPr>
+    </w:lvl>
+    <w:lvl w:ilvl="5" w:tplc="1009001B" w:tentative="1">
+      <w:start w:val="1"/>
+      <w:numFmt w:val="lowerRoman"/>
+      <w:lvlText w:val="%6."/>
+      <w:lvlJc w:val="right"/>
+      <w:pPr>
+        <w:ind w:left="4680" w:hanging="180"/>
+      </w:pPr>
+    </w:lvl>
+    <w:lvl w:ilvl="6" w:tplc="1009000F" w:tentative="1">
+      <w:start w:val="1"/>
+      <w:numFmt w:val="decimal"/>
+      <w:lvlText w:val="%7."/>
+      <w:lvlJc w:val="left"/>
+      <w:pPr>
+        <w:ind w:left="5400" w:hanging="360"/>
+      </w:pPr>
+    </w:lvl>
+    <w:lvl w:ilvl="7" w:tplc="10090019" w:tentative="1">
+      <w:start w:val="1"/>
+      <w:numFmt w:val="lowerLetter"/>
+      <w:lvlText w:val="%8."/>
+      <w:lvlJc w:val="left"/>
+      <w:pPr>
+        <w:ind w:left="6120" w:hanging="360"/>
+      </w:pPr>
+    </w:lvl>
+    <w:lvl w:ilvl="8" w:tplc="1009001B" w:tentative="1">
+      <w:start w:val="1"/>
+      <w:numFmt w:val="lowerRoman"/>
+      <w:lvlText w:val="%9."/>
+      <w:lvlJc w:val="right"/>
+      <w:pPr>
+        <w:ind w:left="6840" w:hanging="180"/>
+      </w:pPr>
+    </w:lvl>
+  </w:abstractNum>
   <w:num w:numId="1" w16cid:durableId="1042704175">
-    <w:abstractNumId w:val="1"/>
+    <w:abstractNumId w:val="2"/>
   </w:num>
   <w:num w:numId="2" w16cid:durableId="548107309">
-    <w:abstractNumId w:val="5"/>
+    <w:abstractNumId w:val="6"/>
   </w:num>
   <w:num w:numId="3" w16cid:durableId="1970435402">
-    <w:abstractNumId w:val="4"/>
+    <w:abstractNumId w:val="5"/>
   </w:num>
   <w:num w:numId="4" w16cid:durableId="1465193618">
     <w:abstractNumId w:val="0"/>
   </w:num>
   <w:num w:numId="5" w16cid:durableId="1963143843">
+    <w:abstractNumId w:val="4"/>
+  </w:num>
+  <w:num w:numId="6" w16cid:durableId="40714192">
+    <w:abstractNumId w:val="7"/>
+  </w:num>
+  <w:num w:numId="7" w16cid:durableId="1019745114">
     <w:abstractNumId w:val="3"/>
   </w:num>
-  <w:num w:numId="6" w16cid:durableId="40714192">
-    <w:abstractNumId w:val="6"/>
+  <w:num w:numId="8" w16cid:durableId="1113937010">
+    <w:abstractNumId w:val="8"/>
   </w:num>
-  <w:num w:numId="7" w16cid:durableId="1019745114">
-    <w:abstractNumId w:val="2"/>
+  <w:num w:numId="9" w16cid:durableId="5058905">
+    <w:abstractNumId w:val="1"/>
   </w:num>
 </w:numbering>
 </file>

</xml_diff>

<commit_message>
(chore): clean up project
</commit_message>
<xml_diff>
--- a/Reflective_Synthesis_Paper.docx
+++ b/Reflective_Synthesis_Paper.docx
@@ -2469,7 +2469,7 @@
         </w:rPr>
         <w:lastRenderedPageBreak/>
         <w:drawing>
-          <wp:inline distT="0" distB="0" distL="0" distR="0" wp14:anchorId="5A99DB7D" wp14:editId="3A4F8A09">
+          <wp:inline distT="0" distB="0" distL="0" distR="0" wp14:anchorId="5A99DB7D" wp14:editId="26B07932">
             <wp:extent cx="5941060" cy="6047105"/>
             <wp:effectExtent l="0" t="0" r="2540" b="0"/>
             <wp:docPr id="1561439249" name="Picture 5"/>
@@ -2730,7 +2730,7 @@
           <w:noProof/>
         </w:rPr>
         <w:drawing>
-          <wp:inline distT="0" distB="0" distL="0" distR="0" wp14:anchorId="231DA530" wp14:editId="2DF8BBF6">
+          <wp:inline distT="0" distB="0" distL="0" distR="0" wp14:anchorId="231DA530" wp14:editId="72B1B66D">
             <wp:extent cx="5937250" cy="2971800"/>
             <wp:effectExtent l="0" t="0" r="6350" b="0"/>
             <wp:docPr id="1696375601" name="Picture 2"/>
@@ -3504,7 +3504,7 @@
           <w:noProof/>
         </w:rPr>
         <w:drawing>
-          <wp:inline distT="0" distB="0" distL="0" distR="0" wp14:anchorId="1068ABD1" wp14:editId="1A941E1C">
+          <wp:inline distT="0" distB="0" distL="0" distR="0" wp14:anchorId="1068ABD1" wp14:editId="3A47E1E4">
             <wp:extent cx="5937250" cy="2381250"/>
             <wp:effectExtent l="0" t="0" r="6350" b="0"/>
             <wp:docPr id="262277473" name="Picture 1"/>
@@ -3632,7 +3632,14 @@
         <w:spacing w:line="480" w:lineRule="auto"/>
       </w:pPr>
       <w:r>
-        <w:t>Semantic Segmentation as a predictive technique – which could have potential applications in Autonomous Driving (</w:t>
+        <w:rPr>
+          <w:i/>
+          <w:iCs/>
+        </w:rPr>
+        <w:t>Semantic Segmentation</w:t>
+      </w:r>
+      <w:r>
+        <w:t xml:space="preserve"> as a predictive technique – which could have potential applications in Autonomous Driving (</w:t>
       </w:r>
       <w:r>
         <w:t>Feng</w:t>
@@ -3665,7 +3672,14 @@
         <w:spacing w:line="480" w:lineRule="auto"/>
       </w:pPr>
       <w:r>
-        <w:t>Agentic Workflows, which is finding applications in Finance (</w:t>
+        <w:rPr>
+          <w:i/>
+          <w:iCs/>
+        </w:rPr>
+        <w:t>Agentic Workflows</w:t>
+      </w:r>
+      <w:r>
+        <w:t>, which is finding applications in Finance (</w:t>
       </w:r>
       <w:r>
         <w:t>Yang</w:t>
@@ -3704,7 +3718,14 @@
         <w:spacing w:line="480" w:lineRule="auto"/>
       </w:pPr>
       <w:r>
-        <w:t>Statistical Analysis to show our approach can have a positive effect on the outcome.</w:t>
+        <w:rPr>
+          <w:i/>
+          <w:iCs/>
+        </w:rPr>
+        <w:t>Statistical Analysis</w:t>
+      </w:r>
+      <w:r>
+        <w:t xml:space="preserve"> to show our approach can have a positive effect on the outcome.</w:t>
       </w:r>
     </w:p>
     <w:p>
@@ -4520,11 +4541,6 @@
           <w:t>https://doi.org/10.48550/arXiv.2405.14767</w:t>
         </w:r>
       </w:hyperlink>
-    </w:p>
-    <w:p>
-      <w:pPr>
-        <w:spacing w:line="480" w:lineRule="auto"/>
-      </w:pPr>
     </w:p>
     <w:sectPr>
       <w:headerReference w:type="even" r:id="rId32"/>
@@ -4592,28 +4608,12 @@
         <w:t xml:space="preserve"> </w:t>
       </w:r>
       <w:hyperlink r:id="rId1" w:history="1">
-        <w:proofErr w:type="spellStart"/>
         <w:r>
           <w:rPr>
             <w:rStyle w:val="Hyperlink"/>
           </w:rPr>
-          <w:t>mgraph-db</w:t>
+          <w:t>mgraph-db · PyPI</w:t>
         </w:r>
-        <w:proofErr w:type="spellEnd"/>
-        <w:r>
-          <w:rPr>
-            <w:rStyle w:val="Hyperlink"/>
-          </w:rPr>
-          <w:t xml:space="preserve"> · </w:t>
-        </w:r>
-        <w:proofErr w:type="spellStart"/>
-        <w:r>
-          <w:rPr>
-            <w:rStyle w:val="Hyperlink"/>
-          </w:rPr>
-          <w:t>PyPI</w:t>
-        </w:r>
-        <w:proofErr w:type="spellEnd"/>
       </w:hyperlink>
     </w:p>
   </w:footnote>

</xml_diff>

<commit_message>
(update): presentation; paper adjustments;
</commit_message>
<xml_diff>
--- a/Reflective_Synthesis_Paper.docx
+++ b/Reflective_Synthesis_Paper.docx
@@ -200,7 +200,13 @@
         <w:t xml:space="preserve">Assuming we had either a high-altitude aerial view, or at a periodic satellite view, </w:t>
       </w:r>
       <w:r>
-        <w:t xml:space="preserve">we built a </w:t>
+        <w:t xml:space="preserve">we </w:t>
+      </w:r>
+      <w:r>
+        <w:t>determined that</w:t>
+      </w:r>
+      <w:r>
+        <w:t xml:space="preserve"> a </w:t>
       </w:r>
       <w:r>
         <w:t xml:space="preserve">“risk” map of the area would be a good approach. </w:t>
@@ -378,6 +384,9 @@
       <w:r>
         <w:t>A visual overview of the system design can be found in Figure 5.</w:t>
       </w:r>
+      <w:r>
+        <w:t xml:space="preserve"> </w:t>
+      </w:r>
     </w:p>
     <w:p>
       <w:pPr>
@@ -408,24 +417,25 @@
     <w:p>
       <w:pPr>
         <w:spacing w:line="480" w:lineRule="auto"/>
+        <w:ind w:firstLine="720"/>
+      </w:pPr>
+      <w:r>
+        <w:t>This module was responsible for simulating the environment as well as generating “risk predictions” based on the environment</w:t>
+      </w:r>
+      <w:r>
+        <w:t>.</w:t>
+      </w:r>
+      <w:r>
+        <w:t xml:space="preserve"> As we do not have a reliable dataset to work from that we can easily integrate with the rest of the system, we chose to randomly generate the environment and use Cellular Automata to simulate fire propagation.</w:t>
+      </w:r>
+    </w:p>
+    <w:p>
+      <w:pPr>
+        <w:spacing w:line="480" w:lineRule="auto"/>
       </w:pPr>
       <w:r>
         <w:tab/>
-      </w:r>
-      <w:r>
-        <w:t>This module was responsible for simulating the environment as well as generating “risk predictions” based on the environment</w:t>
-      </w:r>
-      <w:r>
-        <w:t>.</w:t>
-      </w:r>
-    </w:p>
-    <w:p>
-      <w:pPr>
-        <w:spacing w:line="480" w:lineRule="auto"/>
-      </w:pPr>
-      <w:r>
-        <w:tab/>
-        <w:t xml:space="preserve">Our environment was randomly generated using Perlin Noise, </w:t>
+        <w:t xml:space="preserve">Our environment was generated using Perlin Noise, </w:t>
       </w:r>
       <w:r>
         <w:t>adapted from</w:t>
@@ -528,6 +538,7 @@
         <w:spacing w:line="480" w:lineRule="auto"/>
       </w:pPr>
       <w:r>
+        <w:lastRenderedPageBreak/>
         <w:t>Equation 1:</w:t>
       </w:r>
     </w:p>
@@ -906,8 +917,30 @@
     <w:p>
       <w:pPr>
         <w:spacing w:line="480" w:lineRule="auto"/>
-      </w:pPr>
-      <w:r>
+        <w:rPr>
+          <w:b/>
+          <w:bCs/>
+          <w:i/>
+          <w:iCs/>
+        </w:rPr>
+      </w:pPr>
+    </w:p>
+    <w:p>
+      <w:pPr>
+        <w:spacing w:line="480" w:lineRule="auto"/>
+        <w:ind w:firstLine="720"/>
+      </w:pPr>
+      <w:r>
+        <w:t>Running the Cellular Automata several steps in advance to determine fire trajectory would be slow and may not be a practical real-time approach. We choose to use machine learning to predict the path of the fire instead.</w:t>
+      </w:r>
+    </w:p>
+    <w:p>
+      <w:pPr>
+        <w:spacing w:line="480" w:lineRule="auto"/>
+        <w:ind w:firstLine="720"/>
+      </w:pPr>
+      <w:r>
+        <w:lastRenderedPageBreak/>
         <w:t xml:space="preserve">We trained a modified version of a </w:t>
       </w:r>
       <w:proofErr w:type="spellStart"/>
@@ -960,11 +993,7 @@
         <w:t>A</w:t>
       </w:r>
       <w:r>
-        <w:t xml:space="preserve">reas in the final image that </w:t>
-      </w:r>
-      <w:r>
-        <w:lastRenderedPageBreak/>
-        <w:t>were still burning or destroyed (but not destroyed in the original image)</w:t>
+        <w:t>reas in the final image that were still burning or destroyed (but not destroyed in the original image)</w:t>
       </w:r>
       <w:r>
         <w:t xml:space="preserve"> were marked “Risky” in the mask</w:t>
@@ -1241,6 +1270,7 @@
         <w:t xml:space="preserve"> helps ensure that the overall shape of the output is preserved. </w:t>
       </w:r>
       <w:r>
+        <w:lastRenderedPageBreak/>
         <w:t>This helps mitigate class imbalance</w:t>
       </w:r>
       <w:r>
@@ -1390,7 +1420,6 @@
               <w:spacing w:line="480" w:lineRule="auto"/>
             </w:pPr>
             <w:r>
-              <w:lastRenderedPageBreak/>
               <w:t>RISKY – MIOU</w:t>
             </w:r>
           </w:p>
@@ -1595,6 +1624,7 @@
         <w:ind w:firstLine="720"/>
       </w:pPr>
       <w:r>
+        <w:lastRenderedPageBreak/>
         <w:t>UAVs keep a record of all observations / positions / waypoint</w:t>
       </w:r>
       <w:r>
@@ -1670,7 +1700,6 @@
         <w:spacing w:line="480" w:lineRule="auto"/>
       </w:pPr>
       <w:r>
-        <w:lastRenderedPageBreak/>
         <w:tab/>
         <w:t xml:space="preserve">Each Agent other than the Command Centre Agent keeps a memory of previous interactions which are inserted as part the prompt for each turn. </w:t>
       </w:r>
@@ -1736,16 +1765,11 @@
       <w:r>
         <w:t xml:space="preserve">Our KG ontology </w:t>
       </w:r>
-      <w:proofErr w:type="gramStart"/>
       <w:r>
         <w:t xml:space="preserve">is </w:t>
       </w:r>
       <w:r>
-        <w:t>in</w:t>
-      </w:r>
-      <w:proofErr w:type="gramEnd"/>
-      <w:r>
-        <w:t xml:space="preserve"> Figure 6.</w:t>
+        <w:t>in Figure 6.</w:t>
       </w:r>
       <w:r>
         <w:t xml:space="preserve"> </w:t>
@@ -1873,7 +1897,11 @@
               <w:cnfStyle w:val="000000000000" w:firstRow="0" w:lastRow="0" w:firstColumn="0" w:lastColumn="0" w:oddVBand="0" w:evenVBand="0" w:oddHBand="0" w:evenHBand="0" w:firstRowFirstColumn="0" w:firstRowLastColumn="0" w:lastRowFirstColumn="0" w:lastRowLastColumn="0"/>
             </w:pPr>
             <w:r>
-              <w:t>Orchestration. The command center agent takes in the inputs from the simulation and outputs the final response from the Workflow.</w:t>
+              <w:t xml:space="preserve">Orchestration. The command center agent takes in the inputs from the simulation </w:t>
+            </w:r>
+            <w:r>
+              <w:lastRenderedPageBreak/>
+              <w:t>and outputs the final response from the Workflow.</w:t>
             </w:r>
           </w:p>
         </w:tc>
@@ -1887,6 +1915,7 @@
               <w:cnfStyle w:val="000000000000" w:firstRow="0" w:lastRow="0" w:firstColumn="0" w:lastColumn="0" w:oddVBand="0" w:evenVBand="0" w:oddHBand="0" w:evenHBand="0" w:firstRowFirstColumn="0" w:firstRowLastColumn="0" w:lastRowFirstColumn="0" w:lastRowLastColumn="0"/>
             </w:pPr>
             <w:r>
+              <w:lastRenderedPageBreak/>
               <w:t>None</w:t>
             </w:r>
           </w:p>
@@ -2003,7 +2032,6 @@
               <w:spacing w:line="480" w:lineRule="auto"/>
             </w:pPr>
             <w:r>
-              <w:lastRenderedPageBreak/>
               <w:t>Assistant Agent</w:t>
             </w:r>
           </w:p>
@@ -2169,6 +2197,7 @@
         <w:ind w:firstLine="360"/>
       </w:pPr>
       <w:r>
+        <w:lastRenderedPageBreak/>
         <w:t xml:space="preserve">The </w:t>
       </w:r>
       <w:r>
@@ -2199,7 +2228,13 @@
       </w:pPr>
       <w:r>
         <w:tab/>
-        <w:t xml:space="preserve">The simulation ends either after 750 steps, or when all fire has been extinguished. </w:t>
+        <w:t xml:space="preserve">The simulation ends either after </w:t>
+      </w:r>
+      <w:r>
+        <w:t>500</w:t>
+      </w:r>
+      <w:r>
+        <w:t xml:space="preserve"> steps, or when all fire has been extinguished. </w:t>
       </w:r>
     </w:p>
     <w:p>
@@ -2211,7 +2246,6 @@
         <w:rPr>
           <w:noProof/>
         </w:rPr>
-        <w:lastRenderedPageBreak/>
         <w:drawing>
           <wp:inline distT="0" distB="0" distL="0" distR="0" wp14:anchorId="39C87280" wp14:editId="050CE50D">
             <wp:extent cx="5946140" cy="5946140"/>
@@ -2469,7 +2503,7 @@
         </w:rPr>
         <w:lastRenderedPageBreak/>
         <w:drawing>
-          <wp:inline distT="0" distB="0" distL="0" distR="0" wp14:anchorId="5A99DB7D" wp14:editId="26B07932">
+          <wp:inline distT="0" distB="0" distL="0" distR="0" wp14:anchorId="5A99DB7D" wp14:editId="07CD002A">
             <wp:extent cx="5941060" cy="6047105"/>
             <wp:effectExtent l="0" t="0" r="2540" b="0"/>
             <wp:docPr id="1561439249" name="Picture 5"/>
@@ -2730,7 +2764,7 @@
           <w:noProof/>
         </w:rPr>
         <w:drawing>
-          <wp:inline distT="0" distB="0" distL="0" distR="0" wp14:anchorId="231DA530" wp14:editId="72B1B66D">
+          <wp:inline distT="0" distB="0" distL="0" distR="0" wp14:anchorId="231DA530" wp14:editId="50B9ED2F">
             <wp:extent cx="5937250" cy="2971800"/>
             <wp:effectExtent l="0" t="0" r="6350" b="0"/>
             <wp:docPr id="1696375601" name="Picture 2"/>
@@ -2972,29 +3006,11 @@
         <w:ind w:left="720"/>
       </w:pPr>
       <w:r>
+        <w:lastRenderedPageBreak/>
         <w:tab/>
       </w:r>
       <w:r>
-        <w:t>A</w:t>
-      </w:r>
-      <w:r>
-        <w:t>ssumptions were made during testing that may</w:t>
-      </w:r>
-      <w:r>
-        <w:t xml:space="preserve"> not be realistic</w:t>
-      </w:r>
-      <w:r>
-        <w:t xml:space="preserve">. </w:t>
-      </w:r>
-    </w:p>
-    <w:p>
-      <w:pPr>
-        <w:spacing w:line="480" w:lineRule="auto"/>
-        <w:ind w:left="720"/>
-      </w:pPr>
-      <w:r>
-        <w:lastRenderedPageBreak/>
-        <w:t xml:space="preserve">Examples: </w:t>
+        <w:t>Design trade-offs were made to keep the project within a reasonable scope that would need further investigation in a real-world scenario:</w:t>
       </w:r>
       <w:r>
         <w:t xml:space="preserve"> </w:t>
@@ -3282,7 +3298,13 @@
         <w:ind w:firstLine="720"/>
       </w:pPr>
       <w:r>
-        <w:t>Figure 9 shows the burned area and causalities for each of our two datasets. The table below provides the results of Man</w:t>
+        <w:t xml:space="preserve">Figure 9 shows the burned area and </w:t>
+      </w:r>
+      <w:r>
+        <w:t>casualties</w:t>
+      </w:r>
+      <w:r>
+        <w:t xml:space="preserve"> for each of our two datasets. The table below provides the results of Man</w:t>
       </w:r>
       <w:r>
         <w:t>n</w:t>
@@ -3504,7 +3526,7 @@
           <w:noProof/>
         </w:rPr>
         <w:drawing>
-          <wp:inline distT="0" distB="0" distL="0" distR="0" wp14:anchorId="1068ABD1" wp14:editId="3A47E1E4">
+          <wp:inline distT="0" distB="0" distL="0" distR="0" wp14:anchorId="1068ABD1" wp14:editId="68744CF9">
             <wp:extent cx="5937250" cy="2381250"/>
             <wp:effectExtent l="0" t="0" r="6350" b="0"/>
             <wp:docPr id="262277473" name="Picture 1"/>
@@ -3593,6 +3615,42 @@
         <w:spacing w:line="480" w:lineRule="auto"/>
         <w:ind w:firstLine="720"/>
       </w:pPr>
+      <w:r>
+        <w:t xml:space="preserve">Implementation and corresponding </w:t>
+      </w:r>
+      <w:proofErr w:type="spellStart"/>
+      <w:r>
+        <w:t>jupyter</w:t>
+      </w:r>
+      <w:proofErr w:type="spellEnd"/>
+      <w:r>
+        <w:t xml:space="preserve"> notebook are in the </w:t>
+      </w:r>
+      <w:proofErr w:type="spellStart"/>
+      <w:r>
+        <w:t>github</w:t>
+      </w:r>
+      <w:proofErr w:type="spellEnd"/>
+      <w:r>
+        <w:t xml:space="preserve"> repo that accompanies this project. (</w:t>
+      </w:r>
+      <w:hyperlink r:id="rId17" w:history="1">
+        <w:r>
+          <w:rPr>
+            <w:rStyle w:val="Hyperlink"/>
+          </w:rPr>
+          <w:t>https://github.com/streklin/industry-integrated-ai-systems-synthesis</w:t>
+        </w:r>
+      </w:hyperlink>
+      <w:r>
+        <w:t>)</w:t>
+      </w:r>
+    </w:p>
+    <w:p>
+      <w:pPr>
+        <w:spacing w:line="480" w:lineRule="auto"/>
+        <w:ind w:firstLine="720"/>
+      </w:pPr>
     </w:p>
     <w:p>
       <w:pPr>
@@ -3615,7 +3673,6 @@
         <w:ind w:firstLine="720"/>
       </w:pPr>
       <w:r>
-        <w:lastRenderedPageBreak/>
         <w:t>This project demonstrates several techniques in Artificial Intelligence</w:t>
       </w:r>
       <w:r>
@@ -3880,7 +3937,7 @@
         </w:rPr>
         <w:t xml:space="preserve">. </w:t>
       </w:r>
-      <w:hyperlink r:id="rId17" w:tgtFrame="_blank" w:history="1">
+      <w:hyperlink r:id="rId18" w:tgtFrame="_blank" w:history="1">
         <w:r>
           <w:rPr>
             <w:rStyle w:val="Hyperlink"/>
@@ -3913,7 +3970,7 @@
       <w:r>
         <w:t xml:space="preserve">. </w:t>
       </w:r>
-      <w:hyperlink r:id="rId18" w:history="1">
+      <w:hyperlink r:id="rId19" w:history="1">
         <w:r>
           <w:rPr>
             <w:rStyle w:val="Hyperlink"/>
@@ -3925,99 +3982,65 @@
     <w:p>
       <w:pPr>
         <w:spacing w:line="480" w:lineRule="auto"/>
+        <w:rPr>
+          <w:lang w:val="en-CA"/>
+        </w:rPr>
+      </w:pPr>
+    </w:p>
+    <w:p>
+      <w:pPr>
+        <w:spacing w:line="480" w:lineRule="auto"/>
         <w:ind w:left="720"/>
       </w:pPr>
-    </w:p>
-    <w:p>
-      <w:pPr>
-        <w:spacing w:line="480" w:lineRule="auto"/>
-        <w:ind w:left="720"/>
-      </w:pPr>
-      <w:r>
-        <w:t xml:space="preserve">Centers for Disease Control and Prevention. (2014). Aviation-related wildland firefighter fatalities — United States, 2000–2013. </w:t>
+      <w:r>
+        <w:t xml:space="preserve">Connell, J. H. (1990). </w:t>
       </w:r>
       <w:r>
         <w:rPr>
           <w:i/>
           <w:iCs/>
         </w:rPr>
-        <w:t>Morbidity and Mortality Weekly Report</w:t>
-      </w:r>
-      <w:r>
-        <w:t xml:space="preserve">. </w:t>
-      </w:r>
-      <w:hyperlink r:id="rId19" w:history="1">
-        <w:r>
-          <w:rPr>
-            <w:rStyle w:val="Hyperlink"/>
-          </w:rPr>
-          <w:t>https://www.ncbi.nlm.nih.gov/pmc/articles/PMC4584834/</w:t>
-        </w:r>
-      </w:hyperlink>
-    </w:p>
-    <w:p>
-      <w:pPr>
-        <w:spacing w:line="480" w:lineRule="auto"/>
-        <w:rPr>
-          <w:lang w:val="en-CA"/>
-        </w:rPr>
-      </w:pPr>
+        <w:t>Minimalist mobile robotics: A colony-style architecture for an artificial creature</w:t>
+      </w:r>
+      <w:r>
+        <w:t>. Academic Press.</w:t>
+      </w:r>
     </w:p>
     <w:p>
       <w:pPr>
         <w:spacing w:line="480" w:lineRule="auto"/>
         <w:ind w:left="720"/>
       </w:pPr>
-      <w:r>
-        <w:t xml:space="preserve">Connell, J. H. (1990). </w:t>
+    </w:p>
+    <w:p>
+      <w:pPr>
+        <w:spacing w:line="480" w:lineRule="auto"/>
+        <w:ind w:left="720"/>
+      </w:pPr>
+      <w:r>
+        <w:t xml:space="preserve">Feng, D., Haase-Schutz, C., Rosenbaum, L., Hertlein, H., Glaser, C., Timm, Fabian., </w:t>
+      </w:r>
+      <w:proofErr w:type="spellStart"/>
+      <w:r>
+        <w:t>Wiesbeck</w:t>
+      </w:r>
+      <w:proofErr w:type="spellEnd"/>
+      <w:r>
+        <w:t xml:space="preserve">, W., &amp; </w:t>
+      </w:r>
+      <w:proofErr w:type="spellStart"/>
+      <w:r>
+        <w:t>Dietmayer</w:t>
+      </w:r>
+      <w:proofErr w:type="spellEnd"/>
+      <w:r>
+        <w:t xml:space="preserve">, K. (2021). Deep Multi-Modal Object Detection and Semantic Segmentation for Autonomous Driving: Datasets, Methods, and Challenges. </w:t>
       </w:r>
       <w:r>
         <w:rPr>
           <w:i/>
           <w:iCs/>
         </w:rPr>
-        <w:t>Minimalist mobile robotics: A colony-style architecture for an artificial creature</w:t>
-      </w:r>
-      <w:r>
-        <w:t>. Academic Press.</w:t>
-      </w:r>
-    </w:p>
-    <w:p>
-      <w:pPr>
-        <w:spacing w:line="480" w:lineRule="auto"/>
-        <w:ind w:left="720"/>
-      </w:pPr>
-    </w:p>
-    <w:p>
-      <w:pPr>
-        <w:spacing w:line="480" w:lineRule="auto"/>
-        <w:ind w:left="720"/>
-      </w:pPr>
-      <w:r>
-        <w:t xml:space="preserve">Feng, D., Haase-Schutz, C., Rosenbaum, L., Hertlein, H., Glaser, C., Timm, Fabian., </w:t>
-      </w:r>
-      <w:proofErr w:type="spellStart"/>
-      <w:r>
-        <w:t>Wiesbeck</w:t>
-      </w:r>
-      <w:proofErr w:type="spellEnd"/>
-      <w:r>
-        <w:t xml:space="preserve">, W., &amp; </w:t>
-      </w:r>
-      <w:proofErr w:type="spellStart"/>
-      <w:r>
-        <w:t>Dietmayer</w:t>
-      </w:r>
-      <w:proofErr w:type="spellEnd"/>
-      <w:r>
-        <w:t xml:space="preserve">, K. (2021). Deep Multi-Modal Object Detection and Semantic Segmentation for Autonomous Driving: Datasets, Methods, and Challenges. </w:t>
-      </w:r>
-      <w:r>
-        <w:rPr>
-          <w:i/>
-          <w:iCs/>
-        </w:rPr>
-        <w:lastRenderedPageBreak/>
         <w:t>IEEE Transactions on Intelligent Transportation Systems</w:t>
       </w:r>
       <w:r>
@@ -4286,7 +4309,6 @@
         <w:ind w:left="720"/>
       </w:pPr>
       <w:r>
-        <w:lastRenderedPageBreak/>
         <w:t xml:space="preserve">Merlin, P. W. (2009). </w:t>
       </w:r>
       <w:proofErr w:type="spellStart"/>
@@ -4328,6 +4350,7 @@
         <w:ind w:left="720"/>
       </w:pPr>
       <w:r>
+        <w:lastRenderedPageBreak/>
         <w:t xml:space="preserve">Ramadan, A. (2024). </w:t>
       </w:r>
       <w:r>
@@ -6175,7 +6198,6 @@
   <w:style w:type="character" w:default="1" w:styleId="DefaultParagraphFont">
     <w:name w:val="Default Paragraph Font"/>
     <w:uiPriority w:val="1"/>
-    <w:semiHidden/>
     <w:unhideWhenUsed/>
   </w:style>
   <w:style w:type="table" w:default="1" w:styleId="TableNormal">
@@ -6617,6 +6639,18 @@
       </w:tcPr>
     </w:tblStylePr>
   </w:style>
+  <w:style w:type="character" w:styleId="FollowedHyperlink">
+    <w:name w:val="FollowedHyperlink"/>
+    <w:basedOn w:val="DefaultParagraphFont"/>
+    <w:uiPriority w:val="99"/>
+    <w:semiHidden/>
+    <w:unhideWhenUsed/>
+    <w:rsid w:val="00172F5D"/>
+    <w:rPr>
+      <w:color w:val="800080" w:themeColor="followedHyperlink"/>
+      <w:u w:val="single"/>
+    </w:rPr>
+  </w:style>
 </w:styles>
 </file>
 

</xml_diff>

<commit_message>
(chore): more minor changes
</commit_message>
<xml_diff>
--- a/Reflective_Synthesis_Paper.docx
+++ b/Reflective_Synthesis_Paper.docx
@@ -215,41 +215,10 @@
         <w:t xml:space="preserve">This </w:t>
       </w:r>
       <w:r>
-        <w:t xml:space="preserve">is a simple binary classification problem for each cell in our simulation. </w:t>
-      </w:r>
-      <w:r>
-        <w:t>W</w:t>
-      </w:r>
-      <w:r>
-        <w:t xml:space="preserve">e reused the </w:t>
-      </w:r>
-      <w:proofErr w:type="spellStart"/>
-      <w:r>
-        <w:t>UNet</w:t>
-      </w:r>
-      <w:proofErr w:type="spellEnd"/>
-      <w:r>
-        <w:t xml:space="preserve"> (</w:t>
-      </w:r>
-      <w:proofErr w:type="spellStart"/>
-      <w:r>
-        <w:rPr>
-          <w:lang w:val="en-CA"/>
-        </w:rPr>
-        <w:t>Ronneberger</w:t>
-      </w:r>
-      <w:proofErr w:type="spellEnd"/>
-      <w:r>
-        <w:rPr>
-          <w:lang w:val="en-CA"/>
-        </w:rPr>
-        <w:t xml:space="preserve"> 2015</w:t>
-      </w:r>
-      <w:r>
-        <w:t>) built for Project 4</w:t>
-      </w:r>
-      <w:r>
-        <w:t xml:space="preserve"> here.</w:t>
+        <w:t>is a simple binary classification problem for each cell in our simulation</w:t>
+      </w:r>
+      <w:r>
+        <w:t xml:space="preserve"> – effectively semantic segmentation as used in Project 4. </w:t>
       </w:r>
     </w:p>
     <w:p>
@@ -931,7 +900,42 @@
         <w:ind w:firstLine="720"/>
       </w:pPr>
       <w:r>
-        <w:t>Running the Cellular Automata several steps in advance to determine fire trajectory would be slow and may not be a practical real-time approach. We choose to use machine learning to predict the path of the fire instead.</w:t>
+        <w:t xml:space="preserve">Running the Cellular Automata several steps in advance to determine fire trajectory would be slow and may not be a practical real-time approach. We choose </w:t>
+      </w:r>
+      <w:r>
+        <w:t xml:space="preserve">to treat this as a </w:t>
+      </w:r>
+      <w:r>
+        <w:lastRenderedPageBreak/>
+        <w:t xml:space="preserve">Semantic Segmentation problem based on work from Project 4. We used </w:t>
+      </w:r>
+      <w:proofErr w:type="spellStart"/>
+      <w:r>
+        <w:t>UNet</w:t>
+      </w:r>
+      <w:proofErr w:type="spellEnd"/>
+      <w:r>
+        <w:t xml:space="preserve"> </w:t>
+      </w:r>
+      <w:r>
+        <w:t>(</w:t>
+      </w:r>
+      <w:proofErr w:type="spellStart"/>
+      <w:r>
+        <w:rPr>
+          <w:lang w:val="en-CA"/>
+        </w:rPr>
+        <w:t>Ronneberger</w:t>
+      </w:r>
+      <w:proofErr w:type="spellEnd"/>
+      <w:r>
+        <w:rPr>
+          <w:lang w:val="en-CA"/>
+        </w:rPr>
+        <w:t xml:space="preserve"> 2015</w:t>
+      </w:r>
+      <w:r>
+        <w:t>) to label images of the simulation as either “Risky” or “Safe” on a pixel-by-pixel basis.</w:t>
       </w:r>
     </w:p>
     <w:p>
@@ -939,18 +943,6 @@
         <w:spacing w:line="480" w:lineRule="auto"/>
         <w:ind w:firstLine="720"/>
       </w:pPr>
-      <w:r>
-        <w:lastRenderedPageBreak/>
-        <w:t xml:space="preserve">We trained a modified version of a </w:t>
-      </w:r>
-      <w:proofErr w:type="spellStart"/>
-      <w:r>
-        <w:t>UNet</w:t>
-      </w:r>
-      <w:proofErr w:type="spellEnd"/>
-      <w:r>
-        <w:t xml:space="preserve"> to perform risk prediction. </w:t>
-      </w:r>
       <w:r>
         <w:t>We altered</w:t>
       </w:r>
@@ -1751,7 +1743,24 @@
         <w:t>Yang</w:t>
       </w:r>
       <w:r>
-        <w:t xml:space="preserve"> 2025). We </w:t>
+        <w:t xml:space="preserve"> 2025). </w:t>
+      </w:r>
+      <w:proofErr w:type="spellStart"/>
+      <w:r>
+        <w:t>GraphRAG</w:t>
+      </w:r>
+      <w:proofErr w:type="spellEnd"/>
+      <w:r>
+        <w:t xml:space="preserve"> was chosen as it has been shown to improve Agentic AI’s performance on multi-hop reasoning problems. </w:t>
+      </w:r>
+    </w:p>
+    <w:p>
+      <w:pPr>
+        <w:spacing w:line="480" w:lineRule="auto"/>
+        <w:ind w:firstLine="720"/>
+      </w:pPr>
+      <w:r>
+        <w:t xml:space="preserve">We </w:t>
       </w:r>
       <w:r>
         <w:t xml:space="preserve">have three </w:t>
@@ -1765,11 +1774,16 @@
       <w:r>
         <w:t xml:space="preserve">Our KG ontology </w:t>
       </w:r>
+      <w:proofErr w:type="gramStart"/>
       <w:r>
         <w:t xml:space="preserve">is </w:t>
       </w:r>
       <w:r>
-        <w:t>in Figure 6.</w:t>
+        <w:t>in</w:t>
+      </w:r>
+      <w:proofErr w:type="gramEnd"/>
+      <w:r>
+        <w:t xml:space="preserve"> Figure 6.</w:t>
       </w:r>
       <w:r>
         <w:t xml:space="preserve"> </w:t>
@@ -1883,6 +1897,7 @@
               <w:spacing w:line="480" w:lineRule="auto"/>
             </w:pPr>
             <w:r>
+              <w:lastRenderedPageBreak/>
               <w:t>Command Centre Agent</w:t>
             </w:r>
           </w:p>
@@ -1897,11 +1912,7 @@
               <w:cnfStyle w:val="000000000000" w:firstRow="0" w:lastRow="0" w:firstColumn="0" w:lastColumn="0" w:oddVBand="0" w:evenVBand="0" w:oddHBand="0" w:evenHBand="0" w:firstRowFirstColumn="0" w:firstRowLastColumn="0" w:lastRowFirstColumn="0" w:lastRowLastColumn="0"/>
             </w:pPr>
             <w:r>
-              <w:t xml:space="preserve">Orchestration. The command center agent takes in the inputs from the simulation </w:t>
-            </w:r>
-            <w:r>
-              <w:lastRenderedPageBreak/>
-              <w:t>and outputs the final response from the Workflow.</w:t>
+              <w:t>Orchestration. The command center agent takes in the inputs from the simulation and outputs the final response from the Workflow.</w:t>
             </w:r>
           </w:p>
         </w:tc>
@@ -1915,7 +1926,6 @@
               <w:cnfStyle w:val="000000000000" w:firstRow="0" w:lastRow="0" w:firstColumn="0" w:lastColumn="0" w:oddVBand="0" w:evenVBand="0" w:oddHBand="0" w:evenHBand="0" w:firstRowFirstColumn="0" w:firstRowLastColumn="0" w:lastRowFirstColumn="0" w:lastRowLastColumn="0"/>
             </w:pPr>
             <w:r>
-              <w:lastRenderedPageBreak/>
               <w:t>None</w:t>
             </w:r>
           </w:p>
@@ -2160,6 +2170,7 @@
         <w:spacing w:line="480" w:lineRule="auto"/>
       </w:pPr>
       <w:r>
+        <w:lastRenderedPageBreak/>
         <w:t xml:space="preserve">The most </w:t>
       </w:r>
       <w:r>
@@ -2197,7 +2208,6 @@
         <w:ind w:firstLine="360"/>
       </w:pPr>
       <w:r>
-        <w:lastRenderedPageBreak/>
         <w:t xml:space="preserve">The </w:t>
       </w:r>
       <w:r>
@@ -2246,6 +2256,7 @@
         <w:rPr>
           <w:noProof/>
         </w:rPr>
+        <w:lastRenderedPageBreak/>
         <w:drawing>
           <wp:inline distT="0" distB="0" distL="0" distR="0" wp14:anchorId="39C87280" wp14:editId="050CE50D">
             <wp:extent cx="5946140" cy="5946140"/>
@@ -2503,7 +2514,7 @@
         </w:rPr>
         <w:lastRenderedPageBreak/>
         <w:drawing>
-          <wp:inline distT="0" distB="0" distL="0" distR="0" wp14:anchorId="5A99DB7D" wp14:editId="07CD002A">
+          <wp:inline distT="0" distB="0" distL="0" distR="0" wp14:anchorId="5A99DB7D" wp14:editId="23BE86A8">
             <wp:extent cx="5941060" cy="6047105"/>
             <wp:effectExtent l="0" t="0" r="2540" b="0"/>
             <wp:docPr id="1561439249" name="Picture 5"/>
@@ -2764,7 +2775,7 @@
           <w:noProof/>
         </w:rPr>
         <w:drawing>
-          <wp:inline distT="0" distB="0" distL="0" distR="0" wp14:anchorId="231DA530" wp14:editId="50B9ED2F">
+          <wp:inline distT="0" distB="0" distL="0" distR="0" wp14:anchorId="231DA530" wp14:editId="323E869A">
             <wp:extent cx="5937250" cy="2971800"/>
             <wp:effectExtent l="0" t="0" r="6350" b="0"/>
             <wp:docPr id="1696375601" name="Picture 2"/>
@@ -3526,7 +3537,7 @@
           <w:noProof/>
         </w:rPr>
         <w:drawing>
-          <wp:inline distT="0" distB="0" distL="0" distR="0" wp14:anchorId="1068ABD1" wp14:editId="68744CF9">
+          <wp:inline distT="0" distB="0" distL="0" distR="0" wp14:anchorId="1068ABD1" wp14:editId="61B9DC1F">
             <wp:extent cx="5937250" cy="2381250"/>
             <wp:effectExtent l="0" t="0" r="6350" b="0"/>
             <wp:docPr id="262277473" name="Picture 1"/>
@@ -3783,6 +3794,9 @@
       </w:r>
       <w:r>
         <w:t xml:space="preserve"> to show our approach can have a positive effect on the outcome.</w:t>
+      </w:r>
+      <w:r>
+        <w:t xml:space="preserve"> In our case we applied the Mann-Whitney U Test.</w:t>
       </w:r>
     </w:p>
     <w:p>
@@ -6198,6 +6212,7 @@
   <w:style w:type="character" w:default="1" w:styleId="DefaultParagraphFont">
     <w:name w:val="Default Paragraph Font"/>
     <w:uiPriority w:val="1"/>
+    <w:semiHidden/>
     <w:unhideWhenUsed/>
   </w:style>
   <w:style w:type="table" w:default="1" w:styleId="TableNormal">

</xml_diff>